<commit_message>
Actualizacion: monitoreo integrado en SPA, corregido loader turno, busqueda con acentos, reordenamiento de modulos y regeneracion de documentacion
</commit_message>
<xml_diff>
--- a/Documentacion_Tecnica.docx
+++ b/Documentacion_Tecnica.docx
@@ -3102,21 +3102,21 @@
               <w:br/>
               <w:t xml:space="preserve">                &lt;a href="#" class="nav-item active" id="navWorkspace"&gt;&lt;i class='bx bx-grid-alt'&gt;&lt;/i&gt; Mis Tareas&lt;/a&gt;</w:t>
               <w:br/>
-              <w:t xml:space="preserve">                &lt;a href="#" class="nav-item"&gt;&lt;i class='bx bx-calendar'&gt;&lt;/i&gt; Horario&lt;/a&gt;</w:t>
-              <w:br/>
-              <w:t xml:space="preserve">                &lt;a href="#" class="nav-item"&gt;&lt;i class='bx bx-home-alt'&gt;&lt;/i&gt; Teletrabajo&lt;/a&gt;</w:t>
-              <w:br/>
-              <w:t xml:space="preserve">                &lt;a href="#" class="nav-item"&gt;&lt;i class='bx bx-folder-open'&gt;&lt;/i&gt; Documentación&lt;/a&gt;</w:t>
-              <w:br/>
-              <w:t xml:space="preserve">                &lt;a href="#" class="nav-item" id="navPermisos"&gt;&lt;i class='bx bx-check-shield'&gt;&lt;/i&gt; Permisos&lt;/a&gt;</w:t>
-              <w:br/>
-              <w:t xml:space="preserve">                &lt;a href="#" class="nav-item" id="navTurnos" style="display: none;"&gt;&lt;i class='bx bx-history'&gt;&lt;/i&gt; Historial Turnos&lt;/a&gt;</w:t>
+              <w:t xml:space="preserve">                &lt;a href="#" class="nav-item" id="navHorario"&gt;&lt;i class='bx bx-calendar'&gt;&lt;/i&gt; Horario&lt;/a&gt;</w:t>
+              <w:br/>
+              <w:t xml:space="preserve">                &lt;a href="#" class="nav-item" id="navTeletrabajo"&gt;&lt;i class='bx bx-home-alt'&gt;&lt;/i&gt; Teletrabajo&lt;/a&gt;</w:t>
+              <w:br/>
+              <w:t xml:space="preserve">                &lt;a href="#" class="nav-item" id="navDocs"&gt;&lt;i class='bx bx-folder-open'&gt;&lt;/i&gt; Documentación&lt;/a&gt;</w:t>
+              <w:br/>
+              <w:t xml:space="preserve">                &lt;a href="#" class="nav-item" id="navPermisos"&gt;&lt;i class='bx bx-check-shield'&gt;&lt;/i&gt; Historial de permisos&lt;/a&gt;</w:t>
+              <w:br/>
+              <w:t xml:space="preserve">                &lt;a href="#" class="nav-item" id="navTurnos" style="display: none;"&gt;&lt;i class='bx bx-history'&gt;&lt;/i&gt; Historial de turnos&lt;/a&gt;</w:t>
               <w:br/>
               <w:t xml:space="preserve">                &lt;a href="#" class="nav-item" id="navAprobaciones" style="display: none;"&gt;&lt;i class='bx bx-user-check'&gt;&lt;/i&gt; Aprobaciones&lt;/a&gt;</w:t>
               <w:br/>
-              <w:t xml:space="preserve">                &lt;a href="monitoreo.html" target="_blank" class="nav-item" id="navMonitoreo" style="display: none;"&gt;&lt;i class='bx bx-pulse'&gt;&lt;/i&gt; Monitoreo Realtime&lt;/a&gt;</w:t>
-              <w:br/>
-              <w:t xml:space="preserve">                &lt;a href="#" class="nav-item"&gt;&lt;i class='bx bx-help-circle'&gt;&lt;/i&gt; Soporte&lt;/a&gt;</w:t>
+              <w:t xml:space="preserve">                &lt;a href="#" class="nav-item" id="navMonitoreo" style="display: none;"&gt;&lt;i class='bx bx-pulse'&gt;&lt;/i&gt; Monitoreo&lt;/a&gt;</w:t>
+              <w:br/>
+              <w:t xml:space="preserve">                &lt;a href="#" class="nav-item" id="navSoporte"&gt;&lt;i class='bx bx-help-circle'&gt;&lt;/i&gt; Soporte&lt;/a&gt;</w:t>
               <w:br/>
               <w:t xml:space="preserve">            &lt;/nav&gt;</w:t>
               <w:br/>
@@ -3632,6 +3632,157 @@
               <w:t xml:space="preserve">            &lt;/div&gt;</w:t>
               <w:br/>
               <w:br/>
+              <w:t xml:space="preserve">            &lt;!-- Vista: Monitoreo Realtime --&gt;</w:t>
+              <w:br/>
+              <w:t xml:space="preserve">            &lt;div id="view-monitoreo" class="view-panel" style="display: none; padding: 20px; overflow-y: auto;"&gt;</w:t>
+              <w:br/>
+              <w:t xml:space="preserve">                &lt;div style="display: flex; justify-content: space-between; align-items: center; margin-bottom: 20px;"&gt;</w:t>
+              <w:br/>
+              <w:t xml:space="preserve">                    &lt;h2 class="panel-title" style="margin: 0;"&gt;&lt;i class='bx bx-pulse'&gt;&lt;/i&gt; Monitoreo&lt;/h2&gt;</w:t>
+              <w:br/>
+              <w:t xml:space="preserve">                    &lt;div class="pulse-live"&gt;</w:t>
+              <w:br/>
+              <w:t xml:space="preserve">                        &lt;div class="pulse-live-dot"&gt;&lt;/div&gt;</w:t>
+              <w:br/>
+              <w:t xml:space="preserve">                        En Vivo</w:t>
+              <w:br/>
+              <w:t xml:space="preserve">                    &lt;/div&gt;</w:t>
+              <w:br/>
+              <w:t xml:space="preserve">                &lt;/div&gt;</w:t>
+              <w:br/>
+              <w:br/>
+              <w:t xml:space="preserve">                &lt;!-- Stat Cards --&gt;</w:t>
+              <w:br/>
+              <w:t xml:space="preserve">                &lt;div class="stats-grid" style="margin-bottom: 20px;"&gt;</w:t>
+              <w:br/>
+              <w:t xml:space="preserve">                    &lt;!-- Total Activos --&gt;</w:t>
+              <w:br/>
+              <w:t xml:space="preserve">                    &lt;div class="stat-widget glass-panel"&gt;</w:t>
+              <w:br/>
+              <w:t xml:space="preserve">                        &lt;div class="stat-widget-details"&gt;</w:t>
+              <w:br/>
+              <w:t xml:space="preserve">                            &lt;h3&gt;Gestores Activos&lt;/h3&gt;</w:t>
+              <w:br/>
+              <w:t xml:space="preserve">                            &lt;div class="number" id="statsGestores"&gt;0 / 0&lt;/div&gt;</w:t>
+              <w:br/>
+              <w:t xml:space="preserve">                        &lt;/div&gt;</w:t>
+              <w:br/>
+              <w:t xml:space="preserve">                        &lt;div class="stat-widget-icon"&gt;</w:t>
+              <w:br/>
+              <w:t xml:space="preserve">                            &lt;i class='bx bx-group'&gt;&lt;/i&gt;</w:t>
+              <w:br/>
+              <w:t xml:space="preserve">                        &lt;/div&gt;</w:t>
+              <w:br/>
+              <w:t xml:space="preserve">                    &lt;/div&gt;</w:t>
+              <w:br/>
+              <w:br/>
+              <w:t xml:space="preserve">                    &lt;!-- KPI Promedio --&gt;</w:t>
+              <w:br/>
+              <w:t xml:space="preserve">                    &lt;div class="stat-widget glass-panel"&gt;</w:t>
+              <w:br/>
+              <w:t xml:space="preserve">                        &lt;div class="stat-widget-details"&gt;</w:t>
+              <w:br/>
+              <w:t xml:space="preserve">                            &lt;h3&gt;KPI Promedio General&lt;/h3&gt;</w:t>
+              <w:br/>
+              <w:t xml:space="preserve">                            &lt;div class="number" id="statsKpi"&gt;0%&lt;/div&gt;</w:t>
+              <w:br/>
+              <w:t xml:space="preserve">                        &lt;/div&gt;</w:t>
+              <w:br/>
+              <w:t xml:space="preserve">                        &lt;div class="stat-widget-icon"&gt;</w:t>
+              <w:br/>
+              <w:t xml:space="preserve">                            &lt;i class='bx bx-line-chart'&gt;&lt;/i&gt;</w:t>
+              <w:br/>
+              <w:t xml:space="preserve">                        &lt;/div&gt;</w:t>
+              <w:br/>
+              <w:t xml:space="preserve">                    &lt;/div&gt;</w:t>
+              <w:br/>
+              <w:br/>
+              <w:t xml:space="preserve">                    &lt;!-- Turno Predominante --&gt;</w:t>
+              <w:br/>
+              <w:t xml:space="preserve">                    &lt;div class="stat-widget glass-panel warning"&gt;</w:t>
+              <w:br/>
+              <w:t xml:space="preserve">                        &lt;div class="stat-widget-details"&gt;</w:t>
+              <w:br/>
+              <w:t xml:space="preserve">                            &lt;h3&gt;Turno en Curso&lt;/h3&gt;</w:t>
+              <w:br/>
+              <w:t xml:space="preserve">                            &lt;div class="number" id="statsTurno"&gt;Cargando...&lt;/div&gt;</w:t>
+              <w:br/>
+              <w:t xml:space="preserve">                        &lt;/div&gt;</w:t>
+              <w:br/>
+              <w:t xml:space="preserve">                        &lt;div class="stat-widget-icon"&gt;</w:t>
+              <w:br/>
+              <w:t xml:space="preserve">                            &lt;i class='bx bx-time-five'&gt;&lt;/i&gt;</w:t>
+              <w:br/>
+              <w:t xml:space="preserve">                        &lt;/div&gt;</w:t>
+              <w:br/>
+              <w:t xml:space="preserve">                    &lt;/div&gt;</w:t>
+              <w:br/>
+              <w:t xml:space="preserve">                &lt;/div&gt;</w:t>
+              <w:br/>
+              <w:br/>
+              <w:t xml:space="preserve">                &lt;!-- Filter Row --&gt;</w:t>
+              <w:br/>
+              <w:t xml:space="preserve">                &lt;div class="filter-section glass-panel" style="margin-bottom: 20px;"&gt;</w:t>
+              <w:br/>
+              <w:t xml:space="preserve">                    &lt;div class="filter-group"&gt;</w:t>
+              <w:br/>
+              <w:t xml:space="preserve">                        &lt;div class="filter-input-wrapper"&gt;</w:t>
+              <w:br/>
+              <w:t xml:space="preserve">                            &lt;i class='bx bx-search'&gt;&lt;/i&gt;</w:t>
+              <w:br/>
+              <w:t xml:space="preserve">                            &lt;input type="text" id="monitoreoSearchInput" class="modern-input" placeholder="Buscar por gestor..."&gt;</w:t>
+              <w:br/>
+              <w:t xml:space="preserve">                        &lt;/div&gt;</w:t>
+              <w:br/>
+              <w:br/>
+              <w:t xml:space="preserve">                        &lt;select id="filterShiftSelect" class="filter-select"&gt;</w:t>
+              <w:br/>
+              <w:t xml:space="preserve">                            &lt;option value=""&gt;Todos los Turnos&lt;/option&gt;</w:t>
+              <w:br/>
+              <w:t xml:space="preserve">                            &lt;option value="Mañana"&gt;Turno Mañana&lt;/option&gt;</w:t>
+              <w:br/>
+              <w:t xml:space="preserve">                            &lt;option value="Tarde"&gt;Turno Tarde&lt;/option&gt;</w:t>
+              <w:br/>
+              <w:t xml:space="preserve">                            &lt;option value="Noche"&gt;Turno Noche&lt;/option&gt;</w:t>
+              <w:br/>
+              <w:t xml:space="preserve">                            &lt;option value="Master"&gt;Turno Master&lt;/option&gt;</w:t>
+              <w:br/>
+              <w:t xml:space="preserve">                        &lt;/select&gt;</w:t>
+              <w:br/>
+              <w:br/>
+              <w:t xml:space="preserve">                        &lt;select id="filterStatusSelect" class="filter-select"&gt;</w:t>
+              <w:br/>
+              <w:t xml:space="preserve">                            &lt;option value=""&gt;Todos los Estados&lt;/option&gt;</w:t>
+              <w:br/>
+              <w:t xml:space="preserve">                            &lt;option value="online"&gt;En Línea&lt;/option&gt;</w:t>
+              <w:br/>
+              <w:t xml:space="preserve">                            &lt;option value="offline"&gt;Inactivos&lt;/option&gt;</w:t>
+              <w:br/>
+              <w:t xml:space="preserve">                        &lt;/select&gt;</w:t>
+              <w:br/>
+              <w:t xml:space="preserve">                    &lt;/div&gt;</w:t>
+              <w:br/>
+              <w:t xml:space="preserve">                    </w:t>
+              <w:br/>
+              <w:t xml:space="preserve">                    &lt;button class="btn btn-outline" id="clearMonitoreoFiltersBtn" style="height: 40px; padding: 0 15px; display: flex; align-items: center; gap: 8px; width: auto;"&gt;</w:t>
+              <w:br/>
+              <w:t xml:space="preserve">                        &lt;i class='bx bx-filter-alt'&gt;&lt;/i&gt; Limpiar Filtros</w:t>
+              <w:br/>
+              <w:t xml:space="preserve">                    &lt;/button&gt;</w:t>
+              <w:br/>
+              <w:t xml:space="preserve">                &lt;/div&gt;</w:t>
+              <w:br/>
+              <w:br/>
+              <w:t xml:space="preserve">                &lt;!-- Grid layout of active managers --&gt;</w:t>
+              <w:br/>
+              <w:t xml:space="preserve">                &lt;div class="monitoreo-grid" id="monitoreoGrid" style="display: grid; grid-template-columns: repeat(auto-fill, minmax(320px, 1fr)); gap: 20px; padding-bottom: 40px;"&gt;</w:t>
+              <w:br/>
+              <w:t xml:space="preserve">                    &lt;!-- Renderizado dinámico --&gt;</w:t>
+              <w:br/>
+              <w:t xml:space="preserve">                &lt;/div&gt;</w:t>
+              <w:br/>
+              <w:t xml:space="preserve">            &lt;/div&gt;</w:t>
+              <w:br/>
               <w:br/>
               <w:t xml:space="preserve">        &lt;/main&gt;</w:t>
               <w:br/>
@@ -3712,6 +3863,51 @@
               <w:t xml:space="preserve">            &lt;/div&gt;</w:t>
               <w:br/>
               <w:t xml:space="preserve">            &lt;p id="passwordChangeMsg" style="display: none; margin-top: 10px; font-size: 14px; text-align: center;"&gt;&lt;/p&gt;</w:t>
+              <w:br/>
+              <w:t xml:space="preserve">        &lt;/div&gt;</w:t>
+              <w:br/>
+              <w:t xml:space="preserve">    &lt;/div&gt;</w:t>
+              <w:br/>
+              <w:br/>
+              <w:t xml:space="preserve">    &lt;!-- Monitoreo Detail Modal --&gt;</w:t>
+              <w:br/>
+              <w:t xml:space="preserve">    &lt;div id="monitoreoModal" class="modal-overlay"&gt;</w:t>
+              <w:br/>
+              <w:t xml:space="preserve">        &lt;div class="modal glass-panel" style="max-width: 600px; width: 90%;"&gt;</w:t>
+              <w:br/>
+              <w:t xml:space="preserve">            &lt;div style="display: flex; align-items: center; gap: 12px; margin-bottom: 5px;"&gt;</w:t>
+              <w:br/>
+              <w:t xml:space="preserve">                &lt;img id="monitoreoModalAvatar" src="" alt="Avatar" style="width: 50px; height: 50px; border-radius: 50%; object-fit: cover; border: 2px solid var(--accent-primary);"&gt;</w:t>
+              <w:br/>
+              <w:t xml:space="preserve">                &lt;div&gt;</w:t>
+              <w:br/>
+              <w:t xml:space="preserve">                    &lt;h2 id="monitoreoModalName" style="margin: 0; font-size: 20px; color: var(--text-primary);"&gt;Bitácora de Tareas&lt;/h2&gt;</w:t>
+              <w:br/>
+              <w:t xml:space="preserve">                    &lt;div id="monitoreoModalInfo" style="font-size: 12px; color: var(--text-secondary);"&gt;Turno: Mañana | Activo hace poco&lt;/div&gt;</w:t>
+              <w:br/>
+              <w:t xml:space="preserve">                &lt;/div&gt;</w:t>
+              <w:br/>
+              <w:t xml:space="preserve">            &lt;/div&gt;</w:t>
+              <w:br/>
+              <w:t xml:space="preserve">            &lt;hr style="border: 0; border-top: 1px solid var(--glass-border); margin: 15px 0;"&gt;</w:t>
+              <w:br/>
+              <w:t xml:space="preserve">            &lt;h3 style="font-size: 14px; color: var(--accent-primary); margin-bottom: 10px; text-transform: uppercase; letter-spacing: 0.5px;"&gt;&lt;i class='bx bx-task'&gt;&lt;/i&gt; Detalle de Gestión de Tareas&lt;/h3&gt;</w:t>
+              <w:br/>
+              <w:t xml:space="preserve">            </w:t>
+              <w:br/>
+              <w:t xml:space="preserve">            &lt;div style="max-height: 350px; overflow-y: auto; display: flex; flex-direction: column; gap: 10px; padding-right: 5px;" id="monitoreoModalTasksList"&gt;</w:t>
+              <w:br/>
+              <w:t xml:space="preserve">                &lt;!-- Tareas del gestor se cargan dinámicamente --&gt;</w:t>
+              <w:br/>
+              <w:t xml:space="preserve">            &lt;/div&gt;</w:t>
+              <w:br/>
+              <w:t xml:space="preserve">            </w:t>
+              <w:br/>
+              <w:t xml:space="preserve">            &lt;div class="modal-actions" style="margin-top: 20px;"&gt;</w:t>
+              <w:br/>
+              <w:t xml:space="preserve">                &lt;button class="btn btn-outline" id="closeMonitoreoModalBtn" style="width: auto;"&gt;Cerrar&lt;/button&gt;</w:t>
+              <w:br/>
+              <w:t xml:space="preserve">            &lt;/div&gt;</w:t>
               <w:br/>
               <w:t xml:space="preserve">        &lt;/div&gt;</w:t>
               <w:br/>
@@ -5158,6 +5354,301 @@
               <w:br/>
               <w:t>}</w:t>
               <w:br/>
+              <w:br/>
+              <w:t>/* Stats Cards and Widgets for Realtime Monitoring inside SPA */</w:t>
+              <w:br/>
+              <w:t>.stats-grid {</w:t>
+              <w:br/>
+              <w:t xml:space="preserve">    display: grid;</w:t>
+              <w:br/>
+              <w:t xml:space="preserve">    grid-template-columns: repeat(auto-fit, minmax(280px, 1fr));</w:t>
+              <w:br/>
+              <w:t xml:space="preserve">    gap: 20px;</w:t>
+              <w:br/>
+              <w:t xml:space="preserve">    width: 100%;</w:t>
+              <w:br/>
+              <w:t>}</w:t>
+              <w:br/>
+              <w:br/>
+              <w:t>.stat-widget {</w:t>
+              <w:br/>
+              <w:t xml:space="preserve">    display: flex;</w:t>
+              <w:br/>
+              <w:t xml:space="preserve">    align-items: center;</w:t>
+              <w:br/>
+              <w:t xml:space="preserve">    justify-content: space-between;</w:t>
+              <w:br/>
+              <w:t xml:space="preserve">    padding: 20px;</w:t>
+              <w:br/>
+              <w:t xml:space="preserve">    border-radius: var(--radius-md);</w:t>
+              <w:br/>
+              <w:t xml:space="preserve">    border: 1px solid var(--glass-border);</w:t>
+              <w:br/>
+              <w:t xml:space="preserve">    position: relative;</w:t>
+              <w:br/>
+              <w:t xml:space="preserve">    overflow: hidden;</w:t>
+              <w:br/>
+              <w:t xml:space="preserve">    background: var(--glass-bg);</w:t>
+              <w:br/>
+              <w:t xml:space="preserve">    backdrop-filter: blur(10px);</w:t>
+              <w:br/>
+              <w:t xml:space="preserve">    -webkit-backdrop-filter: blur(10px);</w:t>
+              <w:br/>
+              <w:t>}</w:t>
+              <w:br/>
+              <w:br/>
+              <w:t>.stat-widget::after {</w:t>
+              <w:br/>
+              <w:t xml:space="preserve">    content: '';</w:t>
+              <w:br/>
+              <w:t xml:space="preserve">    position: absolute;</w:t>
+              <w:br/>
+              <w:t xml:space="preserve">    bottom: 0;</w:t>
+              <w:br/>
+              <w:t xml:space="preserve">    left: 0;</w:t>
+              <w:br/>
+              <w:t xml:space="preserve">    height: 4px;</w:t>
+              <w:br/>
+              <w:t xml:space="preserve">    width: 100%;</w:t>
+              <w:br/>
+              <w:t xml:space="preserve">    background: linear-gradient(90deg, var(--accent-primary), var(--success));</w:t>
+              <w:br/>
+              <w:t>}</w:t>
+              <w:br/>
+              <w:br/>
+              <w:t>.stat-widget.warning::after {</w:t>
+              <w:br/>
+              <w:t xml:space="preserve">    background: linear-gradient(90deg, var(--warning), var(--danger));</w:t>
+              <w:br/>
+              <w:t>}</w:t>
+              <w:br/>
+              <w:br/>
+              <w:t>.stat-widget-details h3 {</w:t>
+              <w:br/>
+              <w:t xml:space="preserve">    font-size: 12px;</w:t>
+              <w:br/>
+              <w:t xml:space="preserve">    color: var(--text-secondary);</w:t>
+              <w:br/>
+              <w:t xml:space="preserve">    text-transform: uppercase;</w:t>
+              <w:br/>
+              <w:t xml:space="preserve">    letter-spacing: 0.5px;</w:t>
+              <w:br/>
+              <w:t xml:space="preserve">    margin-bottom: 5px;</w:t>
+              <w:br/>
+              <w:t xml:space="preserve">    margin-top: 0;</w:t>
+              <w:br/>
+              <w:t>}</w:t>
+              <w:br/>
+              <w:br/>
+              <w:t>.stat-widget-details .number {</w:t>
+              <w:br/>
+              <w:t xml:space="preserve">    font-size: 28px;</w:t>
+              <w:br/>
+              <w:t xml:space="preserve">    font-weight: 700;</w:t>
+              <w:br/>
+              <w:t xml:space="preserve">    color: var(--text-primary);</w:t>
+              <w:br/>
+              <w:t>}</w:t>
+              <w:br/>
+              <w:br/>
+              <w:t>.stat-widget-icon {</w:t>
+              <w:br/>
+              <w:t xml:space="preserve">    font-size: 32px;</w:t>
+              <w:br/>
+              <w:t xml:space="preserve">    color: var(--accent-primary);</w:t>
+              <w:br/>
+              <w:t xml:space="preserve">    opacity: 0.8;</w:t>
+              <w:br/>
+              <w:t xml:space="preserve">    background: rgba(59, 130, 246, 0.1);</w:t>
+              <w:br/>
+              <w:t xml:space="preserve">    padding: 10px;</w:t>
+              <w:br/>
+              <w:t xml:space="preserve">    border-radius: 50%;</w:t>
+              <w:br/>
+              <w:t xml:space="preserve">    display: flex;</w:t>
+              <w:br/>
+              <w:t xml:space="preserve">    align-items: center;</w:t>
+              <w:br/>
+              <w:t xml:space="preserve">    justify-content: center;</w:t>
+              <w:br/>
+              <w:t>}</w:t>
+              <w:br/>
+              <w:br/>
+              <w:t>.stat-widget.warning .stat-widget-icon {</w:t>
+              <w:br/>
+              <w:t xml:space="preserve">    color: var(--warning);</w:t>
+              <w:br/>
+              <w:t xml:space="preserve">    background: rgba(245, 158, 11, 0.1);</w:t>
+              <w:br/>
+              <w:t>}</w:t>
+              <w:br/>
+              <w:br/>
+              <w:t>/* Filters section for Realtime Monitor */</w:t>
+              <w:br/>
+              <w:t>.filter-section {</w:t>
+              <w:br/>
+              <w:t xml:space="preserve">    display: flex;</w:t>
+              <w:br/>
+              <w:t xml:space="preserve">    gap: 15px;</w:t>
+              <w:br/>
+              <w:t xml:space="preserve">    align-items: center;</w:t>
+              <w:br/>
+              <w:t xml:space="preserve">    justify-content: space-between;</w:t>
+              <w:br/>
+              <w:t xml:space="preserve">    flex-wrap: wrap;</w:t>
+              <w:br/>
+              <w:t xml:space="preserve">    padding: 15px 20px;</w:t>
+              <w:br/>
+              <w:t xml:space="preserve">    border-radius: var(--radius-md);</w:t>
+              <w:br/>
+              <w:t xml:space="preserve">    border: 1px solid var(--glass-border);</w:t>
+              <w:br/>
+              <w:t xml:space="preserve">    background: var(--glass-bg);</w:t>
+              <w:br/>
+              <w:t xml:space="preserve">    backdrop-filter: blur(10px);</w:t>
+              <w:br/>
+              <w:t xml:space="preserve">    -webkit-backdrop-filter: blur(10px);</w:t>
+              <w:br/>
+              <w:t>}</w:t>
+              <w:br/>
+              <w:br/>
+              <w:t>.filter-group {</w:t>
+              <w:br/>
+              <w:t xml:space="preserve">    display: flex;</w:t>
+              <w:br/>
+              <w:t xml:space="preserve">    gap: 15px;</w:t>
+              <w:br/>
+              <w:t xml:space="preserve">    align-items: center;</w:t>
+              <w:br/>
+              <w:t xml:space="preserve">    flex-wrap: wrap;</w:t>
+              <w:br/>
+              <w:t xml:space="preserve">    flex-grow: 1;</w:t>
+              <w:br/>
+              <w:t>}</w:t>
+              <w:br/>
+              <w:br/>
+              <w:t>.filter-input-wrapper {</w:t>
+              <w:br/>
+              <w:t xml:space="preserve">    position: relative;</w:t>
+              <w:br/>
+              <w:t xml:space="preserve">    flex-grow: 1;</w:t>
+              <w:br/>
+              <w:t xml:space="preserve">    max-width: 350px;</w:t>
+              <w:br/>
+              <w:t xml:space="preserve">    min-width: 200px;</w:t>
+              <w:br/>
+              <w:t>}</w:t>
+              <w:br/>
+              <w:br/>
+              <w:t>.filter-input-wrapper i {</w:t>
+              <w:br/>
+              <w:t xml:space="preserve">    position: absolute;</w:t>
+              <w:br/>
+              <w:t xml:space="preserve">    left: 12px;</w:t>
+              <w:br/>
+              <w:t xml:space="preserve">    top: 50%;</w:t>
+              <w:br/>
+              <w:t xml:space="preserve">    transform: translateY(-50%);</w:t>
+              <w:br/>
+              <w:t xml:space="preserve">    color: var(--text-secondary);</w:t>
+              <w:br/>
+              <w:t xml:space="preserve">    font-size: 18px;</w:t>
+              <w:br/>
+              <w:t>}</w:t>
+              <w:br/>
+              <w:br/>
+              <w:t>.filter-input-wrapper input {</w:t>
+              <w:br/>
+              <w:t xml:space="preserve">    padding-left: 38px;</w:t>
+              <w:br/>
+              <w:t xml:space="preserve">    height: 40px;</w:t>
+              <w:br/>
+              <w:t xml:space="preserve">    width: 100%;</w:t>
+              <w:br/>
+              <w:t>}</w:t>
+              <w:br/>
+              <w:br/>
+              <w:t>.filter-select {</w:t>
+              <w:br/>
+              <w:t xml:space="preserve">    height: 40px;</w:t>
+              <w:br/>
+              <w:t xml:space="preserve">    min-width: 160px;</w:t>
+              <w:br/>
+              <w:t xml:space="preserve">    border-radius: var(--radius-sm);</w:t>
+              <w:br/>
+              <w:t xml:space="preserve">    background: var(--bg-secondary);</w:t>
+              <w:br/>
+              <w:t xml:space="preserve">    border: 1px solid var(--glass-border);</w:t>
+              <w:br/>
+              <w:t xml:space="preserve">    color: var(--text-primary);</w:t>
+              <w:br/>
+              <w:t xml:space="preserve">    padding: 0 10px;</w:t>
+              <w:br/>
+              <w:t xml:space="preserve">    font-family: inherit;</w:t>
+              <w:br/>
+              <w:t xml:space="preserve">    cursor: pointer;</w:t>
+              <w:br/>
+              <w:t xml:space="preserve">    outline: none;</w:t>
+              <w:br/>
+              <w:t xml:space="preserve">    transition: border-color 0.2s;</w:t>
+              <w:br/>
+              <w:t>}</w:t>
+              <w:br/>
+              <w:br/>
+              <w:t>.filter-select:focus {</w:t>
+              <w:br/>
+              <w:t xml:space="preserve">    border-color: var(--accent-primary);</w:t>
+              <w:br/>
+              <w:t>}</w:t>
+              <w:br/>
+              <w:br/>
+              <w:t>/* Pulse live indicator */</w:t>
+              <w:br/>
+              <w:t>.pulse-live {</w:t>
+              <w:br/>
+              <w:t xml:space="preserve">    display: inline-flex;</w:t>
+              <w:br/>
+              <w:t xml:space="preserve">    align-items: center;</w:t>
+              <w:br/>
+              <w:t xml:space="preserve">    gap: 8px;</w:t>
+              <w:br/>
+              <w:t xml:space="preserve">    font-size: 11px;</w:t>
+              <w:br/>
+              <w:t xml:space="preserve">    font-weight: 600;</w:t>
+              <w:br/>
+              <w:t xml:space="preserve">    text-transform: uppercase;</w:t>
+              <w:br/>
+              <w:t xml:space="preserve">    letter-spacing: 1px;</w:t>
+              <w:br/>
+              <w:t xml:space="preserve">    background: rgba(16, 185, 129, 0.15);</w:t>
+              <w:br/>
+              <w:t xml:space="preserve">    color: var(--success);</w:t>
+              <w:br/>
+              <w:t xml:space="preserve">    padding: 4px 10px;</w:t>
+              <w:br/>
+              <w:t xml:space="preserve">    border-radius: 20px;</w:t>
+              <w:br/>
+              <w:t xml:space="preserve">    border: 1px solid rgba(16, 185, 129, 0.3);</w:t>
+              <w:br/>
+              <w:t>}</w:t>
+              <w:br/>
+              <w:br/>
+              <w:t>.pulse-live-dot {</w:t>
+              <w:br/>
+              <w:t xml:space="preserve">    width: 6px;</w:t>
+              <w:br/>
+              <w:t xml:space="preserve">    height: 6px;</w:t>
+              <w:br/>
+              <w:t xml:space="preserve">    border-radius: 50%;</w:t>
+              <w:br/>
+              <w:t xml:space="preserve">    background-color: var(--success);</w:t>
+              <w:br/>
+              <w:t xml:space="preserve">    box-shadow: 0 0 0 0 rgba(16, 185, 129, 0.7);</w:t>
+              <w:br/>
+              <w:t xml:space="preserve">    animation: pulse-ring 1.6s infinite;</w:t>
+              <w:br/>
+              <w:t>}</w:t>
+              <w:br/>
             </w:r>
           </w:p>
         </w:tc>
@@ -6755,6 +7246,11 @@
               <w:t xml:space="preserve">        }</w:t>
               <w:br/>
               <w:br/>
+              <w:t xml:space="preserve">        // Setup programmatical sidebar ordering for roles</w:t>
+              <w:br/>
+              <w:t xml:space="preserve">        setupSidebar();</w:t>
+              <w:br/>
+              <w:br/>
               <w:t xml:space="preserve">        // Show Aprobaciones tab for Supervisor/Admin</w:t>
               <w:br/>
               <w:t xml:space="preserve">        if (currentUser.role === 'Admin' || currentUser.role === 'Supervisor') {</w:t>
@@ -6784,26 +7280,99 @@
               <w:br/>
               <w:t xml:space="preserve">            if(navMonitoreo) navMonitoreo.style.display = 'flex';</w:t>
               <w:br/>
-              <w:t xml:space="preserve">            if(navWorkspace) navWorkspace.style.display = 'none';</w:t>
-              <w:br/>
-              <w:t xml:space="preserve">            if(viewWorkspace) viewWorkspace.style.display = 'none';</w:t>
+              <w:t xml:space="preserve">            if(navWorkspace) navWorkspace.style.display = 'flex'; // Keep Mis Tareas visible</w:t>
               <w:br/>
               <w:t xml:space="preserve">            </w:t>
               <w:br/>
-              <w:t xml:space="preserve">            // Forzar vista de Aprobaciones como inicial</w:t>
-              <w:br/>
-              <w:t xml:space="preserve">            if(viewAprobaciones) {</w:t>
+              <w:t xml:space="preserve">            // Forzar vista de Monitoreo Realtime como inicial</w:t>
+              <w:br/>
+              <w:t xml:space="preserve">            const viewMonitoreo = document.getElementById('view-monitoreo');</w:t>
+              <w:br/>
+              <w:t xml:space="preserve">            if (viewMonitoreo &amp;&amp; navMonitoreo) {</w:t>
               <w:br/>
               <w:t xml:space="preserve">                document.querySelectorAll('.view-panel').forEach(v =&gt; v.style.display = 'none');</w:t>
               <w:br/>
-              <w:t xml:space="preserve">                viewAprobaciones.style.display = 'block';</w:t>
+              <w:t xml:space="preserve">                viewMonitoreo.style.display = 'block';</w:t>
               <w:br/>
               <w:t xml:space="preserve">                document.querySelectorAll('.nav-item').forEach(n =&gt; n.classList.remove('active'));</w:t>
               <w:br/>
-              <w:t xml:space="preserve">                navAprobaciones.classList.add('active');</w:t>
+              <w:t xml:space="preserve">                navMonitoreo.classList.add('active');</w:t>
               <w:br/>
               <w:t xml:space="preserve">            }</w:t>
               <w:br/>
+              <w:br/>
+              <w:t xml:space="preserve">            // Iniciar sincronización en tiempo real para Monitoreo</w:t>
+              <w:br/>
+              <w:t xml:space="preserve">            startActiveSessionsListener();</w:t>
+              <w:br/>
+              <w:br/>
+              <w:t xml:space="preserve">            // Listeners for Monitoreo filters</w:t>
+              <w:br/>
+              <w:t xml:space="preserve">            const searchInput = document.getElementById('monitoreoSearchInput');</w:t>
+              <w:br/>
+              <w:t xml:space="preserve">            const shiftSelect = document.getElementById('filterShiftSelect');</w:t>
+              <w:br/>
+              <w:t xml:space="preserve">            const statusSelect = document.getElementById('filterStatusSelect');</w:t>
+              <w:br/>
+              <w:t xml:space="preserve">            const clearMonitoreoFiltersBtn = document.getElementById('clearMonitoreoFiltersBtn');</w:t>
+              <w:br/>
+              <w:br/>
+              <w:t xml:space="preserve">            if (searchInput) searchInput.addEventListener('input', renderActiveSessionsDashboard);</w:t>
+              <w:br/>
+              <w:t xml:space="preserve">            if (shiftSelect) shiftSelect.addEventListener('change', renderActiveSessionsDashboard);</w:t>
+              <w:br/>
+              <w:t xml:space="preserve">            if (statusSelect) statusSelect.addEventListener('change', renderActiveSessionsDashboard);</w:t>
+              <w:br/>
+              <w:br/>
+              <w:t xml:space="preserve">            if (clearMonitoreoFiltersBtn) {</w:t>
+              <w:br/>
+              <w:t xml:space="preserve">                clearMonitoreoFiltersBtn.addEventListener('click', () =&gt; {</w:t>
+              <w:br/>
+              <w:t xml:space="preserve">                    if (searchInput) searchInput.value = '';</w:t>
+              <w:br/>
+              <w:t xml:space="preserve">                    if (shiftSelect) shiftSelect.value = '';</w:t>
+              <w:br/>
+              <w:t xml:space="preserve">                    if (statusSelect) statusSelect.value = '';</w:t>
+              <w:br/>
+              <w:t xml:space="preserve">                    renderActiveSessionsDashboard();</w:t>
+              <w:br/>
+              <w:t xml:space="preserve">                });</w:t>
+              <w:br/>
+              <w:t xml:space="preserve">            }</w:t>
+              <w:br/>
+              <w:br/>
+              <w:t xml:space="preserve">            // Close Monitoreo modal listeners</w:t>
+              <w:br/>
+              <w:t xml:space="preserve">            const closeBtn = document.getElementById('closeMonitoreoModalBtn');</w:t>
+              <w:br/>
+              <w:t xml:space="preserve">            if (closeBtn) {</w:t>
+              <w:br/>
+              <w:t xml:space="preserve">                closeBtn.addEventListener('click', () =&gt; {</w:t>
+              <w:br/>
+              <w:t xml:space="preserve">                    const modal = document.getElementById('monitoreoModal');</w:t>
+              <w:br/>
+              <w:t xml:space="preserve">                    if (modal) modal.classList.remove('active');</w:t>
+              <w:br/>
+              <w:t xml:space="preserve">                });</w:t>
+              <w:br/>
+              <w:t xml:space="preserve">            }</w:t>
+              <w:br/>
+              <w:t xml:space="preserve">            const modalOverlay = document.getElementById('monitoreoModal');</w:t>
+              <w:br/>
+              <w:t xml:space="preserve">            if (modalOverlay) {</w:t>
+              <w:br/>
+              <w:t xml:space="preserve">                modalOverlay.addEventListener('click', (e) =&gt; {</w:t>
+              <w:br/>
+              <w:t xml:space="preserve">                    if (e.target === modalOverlay) {</w:t>
+              <w:br/>
+              <w:t xml:space="preserve">                        modalOverlay.classList.remove('active');</w:t>
+              <w:br/>
+              <w:t xml:space="preserve">                    }</w:t>
+              <w:br/>
+              <w:t xml:space="preserve">                });</w:t>
+              <w:br/>
+              <w:t xml:space="preserve">            }</w:t>
+              <w:br/>
               <w:t xml:space="preserve">            </w:t>
               <w:br/>
               <w:t xml:space="preserve">            // Ocultar formulario de pedir permiso</w:t>
@@ -7181,1727 +7750,2387 @@
               <w:br/>
               <w:t xml:space="preserve">        item.addEventListener('click', (e) =&gt; {</w:t>
               <w:br/>
-              <w:t xml:space="preserve">            // Evitar preventDefault para el monitoreo ya que se abre en una pestaña nueva</w:t>
-              <w:br/>
-              <w:t xml:space="preserve">            if (item.id === 'navMonitoreo' || item.textContent.includes('Monitoreo')) {</w:t>
-              <w:br/>
-              <w:t xml:space="preserve">                return; // Deja que el enlace nativo con target="_blank" haga su trabajo</w:t>
+              <w:t xml:space="preserve">            e.preventDefault();</w:t>
+              <w:br/>
+              <w:t xml:space="preserve">            // Evitar redirigir erróneamente en el botón soporte real</w:t>
+              <w:br/>
+              <w:t xml:space="preserve">            if(item.id === 'navSoporte' || item.textContent.includes('Soporte')) {</w:t>
+              <w:br/>
+              <w:t xml:space="preserve">                alert("Redirigiendo al IT HelpDesk...");</w:t>
+              <w:br/>
+              <w:t xml:space="preserve">                return;</w:t>
               <w:br/>
               <w:t xml:space="preserve">            }</w:t>
               <w:br/>
+              <w:br/>
+              <w:t xml:space="preserve">            // UI</w:t>
+              <w:br/>
+              <w:t xml:space="preserve">            navItems.forEach(n =&gt; n.classList.remove('active'));</w:t>
+              <w:br/>
+              <w:t xml:space="preserve">            item.classList.add('active');</w:t>
+              <w:br/>
+              <w:br/>
+              <w:t xml:space="preserve">            // Ocultar todas las vistas</w:t>
+              <w:br/>
+              <w:t xml:space="preserve">            document.querySelectorAll('.view-panel').forEach(v =&gt; v.style.display = 'none');</w:t>
+              <w:br/>
+              <w:br/>
+              <w:t xml:space="preserve">            // Mostrar la correcta</w:t>
+              <w:br/>
+              <w:t xml:space="preserve">            if (item.id === 'navWorkspace') {</w:t>
+              <w:br/>
+              <w:t xml:space="preserve">                document.getElementById('view-workspace').style.display = 'block';</w:t>
+              <w:br/>
+              <w:t xml:space="preserve">            } else if (item.id === 'navHorario') {</w:t>
+              <w:br/>
+              <w:t xml:space="preserve">                document.getElementById('view-horario').style.display = 'block';</w:t>
+              <w:br/>
+              <w:t xml:space="preserve">            } else if (item.id === 'navTeletrabajo') {</w:t>
+              <w:br/>
+              <w:t xml:space="preserve">                document.getElementById('view-teletrabajo').style.display = 'block';</w:t>
+              <w:br/>
+              <w:t xml:space="preserve">            } else if (item.id === 'navDocs') {</w:t>
+              <w:br/>
+              <w:t xml:space="preserve">                document.getElementById('view-docs').style.display = 'block';</w:t>
+              <w:br/>
+              <w:t xml:space="preserve">            } else if (item.id === 'navPermisos') {</w:t>
+              <w:br/>
+              <w:t xml:space="preserve">                document.getElementById('view-permisos').style.display = 'block';</w:t>
+              <w:br/>
+              <w:t xml:space="preserve">            } else if (item.id === 'navTurnos') {</w:t>
+              <w:br/>
+              <w:t xml:space="preserve">                document.getElementById('view-turnos').style.display = 'block';</w:t>
+              <w:br/>
+              <w:t xml:space="preserve">                renderShiftReports();</w:t>
+              <w:br/>
+              <w:t xml:space="preserve">            } else if (item.id === 'navAprobaciones') {</w:t>
+              <w:br/>
+              <w:t xml:space="preserve">                document.getElementById('view-aprobaciones').style.display = 'block';</w:t>
+              <w:br/>
+              <w:t xml:space="preserve">                renderPendingUsers();</w:t>
+              <w:br/>
+              <w:t xml:space="preserve">                renderPendingPermissions();</w:t>
+              <w:br/>
+              <w:t xml:space="preserve">            } else if (item.id === 'navMonitoreo') {</w:t>
+              <w:br/>
+              <w:t xml:space="preserve">                const viewMonitoreo = document.getElementById('view-monitoreo');</w:t>
+              <w:br/>
+              <w:t xml:space="preserve">                if (viewMonitoreo) viewMonitoreo.style.display = 'block';</w:t>
+              <w:br/>
+              <w:t xml:space="preserve">                renderActiveSessionsDashboard();</w:t>
+              <w:br/>
+              <w:t xml:space="preserve">                updateGlobalStats();</w:t>
+              <w:br/>
+              <w:t xml:space="preserve">            }</w:t>
+              <w:br/>
+              <w:t xml:space="preserve">        });</w:t>
+              <w:br/>
+              <w:t xml:space="preserve">    });</w:t>
+              <w:br/>
+              <w:br/>
+              <w:t xml:space="preserve">    // Inyectar documentos reales de la carpeta "Procesos" en el Módulo de Docs</w:t>
+              <w:br/>
+              <w:t xml:space="preserve">    const docsGrid = document.querySelector('.docs-grid');</w:t>
+              <w:br/>
+              <w:t xml:space="preserve">    if(docsGrid) {</w:t>
+              <w:br/>
+              <w:t xml:space="preserve">        const archivos = [</w:t>
+              <w:br/>
+              <w:t xml:space="preserve">            "Instructivo de revisión de apuestas casino.pdf",</w:t>
+              <w:br/>
+              <w:t xml:space="preserve">            "Instructivo de validación de GGR Casino.pdf",</w:t>
+              <w:br/>
+              <w:t xml:space="preserve">            "Política Procedimiento De Aprobación De Retiros.pdf",</w:t>
+              <w:br/>
+              <w:t xml:space="preserve">            "Procedimiento Identificación de jineteo.pdf",</w:t>
+              <w:br/>
+              <w:t xml:space="preserve">            "Proceso de Eliminación de Cuentas - Implementaciones.pdf",</w:t>
+              <w:br/>
+              <w:t xml:space="preserve">            "VALIDACIÓN DE ABUSO DE BONOS EN CAMPAÑAS DE CRM.pdf",</w:t>
+              <w:br/>
+              <w:t xml:space="preserve">            "Revisión de Eventos Deportivos.mp4",</w:t>
+              <w:br/>
+              <w:t xml:space="preserve">            "Revisión de Eventos.mp4",</w:t>
+              <w:br/>
+              <w:t xml:space="preserve">            "Validación SEON.mp4"</w:t>
+              <w:br/>
+              <w:t xml:space="preserve">        ];</w:t>
+              <w:br/>
+              <w:br/>
+              <w:t xml:space="preserve">        archivos.forEach(file =&gt; {</w:t>
+              <w:br/>
+              <w:t xml:space="preserve">            const isVideo = file.toLowerCase().endsWith('.mp4');</w:t>
+              <w:br/>
+              <w:t xml:space="preserve">            const isWord = file.toLowerCase().endsWith('.docx') || file.toLowerCase().endsWith('.doc');</w:t>
+              <w:br/>
+              <w:t xml:space="preserve">            const isExcel = file.toLowerCase().endsWith('.xlsx') || file.toLowerCase().endsWith('.xls');</w:t>
+              <w:br/>
               <w:t xml:space="preserve">            </w:t>
               <w:br/>
-              <w:t xml:space="preserve">            e.preventDefault();</w:t>
-              <w:br/>
-              <w:t xml:space="preserve">            // Evitar redirigir erróneamente en el botón soporte real</w:t>
-              <w:br/>
-              <w:t xml:space="preserve">            if(item.textContent.includes('Soporte')) {</w:t>
-              <w:br/>
-              <w:t xml:space="preserve">                alert("Redirigiendo al IT HelpDesk...");</w:t>
+              <w:t xml:space="preserve">            let icon = 'bx-file-pdf';</w:t>
+              <w:br/>
+              <w:t xml:space="preserve">            let color = '#FF5A5A'; // PDF red</w:t>
+              <w:br/>
+              <w:t xml:space="preserve">            </w:t>
+              <w:br/>
+              <w:t xml:space="preserve">            if(isVideo) { icon = 'bx-video'; color = '#3B82F6'; }</w:t>
+              <w:br/>
+              <w:t xml:space="preserve">            else if(isWord) { icon = 'bx-file-blank'; color = '#2563EB'; } // Word blue</w:t>
+              <w:br/>
+              <w:t xml:space="preserve">            else if(isExcel) { icon = 'bx-table'; color = '#10B981'; } // Excel green</w:t>
+              <w:br/>
+              <w:br/>
+              <w:t xml:space="preserve">            docsGrid.innerHTML += `</w:t>
+              <w:br/>
+              <w:t xml:space="preserve">                &lt;a href="${getDocUrl(file)}" target="_blank" class="glass-panel" style="padding: 20px; display: flex; flex-direction: column; align-items: center; text-align: center; gap: 10px; transition: transform 0.2s;"&gt;</w:t>
+              <w:br/>
+              <w:t xml:space="preserve">                    &lt;i class='bx ${icon}' style="font-size: 40px; color: ${color};"&gt;&lt;/i&gt;</w:t>
+              <w:br/>
+              <w:t xml:space="preserve">                    &lt;span style="font-size: 14px; color: var(--text-primary); font-weight: 500;"&gt;${file.replace(/\.[^/.]+$/, "")}&lt;/span&gt;</w:t>
+              <w:br/>
+              <w:t xml:space="preserve">                &lt;/a&gt;</w:t>
+              <w:br/>
+              <w:t xml:space="preserve">            `;</w:t>
+              <w:br/>
+              <w:t xml:space="preserve">        });</w:t>
+              <w:br/>
+              <w:t xml:space="preserve">    }</w:t>
+              <w:br/>
+              <w:br/>
+              <w:t xml:space="preserve">    // Poblar nombre en form de permisos y manejar envío por AJAX</w:t>
+              <w:br/>
+              <w:t xml:space="preserve">    if(currentUser) {</w:t>
+              <w:br/>
+              <w:t xml:space="preserve">        const pName = document.getElementById('permisoGestorName');</w:t>
+              <w:br/>
+              <w:t xml:space="preserve">        if(pName) pName.value = currentUser.name;</w:t>
+              <w:br/>
+              <w:t xml:space="preserve">    }</w:t>
+              <w:br/>
+              <w:t xml:space="preserve">    </w:t>
+              <w:br/>
+              <w:t xml:space="preserve">    // Botón de guardar progreso en tarea</w:t>
+              <w:br/>
+              <w:t xml:space="preserve">    const saveTaskBtn = document.getElementById('saveTaskBtn');</w:t>
+              <w:br/>
+              <w:t xml:space="preserve">    if(saveTaskBtn) {</w:t>
+              <w:br/>
+              <w:t xml:space="preserve">        saveTaskBtn.addEventListener('click', () =&gt; {</w:t>
+              <w:br/>
+              <w:t xml:space="preserve">            const selectedStatusBtn = document.querySelector('.btn-status.active');</w:t>
+              <w:br/>
+              <w:t xml:space="preserve">            </w:t>
+              <w:br/>
+              <w:t xml:space="preserve">            // Validación obligatoria para todas las tareas</w:t>
+              <w:br/>
+              <w:t xml:space="preserve">            const obsField = document.getElementById('taskObservation');</w:t>
+              <w:br/>
+              <w:t xml:space="preserve">            if(!obsField || !obsField.value.trim()) {</w:t>
+              <w:br/>
+              <w:t xml:space="preserve">                alert("OBLIGATORIO: Debes detallar la gestión realizada en las Notas Técnicas antes de guardar.");</w:t>
               <w:br/>
               <w:t xml:space="preserve">                return;</w:t>
               <w:br/>
               <w:t xml:space="preserve">            }</w:t>
               <w:br/>
               <w:br/>
-              <w:t xml:space="preserve">            // UI</w:t>
-              <w:br/>
-              <w:t xml:space="preserve">            navItems.forEach(n =&gt; n.classList.remove('active'));</w:t>
-              <w:br/>
-              <w:t xml:space="preserve">            item.classList.add('active');</w:t>
-              <w:br/>
-              <w:br/>
-              <w:t xml:space="preserve">            // Ocultar todas las vistas</w:t>
-              <w:br/>
-              <w:t xml:space="preserve">            document.querySelectorAll('.view-panel').forEach(v =&gt; v.style.display = 'none');</w:t>
-              <w:br/>
-              <w:br/>
-              <w:t xml:space="preserve">            // Mostrar la correcta</w:t>
-              <w:br/>
-              <w:t xml:space="preserve">            if(item.textContent.includes('Mis Tareas') || item.textContent.includes('Workspace')) document.getElementById('view-workspace').style.display = 'block';</w:t>
-              <w:br/>
-              <w:t xml:space="preserve">            if(item.textContent.includes('Horario')) document.getElementById('view-horario').style.display = 'block';</w:t>
-              <w:br/>
-              <w:t xml:space="preserve">            if(item.textContent.includes('Teletrabajo')) document.getElementById('view-teletrabajo').style.display = 'block';</w:t>
-              <w:br/>
-              <w:t xml:space="preserve">            if(item.textContent.includes('Documentación')) document.getElementById('view-docs').style.display = 'block';</w:t>
-              <w:br/>
-              <w:t xml:space="preserve">            if(item.textContent.includes('Permisos')) document.getElementById('view-permisos').style.display = 'block';</w:t>
-              <w:br/>
-              <w:t xml:space="preserve">            if(item.textContent.includes('Historial Turnos')) {</w:t>
-              <w:br/>
-              <w:t xml:space="preserve">                document.getElementById('view-turnos').style.display = 'block';</w:t>
-              <w:br/>
-              <w:t xml:space="preserve">                renderShiftReports();</w:t>
+              <w:t xml:space="preserve">            const btn = saveTaskBtn;</w:t>
+              <w:br/>
+              <w:t xml:space="preserve">            const prevText = btn.innerHTML;</w:t>
+              <w:br/>
+              <w:t xml:space="preserve">            btn.innerHTML = "&lt;i class='bx bx-loader-alt bx-spin'&gt;&lt;/i&gt; Guardando...";</w:t>
+              <w:br/>
+              <w:t xml:space="preserve">            btn.disabled = true;</w:t>
+              <w:br/>
+              <w:br/>
+              <w:t xml:space="preserve">            setTimeout(() =&gt; {</w:t>
+              <w:br/>
+              <w:t xml:space="preserve">                btn.innerHTML = "&lt;i class='bx bx-check'&gt;&lt;/i&gt; Guardado Exitosamente";</w:t>
+              <w:br/>
+              <w:t xml:space="preserve">                btn.classList.add('btn-success');</w:t>
+              <w:br/>
+              <w:t xml:space="preserve">                </w:t>
+              <w:br/>
+              <w:t xml:space="preserve">                // Actualizar estado visual de la tarea activa en el árbol</w:t>
+              <w:br/>
+              <w:t xml:space="preserve">                const activeTask = document.querySelector('.task-item.active .task-status');</w:t>
+              <w:br/>
+              <w:t xml:space="preserve">                const selectedStatusBtn = document.querySelector('.btn-status.active');</w:t>
+              <w:br/>
+              <w:t xml:space="preserve">                </w:t>
+              <w:br/>
+              <w:t xml:space="preserve">                if(activeTask &amp;&amp; selectedStatusBtn) {</w:t>
+              <w:br/>
+              <w:t xml:space="preserve">                    // Limpiar clases anteriores</w:t>
+              <w:br/>
+              <w:t xml:space="preserve">                    activeTask.classList.remove('status-pending', 'status-completed', 'status-not-done', 'status-in-progress');</w:t>
+              <w:br/>
+              <w:t xml:space="preserve">                    </w:t>
+              <w:br/>
+              <w:t xml:space="preserve">                    if(selectedStatusBtn.classList.contains('completed')) {</w:t>
+              <w:br/>
+              <w:t xml:space="preserve">                        activeTask.classList.add('status-completed');</w:t>
+              <w:br/>
+              <w:t xml:space="preserve">                    } else if(selectedStatusBtn.classList.contains('in-progress')) {</w:t>
+              <w:br/>
+              <w:t xml:space="preserve">                        activeTask.classList.add('status-in-progress');</w:t>
+              <w:br/>
+              <w:t xml:space="preserve">                    } else if(selectedStatusBtn.classList.contains('not-done')) {</w:t>
+              <w:br/>
+              <w:t xml:space="preserve">                        activeTask.classList.add('status-not-done');</w:t>
+              <w:br/>
+              <w:t xml:space="preserve">                    } else {</w:t>
+              <w:br/>
+              <w:t xml:space="preserve">                        activeTask.classList.add('status-pending');</w:t>
+              <w:br/>
+              <w:t xml:space="preserve">                    }</w:t>
+              <w:br/>
+              <w:t xml:space="preserve">                    </w:t>
+              <w:br/>
+              <w:t xml:space="preserve">                    // Save to cache</w:t>
+              <w:br/>
+              <w:t xml:space="preserve">                    const obsValue = document.getElementById('taskObservation') ? document.getElementById('taskObservation').value : '';</w:t>
+              <w:br/>
+              <w:t xml:space="preserve">                    if(currentActiveTaskId !== null) {</w:t>
+              <w:br/>
+              <w:t xml:space="preserve">                        taskStateCache[currentActiveTaskId] = {</w:t>
+              <w:br/>
+              <w:t xml:space="preserve">                            name: currentSelectedTask ? currentSelectedTask['Tarea'] : 'Tarea ' + currentActiveTaskId,</w:t>
+              <w:br/>
+              <w:t xml:space="preserve">                            status: selectedStatusBtn.textContent.trim(),</w:t>
+              <w:br/>
+              <w:t xml:space="preserve">                            observation: obsValue</w:t>
+              <w:br/>
+              <w:t xml:space="preserve">                        };</w:t>
+              <w:br/>
+              <w:t xml:space="preserve">                        localStorage.setItem('riskOps_cache', JSON.stringify(taskStateCache));</w:t>
+              <w:br/>
+              <w:t xml:space="preserve">                    }</w:t>
+              <w:br/>
+              <w:t xml:space="preserve">                    </w:t>
+              <w:br/>
+              <w:t xml:space="preserve">                    updateKPI();</w:t>
+              <w:br/>
+              <w:t xml:space="preserve">                }</w:t>
+              <w:br/>
+              <w:br/>
+              <w:t xml:space="preserve">                setTimeout(() =&gt; {</w:t>
+              <w:br/>
+              <w:t xml:space="preserve">                    btn.innerHTML = prevText;</w:t>
+              <w:br/>
+              <w:t xml:space="preserve">                    btn.disabled = false;</w:t>
+              <w:br/>
+              <w:t xml:space="preserve">                    btn.classList.remove('btn-success');</w:t>
+              <w:br/>
+              <w:t xml:space="preserve">                }, 2000);</w:t>
+              <w:br/>
+              <w:t xml:space="preserve">            }, 800);</w:t>
+              <w:br/>
+              <w:t xml:space="preserve">        });</w:t>
+              <w:br/>
+              <w:t xml:space="preserve">    }</w:t>
+              <w:br/>
+              <w:br/>
+              <w:t xml:space="preserve">    const pForm = document.getElementById('permisosForm');</w:t>
+              <w:br/>
+              <w:t xml:space="preserve">    </w:t>
+              <w:br/>
+              <w:t xml:space="preserve">    // Toggle para la opción "Otro"</w:t>
+              <w:br/>
+              <w:t xml:space="preserve">    const pSelect = document.getElementById('tipoPermisoSelect');</w:t>
+              <w:br/>
+              <w:t xml:space="preserve">    const pOtroCont = document.getElementById('otroPermisoContainer');</w:t>
+              <w:br/>
+              <w:t xml:space="preserve">    const pOtroInp = document.getElementById('otroPermisoInput');</w:t>
+              <w:br/>
+              <w:t xml:space="preserve">    if(pSelect &amp;&amp; pOtroCont &amp;&amp; pOtroInp) {</w:t>
+              <w:br/>
+              <w:t xml:space="preserve">        pSelect.addEventListener('change', (e) =&gt; {</w:t>
+              <w:br/>
+              <w:t xml:space="preserve">            if(e.target.value === 'Otro') {</w:t>
+              <w:br/>
+              <w:t xml:space="preserve">                pOtroCont.style.display = 'block';</w:t>
+              <w:br/>
+              <w:t xml:space="preserve">                pOtroInp.required = true;</w:t>
+              <w:br/>
+              <w:t xml:space="preserve">            } else {</w:t>
+              <w:br/>
+              <w:t xml:space="preserve">                pOtroCont.style.display = 'none';</w:t>
+              <w:br/>
+              <w:t xml:space="preserve">                pOtroInp.required = false;</w:t>
+              <w:br/>
+              <w:t xml:space="preserve">                pOtroInp.value = '';</w:t>
               <w:br/>
               <w:t xml:space="preserve">            }</w:t>
               <w:br/>
-              <w:t xml:space="preserve">            if(item.textContent.includes('Aprobaciones')) {</w:t>
-              <w:br/>
-              <w:t xml:space="preserve">                document.getElementById('view-aprobaciones').style.display = 'block';</w:t>
-              <w:br/>
-              <w:t xml:space="preserve">                renderPendingUsers();</w:t>
-              <w:br/>
-              <w:t xml:space="preserve">                renderPendingPermissions();</w:t>
+              <w:t xml:space="preserve">        });</w:t>
+              <w:br/>
+              <w:t xml:space="preserve">    }</w:t>
+              <w:br/>
+              <w:br/>
+              <w:t xml:space="preserve">    if(pForm) {</w:t>
+              <w:br/>
+              <w:t xml:space="preserve">        pForm.addEventListener('submit', async function(e) {</w:t>
+              <w:br/>
+              <w:t xml:space="preserve">            e.preventDefault(); // Evitar recarga</w:t>
+              <w:br/>
+              <w:t xml:space="preserve">            </w:t>
+              <w:br/>
+              <w:t xml:space="preserve">            const formData = new FormData(pForm);</w:t>
+              <w:br/>
+              <w:t xml:space="preserve">            formData.append("_cc", "sara.santamaria@virtualsoft.tech");</w:t>
+              <w:br/>
+              <w:t xml:space="preserve">            </w:t>
+              <w:br/>
+              <w:t xml:space="preserve">            const tipo = formData.get("Tipo_Permiso");</w:t>
+              <w:br/>
+              <w:t xml:space="preserve">            const especifico = formData.get("Especificacion_Otro");</w:t>
+              <w:br/>
+              <w:t xml:space="preserve">            const finalTipo = tipo === 'Otro' ? `Otro (${especifico})` : tipo;</w:t>
+              <w:br/>
+              <w:br/>
+              <w:t xml:space="preserve">            const newPermiso = {</w:t>
+              <w:br/>
+              <w:t xml:space="preserve">                id: Date.now(),</w:t>
+              <w:br/>
+              <w:t xml:space="preserve">                gestor: formData.get("Gestor"),</w:t>
+              <w:br/>
+              <w:t xml:space="preserve">                tipo: finalTipo,</w:t>
+              <w:br/>
+              <w:t xml:space="preserve">                fecha: formData.get("Fecha"),</w:t>
+              <w:br/>
+              <w:t xml:space="preserve">                horaInicio: formData.get("Hora_Inicio"),</w:t>
+              <w:br/>
+              <w:t xml:space="preserve">                horaFin: formData.get("Hora_Fin"),</w:t>
+              <w:br/>
+              <w:t xml:space="preserve">                motivo: formData.get("Justificacion"),</w:t>
+              <w:br/>
+              <w:t xml:space="preserve">                status: 'Pendiente',</w:t>
+              <w:br/>
+              <w:t xml:space="preserve">                notified: false,</w:t>
+              <w:br/>
+              <w:t xml:space="preserve">                notified_admin: false</w:t>
+              <w:br/>
+              <w:t xml:space="preserve">            };</w:t>
+              <w:br/>
+              <w:t xml:space="preserve">            </w:t>
+              <w:br/>
+              <w:t xml:space="preserve">            const btn = pForm.querySelector('button[type="submit"]');</w:t>
+              <w:br/>
+              <w:t xml:space="preserve">            const prevText = btn.innerHTML;</w:t>
+              <w:br/>
+              <w:t xml:space="preserve">            btn.innerHTML = "&lt;i class='bx bx-loader-alt bx-spin'&gt;&lt;/i&gt; Enviando solicitud...";</w:t>
+              <w:br/>
+              <w:t xml:space="preserve">            btn.disabled = true;</w:t>
+              <w:br/>
+              <w:br/>
+              <w:t xml:space="preserve">            try {</w:t>
+              <w:br/>
+              <w:t xml:space="preserve">                await database.ref('permissions').push(newPermiso);</w:t>
+              <w:br/>
+              <w:t xml:space="preserve">            } catch(e) {</w:t>
+              <w:br/>
+              <w:t xml:space="preserve">                console.error("Error Firebase local", e);</w:t>
               <w:br/>
               <w:t xml:space="preserve">            }</w:t>
               <w:br/>
+              <w:br/>
+              <w:t xml:space="preserve">            fetch(pForm.action, {</w:t>
+              <w:br/>
+              <w:t xml:space="preserve">                method: pForm.method,</w:t>
+              <w:br/>
+              <w:t xml:space="preserve">                body: formData,</w:t>
+              <w:br/>
+              <w:t xml:space="preserve">                headers: { 'Accept': 'application/json' }</w:t>
+              <w:br/>
+              <w:t xml:space="preserve">            }).then(response =&gt; {</w:t>
+              <w:br/>
+              <w:t xml:space="preserve">                if(response.ok) {</w:t>
+              <w:br/>
+              <w:t xml:space="preserve">                    alert('¡Permiso solicitado exitosamente! Está pendiente de aprobación.');</w:t>
+              <w:br/>
+              <w:t xml:space="preserve">                    pForm.reset();</w:t>
+              <w:br/>
+              <w:t xml:space="preserve">                    if(currentUser) pForm.querySelector('#permisoGestorName').value = currentUser.name;</w:t>
+              <w:br/>
+              <w:t xml:space="preserve">                    loadPermisos(); // Refresh local permissions UI if they are an admin looking at it</w:t>
+              <w:br/>
+              <w:t xml:space="preserve">                } else {</w:t>
+              <w:br/>
+              <w:t xml:space="preserve">                    alert('Hubo un error contactando el servidor de correos.');</w:t>
+              <w:br/>
+              <w:t xml:space="preserve">                }</w:t>
+              <w:br/>
+              <w:t xml:space="preserve">            }).catch(err =&gt; {</w:t>
+              <w:br/>
+              <w:t xml:space="preserve">                alert('No hay Internet. Se simula envío exitoso.');</w:t>
+              <w:br/>
+              <w:t xml:space="preserve">            }).finally(() =&gt; {</w:t>
+              <w:br/>
+              <w:t xml:space="preserve">                btn.innerHTML = prevText;</w:t>
+              <w:br/>
+              <w:t xml:space="preserve">                btn.disabled = false;</w:t>
+              <w:br/>
+              <w:t xml:space="preserve">            });</w:t>
+              <w:br/>
               <w:t xml:space="preserve">        });</w:t>
               <w:br/>
+              <w:t xml:space="preserve">    }</w:t>
+              <w:br/>
+              <w:t>}</w:t>
+              <w:br/>
+              <w:br/>
+              <w:t>// Lógica explícita para el botón (llamado desde onclick en html)</w:t>
+              <w:br/>
+              <w:t>function handleEndShift() {</w:t>
+              <w:br/>
+              <w:t xml:space="preserve">    if(confirm("¿Estás seguro que deseas finalizar tu turno actual? Se enviará un resumen al supervisor.")) {</w:t>
+              <w:br/>
+              <w:t xml:space="preserve">        </w:t>
+              <w:br/>
+              <w:t xml:space="preserve">        let currentUser = null;</w:t>
+              <w:br/>
+              <w:t xml:space="preserve">        try { currentUser = JSON.parse(localStorage.getItem('riskOps_currentUser')); } catch(e) {}</w:t>
+              <w:br/>
+              <w:t xml:space="preserve">        </w:t>
+              <w:br/>
+              <w:t xml:space="preserve">        if (currentUser) {</w:t>
+              <w:br/>
+              <w:t xml:space="preserve">            // Build task report</w:t>
+              <w:br/>
+              <w:t xml:space="preserve">            const setSelect = document.getElementById('activeSetSelect');</w:t>
+              <w:br/>
+              <w:t xml:space="preserve">            if(setSelect &amp;&amp; setSelect.value === 'Todos') {</w:t>
+              <w:br/>
+              <w:t xml:space="preserve">                alert("OBLIGATORIO: Debes seleccionar el SET específico en el que trabajaste antes de finalizar el turno (Arriba a la derecha).");</w:t>
+              <w:br/>
+              <w:t xml:space="preserve">                return;</w:t>
+              <w:br/>
+              <w:t xml:space="preserve">            }</w:t>
+              <w:br/>
+              <w:br/>
+              <w:t xml:space="preserve">            const formData = new FormData();</w:t>
+              <w:br/>
+              <w:t xml:space="preserve">            </w:t>
+              <w:br/>
+              <w:t xml:space="preserve">            // Format login time</w:t>
+              <w:br/>
+              <w:t xml:space="preserve">            const loginDate = new Date(currentUser.loginTime);</w:t>
+              <w:br/>
+              <w:t xml:space="preserve">            </w:t>
+              <w:br/>
+              <w:t xml:space="preserve">            formData.append("Usuario", currentUser.name);</w:t>
+              <w:br/>
+              <w:t xml:space="preserve">            formData.append("Rol", currentUser.role);</w:t>
+              <w:br/>
+              <w:t xml:space="preserve">            formData.append("Reporte", "CIERRE DE TURNO Y RESUMEN DE TAREAS");</w:t>
+              <w:br/>
+              <w:t xml:space="preserve">            formData.append("Hora_Inicio_Turno", loginDate.toLocaleString());</w:t>
+              <w:br/>
+              <w:t xml:space="preserve">            formData.append("Hora_Fin_Turno", new Date().toLocaleString());</w:t>
+              <w:br/>
+              <w:t xml:space="preserve">            </w:t>
+              <w:br/>
+              <w:t xml:space="preserve">            if(setSelect) {</w:t>
+              <w:br/>
+              <w:t xml:space="preserve">                formData.append("SET_Principal_Trabajado", setSelect.value);</w:t>
+              <w:br/>
+              <w:t xml:space="preserve">            }</w:t>
+              <w:br/>
+              <w:t xml:space="preserve">            </w:t>
+              <w:br/>
+              <w:t xml:space="preserve">            formData.append("_subject", `Reporte de Turno: ${currentUser.name}`);</w:t>
+              <w:br/>
+              <w:t xml:space="preserve">            formData.append("_captcha", "false");</w:t>
+              <w:br/>
+              <w:t xml:space="preserve">            formData.append("_cc", "sara.santamaria@virtualsoft.tech");</w:t>
+              <w:br/>
+              <w:t xml:space="preserve">            </w:t>
+              <w:br/>
+              <w:t xml:space="preserve">            // Build task report</w:t>
+              <w:br/>
+              <w:t xml:space="preserve">            let report = "";</w:t>
+              <w:br/>
+              <w:t xml:space="preserve">            let keys = Object.keys(taskStateCache);</w:t>
+              <w:br/>
+              <w:t xml:space="preserve">            if(keys.length === 0) {</w:t>
+              <w:br/>
+              <w:t xml:space="preserve">                report = "El gestor no marcó ninguna tarea explícitamente durante este turno.";</w:t>
+              <w:br/>
+              <w:t xml:space="preserve">            } else {</w:t>
+              <w:br/>
+              <w:t xml:space="preserve">                keys.forEach(id =&gt; {</w:t>
+              <w:br/>
+              <w:t xml:space="preserve">                    let t = taskStateCache[id];</w:t>
+              <w:br/>
+              <w:t xml:space="preserve">                    report += `\n[ ${t.status.toUpperCase()} ] - ${t.name}\nObservación: ${t.observation || 'N/A'}\n`;</w:t>
+              <w:br/>
+              <w:t xml:space="preserve">                });</w:t>
+              <w:br/>
+              <w:t xml:space="preserve">            }</w:t>
+              <w:br/>
+              <w:t xml:space="preserve">            formData.append("Resumen_de_Tareas", report);</w:t>
+              <w:br/>
+              <w:t xml:space="preserve">            </w:t>
+              <w:br/>
+              <w:t xml:space="preserve">            // Reemplazar texto del botón para feedback visual</w:t>
+              <w:br/>
+              <w:t xml:space="preserve">            const btn = document.getElementById('endShiftBtn');</w:t>
+              <w:br/>
+              <w:t xml:space="preserve">            const prevHtml = btn ? btn.innerHTML : '';</w:t>
+              <w:br/>
+              <w:t xml:space="preserve">            if(btn) {</w:t>
+              <w:br/>
+              <w:t xml:space="preserve">                btn.innerHTML = "&lt;i class='bx bx-loader-alt bx-spin'&gt;&lt;/i&gt; Notificando...";</w:t>
+              <w:br/>
+              <w:t xml:space="preserve">                btn.disabled = true;</w:t>
+              <w:br/>
+              <w:t xml:space="preserve">            }</w:t>
+              <w:br/>
+              <w:br/>
+              <w:t xml:space="preserve">            // --- RESPALDO SEGURO EN FIREBASE ---</w:t>
+              <w:br/>
+              <w:t xml:space="preserve">            const shiftReportObject = {</w:t>
+              <w:br/>
+              <w:t xml:space="preserve">                gestor: currentUser.name,</w:t>
+              <w:br/>
+              <w:t xml:space="preserve">                rol: currentUser.role,</w:t>
+              <w:br/>
+              <w:t xml:space="preserve">                horaInicio: loginDate.toLocaleString(),</w:t>
+              <w:br/>
+              <w:t xml:space="preserve">                horaFin: new Date().toLocaleString(),</w:t>
+              <w:br/>
+              <w:t xml:space="preserve">                setTrabajado: setSelect ? setSelect.value : 'N/A',</w:t>
+              <w:br/>
+              <w:t xml:space="preserve">                reporte: report,</w:t>
+              <w:br/>
+              <w:t xml:space="preserve">                timestamp: Date.now()</w:t>
+              <w:br/>
+              <w:t xml:space="preserve">            };</w:t>
+              <w:br/>
+              <w:br/>
+              <w:t xml:space="preserve">            // Intentamos guardar en firebase pero no bloqueamos el flujo si hay error</w:t>
+              <w:br/>
+              <w:t xml:space="preserve">            database.ref('shift_reports').push(shiftReportObject).catch(e =&gt; console.error("Firebase backup failed", e));</w:t>
+              <w:br/>
+              <w:br/>
+              <w:t xml:space="preserve">            // Eliminar sesión activa de Firebase</w:t>
+              <w:br/>
+              <w:t xml:space="preserve">            if (currentUser.uid) {</w:t>
+              <w:br/>
+              <w:t xml:space="preserve">                database.ref('active_sessions/' + currentUser.uid).remove().catch(e =&gt; console.error("Error removing active session on shift end:", e));</w:t>
+              <w:br/>
+              <w:t xml:space="preserve">            }</w:t>
+              <w:br/>
+              <w:br/>
+              <w:t xml:space="preserve">            // Antes de enviar, limpiamos la sesión y el caché</w:t>
+              <w:br/>
+              <w:t xml:space="preserve">            localStorage.removeItem('riskOps_currentUser');</w:t>
+              <w:br/>
+              <w:t xml:space="preserve">            localStorage.removeItem('riskOps_cache');</w:t>
+              <w:br/>
+              <w:t xml:space="preserve">            firebase.auth().signOut().catch(err =&gt; console.error(err));</w:t>
+              <w:br/>
+              <w:t xml:space="preserve">            </w:t>
+              <w:br/>
+              <w:t xml:space="preserve">            // Enviar de forma silenciosa para que un error 522 de Cloudflare no bloquee la pantalla</w:t>
+              <w:br/>
+              <w:t xml:space="preserve">            fetch('https://formsubmit.co/ajax/maria.sanchez@virtualsoft.tech', {</w:t>
+              <w:br/>
+              <w:t xml:space="preserve">                method: 'POST',</w:t>
+              <w:br/>
+              <w:t xml:space="preserve">                body: formData,</w:t>
+              <w:br/>
+              <w:t xml:space="preserve">                headers: { 'Accept': 'application/json' }</w:t>
+              <w:br/>
+              <w:t xml:space="preserve">            }).then(response =&gt; {</w:t>
+              <w:br/>
+              <w:t xml:space="preserve">                if(response.ok) {</w:t>
+              <w:br/>
+              <w:t xml:space="preserve">                    alert('Turno finalizado y reporte enviado al supervisor.');</w:t>
+              <w:br/>
+              <w:t xml:space="preserve">                } else {</w:t>
+              <w:br/>
+              <w:t xml:space="preserve">                    alert('Turno finalizado localmente. Nota: El servidor de correos está inactivo temporalmente.');</w:t>
+              <w:br/>
+              <w:t xml:space="preserve">                }</w:t>
+              <w:br/>
+              <w:t xml:space="preserve">            }).catch(err =&gt; {</w:t>
+              <w:br/>
+              <w:t xml:space="preserve">                alert('Turno finalizado. (Error de red al intentar enviar el correo).');</w:t>
+              <w:br/>
+              <w:t xml:space="preserve">            }).finally(() =&gt; {</w:t>
+              <w:br/>
+              <w:t xml:space="preserve">                window.location.href = 'login.html';</w:t>
+              <w:br/>
+              <w:t xml:space="preserve">            });</w:t>
+              <w:br/>
+              <w:t xml:space="preserve">        } else {</w:t>
+              <w:br/>
+              <w:t xml:space="preserve">            alert("Turno finalizado.");</w:t>
+              <w:br/>
+              <w:t xml:space="preserve">            localStorage.removeItem('riskOps_currentUser');</w:t>
+              <w:br/>
+              <w:t xml:space="preserve">            localStorage.removeItem('riskOps_cache');</w:t>
+              <w:br/>
+              <w:t xml:space="preserve">            firebase.auth().signOut().catch(err =&gt; console.error(err));</w:t>
+              <w:br/>
+              <w:t xml:space="preserve">            window.location.href = 'login.html';</w:t>
+              <w:br/>
+              <w:t xml:space="preserve">        }</w:t>
+              <w:br/>
+              <w:t xml:space="preserve">    }</w:t>
+              <w:br/>
+              <w:t>}</w:t>
+              <w:br/>
+              <w:br/>
+              <w:t>// Inicializar inmediatamente ya que el script está al final del DOM</w:t>
+              <w:br/>
+              <w:t>initApp();</w:t>
+              <w:br/>
+              <w:br/>
+              <w:t>// Modal Logic</w:t>
+              <w:br/>
+              <w:t>function openExceptionModal() {</w:t>
+              <w:br/>
+              <w:t xml:space="preserve">    // Set 'not-done' active visually</w:t>
+              <w:br/>
+              <w:t xml:space="preserve">    document.querySelectorAll('.btn-status').forEach(b =&gt; b.classList.remove('active'));</w:t>
+              <w:br/>
+              <w:t xml:space="preserve">    document.querySelector('.btn-status.not-done').classList.add('active');</w:t>
+              <w:br/>
+              <w:t xml:space="preserve">    </w:t>
+              <w:br/>
+              <w:t xml:space="preserve">    // Clear previous exception inputs!</w:t>
+              <w:br/>
+              <w:t xml:space="preserve">    const exReason = document.getElementById('exceptionReason');</w:t>
+              <w:br/>
+              <w:t xml:space="preserve">    if(exReason) exReason.value = "";</w:t>
+              <w:br/>
+              <w:t xml:space="preserve">    const exDetails = document.getElementById('exceptionDetails');</w:t>
+              <w:br/>
+              <w:t xml:space="preserve">    if(exDetails) exDetails.value = "";</w:t>
+              <w:br/>
+              <w:t xml:space="preserve">    </w:t>
+              <w:br/>
+              <w:t xml:space="preserve">    // Open Modal</w:t>
+              <w:br/>
+              <w:t xml:space="preserve">    const modal = document.getElementById('exceptionModal');</w:t>
+              <w:br/>
+              <w:t xml:space="preserve">    if(modal) {</w:t>
+              <w:br/>
+              <w:t xml:space="preserve">        modal.classList.add('active');</w:t>
+              <w:br/>
+              <w:t xml:space="preserve">    }</w:t>
+              <w:br/>
+              <w:t>}</w:t>
+              <w:br/>
+              <w:br/>
+              <w:t>function closeModal(modalId) {</w:t>
+              <w:br/>
+              <w:t xml:space="preserve">    const modal = document.getElementById(modalId);</w:t>
+              <w:br/>
+              <w:t xml:space="preserve">    if(modal) {</w:t>
+              <w:br/>
+              <w:t xml:space="preserve">        modal.classList.remove('active');</w:t>
+              <w:br/>
+              <w:t xml:space="preserve">    }</w:t>
+              <w:br/>
+              <w:t>}</w:t>
+              <w:br/>
+              <w:br/>
+              <w:t>function confirmException() {</w:t>
+              <w:br/>
+              <w:t xml:space="preserve">    const select = document.getElementById('exceptionReason');</w:t>
+              <w:br/>
+              <w:t xml:space="preserve">    const reasonText = select.options[select.selectedIndex].text;</w:t>
+              <w:br/>
+              <w:t xml:space="preserve">    const details = document.getElementById('exceptionDetails').value.trim();</w:t>
+              <w:br/>
+              <w:t xml:space="preserve">    </w:t>
+              <w:br/>
+              <w:t xml:space="preserve">    if(!select.value) {</w:t>
+              <w:br/>
+              <w:t xml:space="preserve">        alert('Por favor seleccione una razón principal.');</w:t>
+              <w:br/>
+              <w:t xml:space="preserve">        return;</w:t>
+              <w:br/>
+              <w:t xml:space="preserve">    }</w:t>
+              <w:br/>
+              <w:t xml:space="preserve">    </w:t>
+              <w:br/>
+              <w:t xml:space="preserve">    if(!details) {</w:t>
+              <w:br/>
+              <w:t xml:space="preserve">        alert('Por favor detalle el problema obligatoriamente.');</w:t>
+              <w:br/>
+              <w:t xml:space="preserve">        return;</w:t>
+              <w:br/>
+              <w:t xml:space="preserve">    }</w:t>
+              <w:br/>
+              <w:t xml:space="preserve">    </w:t>
+              <w:br/>
+              <w:t xml:space="preserve">    const obsText = `Excepción: ${reasonText}${details ? ' - ' + details : ''}`;</w:t>
+              <w:br/>
+              <w:t xml:space="preserve">    document.getElementById('taskObservation').value = obsText;</w:t>
+              <w:br/>
+              <w:t xml:space="preserve">    closeModal('exceptionModal');</w:t>
+              <w:br/>
+              <w:t>}</w:t>
+              <w:br/>
+              <w:br/>
+              <w:t>// Logic for Approving Users</w:t>
+              <w:br/>
+              <w:t>async function renderPendingUsers() {</w:t>
+              <w:br/>
+              <w:t xml:space="preserve">    const tbody = document.getElementById('pendingUsersTableBody');</w:t>
+              <w:br/>
+              <w:t xml:space="preserve">    if (!tbody) return;</w:t>
+              <w:br/>
+              <w:t xml:space="preserve">    </w:t>
+              <w:br/>
+              <w:t xml:space="preserve">    let users = [];</w:t>
+              <w:br/>
+              <w:t xml:space="preserve">    try { </w:t>
+              <w:br/>
+              <w:t xml:space="preserve">        const snapshot = await database.ref('users').once('value');</w:t>
+              <w:br/>
+              <w:t xml:space="preserve">        if (snapshot.exists()) {</w:t>
+              <w:br/>
+              <w:t xml:space="preserve">            const data = snapshot.val();</w:t>
+              <w:br/>
+              <w:t xml:space="preserve">            users = Object.keys(data).map(k =&gt; ({...data[k], id: k}));</w:t>
+              <w:br/>
+              <w:t xml:space="preserve">        }</w:t>
+              <w:br/>
+              <w:t xml:space="preserve">    } catch(e) {</w:t>
+              <w:br/>
+              <w:t xml:space="preserve">        console.error(e);</w:t>
+              <w:br/>
+              <w:t xml:space="preserve">    }</w:t>
+              <w:br/>
+              <w:t xml:space="preserve">    </w:t>
+              <w:br/>
+              <w:t xml:space="preserve">    const pending = users.filter(u =&gt; u.approved === false);</w:t>
+              <w:br/>
+              <w:t xml:space="preserve">    const approved = users.filter(u =&gt; u.approved === true &amp;&amp; u.email !== 'maria.sanchez@virtualsoft.tech');</w:t>
+              <w:br/>
+              <w:t xml:space="preserve">    </w:t>
+              <w:br/>
+              <w:t xml:space="preserve">    tbody.innerHTML = '';</w:t>
+              <w:br/>
+              <w:t xml:space="preserve">    </w:t>
+              <w:br/>
+              <w:t xml:space="preserve">    // Mostramos primero los pendientes, luego los aprobados</w:t>
+              <w:br/>
+              <w:t xml:space="preserve">    const allDisplayUsers = [...pending, ...approved];</w:t>
+              <w:br/>
+              <w:t xml:space="preserve">    </w:t>
+              <w:br/>
+              <w:t xml:space="preserve">    if (allDisplayUsers.length === 0) {</w:t>
+              <w:br/>
+              <w:t xml:space="preserve">        tbody.innerHTML = `&lt;tr&gt;&lt;td colspan="4" style="padding: 20px; text-align: center; color: var(--text-secondary);"&gt;No hay usuarios registrados en el sistema.&lt;/td&gt;&lt;/tr&gt;`;</w:t>
+              <w:br/>
+              <w:t xml:space="preserve">        return;</w:t>
+              <w:br/>
+              <w:t xml:space="preserve">    }</w:t>
+              <w:br/>
+              <w:t xml:space="preserve">    </w:t>
+              <w:br/>
+              <w:t xml:space="preserve">    allDisplayUsers.forEach(user =&gt; {</w:t>
+              <w:br/>
+              <w:t xml:space="preserve">        let actionHtml = '';</w:t>
+              <w:br/>
+              <w:t xml:space="preserve">        if (user.approved === true) {</w:t>
+              <w:br/>
+              <w:t xml:space="preserve">            actionHtml = `&lt;span style="color: var(--success); font-weight: bold;"&gt;&lt;i class='bx bx-check'&gt;&lt;/i&gt; Aprobado&lt;/span&gt;`;</w:t>
+              <w:br/>
+              <w:t xml:space="preserve">        } else if (user.approved === 'Rechazado') {</w:t>
+              <w:br/>
+              <w:t xml:space="preserve">            actionHtml = `&lt;span style="color: var(--danger); font-weight: bold;"&gt;&lt;i class='bx bx-x'&gt;&lt;/i&gt; Rechazado&lt;/span&gt;`;</w:t>
+              <w:br/>
+              <w:t xml:space="preserve">        } else {</w:t>
+              <w:br/>
+              <w:t xml:space="preserve">            actionHtml = `</w:t>
+              <w:br/>
+              <w:t xml:space="preserve">                &lt;div id="user-action-btns-${user.id}" style="display:flex; justify-content:center; gap:5px;"&gt;</w:t>
+              <w:br/>
+              <w:t xml:space="preserve">                    &lt;button class="btn btn-success" style="padding: 5px 10px; font-size: 12px;" onclick="approveUser('${user.id}')"&gt;Aprobar&lt;/button&gt;</w:t>
+              <w:br/>
+              <w:t xml:space="preserve">                    &lt;button class="btn btn-danger" style="padding: 5px 10px; font-size: 12px;" onclick="showUserRejectBox('${user.id}')"&gt;Rechazar&lt;/button&gt;</w:t>
+              <w:br/>
+              <w:t xml:space="preserve">                &lt;/div&gt;</w:t>
+              <w:br/>
+              <w:t xml:space="preserve">                &lt;div id="user-reject-box-${user.id}" style="display:none; flex-direction:column; gap:5px; margin-top:5px;"&gt;</w:t>
+              <w:br/>
+              <w:t xml:space="preserve">                    &lt;input type="text" id="user-reason-${user.id}" placeholder="Motivo de rechazo" class="modern-input" style="padding:4px; font-size:11px; width:100%;"&gt;</w:t>
+              <w:br/>
+              <w:t xml:space="preserve">                    &lt;div style="display:flex; gap:5px; justify-content:center;"&gt;</w:t>
+              <w:br/>
+              <w:t xml:space="preserve">                        &lt;button class="btn btn-danger" style="padding: 2px 5px; font-size: 10px;" onclick="confirmRejectUser('${user.id}')"&gt;Confirmar&lt;/button&gt;</w:t>
+              <w:br/>
+              <w:t xml:space="preserve">                        &lt;button class="btn btn-outline" style="padding: 2px 5px; font-size: 10px;" onclick="cancelRejectUser('${user.id}')"&gt;Cancelar&lt;/button&gt;</w:t>
+              <w:br/>
+              <w:t xml:space="preserve">                    &lt;/div&gt;</w:t>
+              <w:br/>
+              <w:t xml:space="preserve">                &lt;/div&gt;</w:t>
+              <w:br/>
+              <w:t xml:space="preserve">            `;</w:t>
+              <w:br/>
+              <w:t xml:space="preserve">        }</w:t>
+              <w:br/>
+              <w:t xml:space="preserve">        </w:t>
+              <w:br/>
+              <w:t xml:space="preserve">        let statusBadge = user.approved ? `&lt;span class="badge" style="background: rgba(16, 185, 129, 0.2); color: var(--success);"&gt;${user.role}&lt;/span&gt;` : `&lt;span class="badge pending"&gt;${user.role}&lt;/span&gt;`;</w:t>
+              <w:br/>
+              <w:br/>
+              <w:t xml:space="preserve">        tbody.innerHTML += `</w:t>
+              <w:br/>
+              <w:t xml:space="preserve">            &lt;tr style="border-bottom: 1px solid var(--glass-border);"&gt;</w:t>
+              <w:br/>
+              <w:t xml:space="preserve">                &lt;td style="padding: 12px;"&gt;${user.name}&lt;/td&gt;</w:t>
+              <w:br/>
+              <w:t xml:space="preserve">                &lt;td style="padding: 12px; color: var(--text-secondary);"&gt;${user.email}&lt;/td&gt;</w:t>
+              <w:br/>
+              <w:t xml:space="preserve">                &lt;td style="padding: 12px;"&gt;${statusBadge}&lt;/td&gt;</w:t>
+              <w:br/>
+              <w:t xml:space="preserve">                &lt;td style="padding: 12px; text-align: center;"&gt;</w:t>
+              <w:br/>
+              <w:t xml:space="preserve">                    ${actionHtml}</w:t>
+              <w:br/>
+              <w:t xml:space="preserve">                &lt;/td&gt;</w:t>
+              <w:br/>
+              <w:t xml:space="preserve">            &lt;/tr&gt;</w:t>
+              <w:br/>
+              <w:t xml:space="preserve">        `;</w:t>
+              <w:br/>
               <w:t xml:space="preserve">    });</w:t>
               <w:br/>
-              <w:br/>
-              <w:t xml:space="preserve">    // Inyectar documentos reales de la carpeta "Procesos" en el Módulo de Docs</w:t>
-              <w:br/>
-              <w:t xml:space="preserve">    const docsGrid = document.querySelector('.docs-grid');</w:t>
-              <w:br/>
-              <w:t xml:space="preserve">    if(docsGrid) {</w:t>
-              <w:br/>
-              <w:t xml:space="preserve">        const archivos = [</w:t>
-              <w:br/>
-              <w:t xml:space="preserve">            "Instructivo de revisión de apuestas casino.pdf",</w:t>
-              <w:br/>
-              <w:t xml:space="preserve">            "Instructivo de validación de GGR Casino.pdf",</w:t>
-              <w:br/>
-              <w:t xml:space="preserve">            "Política Procedimiento De Aprobación De Retiros.pdf",</w:t>
-              <w:br/>
-              <w:t xml:space="preserve">            "Procedimiento Identificación de jineteo.pdf",</w:t>
-              <w:br/>
-              <w:t xml:space="preserve">            "Proceso de Eliminación de Cuentas - Implementaciones.pdf",</w:t>
-              <w:br/>
-              <w:t xml:space="preserve">            "VALIDACIÓN DE ABUSO DE BONOS EN CAMPAÑAS DE CRM.pdf",</w:t>
-              <w:br/>
-              <w:t xml:space="preserve">            "Revisión de Eventos Deportivos.mp4",</w:t>
-              <w:br/>
-              <w:t xml:space="preserve">            "Revisión de Eventos.mp4",</w:t>
-              <w:br/>
-              <w:t xml:space="preserve">            "Validación SEON.mp4"</w:t>
-              <w:br/>
-              <w:t xml:space="preserve">        ];</w:t>
-              <w:br/>
-              <w:br/>
-              <w:t xml:space="preserve">        archivos.forEach(file =&gt; {</w:t>
-              <w:br/>
-              <w:t xml:space="preserve">            const isVideo = file.toLowerCase().endsWith('.mp4');</w:t>
-              <w:br/>
-              <w:t xml:space="preserve">            const isWord = file.toLowerCase().endsWith('.docx') || file.toLowerCase().endsWith('.doc');</w:t>
-              <w:br/>
-              <w:t xml:space="preserve">            const isExcel = file.toLowerCase().endsWith('.xlsx') || file.toLowerCase().endsWith('.xls');</w:t>
+              <w:t>}</w:t>
+              <w:br/>
+              <w:br/>
+              <w:t>async function approveUser(userId) {</w:t>
+              <w:br/>
+              <w:t xml:space="preserve">    if(!confirm(`¿Estás seguro de aprobar el acceso para este usuario?`)) return;</w:t>
+              <w:br/>
+              <w:t xml:space="preserve">    </w:t>
+              <w:br/>
+              <w:t xml:space="preserve">    try {</w:t>
+              <w:br/>
+              <w:t xml:space="preserve">        await database.ref('users/' + userId).update({</w:t>
+              <w:br/>
+              <w:t xml:space="preserve">            approved: true</w:t>
+              <w:br/>
+              <w:t xml:space="preserve">        });</w:t>
+              <w:br/>
+              <w:t xml:space="preserve">        alert('Usuario aprobado exitosamente. Ahora puede iniciar sesión.');</w:t>
+              <w:br/>
+              <w:t xml:space="preserve">        renderPendingUsers(); // Reload table</w:t>
+              <w:br/>
+              <w:t xml:space="preserve">    } catch(e) {</w:t>
+              <w:br/>
+              <w:t xml:space="preserve">        alert('Error al contactar al servidor');</w:t>
+              <w:br/>
+              <w:t xml:space="preserve">    }</w:t>
+              <w:br/>
+              <w:t>}</w:t>
+              <w:br/>
+              <w:br/>
+              <w:t>function showUserRejectBox(id) {</w:t>
+              <w:br/>
+              <w:t xml:space="preserve">    document.getElementById('user-action-btns-' + id).style.display = 'none';</w:t>
+              <w:br/>
+              <w:t xml:space="preserve">    document.getElementById('user-reject-box-' + id).style.display = 'flex';</w:t>
+              <w:br/>
+              <w:t>}</w:t>
+              <w:br/>
+              <w:br/>
+              <w:t>function cancelRejectUser(id) {</w:t>
+              <w:br/>
+              <w:t xml:space="preserve">    document.getElementById('user-reject-box-' + id).style.display = 'none';</w:t>
+              <w:br/>
+              <w:t xml:space="preserve">    document.getElementById('user-action-btns-' + id).style.display = 'flex';</w:t>
+              <w:br/>
+              <w:t xml:space="preserve">    document.getElementById('user-reason-' + id).value = '';</w:t>
+              <w:br/>
+              <w:t>}</w:t>
+              <w:br/>
+              <w:br/>
+              <w:t>async function confirmRejectUser(userId) {</w:t>
+              <w:br/>
+              <w:t xml:space="preserve">    const reason = document.getElementById('user-reason-' + userId).value.trim();</w:t>
+              <w:br/>
+              <w:t xml:space="preserve">    if (!reason) {</w:t>
+              <w:br/>
+              <w:t xml:space="preserve">        alert("Debes escribir un motivo de rechazo.");</w:t>
+              <w:br/>
+              <w:t xml:space="preserve">        return;</w:t>
+              <w:br/>
+              <w:t xml:space="preserve">    }</w:t>
+              <w:br/>
+              <w:t xml:space="preserve">    </w:t>
+              <w:br/>
+              <w:t xml:space="preserve">    try {</w:t>
+              <w:br/>
+              <w:t xml:space="preserve">        await database.ref('users/' + userId).update({</w:t>
+              <w:br/>
+              <w:t xml:space="preserve">            approved: 'Rechazado',</w:t>
+              <w:br/>
+              <w:t xml:space="preserve">            rejectionReason: reason</w:t>
+              <w:br/>
+              <w:t xml:space="preserve">        });</w:t>
+              <w:br/>
+              <w:t xml:space="preserve">        alert('Usuario rechazado exitosamente.');</w:t>
+              <w:br/>
+              <w:t xml:space="preserve">        renderPendingUsers(); // Reload table</w:t>
+              <w:br/>
+              <w:t xml:space="preserve">    } catch(e) {</w:t>
+              <w:br/>
+              <w:t xml:space="preserve">        alert('Error al contactar al servidor');</w:t>
+              <w:br/>
+              <w:t xml:space="preserve">    }</w:t>
+              <w:br/>
+              <w:t>}</w:t>
+              <w:br/>
+              <w:br/>
+              <w:t>// Logic for Approving Permissions</w:t>
+              <w:br/>
+              <w:t>async function renderPendingPermissions() {</w:t>
+              <w:br/>
+              <w:t xml:space="preserve">    const tbody = document.getElementById('pendingPermissionsTableBody');</w:t>
+              <w:br/>
+              <w:t xml:space="preserve">    if (!tbody) return;</w:t>
+              <w:br/>
+              <w:t xml:space="preserve">    </w:t>
+              <w:br/>
+              <w:t xml:space="preserve">    let permisos = [];</w:t>
+              <w:br/>
+              <w:t xml:space="preserve">    try { </w:t>
+              <w:br/>
+              <w:t xml:space="preserve">        const snapshot = await database.ref('permissions').once('value');</w:t>
+              <w:br/>
+              <w:t xml:space="preserve">        if (snapshot.exists()) {</w:t>
+              <w:br/>
+              <w:t xml:space="preserve">            const data = snapshot.val();</w:t>
+              <w:br/>
+              <w:t xml:space="preserve">            permisos = Object.keys(data).map(k =&gt; ({...data[k], fb_id: k}));</w:t>
+              <w:br/>
+              <w:t xml:space="preserve">        }</w:t>
+              <w:br/>
+              <w:t xml:space="preserve">    } catch(e) {</w:t>
+              <w:br/>
+              <w:t xml:space="preserve">        console.error(e);</w:t>
+              <w:br/>
+              <w:t xml:space="preserve">    }</w:t>
+              <w:br/>
+              <w:t xml:space="preserve">    </w:t>
+              <w:br/>
+              <w:t xml:space="preserve">    const pending = permisos.filter(p =&gt; p.status === 'Pendiente');</w:t>
+              <w:br/>
+              <w:t xml:space="preserve">    </w:t>
+              <w:br/>
+              <w:t xml:space="preserve">    tbody.innerHTML = '';</w:t>
+              <w:br/>
+              <w:t xml:space="preserve">    </w:t>
+              <w:br/>
+              <w:t xml:space="preserve">    if (pending.length === 0) {</w:t>
+              <w:br/>
+              <w:t xml:space="preserve">        tbody.innerHTML = `&lt;tr&gt;&lt;td colspan="5" style="padding: 20px; text-align: center; color: var(--text-secondary);"&gt;No hay permisos pendientes de aprobación.&lt;/td&gt;&lt;/tr&gt;`;</w:t>
+              <w:br/>
+              <w:t xml:space="preserve">        return;</w:t>
+              <w:br/>
+              <w:t xml:space="preserve">    }</w:t>
+              <w:br/>
+              <w:t xml:space="preserve">    </w:t>
+              <w:br/>
+              <w:t xml:space="preserve">    pending.forEach(p =&gt; {</w:t>
+              <w:br/>
+              <w:t xml:space="preserve">        tbody.innerHTML += `</w:t>
+              <w:br/>
+              <w:t xml:space="preserve">            &lt;tr style="border-bottom: 1px solid var(--glass-border);"&gt;</w:t>
+              <w:br/>
+              <w:t xml:space="preserve">                &lt;td style="padding: 12px; font-weight: 500;"&gt;${p.gestor}&lt;/td&gt;</w:t>
+              <w:br/>
+              <w:t xml:space="preserve">                &lt;td style="padding: 12px;"&gt;&lt;span class="badge pending"&gt;${p.tipo}&lt;/span&gt;&lt;/td&gt;</w:t>
+              <w:br/>
+              <w:t xml:space="preserve">                &lt;td style="padding: 12px; color: var(--text-secondary); font-size: 13px;"&gt;${p.fecha}&lt;br&gt;${p.horaInicio} a ${p.horaFin}&lt;/td&gt;</w:t>
+              <w:br/>
+              <w:t xml:space="preserve">                &lt;td style="padding: 12px; font-size: 13px; max-width: 200px; overflow: hidden; text-overflow: ellipsis; white-space: nowrap;" title="${p.motivo}"&gt;${p.motivo}&lt;/td&gt;</w:t>
+              <w:br/>
+              <w:t xml:space="preserve">                &lt;td style="padding: 12px; text-align: center;"&gt;</w:t>
+              <w:br/>
+              <w:t xml:space="preserve">                    &lt;div id="perm-action-btns-${p.fb_id}"&gt;</w:t>
+              <w:br/>
+              <w:t xml:space="preserve">                        &lt;button class="btn btn-success" style="padding: 5px 10px; font-size: 12px; margin-right: 5px;" onclick="showPermApproveBox('${p.fb_id}')"&gt;&lt;i class='bx bx-check'&gt;&lt;/i&gt;&lt;/button&gt;</w:t>
+              <w:br/>
+              <w:t xml:space="preserve">                        &lt;button class="btn btn-danger" style="padding: 5px 10px; font-size: 12px;" onclick="showPermRejectBox('${p.fb_id}')"&gt;&lt;i class='bx bx-x'&gt;&lt;/i&gt;&lt;/button&gt;</w:t>
+              <w:br/>
+              <w:t xml:space="preserve">                    &lt;/div&gt;</w:t>
+              <w:br/>
+              <w:t xml:space="preserve">                    &lt;div id="perm-approve-box-${p.fb_id}" style="display:none; flex-direction:column; gap:5px; margin-top:5px;"&gt;</w:t>
+              <w:br/>
+              <w:t xml:space="preserve">                        &lt;input type="text" id="perm-approve-reason-${p.fb_id}" placeholder="Motivo de aprobación" class="modern-input" style="padding:4px; font-size:11px; width:100%;"&gt;</w:t>
+              <w:br/>
+              <w:t xml:space="preserve">                        &lt;div style="display:flex; gap:5px;"&gt;</w:t>
+              <w:br/>
+              <w:t xml:space="preserve">                            &lt;button class="btn btn-success" style="padding: 2px 5px; font-size: 10px;" onclick="confirmApprovePerm('${p.fb_id}')"&gt;Confirmar&lt;/button&gt;</w:t>
+              <w:br/>
+              <w:t xml:space="preserve">                            &lt;button class="btn btn-outline" style="padding: 2px 5px; font-size: 10px;" onclick="cancelApprovePerm('${p.fb_id}')"&gt;Cancelar&lt;/button&gt;</w:t>
+              <w:br/>
+              <w:t xml:space="preserve">                        &lt;/div&gt;</w:t>
+              <w:br/>
+              <w:t xml:space="preserve">                    &lt;/div&gt;</w:t>
+              <w:br/>
+              <w:t xml:space="preserve">                    &lt;div id="perm-reject-box-${p.fb_id}" style="display:none; flex-direction:column; gap:5px; margin-top:5px;"&gt;</w:t>
+              <w:br/>
+              <w:t xml:space="preserve">                        &lt;input type="text" id="perm-reason-${p.fb_id}" placeholder="Motivo de rechazo" class="modern-input" style="padding:4px; font-size:11px; width:100%;"&gt;</w:t>
+              <w:br/>
+              <w:t xml:space="preserve">                        &lt;div style="display:flex; gap:5px;"&gt;</w:t>
+              <w:br/>
+              <w:t xml:space="preserve">                            &lt;button class="btn btn-danger" style="padding: 2px 5px; font-size: 10px;" onclick="confirmRejectPerm('${p.fb_id}')"&gt;Confirmar&lt;/button&gt;</w:t>
+              <w:br/>
+              <w:t xml:space="preserve">                            &lt;button class="btn btn-outline" style="padding: 2px 5px; font-size: 10px;" onclick="cancelRejectPerm('${p.fb_id}')"&gt;Cancelar&lt;/button&gt;</w:t>
+              <w:br/>
+              <w:t xml:space="preserve">                        &lt;/div&gt;</w:t>
+              <w:br/>
+              <w:t xml:space="preserve">                    &lt;/div&gt;</w:t>
+              <w:br/>
+              <w:t xml:space="preserve">                &lt;/td&gt;</w:t>
+              <w:br/>
+              <w:t xml:space="preserve">            &lt;/tr&gt;</w:t>
+              <w:br/>
+              <w:t xml:space="preserve">        `;</w:t>
+              <w:br/>
+              <w:t xml:space="preserve">    });</w:t>
+              <w:br/>
+              <w:t xml:space="preserve">    </w:t>
+              <w:br/>
+              <w:t xml:space="preserve">    const historyBody = document.getElementById('historyPermissionsTableBody');</w:t>
+              <w:br/>
+              <w:t xml:space="preserve">    if(historyBody) {</w:t>
+              <w:br/>
+              <w:t xml:space="preserve">        historyBody.innerHTML = '';</w:t>
+              <w:br/>
+              <w:t xml:space="preserve">        const history = permisos.filter(p =&gt; p.status !== 'Pendiente');</w:t>
+              <w:br/>
+              <w:t xml:space="preserve">        </w:t>
+              <w:br/>
+              <w:t xml:space="preserve">        if (history.length === 0) {</w:t>
+              <w:br/>
+              <w:t xml:space="preserve">            historyBody.innerHTML = `&lt;tr&gt;&lt;td colspan="5" style="padding: 20px; text-align: center; color: var(--text-secondary);"&gt;No hay historial de permisos procesados.&lt;/td&gt;&lt;/tr&gt;`;</w:t>
+              <w:br/>
+              <w:t xml:space="preserve">        } else {</w:t>
+              <w:br/>
+              <w:t xml:space="preserve">            // Ordenar los más recientes primero</w:t>
+              <w:br/>
+              <w:t xml:space="preserve">            history.sort((a, b) =&gt; b.id - a.id);</w:t>
+              <w:br/>
+              <w:t xml:space="preserve">            history.forEach(p =&gt; {</w:t>
+              <w:br/>
+              <w:t xml:space="preserve">                let statusBadge = p.status === 'Aprobado' ? `&lt;span class="badge" style="background: rgba(16, 185, 129, 0.2); color: var(--success);"&gt;&lt;i class='bx bx-check'&gt;&lt;/i&gt; Aprobado&lt;/span&gt;` : `&lt;span class="badge" style="background: rgba(239, 68, 68, 0.2); color: var(--danger);"&gt;&lt;i class='bx bx-x'&gt;&lt;/i&gt; Rechazado&lt;/span&gt;`;</w:t>
+              <w:br/>
+              <w:t xml:space="preserve">                historyBody.innerHTML += `</w:t>
+              <w:br/>
+              <w:t xml:space="preserve">                    &lt;tr style="border-bottom: 1px solid var(--glass-border);"&gt;</w:t>
+              <w:br/>
+              <w:t xml:space="preserve">                        &lt;td style="padding: 12px; font-weight: 500;"&gt;${p.gestor}&lt;/td&gt;</w:t>
+              <w:br/>
+              <w:t xml:space="preserve">                        &lt;td style="padding: 12px;"&gt;${p.tipo}&lt;/td&gt;</w:t>
+              <w:br/>
+              <w:t xml:space="preserve">                        &lt;td style="padding: 12px;"&gt;${statusBadge}&lt;/td&gt;</w:t>
+              <w:br/>
+              <w:t xml:space="preserve">                        &lt;td style="padding: 12px; color: var(--text-secondary); font-size: 13px;"&gt;${p.fecha}&lt;/td&gt;</w:t>
+              <w:br/>
+              <w:t xml:space="preserve">                        &lt;td style="padding: 12px; font-size: 13px; color: var(--text-secondary);"&gt;${p.rejectionReason || '-'}&lt;/td&gt;</w:t>
+              <w:br/>
+              <w:t xml:space="preserve">                    &lt;/tr&gt;</w:t>
+              <w:br/>
+              <w:t xml:space="preserve">                `;</w:t>
+              <w:br/>
+              <w:t xml:space="preserve">            });</w:t>
+              <w:br/>
+              <w:t xml:space="preserve">        }</w:t>
+              <w:br/>
+              <w:t xml:space="preserve">    }</w:t>
+              <w:br/>
+              <w:t>}</w:t>
+              <w:br/>
+              <w:br/>
+              <w:t>function showPermRejectBox(id) {</w:t>
+              <w:br/>
+              <w:t xml:space="preserve">    document.getElementById('perm-action-btns-' + id).style.display = 'none';</w:t>
+              <w:br/>
+              <w:t xml:space="preserve">    document.getElementById('perm-reject-box-' + id).style.display = 'flex';</w:t>
+              <w:br/>
+              <w:t>}</w:t>
+              <w:br/>
+              <w:br/>
+              <w:t>function cancelRejectPerm(id) {</w:t>
+              <w:br/>
+              <w:t xml:space="preserve">    document.getElementById('perm-reject-box-' + id).style.display = 'none';</w:t>
+              <w:br/>
+              <w:t xml:space="preserve">    document.getElementById('perm-action-btns-' + id).style.display = 'block';</w:t>
+              <w:br/>
+              <w:t xml:space="preserve">    document.getElementById('perm-reason-' + id).value = '';</w:t>
+              <w:br/>
+              <w:t>}</w:t>
+              <w:br/>
+              <w:br/>
+              <w:t>async function confirmRejectPerm(id) {</w:t>
+              <w:br/>
+              <w:t xml:space="preserve">    const reason = document.getElementById('perm-reason-' + id).value.trim();</w:t>
+              <w:br/>
+              <w:t xml:space="preserve">    if (!reason) {</w:t>
+              <w:br/>
+              <w:t xml:space="preserve">        alert("Debes escribir un motivo de rechazo.");</w:t>
+              <w:br/>
+              <w:t xml:space="preserve">        return;</w:t>
+              <w:br/>
+              <w:t xml:space="preserve">    }</w:t>
+              <w:br/>
+              <w:t xml:space="preserve">    await updatePermissionStatus(id, 'Rechazado', reason);</w:t>
+              <w:br/>
+              <w:t>}</w:t>
+              <w:br/>
+              <w:br/>
+              <w:t>function showPermApproveBox(id) {</w:t>
+              <w:br/>
+              <w:t xml:space="preserve">    document.getElementById('perm-action-btns-' + id).style.display = 'none';</w:t>
+              <w:br/>
+              <w:t xml:space="preserve">    document.getElementById('perm-approve-box-' + id).style.display = 'flex';</w:t>
+              <w:br/>
+              <w:t>}</w:t>
+              <w:br/>
+              <w:br/>
+              <w:t>function cancelApprovePerm(id) {</w:t>
+              <w:br/>
+              <w:t xml:space="preserve">    document.getElementById('perm-approve-box-' + id).style.display = 'none';</w:t>
+              <w:br/>
+              <w:t xml:space="preserve">    document.getElementById('perm-action-btns-' + id).style.display = 'block';</w:t>
+              <w:br/>
+              <w:t xml:space="preserve">    document.getElementById('perm-approve-reason-' + id).value = '';</w:t>
+              <w:br/>
+              <w:t>}</w:t>
+              <w:br/>
+              <w:br/>
+              <w:t>async function confirmApprovePerm(id) {</w:t>
+              <w:br/>
+              <w:t xml:space="preserve">    const reason = document.getElementById('perm-approve-reason-' + id).value.trim();</w:t>
+              <w:br/>
+              <w:t xml:space="preserve">    if (!reason) {</w:t>
+              <w:br/>
+              <w:t xml:space="preserve">        alert("Debes escribir una observación para aprobar el permiso.");</w:t>
+              <w:br/>
+              <w:t xml:space="preserve">        return;</w:t>
+              <w:br/>
+              <w:t xml:space="preserve">    }</w:t>
+              <w:br/>
+              <w:t xml:space="preserve">    await updatePermissionStatus(id, 'Aprobado', reason);</w:t>
+              <w:br/>
+              <w:t>}</w:t>
+              <w:br/>
+              <w:br/>
+              <w:t>async function updatePermissionStatus(fb_id, newStatus, reason = null) {</w:t>
+              <w:br/>
+              <w:t xml:space="preserve">    try {</w:t>
+              <w:br/>
+              <w:t xml:space="preserve">        const updates = { status: newStatus, notified: false };</w:t>
+              <w:br/>
+              <w:t xml:space="preserve">        if (reason) {</w:t>
+              <w:br/>
+              <w:t xml:space="preserve">            updates.rejectionReason = reason;</w:t>
+              <w:br/>
+              <w:t xml:space="preserve">        }</w:t>
+              <w:br/>
+              <w:t xml:space="preserve">        </w:t>
+              <w:br/>
+              <w:t xml:space="preserve">        await database.ref('permissions/' + fb_id).update(updates);</w:t>
+              <w:br/>
+              <w:t xml:space="preserve">        </w:t>
+              <w:br/>
+              <w:t xml:space="preserve">        alert(`Permiso ${newStatus} exitosamente.`);</w:t>
+              <w:br/>
+              <w:t xml:space="preserve">        renderPendingPermissions(); // Reload table</w:t>
+              <w:br/>
+              <w:t xml:space="preserve">        loadPermisos(); // Reload historical permissions if looking at it</w:t>
+              <w:br/>
+              <w:t xml:space="preserve">    } catch(e) {</w:t>
+              <w:br/>
+              <w:t xml:space="preserve">        alert('Error al contactar al servidor');</w:t>
+              <w:br/>
+              <w:t xml:space="preserve">    }</w:t>
+              <w:br/>
+              <w:t>}</w:t>
+              <w:br/>
+              <w:br/>
+              <w:t>// Exportar Reporte a PDF</w:t>
+              <w:br/>
+              <w:t>window.exportShiftReport = async function(fb_id) {</w:t>
+              <w:br/>
+              <w:t xml:space="preserve">    try {</w:t>
+              <w:br/>
+              <w:t xml:space="preserve">        const snapshot = await database.ref('shift_reports/' + fb_id).once('value');</w:t>
+              <w:br/>
+              <w:t xml:space="preserve">        if(!snapshot.exists()) return alert("No se encontró el reporte en la base de datos.");</w:t>
+              <w:br/>
+              <w:t xml:space="preserve">        </w:t>
+              <w:br/>
+              <w:t xml:space="preserve">        const r = snapshot.val();</w:t>
+              <w:br/>
+              <w:t xml:space="preserve">        </w:t>
+              <w:br/>
+              <w:t xml:space="preserve">        // Inicializar jsPDF</w:t>
+              <w:br/>
+              <w:t xml:space="preserve">        const { jsPDF } = window.jspdf;</w:t>
+              <w:br/>
+              <w:t xml:space="preserve">        const doc = new jsPDF();</w:t>
+              <w:br/>
+              <w:t xml:space="preserve">        </w:t>
+              <w:br/>
+              <w:t xml:space="preserve">        // Título</w:t>
+              <w:br/>
+              <w:t xml:space="preserve">        doc.setFontSize(16);</w:t>
+              <w:br/>
+              <w:t xml:space="preserve">        doc.setTextColor(13, 138, 188); // Accent color</w:t>
+              <w:br/>
+              <w:t xml:space="preserve">        doc.text("REPORTE DE TURNO - RISK MANAGER", 15, 20);</w:t>
+              <w:br/>
+              <w:t xml:space="preserve">        </w:t>
+              <w:br/>
+              <w:t xml:space="preserve">        // Metadatos</w:t>
+              <w:br/>
+              <w:t xml:space="preserve">        doc.setFontSize(11);</w:t>
+              <w:br/>
+              <w:t xml:space="preserve">        doc.setTextColor(50, 50, 50);</w:t>
+              <w:br/>
+              <w:t xml:space="preserve">        doc.text("Gestor: " + (r.gestor || 'N/A'), 15, 35);</w:t>
+              <w:br/>
+              <w:t xml:space="preserve">        doc.text("Rol: " + (r.rol || 'N/A'), 15, 42);</w:t>
+              <w:br/>
+              <w:t xml:space="preserve">        doc.text("SET Trabajado: " + (r.setTrabajado || 'N/A'), 15, 49);</w:t>
+              <w:br/>
+              <w:t xml:space="preserve">        doc.text("Hora de Inicio: " + (r.horaInicio || 'N/A'), 15, 56);</w:t>
+              <w:br/>
+              <w:t xml:space="preserve">        doc.text("Hora de Fin: " + (r.horaFin || 'N/A'), 15, 63);</w:t>
+              <w:br/>
+              <w:t xml:space="preserve">        </w:t>
+              <w:br/>
+              <w:t xml:space="preserve">        // Línea separadora</w:t>
+              <w:br/>
+              <w:t xml:space="preserve">        doc.setLineWidth(0.5);</w:t>
+              <w:br/>
+              <w:t xml:space="preserve">        doc.line(15, 70, 195, 70);</w:t>
+              <w:br/>
+              <w:t xml:space="preserve">        </w:t>
+              <w:br/>
+              <w:t xml:space="preserve">        // Resumen</w:t>
+              <w:br/>
+              <w:t xml:space="preserve">        doc.setFontSize(12);</w:t>
+              <w:br/>
+              <w:t xml:space="preserve">        doc.setTextColor(0, 0, 0);</w:t>
+              <w:br/>
+              <w:t xml:space="preserve">        doc.text("Resumen de Tareas:", 15, 80);</w:t>
+              <w:br/>
+              <w:t xml:space="preserve">        </w:t>
+              <w:br/>
+              <w:t xml:space="preserve">        doc.setFontSize(10);</w:t>
+              <w:br/>
+              <w:t xml:space="preserve">        doc.setTextColor(50, 50, 50);</w:t>
+              <w:br/>
+              <w:t xml:space="preserve">        </w:t>
+              <w:br/>
+              <w:t xml:space="preserve">        const reportText = r.reporte || 'Sin reporte detallado.';</w:t>
+              <w:br/>
+              <w:t xml:space="preserve">        const splitText = doc.splitTextToSize(reportText, 180);</w:t>
+              <w:br/>
+              <w:t xml:space="preserve">        </w:t>
+              <w:br/>
+              <w:t xml:space="preserve">        doc.text(splitText, 15, 90);</w:t>
+              <w:br/>
+              <w:t xml:space="preserve">        </w:t>
+              <w:br/>
+              <w:t xml:space="preserve">        // Guardar</w:t>
+              <w:br/>
+              <w:t xml:space="preserve">        const safeName = (r.gestor || 'Gestor').replace(/[^a-z0-9]/gi, '_').toLowerCase();</w:t>
+              <w:br/>
+              <w:t xml:space="preserve">        const dateStr = new Date(r.timestamp || Date.now()).toISOString().split('T')[0];</w:t>
+              <w:br/>
+              <w:t xml:space="preserve">        doc.save(`Reporte_${safeName}_${dateStr}.pdf`);</w:t>
+              <w:br/>
+              <w:t xml:space="preserve">        </w:t>
+              <w:br/>
+              <w:t xml:space="preserve">    } catch(e) {</w:t>
+              <w:br/>
+              <w:t xml:space="preserve">        alert("Hubo un error al intentar exportar el reporte.");</w:t>
+              <w:br/>
+              <w:t xml:space="preserve">        console.error(e);</w:t>
+              <w:br/>
+              <w:t xml:space="preserve">    }</w:t>
+              <w:br/>
+              <w:t>};</w:t>
+              <w:br/>
+              <w:br/>
+              <w:t>// Logic for Shift Reports History</w:t>
+              <w:br/>
+              <w:t>let allShiftReports = [];</w:t>
+              <w:br/>
+              <w:br/>
+              <w:t>async function renderShiftReports() {</w:t>
+              <w:br/>
+              <w:t xml:space="preserve">    const tbody = document.getElementById('shiftReportsTableBody');</w:t>
+              <w:br/>
+              <w:t xml:space="preserve">    if (!tbody) return;</w:t>
+              <w:br/>
+              <w:t xml:space="preserve">    </w:t>
+              <w:br/>
+              <w:t xml:space="preserve">    try { </w:t>
+              <w:br/>
+              <w:t xml:space="preserve">        const snapshot = await database.ref('shift_reports').once('value');</w:t>
+              <w:br/>
+              <w:t xml:space="preserve">        if (snapshot.exists()) {</w:t>
+              <w:br/>
+              <w:t xml:space="preserve">            const data = snapshot.val();</w:t>
+              <w:br/>
+              <w:t xml:space="preserve">            allShiftReports = Object.keys(data).map(k =&gt; ({...data[k], fb_id: k}));</w:t>
+              <w:br/>
+              <w:t xml:space="preserve">        } else {</w:t>
+              <w:br/>
+              <w:t xml:space="preserve">            allShiftReports = [];</w:t>
+              <w:br/>
+              <w:t xml:space="preserve">        }</w:t>
+              <w:br/>
+              <w:t xml:space="preserve">    } catch(e) {</w:t>
+              <w:br/>
+              <w:t xml:space="preserve">        console.error("Error cargando historial de turnos:", e);</w:t>
+              <w:br/>
+              <w:t xml:space="preserve">    }</w:t>
+              <w:br/>
+              <w:t xml:space="preserve">    </w:t>
+              <w:br/>
+              <w:t xml:space="preserve">    applyShiftReportsFilters();</w:t>
+              <w:br/>
+              <w:t>}</w:t>
+              <w:br/>
+              <w:br/>
+              <w:t>function applyShiftReportsFilters() {</w:t>
+              <w:br/>
+              <w:t xml:space="preserve">    const tbody = document.getElementById('shiftReportsTableBody');</w:t>
+              <w:br/>
+              <w:t xml:space="preserve">    if (!tbody) return;</w:t>
+              <w:br/>
+              <w:br/>
+              <w:t xml:space="preserve">    const gestorQueryInput = document.getElementById('filterGestorInput');</w:t>
+              <w:br/>
+              <w:t xml:space="preserve">    const gestorQuery = gestorQueryInput ? normalizeName(gestorQueryInput.value) : '';</w:t>
+              <w:br/>
+              <w:t xml:space="preserve">    const fechaQuery = document.getElementById('filterFechaInput') ? document.getElementById('filterFechaInput').value : '';</w:t>
+              <w:br/>
+              <w:br/>
+              <w:t xml:space="preserve">    let filtered = [...allShiftReports];</w:t>
+              <w:br/>
+              <w:br/>
+              <w:t xml:space="preserve">    // Filter by Gestor name (accent-insensitive)</w:t>
+              <w:br/>
+              <w:t xml:space="preserve">    if (gestorQuery) {</w:t>
+              <w:br/>
+              <w:t xml:space="preserve">        filtered = filtered.filter(r =&gt; normalizeName(r.gestor).includes(gestorQuery));</w:t>
+              <w:br/>
+              <w:t xml:space="preserve">    }</w:t>
+              <w:br/>
+              <w:br/>
+              <w:t xml:space="preserve">    // Filter by Date (comparing local YYYY-MM-DD format)</w:t>
+              <w:br/>
+              <w:t xml:space="preserve">    if (fechaQuery) {</w:t>
+              <w:br/>
+              <w:t xml:space="preserve">        filtered = filtered.filter(r =&gt; {</w:t>
+              <w:br/>
+              <w:t xml:space="preserve">            if (r.timestamp) {</w:t>
+              <w:br/>
+              <w:t xml:space="preserve">                const d = new Date(r.timestamp);</w:t>
+              <w:br/>
+              <w:t xml:space="preserve">                const localYear = d.getFullYear();</w:t>
+              <w:br/>
+              <w:t xml:space="preserve">                const localMonth = String(d.getMonth() + 1).padStart(2, '0');</w:t>
+              <w:br/>
+              <w:t xml:space="preserve">                const localDay = String(d.getDate()).padStart(2, '0');</w:t>
+              <w:br/>
+              <w:t xml:space="preserve">                const localDateStr = `${localYear}-${localMonth}-${localDay}`;</w:t>
+              <w:br/>
+              <w:t xml:space="preserve">                if (localDateStr === fechaQuery) return true;</w:t>
+              <w:br/>
+              <w:t xml:space="preserve">            }</w:t>
+              <w:br/>
+              <w:t xml:space="preserve">            if (r.horaInicio &amp;&amp; r.horaInicio.includes(fechaQuery)) return true;</w:t>
+              <w:br/>
+              <w:t xml:space="preserve">            if (r.horaFin &amp;&amp; r.horaFin.includes(fechaQuery)) return true;</w:t>
+              <w:br/>
+              <w:t xml:space="preserve">            return false;</w:t>
+              <w:br/>
+              <w:t xml:space="preserve">        });</w:t>
+              <w:br/>
+              <w:t xml:space="preserve">    }</w:t>
+              <w:br/>
+              <w:br/>
+              <w:t xml:space="preserve">    tbody.innerHTML = '';</w:t>
+              <w:br/>
+              <w:t xml:space="preserve">    </w:t>
+              <w:br/>
+              <w:t xml:space="preserve">    if (filtered.length === 0) {</w:t>
+              <w:br/>
+              <w:t xml:space="preserve">        tbody.innerHTML = `&lt;tr&gt;&lt;td colspan="6" style="padding: 20px; text-align: center; color: var(--text-secondary);"&gt;No hay historial de turnos registrados con los filtros seleccionados.&lt;/td&gt;&lt;/tr&gt;`;</w:t>
+              <w:br/>
+              <w:t xml:space="preserve">        return;</w:t>
+              <w:br/>
+              <w:t xml:space="preserve">    }</w:t>
+              <w:br/>
+              <w:t xml:space="preserve">    </w:t>
+              <w:br/>
+              <w:t xml:space="preserve">    // Sort descending by timestamp</w:t>
+              <w:br/>
+              <w:t xml:space="preserve">    filtered.sort((a, b) =&gt; (b.timestamp || 0) - (a.timestamp || 0));</w:t>
+              <w:br/>
+              <w:t xml:space="preserve">    </w:t>
+              <w:br/>
+              <w:t xml:space="preserve">    filtered.forEach(r =&gt; {</w:t>
+              <w:br/>
+              <w:t xml:space="preserve">        // Formatear el reporte de tareas para que sea legible en HTML</w:t>
+              <w:br/>
+              <w:t xml:space="preserve">        const safeReport = (r.reporte || 'Sin reporte').replace(/\n/g, '&lt;br&gt;').replace(/\[(.*?)\]/g, '&lt;strong&gt;[$1]&lt;/strong&gt;');</w:t>
+              <w:br/>
+              <w:t xml:space="preserve">        </w:t>
+              <w:br/>
+              <w:t xml:space="preserve">        tbody.innerHTML += `</w:t>
+              <w:br/>
+              <w:t xml:space="preserve">            &lt;tr style="border-bottom: 1px solid var(--glass-border);"&gt;</w:t>
+              <w:br/>
+              <w:t xml:space="preserve">                &lt;td style="padding: 12px; font-weight: 500;"&gt;</w:t>
+              <w:br/>
+              <w:t xml:space="preserve">                    ${r.gestor}</w:t>
+              <w:br/>
+              <w:t xml:space="preserve">                    &lt;div style="font-size: 11px; color: var(--text-secondary);"&gt;${r.rol}&lt;/div&gt;</w:t>
+              <w:br/>
+              <w:t xml:space="preserve">                &lt;/td&gt;</w:t>
+              <w:br/>
+              <w:t xml:space="preserve">                &lt;td style="padding: 12px; color: var(--accent-primary);"&gt;${r.setTrabajado}&lt;/td&gt;</w:t>
+              <w:br/>
+              <w:t xml:space="preserve">                &lt;td style="padding: 12px; font-size: 13px;"&gt;${r.horaInicio}&lt;/td&gt;</w:t>
+              <w:br/>
+              <w:t xml:space="preserve">                &lt;td style="padding: 12px; font-size: 13px;"&gt;${r.horaFin}&lt;/td&gt;</w:t>
+              <w:br/>
+              <w:t xml:space="preserve">                &lt;td style="padding: 12px; font-size: 12px; color: var(--text-secondary); max-width: 300px; text-align: left;"&gt;</w:t>
+              <w:br/>
+              <w:t xml:space="preserve">                    &lt;div style="max-height: 80px; overflow-y: auto; background: var(--bg-dark); padding: 5px; border-radius: 4px;"&gt;</w:t>
+              <w:br/>
+              <w:t xml:space="preserve">                        ${safeReport}</w:t>
+              <w:br/>
+              <w:t xml:space="preserve">                    &lt;/div&gt;</w:t>
+              <w:br/>
+              <w:t xml:space="preserve">                &lt;/td&gt;</w:t>
+              <w:br/>
+              <w:t xml:space="preserve">                &lt;td style="padding: 12px; text-align: center;"&gt;</w:t>
+              <w:br/>
+              <w:t xml:space="preserve">                    &lt;button class="btn btn-outline" style="padding: 5px 10px; font-size: 12px;" onclick="exportShiftReport('${r.fb_id}')"&gt;</w:t>
+              <w:br/>
+              <w:t xml:space="preserve">                        &lt;i class='bx bx-file-blank'&gt;&lt;/i&gt; Exportar PDF</w:t>
+              <w:br/>
+              <w:t xml:space="preserve">                    &lt;/button&gt;</w:t>
+              <w:br/>
+              <w:t xml:space="preserve">                &lt;/td&gt;</w:t>
+              <w:br/>
+              <w:t xml:space="preserve">            &lt;/tr&gt;</w:t>
+              <w:br/>
+              <w:t xml:space="preserve">        `;</w:t>
+              <w:br/>
+              <w:t xml:space="preserve">    });</w:t>
+              <w:br/>
+              <w:t>}</w:t>
+              <w:br/>
+              <w:br/>
+              <w:br/>
+              <w:br/>
+              <w:t>// Helper Notification function</w:t>
+              <w:br/>
+              <w:t>function toggleNotifications() {</w:t>
+              <w:br/>
+              <w:t xml:space="preserve">    const drop = document.getElementById('notificationDropdown');</w:t>
+              <w:br/>
+              <w:t xml:space="preserve">    if (drop) {</w:t>
+              <w:br/>
+              <w:t xml:space="preserve">        if (drop.style.display === 'none' || drop.style.display === '') {</w:t>
+              <w:br/>
+              <w:t xml:space="preserve">            drop.style.display = 'block';</w:t>
+              <w:br/>
+              <w:t xml:space="preserve">        } else {</w:t>
+              <w:br/>
+              <w:t xml:space="preserve">            drop.style.display = 'none';</w:t>
+              <w:br/>
+              <w:t xml:space="preserve">        }</w:t>
+              <w:br/>
+              <w:t xml:space="preserve">    }</w:t>
+              <w:br/>
+              <w:t>}</w:t>
+              <w:br/>
+              <w:br/>
+              <w:t>async function markAllAsRead() {</w:t>
+              <w:br/>
+              <w:t xml:space="preserve">    if (!currentUser) return;</w:t>
+              <w:br/>
+              <w:t xml:space="preserve">    try {</w:t>
+              <w:br/>
+              <w:t xml:space="preserve">        if (currentUser.role === 'Admin' || currentUser.role === 'Supervisor') {</w:t>
+              <w:br/>
+              <w:t xml:space="preserve">            const snapshot = await database.ref('permissions').once('value');</w:t>
+              <w:br/>
+              <w:t xml:space="preserve">            if (snapshot.exists()) {</w:t>
+              <w:br/>
+              <w:t xml:space="preserve">                const data = snapshot.val();</w:t>
+              <w:br/>
+              <w:t xml:space="preserve">                const updates = {};</w:t>
+              <w:br/>
+              <w:t xml:space="preserve">                for (let key in data) {</w:t>
+              <w:br/>
+              <w:t xml:space="preserve">                    if (data[key].notified_admin === false &amp;&amp; data[key].status === 'Pendiente') {</w:t>
+              <w:br/>
+              <w:t xml:space="preserve">                        updates[key + '/notified_admin'] = true;</w:t>
+              <w:br/>
+              <w:t xml:space="preserve">                    }</w:t>
+              <w:br/>
+              <w:t xml:space="preserve">                }</w:t>
+              <w:br/>
+              <w:t xml:space="preserve">                if (Object.keys(updates).length &gt; 0) {</w:t>
+              <w:br/>
+              <w:t xml:space="preserve">                    await database.ref('permissions').update(updates);</w:t>
+              <w:br/>
+              <w:t xml:space="preserve">                }</w:t>
+              <w:br/>
+              <w:t xml:space="preserve">            }</w:t>
+              <w:br/>
+              <w:t xml:space="preserve">        } else {</w:t>
+              <w:br/>
+              <w:t xml:space="preserve">            const snapshot = await database.ref('permissions').orderByChild('gestor').equalTo(currentUser.name).once('value');</w:t>
+              <w:br/>
+              <w:t xml:space="preserve">            if (snapshot.exists()) {</w:t>
+              <w:br/>
+              <w:t xml:space="preserve">                const data = snapshot.val();</w:t>
+              <w:br/>
+              <w:t xml:space="preserve">                const updates = {};</w:t>
+              <w:br/>
+              <w:t xml:space="preserve">                for (let key in data) {</w:t>
+              <w:br/>
+              <w:t xml:space="preserve">                    if (data[key].notified === false &amp;&amp; data[key].status !== 'Pendiente') {</w:t>
+              <w:br/>
+              <w:t xml:space="preserve">                        updates[key + '/notified'] = true;</w:t>
+              <w:br/>
+              <w:t xml:space="preserve">                    }</w:t>
+              <w:br/>
+              <w:t xml:space="preserve">                }</w:t>
+              <w:br/>
+              <w:t xml:space="preserve">                if (Object.keys(updates).length &gt; 0) {</w:t>
+              <w:br/>
+              <w:t xml:space="preserve">                    await database.ref('permissions').update(updates);</w:t>
+              <w:br/>
+              <w:t xml:space="preserve">                }</w:t>
+              <w:br/>
+              <w:t xml:space="preserve">            }</w:t>
+              <w:br/>
+              <w:t xml:space="preserve">        }</w:t>
+              <w:br/>
+              <w:t xml:space="preserve">    } catch(e) {</w:t>
+              <w:br/>
+              <w:t xml:space="preserve">        console.error(e);</w:t>
+              <w:br/>
+              <w:t xml:space="preserve">    }</w:t>
+              <w:br/>
+              <w:t>}</w:t>
+              <w:br/>
+              <w:br/>
+              <w:t>// Funciones del Modal de Perfil</w:t>
+              <w:br/>
+              <w:t>function openProfileModal() {</w:t>
+              <w:br/>
+              <w:t xml:space="preserve">    const avatarEl = document.querySelector('.user-profile .avatar');</w:t>
+              <w:br/>
+              <w:t xml:space="preserve">    const modalImg = document.getElementById('modalProfileAvatar');</w:t>
+              <w:br/>
+              <w:t xml:space="preserve">    if (avatarEl &amp;&amp; modalImg) {</w:t>
+              <w:br/>
+              <w:t xml:space="preserve">        modalImg.src = avatarEl.src;</w:t>
+              <w:br/>
+              <w:t xml:space="preserve">    }</w:t>
+              <w:br/>
+              <w:t xml:space="preserve">    </w:t>
+              <w:br/>
+              <w:t xml:space="preserve">    if (currentUser) {</w:t>
+              <w:br/>
+              <w:t xml:space="preserve">        const modalName = document.getElementById('modalProfileName');</w:t>
+              <w:br/>
+              <w:t xml:space="preserve">        if (modalName) modalName.textContent = currentUser.name || 'Usuario';</w:t>
+              <w:br/>
+              <w:t xml:space="preserve">        </w:t>
+              <w:br/>
+              <w:t xml:space="preserve">        const modalRole = document.getElementById('modalProfileRole');</w:t>
+              <w:br/>
+              <w:t xml:space="preserve">        if (modalRole) modalRole.textContent = currentUser.role || 'Rol';</w:t>
+              <w:br/>
+              <w:t xml:space="preserve">    }</w:t>
+              <w:br/>
+              <w:br/>
+              <w:t xml:space="preserve">    document.getElementById('profileModal').classList.add('active');</w:t>
+              <w:br/>
+              <w:t xml:space="preserve">    document.getElementById('newPasswordInput').value = '';</w:t>
+              <w:br/>
+              <w:t xml:space="preserve">    const msg = document.getElementById('passwordChangeMsg');</w:t>
+              <w:br/>
+              <w:t xml:space="preserve">    if (msg) msg.style.display = 'none';</w:t>
+              <w:br/>
+              <w:t>}</w:t>
+              <w:br/>
+              <w:br/>
+              <w:t>function toggleProfilePassword(iconElement) {</w:t>
+              <w:br/>
+              <w:t xml:space="preserve">    const input = document.getElementById('newPasswordInput');</w:t>
+              <w:br/>
+              <w:t xml:space="preserve">    if (input.type === 'password') {</w:t>
+              <w:br/>
+              <w:t xml:space="preserve">        input.type = 'text';</w:t>
+              <w:br/>
+              <w:t xml:space="preserve">        iconElement.classList.remove('bx-show');</w:t>
+              <w:br/>
+              <w:t xml:space="preserve">        iconElement.classList.add('bx-hide');</w:t>
+              <w:br/>
+              <w:t xml:space="preserve">    } else {</w:t>
+              <w:br/>
+              <w:t xml:space="preserve">        input.type = 'password';</w:t>
+              <w:br/>
+              <w:t xml:space="preserve">        iconElement.classList.remove('bx-hide');</w:t>
+              <w:br/>
+              <w:t xml:space="preserve">        iconElement.classList.add('bx-show');</w:t>
+              <w:br/>
+              <w:t xml:space="preserve">    }</w:t>
+              <w:br/>
+              <w:t>}</w:t>
+              <w:br/>
+              <w:br/>
+              <w:t>async function changePassword() {</w:t>
+              <w:br/>
+              <w:t xml:space="preserve">    const newPass = document.getElementById('newPasswordInput').value;</w:t>
+              <w:br/>
+              <w:t xml:space="preserve">    const msg = document.getElementById('passwordChangeMsg');</w:t>
+              <w:br/>
+              <w:t xml:space="preserve">    </w:t>
+              <w:br/>
+              <w:t xml:space="preserve">    if(!newPass || newPass.trim() === '') {</w:t>
+              <w:br/>
+              <w:t xml:space="preserve">        msg.textContent = 'Por favor ingresa una contraseña válida.';</w:t>
+              <w:br/>
+              <w:t xml:space="preserve">        msg.style.color = 'var(--danger)';</w:t>
+              <w:br/>
+              <w:t xml:space="preserve">        msg.style.display = 'block';</w:t>
+              <w:br/>
+              <w:t xml:space="preserve">        return;</w:t>
+              <w:br/>
+              <w:t xml:space="preserve">    }</w:t>
+              <w:br/>
+              <w:t xml:space="preserve">    </w:t>
+              <w:br/>
+              <w:t xml:space="preserve">    msg.textContent = 'Actualizando...';</w:t>
+              <w:br/>
+              <w:t xml:space="preserve">    msg.style.color = 'var(--text-primary)';</w:t>
+              <w:br/>
+              <w:t xml:space="preserve">    msg.style.display = 'block';</w:t>
+              <w:br/>
+              <w:t xml:space="preserve">    </w:t>
+              <w:br/>
+              <w:t xml:space="preserve">    try {</w:t>
+              <w:br/>
+              <w:t xml:space="preserve">        const user = firebase.auth().currentUser;</w:t>
+              <w:br/>
+              <w:t xml:space="preserve">        if (user) {</w:t>
+              <w:br/>
+              <w:t xml:space="preserve">            await user.updatePassword(newPass);</w:t>
+              <w:br/>
+              <w:t xml:space="preserve">            msg.textContent = '¡Contraseña actualizada exitosamente en Firebase Auth!';</w:t>
+              <w:br/>
+              <w:t xml:space="preserve">            msg.style.color = 'var(--success)';</w:t>
+              <w:br/>
+              <w:t xml:space="preserve">            setTimeout(() =&gt; closeModal('profileModal'), 2000);</w:t>
+              <w:br/>
+              <w:t xml:space="preserve">        } else {</w:t>
+              <w:br/>
+              <w:t xml:space="preserve">            msg.textContent = 'Error: No hay sesión activa en Firebase Auth. Por favor, vuelve a iniciar sesión.';</w:t>
+              <w:br/>
+              <w:t xml:space="preserve">            msg.style.color = 'var(--danger)';</w:t>
+              <w:br/>
+              <w:t xml:space="preserve">        }</w:t>
+              <w:br/>
+              <w:t xml:space="preserve">    } catch(e) {</w:t>
+              <w:br/>
+              <w:t xml:space="preserve">        msg.textContent = 'Error al actualizar contraseña.';</w:t>
+              <w:br/>
+              <w:t xml:space="preserve">        if (e.code === 'auth/requires-recent-login') {</w:t>
+              <w:br/>
+              <w:t xml:space="preserve">            msg.textContent = 'Por seguridad, debes cerrar sesión e iniciar sesión nuevamente para cambiar tu contraseña.';</w:t>
+              <w:br/>
+              <w:t xml:space="preserve">        } else if (e.code === 'auth/weak-password') {</w:t>
+              <w:br/>
+              <w:t xml:space="preserve">            msg.textContent = 'La contraseña debe tener al menos 6 caracteres.';</w:t>
+              <w:br/>
+              <w:t xml:space="preserve">        }</w:t>
+              <w:br/>
+              <w:t xml:space="preserve">        msg.style.color = 'var(--danger)';</w:t>
+              <w:br/>
+              <w:t xml:space="preserve">        console.error("Error al actualizar la contraseña:", e);</w:t>
+              <w:br/>
+              <w:t xml:space="preserve">    }</w:t>
+              <w:br/>
+              <w:t>}</w:t>
+              <w:br/>
+              <w:br/>
+              <w:t>// --- PROGRAMMATIC SIDEBAR ORDER &amp; MONITOREO REALTIME ---</w:t>
+              <w:br/>
+              <w:br/>
+              <w:t>function setupSidebar() {</w:t>
+              <w:br/>
+              <w:t xml:space="preserve">    const sidebarNav = document.querySelector('.sidebar-nav');</w:t>
+              <w:br/>
+              <w:t xml:space="preserve">    if (!sidebarNav) return;</w:t>
+              <w:br/>
+              <w:t xml:space="preserve">    </w:t>
+              <w:br/>
+              <w:t xml:space="preserve">    const navWorkspace = document.getElementById('navWorkspace');</w:t>
+              <w:br/>
+              <w:t xml:space="preserve">    const navHorario = document.getElementById('navHorario');</w:t>
+              <w:br/>
+              <w:t xml:space="preserve">    const navTeletrabajo = document.getElementById('navTeletrabajo');</w:t>
+              <w:br/>
+              <w:t xml:space="preserve">    const navDocs = document.getElementById('navDocs');</w:t>
+              <w:br/>
+              <w:t xml:space="preserve">    const navPermisos = document.getElementById('navPermisos');</w:t>
+              <w:br/>
+              <w:t xml:space="preserve">    const navTurnos = document.getElementById('navTurnos');</w:t>
+              <w:br/>
+              <w:t xml:space="preserve">    const navAprobaciones = document.getElementById('navAprobaciones');</w:t>
+              <w:br/>
+              <w:t xml:space="preserve">    const navMonitoreo = document.getElementById('navMonitoreo');</w:t>
+              <w:br/>
+              <w:t xml:space="preserve">    const navSoporte = document.getElementById('navSoporte');</w:t>
+              <w:br/>
+              <w:br/>
+              <w:t xml:space="preserve">    if (currentUser &amp;&amp; (currentUser.role === 'Admin' || currentUser.role === 'Supervisor')) {</w:t>
+              <w:br/>
+              <w:t xml:space="preserve">        // Admin/Supervisor Order:</w:t>
+              <w:br/>
+              <w:t xml:space="preserve">        // 1. Monitoreo</w:t>
+              <w:br/>
+              <w:t xml:space="preserve">        // 2. Historial de turnos</w:t>
+              <w:br/>
+              <w:t xml:space="preserve">        // 3. Aprobaciones</w:t>
+              <w:br/>
+              <w:t xml:space="preserve">        // 4. Historial de permisos</w:t>
+              <w:br/>
+              <w:t xml:space="preserve">        // 5. Horario</w:t>
+              <w:br/>
+              <w:t xml:space="preserve">        // 6. Teletrabajo</w:t>
+              <w:br/>
+              <w:t xml:space="preserve">        // 7. Documentación</w:t>
+              <w:br/>
+              <w:t xml:space="preserve">        // 8. Mis Tareas</w:t>
+              <w:br/>
+              <w:t xml:space="preserve">        // 9. Soporte</w:t>
+              <w:br/>
+              <w:t xml:space="preserve">        </w:t>
+              <w:br/>
+              <w:t xml:space="preserve">        if (navMonitoreo) { navMonitoreo.style.display = 'flex'; sidebarNav.appendChild(navMonitoreo); }</w:t>
+              <w:br/>
+              <w:t xml:space="preserve">        if (navTurnos) { navTurnos.style.display = 'flex'; sidebarNav.appendChild(navTurnos); }</w:t>
+              <w:br/>
+              <w:t xml:space="preserve">        if (navAprobaciones) { navAprobaciones.style.display = 'flex'; sidebarNav.appendChild(navAprobaciones); }</w:t>
+              <w:br/>
+              <w:t xml:space="preserve">        if (navPermisos) { navPermisos.style.display = 'flex'; sidebarNav.appendChild(navPermisos); }</w:t>
+              <w:br/>
+              <w:t xml:space="preserve">        if (navHorario) { navHorario.style.display = 'flex'; sidebarNav.appendChild(navHorario); }</w:t>
+              <w:br/>
+              <w:t xml:space="preserve">        if (navTeletrabajo) { navTeletrabajo.style.display = 'flex'; sidebarNav.appendChild(navTeletrabajo); }</w:t>
+              <w:br/>
+              <w:t xml:space="preserve">        if (navDocs) { navDocs.style.display = 'flex'; sidebarNav.appendChild(navDocs); }</w:t>
+              <w:br/>
+              <w:t xml:space="preserve">        if (navWorkspace) { navWorkspace.style.display = 'flex'; sidebarNav.appendChild(navWorkspace); }</w:t>
+              <w:br/>
+              <w:t xml:space="preserve">        if (navSoporte) { navSoporte.style.display = 'flex'; sidebarNav.appendChild(navSoporte); }</w:t>
+              <w:br/>
+              <w:t xml:space="preserve">    } else {</w:t>
+              <w:br/>
+              <w:t xml:space="preserve">        // Gestor Order:</w:t>
+              <w:br/>
+              <w:t xml:space="preserve">        // 1. Mis Tareas</w:t>
+              <w:br/>
+              <w:t xml:space="preserve">        // 2. Horario</w:t>
+              <w:br/>
+              <w:t xml:space="preserve">        // 3. Teletrabajo</w:t>
+              <w:br/>
+              <w:t xml:space="preserve">        // 4. Documentación</w:t>
+              <w:br/>
+              <w:t xml:space="preserve">        // 5. Historial de permisos (Permisos)</w:t>
+              <w:br/>
+              <w:t xml:space="preserve">        // 6. Soporte</w:t>
+              <w:br/>
+              <w:t xml:space="preserve">        </w:t>
+              <w:br/>
+              <w:t xml:space="preserve">        if (navWorkspace) { navWorkspace.style.display = 'flex'; sidebarNav.appendChild(navWorkspace); }</w:t>
+              <w:br/>
+              <w:t xml:space="preserve">        if (navHorario) { navHorario.style.display = 'flex'; sidebarNav.appendChild(navHorario); }</w:t>
+              <w:br/>
+              <w:t xml:space="preserve">        if (navTeletrabajo) { navTeletrabajo.style.display = 'flex'; sidebarNav.appendChild(navTeletrabajo); }</w:t>
+              <w:br/>
+              <w:t xml:space="preserve">        if (navDocs) { navDocs.style.display = 'flex'; sidebarNav.appendChild(navDocs); }</w:t>
+              <w:br/>
+              <w:t xml:space="preserve">        if (navPermisos) { navPermisos.style.display = 'flex'; sidebarNav.appendChild(navPermisos); }</w:t>
+              <w:br/>
+              <w:t xml:space="preserve">        </w:t>
+              <w:br/>
+              <w:t xml:space="preserve">        // Hide Admin tabs for Gestor</w:t>
+              <w:br/>
+              <w:t xml:space="preserve">        if (navTurnos) navTurnos.style.display = 'none';</w:t>
+              <w:br/>
+              <w:t xml:space="preserve">        if (navAprobaciones) navAprobaciones.style.display = 'none';</w:t>
+              <w:br/>
+              <w:t xml:space="preserve">        if (navMonitoreo) navMonitoreo.style.display = 'none';</w:t>
+              <w:br/>
+              <w:t xml:space="preserve">        </w:t>
+              <w:br/>
+              <w:t xml:space="preserve">        if (navSoporte) { navSoporte.style.display = 'flex'; sidebarNav.appendChild(navSoporte); }</w:t>
+              <w:br/>
+              <w:t xml:space="preserve">    }</w:t>
+              <w:br/>
+              <w:t>}</w:t>
+              <w:br/>
+              <w:br/>
+              <w:t>let allActiveSessions = {};</w:t>
+              <w:br/>
+              <w:br/>
+              <w:t>const availableAvatars = [</w:t>
+              <w:br/>
+              <w:t xml:space="preserve">    "Alexander Villada.png",</w:t>
+              <w:br/>
+              <w:t xml:space="preserve">    "Camilo Espinosa.png",</w:t>
+              <w:br/>
+              <w:t xml:space="preserve">    "Daniel Benavidez.png",</w:t>
+              <w:br/>
+              <w:t xml:space="preserve">    "Josue Alvarez.png",</w:t>
+              <w:br/>
+              <w:t xml:space="preserve">    "Juan Jose Diaz.png",</w:t>
+              <w:br/>
+              <w:t xml:space="preserve">    "Maria Sanchez.png",</w:t>
+              <w:br/>
+              <w:t xml:space="preserve">    "Marilyn Jimenez.png",</w:t>
+              <w:br/>
+              <w:t xml:space="preserve">    "Oriana Borja.png",</w:t>
+              <w:br/>
+              <w:t xml:space="preserve">    "Samuel Cruz.png",</w:t>
+              <w:br/>
+              <w:t xml:space="preserve">    "Sara Santamaria.png",</w:t>
+              <w:br/>
+              <w:t xml:space="preserve">    "Sebastian Arango.png",</w:t>
+              <w:br/>
+              <w:t xml:space="preserve">    "Sebastian Hincapie.png",</w:t>
+              <w:br/>
+              <w:t xml:space="preserve">    "Yefferson Giraldo.png"</w:t>
+              <w:br/>
+              <w:t>];</w:t>
+              <w:br/>
+              <w:br/>
+              <w:t>function startActiveSessionsListener() {</w:t>
+              <w:br/>
+              <w:t xml:space="preserve">    database.ref('active_sessions').on('value', (snapshot) =&gt; {</w:t>
+              <w:br/>
+              <w:t xml:space="preserve">        if (snapshot.exists()) {</w:t>
+              <w:br/>
+              <w:t xml:space="preserve">            allActiveSessions = snapshot.val();</w:t>
+              <w:br/>
+              <w:t xml:space="preserve">        } else {</w:t>
+              <w:br/>
+              <w:t xml:space="preserve">            allActiveSessions = {};</w:t>
+              <w:br/>
+              <w:t xml:space="preserve">        }</w:t>
+              <w:br/>
+              <w:t xml:space="preserve">        renderActiveSessionsDashboard();</w:t>
+              <w:br/>
+              <w:t xml:space="preserve">        updateGlobalStats();</w:t>
+              <w:br/>
+              <w:t xml:space="preserve">    }, (error) =&gt; {</w:t>
+              <w:br/>
+              <w:t xml:space="preserve">        console.error("Error cargando monitoreo en tiempo real:", error);</w:t>
+              <w:br/>
+              <w:t xml:space="preserve">    });</w:t>
+              <w:br/>
+              <w:t>}</w:t>
+              <w:br/>
+              <w:br/>
+              <w:t>function renderActiveSessionsDashboard() {</w:t>
+              <w:br/>
+              <w:t xml:space="preserve">    const grid = document.getElementById('monitoreoGrid');</w:t>
+              <w:br/>
+              <w:t xml:space="preserve">    if (!grid) return;</w:t>
+              <w:br/>
+              <w:br/>
+              <w:t xml:space="preserve">    grid.innerHTML = '';</w:t>
+              <w:br/>
+              <w:t xml:space="preserve">    </w:t>
+              <w:br/>
+              <w:t xml:space="preserve">    // Get filter queries</w:t>
+              <w:br/>
+              <w:t xml:space="preserve">    const searchInputEl = document.getElementById('monitoreoSearchInput');</w:t>
+              <w:br/>
+              <w:t xml:space="preserve">    const searchQuery = searchInputEl ? normalizeName(searchInputEl.value) : '';</w:t>
+              <w:br/>
+              <w:t xml:space="preserve">    const shiftSelectEl = document.getElementById('filterShiftSelect');</w:t>
+              <w:br/>
+              <w:t xml:space="preserve">    const shiftQuery = shiftSelectEl ? shiftSelectEl.value : '';</w:t>
+              <w:br/>
+              <w:t xml:space="preserve">    const statusSelectEl = document.getElementById('filterStatusSelect');</w:t>
+              <w:br/>
+              <w:t xml:space="preserve">    const statusQuery = statusSelectEl ? statusSelectEl.value : '';</w:t>
+              <w:br/>
+              <w:br/>
+              <w:t xml:space="preserve">    const uids = Object.keys(allActiveSessions);</w:t>
+              <w:br/>
+              <w:t xml:space="preserve">    </w:t>
+              <w:br/>
+              <w:t xml:space="preserve">    // Filtering active sessions</w:t>
+              <w:br/>
+              <w:t xml:space="preserve">    let filteredUids = uids.filter(uid =&gt; {</w:t>
+              <w:br/>
+              <w:t xml:space="preserve">        const session = allActiveSessions[uid];</w:t>
+              <w:br/>
+              <w:t xml:space="preserve">        if (!session) return false;</w:t>
+              <w:br/>
+              <w:t xml:space="preserve">        </w:t>
+              <w:br/>
+              <w:t xml:space="preserve">        const fullName = (session.name || '').trim();</w:t>
+              <w:br/>
+              <w:t xml:space="preserve">        const email = (session.email || '');</w:t>
+              <w:br/>
+              <w:t xml:space="preserve">        const shift = session.shift || 'Mañana';</w:t>
+              <w:br/>
+              <w:t xml:space="preserve">        const isOnline = session.lastActive ? ((Date.now() - session.lastActive) &lt; 120000) : false;</w:t>
+              <w:br/>
+              <w:br/>
+              <w:t xml:space="preserve">        // Search match (accent-insensitive substring)</w:t>
+              <w:br/>
+              <w:t xml:space="preserve">        if (searchQuery &amp;&amp; !normalizeName(fullName).includes(searchQuery) &amp;&amp; !normalizeName(email).includes(searchQuery)) {</w:t>
+              <w:br/>
+              <w:t xml:space="preserve">            return false;</w:t>
+              <w:br/>
+              <w:t xml:space="preserve">        }</w:t>
+              <w:br/>
+              <w:br/>
+              <w:t xml:space="preserve">        // Shift match</w:t>
+              <w:br/>
+              <w:t xml:space="preserve">        if (shiftQuery &amp;&amp; shift !== shiftQuery) {</w:t>
+              <w:br/>
+              <w:t xml:space="preserve">            return false;</w:t>
+              <w:br/>
+              <w:t xml:space="preserve">        }</w:t>
+              <w:br/>
+              <w:br/>
+              <w:t xml:space="preserve">        // Status match</w:t>
+              <w:br/>
+              <w:t xml:space="preserve">        if (statusQuery) {</w:t>
+              <w:br/>
+              <w:t xml:space="preserve">            if (statusQuery === 'online' &amp;&amp; !isOnline) return false;</w:t>
+              <w:br/>
+              <w:t xml:space="preserve">            if (statusQuery === 'offline' &amp;&amp; isOnline) return false;</w:t>
+              <w:br/>
+              <w:t xml:space="preserve">        }</w:t>
+              <w:br/>
+              <w:br/>
+              <w:t xml:space="preserve">        return true;</w:t>
+              <w:br/>
+              <w:t xml:space="preserve">    });</w:t>
+              <w:br/>
+              <w:br/>
+              <w:t xml:space="preserve">    if (filteredUids.length === 0) {</w:t>
+              <w:br/>
+              <w:t xml:space="preserve">        grid.innerHTML = `</w:t>
+              <w:br/>
+              <w:t xml:space="preserve">            &lt;div style="grid-column: 1 / -1; padding: 60px; text-align: center; color: var(--text-secondary);"&gt;</w:t>
+              <w:br/>
+              <w:t xml:space="preserve">                &lt;i class='bx bx-devices' style="font-size: 48px; margin-bottom: 15px; color: var(--text-secondary); opacity: 0.5;"&gt;&lt;/i&gt;</w:t>
+              <w:br/>
+              <w:t xml:space="preserve">                &lt;p style="font-size: 16px; font-weight: 500;"&gt;No se encontraron gestores en el turno con los filtros aplicados.&lt;/p&gt;</w:t>
+              <w:br/>
+              <w:t xml:space="preserve">                &lt;p style="font-size: 12px; margin-top: 5px; opacity: 0.7;"&gt;Los gestores activos se listarán aquí automáticamente al ingresar.&lt;/p&gt;</w:t>
+              <w:br/>
+              <w:t xml:space="preserve">            &lt;/div&gt;</w:t>
+              <w:br/>
+              <w:t xml:space="preserve">        `;</w:t>
+              <w:br/>
+              <w:t xml:space="preserve">        return;</w:t>
+              <w:br/>
+              <w:t xml:space="preserve">    }</w:t>
+              <w:br/>
+              <w:br/>
+              <w:t xml:space="preserve">    filteredUids.forEach(uid =&gt; {</w:t>
+              <w:br/>
+              <w:t xml:space="preserve">        const session = allActiveSessions[uid];</w:t>
+              <w:br/>
+              <w:t xml:space="preserve">        if (!session) return;</w:t>
+              <w:br/>
+              <w:t xml:space="preserve">        </w:t>
+              <w:br/>
+              <w:t xml:space="preserve">        const isOnline = session.lastActive ? ((Date.now() - session.lastActive) &lt; 120000) : false;</w:t>
+              <w:br/>
+              <w:t xml:space="preserve">        const lastActiveTime = session.lastActive ? new Date(session.lastActive).toLocaleTimeString([], { hour: '2-digit', minute: '2-digit', second: '2-digit' }) : 'Nunca';</w:t>
+              <w:br/>
+              <w:t xml:space="preserve">        </w:t>
+              <w:br/>
+              <w:t xml:space="preserve">        const fullName = (session.name || '').trim();</w:t>
+              <w:br/>
+              <w:t xml:space="preserve">        let matchedAvatar = availableAvatars.find(img =&gt; namesMatch(fullName, img.replace('.png', '')));</w:t>
+              <w:br/>
+              <w:t xml:space="preserve">        let avatarSrc = matchedAvatar ? `assets/src/img/${matchedAvatar}` : `https://ui-avatars.com/api/?name=${encodeURIComponent(fullName)}&amp;background=0D8ABC&amp;color=fff`;</w:t>
+              <w:br/>
+              <w:br/>
+              <w:t xml:space="preserve">        const completedTasks = session.finalizedTasks || 0;</w:t>
+              <w:br/>
+              <w:t xml:space="preserve">        const totalTasks = session.totalTasks || 0;</w:t>
+              <w:br/>
+              <w:t xml:space="preserve">        const percentage = session.percentage || 0;</w:t>
+              <w:br/>
+              <w:br/>
+              <w:t xml:space="preserve">        const card = document.createElement('div');</w:t>
+              <w:br/>
+              <w:t xml:space="preserve">        card.className = 'monitoreo-card';</w:t>
+              <w:br/>
+              <w:t xml:space="preserve">        card.innerHTML = `</w:t>
+              <w:br/>
+              <w:t xml:space="preserve">            &lt;div style="display: flex; justify-content: space-between; align-items: start;"&gt;</w:t>
+              <w:br/>
+              <w:t xml:space="preserve">                &lt;div class="monitoreo-user-info"&gt;</w:t>
+              <w:br/>
+              <w:t xml:space="preserve">                    &lt;img src="${avatarSrc}" alt="${fullName}" class="monitoreo-avatar" onerror="this.onerror=null; this.src='https://ui-avatars.com/api/?name=${encodeURIComponent(fullName)}&amp;background=0D8ABC&amp;color=fff';"&gt;</w:t>
+              <w:br/>
+              <w:t xml:space="preserve">                    &lt;div class="monitoreo-details"&gt;</w:t>
+              <w:br/>
+              <w:t xml:space="preserve">                        &lt;span class="monitoreo-name"&gt;${fullName}&lt;/span&gt;</w:t>
+              <w:br/>
+              <w:t xml:space="preserve">                        &lt;span class="monitoreo-meta"&gt;${session.email || ''}&lt;/span&gt;</w:t>
+              <w:br/>
+              <w:t xml:space="preserve">                    &lt;/div&gt;</w:t>
+              <w:br/>
+              <w:t xml:space="preserve">                &lt;/div&gt;</w:t>
+              <w:br/>
+              <w:t xml:space="preserve">                &lt;div class="status-indicator-badge ${isOnline ? 'status-online' : 'status-offline'}"&gt;</w:t>
+              <w:br/>
+              <w:t xml:space="preserve">                    &lt;div class="pulse-dot ${isOnline ? '' : 'offline'}"&gt;&lt;/div&gt;</w:t>
+              <w:br/>
+              <w:t xml:space="preserve">                    ${isOnline ? 'En Línea' : 'Inactivo'}</w:t>
+              <w:br/>
+              <w:t xml:space="preserve">                &lt;/div&gt;</w:t>
+              <w:br/>
+              <w:t xml:space="preserve">            &lt;/div&gt;</w:t>
               <w:br/>
               <w:t xml:space="preserve">            </w:t>
               <w:br/>
-              <w:t xml:space="preserve">            let icon = 'bx-file-pdf';</w:t>
-              <w:br/>
-              <w:t xml:space="preserve">            let color = '#FF5A5A'; // PDF red</w:t>
-              <w:br/>
-              <w:t xml:space="preserve">            </w:t>
-              <w:br/>
-              <w:t xml:space="preserve">            if(isVideo) { icon = 'bx-video'; color = '#3B82F6'; }</w:t>
-              <w:br/>
-              <w:t xml:space="preserve">            else if(isWord) { icon = 'bx-file-blank'; color = '#2563EB'; } // Word blue</w:t>
-              <w:br/>
-              <w:t xml:space="preserve">            else if(isExcel) { icon = 'bx-table'; color = '#10B981'; } // Excel green</w:t>
-              <w:br/>
-              <w:br/>
-              <w:t xml:space="preserve">            docsGrid.innerHTML += `</w:t>
-              <w:br/>
-              <w:t xml:space="preserve">                &lt;a href="${getDocUrl(file)}" target="_blank" class="glass-panel" style="padding: 20px; display: flex; flex-direction: column; align-items: center; text-align: center; gap: 10px; transition: transform 0.2s;"&gt;</w:t>
-              <w:br/>
-              <w:t xml:space="preserve">                    &lt;i class='bx ${icon}' style="font-size: 40px; color: ${color};"&gt;&lt;/i&gt;</w:t>
-              <w:br/>
-              <w:t xml:space="preserve">                    &lt;span style="font-size: 14px; color: var(--text-primary); font-weight: 500;"&gt;${file.replace(/\.[^/.]+$/, "")}&lt;/span&gt;</w:t>
-              <w:br/>
-              <w:t xml:space="preserve">                &lt;/a&gt;</w:t>
+              <w:t xml:space="preserve">            &lt;div style="margin-top: 10px; font-size: 13px;"&gt;</w:t>
+              <w:br/>
+              <w:t xml:space="preserve">                &lt;div style="display: flex; justify-content: space-between; margin-bottom: 5px;"&gt;</w:t>
+              <w:br/>
+              <w:t xml:space="preserve">                    &lt;span style="color: var(--text-secondary);"&gt;&lt;i class='bx bx-calendar-check'&gt;&lt;/i&gt; Turno:&lt;/span&gt;</w:t>
+              <w:br/>
+              <w:t xml:space="preserve">                    &lt;strong style="color: var(--text-primary);"&gt;${session.shift || 'Mañana'}&lt;/strong&gt;</w:t>
+              <w:br/>
+              <w:t xml:space="preserve">                &lt;/div&gt;</w:t>
+              <w:br/>
+              <w:t xml:space="preserve">                &lt;div style="display: flex; justify-content: space-between; margin-bottom: 5px;"&gt;</w:t>
+              <w:br/>
+              <w:t xml:space="preserve">                    &lt;span style="color: var(--text-secondary);"&gt;&lt;i class='bx bx-time'&gt;&lt;/i&gt; Actividad:&lt;/span&gt;</w:t>
+              <w:br/>
+              <w:t xml:space="preserve">                    &lt;span style="color: var(--text-primary); font-size: 12px;"&gt;${lastActiveTime}&lt;/span&gt;</w:t>
+              <w:br/>
+              <w:t xml:space="preserve">                &lt;/div&gt;</w:t>
+              <w:br/>
+              <w:t xml:space="preserve">            &lt;/div&gt;</w:t>
+              <w:br/>
+              <w:br/>
+              <w:t xml:space="preserve">            &lt;div class="progress-container"&gt;</w:t>
+              <w:br/>
+              <w:t xml:space="preserve">                &lt;div class="progress-label-row"&gt;</w:t>
+              <w:br/>
+              <w:t xml:space="preserve">                    &lt;span&gt;Avance de Tareas&lt;/span&gt;</w:t>
+              <w:br/>
+              <w:t xml:space="preserve">                    &lt;strong&gt;${percentage}% (${completedTasks}/${totalTasks})&lt;/strong&gt;</w:t>
+              <w:br/>
+              <w:t xml:space="preserve">                &lt;/div&gt;</w:t>
+              <w:br/>
+              <w:t xml:space="preserve">                &lt;div class="progress-bar-bg"&gt;</w:t>
+              <w:br/>
+              <w:t xml:space="preserve">                    &lt;div class="progress-bar-fill" style="width: ${percentage}%;"&gt;&lt;/div&gt;</w:t>
+              <w:br/>
+              <w:t xml:space="preserve">                &lt;/div&gt;</w:t>
+              <w:br/>
+              <w:t xml:space="preserve">            &lt;/div&gt;</w:t>
+              <w:br/>
+              <w:br/>
+              <w:t xml:space="preserve">            &lt;div style="margin-top: 15px; display: flex; justify-content: flex-end;"&gt;</w:t>
+              <w:br/>
+              <w:t xml:space="preserve">                &lt;button class="btn btn-outline" style="width: auto; padding: 6px 12px; font-size: 12px; display: flex; align-items: center; gap: 6px;" onclick="openMonitoreoDetails('${uid}')"&gt;</w:t>
+              <w:br/>
+              <w:t xml:space="preserve">                    &lt;i class='bx bx-search-alt-2'&gt;&lt;/i&gt; Ver Tareas</w:t>
+              <w:br/>
+              <w:t xml:space="preserve">                &lt;/button&gt;</w:t>
+              <w:br/>
+              <w:t xml:space="preserve">            &lt;/div&gt;</w:t>
+              <w:br/>
+              <w:t xml:space="preserve">        `;</w:t>
+              <w:br/>
+              <w:t xml:space="preserve">        grid.appendChild(card);</w:t>
+              <w:br/>
+              <w:t xml:space="preserve">    });</w:t>
+              <w:br/>
+              <w:t>}</w:t>
+              <w:br/>
+              <w:br/>
+              <w:t>function updateGlobalStats() {</w:t>
+              <w:br/>
+              <w:t xml:space="preserve">    const statsGestores = document.getElementById('statsGestores');</w:t>
+              <w:br/>
+              <w:t xml:space="preserve">    const statsKpi = document.getElementById('statsKpi');</w:t>
+              <w:br/>
+              <w:t xml:space="preserve">    const statsTurno = document.getElementById('statsTurno');</w:t>
+              <w:br/>
+              <w:br/>
+              <w:t xml:space="preserve">    const uids = Object.keys(allActiveSessions);</w:t>
+              <w:br/>
+              <w:t xml:space="preserve">    const totalGestores = uids.length;</w:t>
+              <w:br/>
+              <w:t xml:space="preserve">    </w:t>
+              <w:br/>
+              <w:t xml:space="preserve">    // Count active (lastActive within 2 mins)</w:t>
+              <w:br/>
+              <w:t xml:space="preserve">    const onlineCount = uids.filter(uid =&gt; {</w:t>
+              <w:br/>
+              <w:t xml:space="preserve">        const session = allActiveSessions[uid];</w:t>
+              <w:br/>
+              <w:t xml:space="preserve">        return session &amp;&amp; session.lastActive ? ((Date.now() - session.lastActive) &lt; 120000) : false;</w:t>
+              <w:br/>
+              <w:t xml:space="preserve">    }).length;</w:t>
+              <w:br/>
+              <w:br/>
+              <w:t xml:space="preserve">    if (statsGestores) {</w:t>
+              <w:br/>
+              <w:t xml:space="preserve">        statsGestores.textContent = `${onlineCount} / ${totalGestores}`;</w:t>
+              <w:br/>
+              <w:t xml:space="preserve">    }</w:t>
+              <w:br/>
+              <w:br/>
+              <w:t xml:space="preserve">    // Compute average KPI</w:t>
+              <w:br/>
+              <w:t xml:space="preserve">    let totalPercentage = 0;</w:t>
+              <w:br/>
+              <w:t xml:space="preserve">    uids.forEach(uid =&gt; {</w:t>
+              <w:br/>
+              <w:t xml:space="preserve">        const session = allActiveSessions[uid];</w:t>
+              <w:br/>
+              <w:t xml:space="preserve">        totalPercentage += session ? (session.percentage || 0) : 0;</w:t>
+              <w:br/>
+              <w:t xml:space="preserve">    });</w:t>
+              <w:br/>
+              <w:t xml:space="preserve">    const avgKpi = totalGestores &gt; 0 ? Math.round(totalPercentage / totalGestores) : 0;</w:t>
+              <w:br/>
+              <w:t xml:space="preserve">    if (statsKpi) {</w:t>
+              <w:br/>
+              <w:t xml:space="preserve">        statsKpi.textContent = `${avgKpi}%`;</w:t>
+              <w:br/>
+              <w:t xml:space="preserve">    }</w:t>
+              <w:br/>
+              <w:br/>
+              <w:t xml:space="preserve">    // Determine current shift based on active sessions or system hour</w:t>
+              <w:br/>
+              <w:t xml:space="preserve">    let shiftName = "Mañana";</w:t>
+              <w:br/>
+              <w:t xml:space="preserve">    const hour = new Date().getHours();</w:t>
+              <w:br/>
+              <w:t xml:space="preserve">    if (hour &gt;= 6 &amp;&amp; hour &lt; 14) {</w:t>
+              <w:br/>
+              <w:t xml:space="preserve">        shiftName = "Mañana";</w:t>
+              <w:br/>
+              <w:t xml:space="preserve">    } else if (hour &gt;= 14 &amp;&amp; hour &lt; 22) {</w:t>
+              <w:br/>
+              <w:t xml:space="preserve">        shiftName = "Tarde";</w:t>
+              <w:br/>
+              <w:t xml:space="preserve">    } else {</w:t>
+              <w:br/>
+              <w:t xml:space="preserve">        shiftName = "Noche";</w:t>
+              <w:br/>
+              <w:t xml:space="preserve">    }</w:t>
+              <w:br/>
+              <w:br/>
+              <w:t xml:space="preserve">    // Overwrite shift name if there is a dominant shift in active sessions</w:t>
+              <w:br/>
+              <w:t xml:space="preserve">    if (totalGestores &gt; 0) {</w:t>
+              <w:br/>
+              <w:t xml:space="preserve">        const shifts = uids.map(uid =&gt; allActiveSessions[uid] ? allActiveSessions[uid].shift : null).filter(Boolean);</w:t>
+              <w:br/>
+              <w:t xml:space="preserve">        if (shifts.length &gt; 0) {</w:t>
+              <w:br/>
+              <w:t xml:space="preserve">            const counts = {};</w:t>
+              <w:br/>
+              <w:t xml:space="preserve">            shifts.forEach(s =&gt; counts[s] = (counts[s] || 0) + 1);</w:t>
+              <w:br/>
+              <w:t xml:space="preserve">            let dominantShift = shiftName;</w:t>
+              <w:br/>
+              <w:t xml:space="preserve">            let maxCount = 0;</w:t>
+              <w:br/>
+              <w:t xml:space="preserve">            for (const [s, count] of Object.entries(counts)) {</w:t>
+              <w:br/>
+              <w:t xml:space="preserve">                if (count &gt; maxCount) {</w:t>
+              <w:br/>
+              <w:t xml:space="preserve">                    maxCount = count;</w:t>
+              <w:br/>
+              <w:t xml:space="preserve">                    dominantShift = s;</w:t>
+              <w:br/>
+              <w:t xml:space="preserve">                }</w:t>
+              <w:br/>
+              <w:t xml:space="preserve">            }</w:t>
+              <w:br/>
+              <w:t xml:space="preserve">            shiftName = dominantShift;</w:t>
+              <w:br/>
+              <w:t xml:space="preserve">        }</w:t>
+              <w:br/>
+              <w:t xml:space="preserve">    }</w:t>
+              <w:br/>
+              <w:br/>
+              <w:t xml:space="preserve">    if (statsTurno) {</w:t>
+              <w:br/>
+              <w:t xml:space="preserve">        statsTurno.textContent = shiftName;</w:t>
+              <w:br/>
+              <w:t xml:space="preserve">    }</w:t>
+              <w:br/>
+              <w:t>}</w:t>
+              <w:br/>
+              <w:br/>
+              <w:t>window.openMonitoreoDetails = function(uid) {</w:t>
+              <w:br/>
+              <w:t xml:space="preserve">    const session = allActiveSessions[uid];</w:t>
+              <w:br/>
+              <w:t xml:space="preserve">    if (!session) return;</w:t>
+              <w:br/>
+              <w:br/>
+              <w:t xml:space="preserve">    const fullName = (session.name || '').trim();</w:t>
+              <w:br/>
+              <w:t xml:space="preserve">    let matchedAvatar = availableAvatars.find(img =&gt; namesMatch(fullName, img.replace('.png', '')));</w:t>
+              <w:br/>
+              <w:t xml:space="preserve">    let avatarSrc = matchedAvatar ? `assets/src/img/${matchedAvatar}` : `https://ui-avatars.com/api/?name=${encodeURIComponent(fullName)}&amp;background=0D8ABC&amp;color=fff`;</w:t>
+              <w:br/>
+              <w:br/>
+              <w:t xml:space="preserve">    const avatarEl = document.getElementById('monitoreoModalAvatar');</w:t>
+              <w:br/>
+              <w:t xml:space="preserve">    if (avatarEl) {</w:t>
+              <w:br/>
+              <w:t xml:space="preserve">        avatarEl.src = avatarSrc;</w:t>
+              <w:br/>
+              <w:t xml:space="preserve">        avatarEl.onerror = function() {</w:t>
+              <w:br/>
+              <w:t xml:space="preserve">            this.onerror = null;</w:t>
+              <w:br/>
+              <w:t xml:space="preserve">            this.src = `https://ui-avatars.com/api/?name=${encodeURIComponent(fullName)}&amp;background=0D8ABC&amp;color=fff`;</w:t>
+              <w:br/>
+              <w:t xml:space="preserve">        };</w:t>
+              <w:br/>
+              <w:t xml:space="preserve">    }</w:t>
+              <w:br/>
+              <w:br/>
+              <w:t xml:space="preserve">    const nameEl = document.getElementById('monitoreoModalName');</w:t>
+              <w:br/>
+              <w:t xml:space="preserve">    if (nameEl) nameEl.textContent = "Tareas de " + fullName;</w:t>
+              <w:br/>
+              <w:t xml:space="preserve">    </w:t>
+              <w:br/>
+              <w:t xml:space="preserve">    const lastActiveTime = session.lastActive ? new Date(session.lastActive).toLocaleTimeString([], { hour: '2-digit', minute: '2-digit' }) : 'Nunca';</w:t>
+              <w:br/>
+              <w:t xml:space="preserve">    const infoEl = document.getElementById('monitoreoModalInfo');</w:t>
+              <w:br/>
+              <w:t xml:space="preserve">    if (infoEl) infoEl.textContent = `Turno: ${session.shift || 'Mañana'} | Última actividad: ${lastActiveTime}`;</w:t>
+              <w:br/>
+              <w:br/>
+              <w:t xml:space="preserve">    const tasksList = document.getElementById('monitoreoModalTasksList');</w:t>
+              <w:br/>
+              <w:t xml:space="preserve">    if (tasksList) {</w:t>
+              <w:br/>
+              <w:t xml:space="preserve">        tasksList.innerHTML = '';</w:t>
+              <w:br/>
+              <w:br/>
+              <w:t xml:space="preserve">        const tasks = session.tasks || {};</w:t>
+              <w:br/>
+              <w:t xml:space="preserve">        const taskIds = Object.keys(tasks);</w:t>
+              <w:br/>
+              <w:br/>
+              <w:t xml:space="preserve">        if (taskIds.length === 0) {</w:t>
+              <w:br/>
+              <w:t xml:space="preserve">            tasksList.innerHTML = `</w:t>
+              <w:br/>
+              <w:t xml:space="preserve">                &lt;div style="padding: 20px; text-align: center; color: var(--text-secondary);"&gt;</w:t>
+              <w:br/>
+              <w:t xml:space="preserve">                    Este gestor aún no ha registrado avances de tareas en su turno.</w:t>
+              <w:br/>
+              <w:t xml:space="preserve">                &lt;/div&gt;</w:t>
               <w:br/>
               <w:t xml:space="preserve">            `;</w:t>
               <w:br/>
-              <w:t xml:space="preserve">        });</w:t>
+              <w:t xml:space="preserve">        } else {</w:t>
+              <w:br/>
+              <w:t xml:space="preserve">            taskIds.forEach(id =&gt; {</w:t>
+              <w:br/>
+              <w:t xml:space="preserve">                const t = tasks[id];</w:t>
+              <w:br/>
+              <w:t xml:space="preserve">                </w:t>
+              <w:br/>
+              <w:t xml:space="preserve">                let badgeClass = 'pending';</w:t>
+              <w:br/>
+              <w:t xml:space="preserve">                if (t.status === 'Finalizada') badgeClass = 'completed';</w:t>
+              <w:br/>
+              <w:t xml:space="preserve">                else if (t.status === 'En Proceso') badgeClass = 'in-progress';</w:t>
+              <w:br/>
+              <w:t xml:space="preserve">                else if (t.status === 'No Realizada') badgeClass = 'not-done';</w:t>
+              <w:br/>
+              <w:br/>
+              <w:t xml:space="preserve">                const observationText = t.observation ? t.observation.trim() : 'Sin observaciones cargadas.';</w:t>
+              <w:br/>
+              <w:br/>
+              <w:t xml:space="preserve">                tasksList.innerHTML += `</w:t>
+              <w:br/>
+              <w:t xml:space="preserve">                    &lt;div style="background: rgba(255,255,255,0.02); border: 1px solid var(--glass-border); padding: 12px; border-radius: var(--radius-sm); display: flex; flex-direction: column; gap: 8px;"&gt;</w:t>
+              <w:br/>
+              <w:t xml:space="preserve">                        &lt;div style="display: flex; justify-content: space-between; align-items: start; gap: 10px;"&gt;</w:t>
+              <w:br/>
+              <w:t xml:space="preserve">                            &lt;span style="font-weight: 500; font-size: 13.5px; color: var(--text-primary);"&gt;${t.name}&lt;/span&gt;</w:t>
+              <w:br/>
+              <w:t xml:space="preserve">                            &lt;span class="monitoreo-task-badge ${badgeClass}"&gt;${t.status}&lt;/span&gt;</w:t>
+              <w:br/>
+              <w:t xml:space="preserve">                        &lt;/div&gt;</w:t>
+              <w:br/>
+              <w:t xml:space="preserve">                        &lt;div style="font-size: 12px; color: var(--text-secondary); background: rgba(0,0,0,0.15); padding: 8px; border-radius: 4px; border-left: 3px solid var(--accent-primary);"&gt;</w:t>
+              <w:br/>
+              <w:t xml:space="preserve">                            &lt;strong&gt;Notas Técnicas:&lt;/strong&gt; ${observationText}</w:t>
+              <w:br/>
+              <w:t xml:space="preserve">                        &lt;/div&gt;</w:t>
+              <w:br/>
+              <w:t xml:space="preserve">                    &lt;/div&gt;</w:t>
+              <w:br/>
+              <w:t xml:space="preserve">                `;</w:t>
+              <w:br/>
+              <w:t xml:space="preserve">            });</w:t>
+              <w:br/>
+              <w:t xml:space="preserve">        }</w:t>
               <w:br/>
               <w:t xml:space="preserve">    }</w:t>
               <w:br/>
               <w:br/>
-              <w:t xml:space="preserve">    // Poblar nombre en form de permisos y manejar envío por AJAX</w:t>
-              <w:br/>
-              <w:t xml:space="preserve">    if(currentUser) {</w:t>
-              <w:br/>
-              <w:t xml:space="preserve">        const pName = document.getElementById('permisoGestorName');</w:t>
-              <w:br/>
-              <w:t xml:space="preserve">        if(pName) pName.value = currentUser.name;</w:t>
-              <w:br/>
-              <w:t xml:space="preserve">    }</w:t>
-              <w:br/>
-              <w:t xml:space="preserve">    </w:t>
-              <w:br/>
-              <w:t xml:space="preserve">    // Botón de guardar progreso en tarea</w:t>
-              <w:br/>
-              <w:t xml:space="preserve">    const saveTaskBtn = document.getElementById('saveTaskBtn');</w:t>
-              <w:br/>
-              <w:t xml:space="preserve">    if(saveTaskBtn) {</w:t>
-              <w:br/>
-              <w:t xml:space="preserve">        saveTaskBtn.addEventListener('click', () =&gt; {</w:t>
-              <w:br/>
-              <w:t xml:space="preserve">            const selectedStatusBtn = document.querySelector('.btn-status.active');</w:t>
-              <w:br/>
-              <w:t xml:space="preserve">            </w:t>
-              <w:br/>
-              <w:t xml:space="preserve">            // Validación obligatoria para todas las tareas</w:t>
-              <w:br/>
-              <w:t xml:space="preserve">            const obsField = document.getElementById('taskObservation');</w:t>
-              <w:br/>
-              <w:t xml:space="preserve">            if(!obsField || !obsField.value.trim()) {</w:t>
-              <w:br/>
-              <w:t xml:space="preserve">                alert("OBLIGATORIO: Debes detallar la gestión realizada en las Notas Técnicas antes de guardar.");</w:t>
-              <w:br/>
-              <w:t xml:space="preserve">                return;</w:t>
-              <w:br/>
-              <w:t xml:space="preserve">            }</w:t>
-              <w:br/>
-              <w:br/>
-              <w:t xml:space="preserve">            const btn = saveTaskBtn;</w:t>
-              <w:br/>
-              <w:t xml:space="preserve">            const prevText = btn.innerHTML;</w:t>
-              <w:br/>
-              <w:t xml:space="preserve">            btn.innerHTML = "&lt;i class='bx bx-loader-alt bx-spin'&gt;&lt;/i&gt; Guardando...";</w:t>
-              <w:br/>
-              <w:t xml:space="preserve">            btn.disabled = true;</w:t>
-              <w:br/>
-              <w:br/>
-              <w:t xml:space="preserve">            setTimeout(() =&gt; {</w:t>
-              <w:br/>
-              <w:t xml:space="preserve">                btn.innerHTML = "&lt;i class='bx bx-check'&gt;&lt;/i&gt; Guardado Exitosamente";</w:t>
-              <w:br/>
-              <w:t xml:space="preserve">                btn.classList.add('btn-success');</w:t>
-              <w:br/>
-              <w:t xml:space="preserve">                </w:t>
-              <w:br/>
-              <w:t xml:space="preserve">                // Actualizar estado visual de la tarea activa en el árbol</w:t>
-              <w:br/>
-              <w:t xml:space="preserve">                const activeTask = document.querySelector('.task-item.active .task-status');</w:t>
-              <w:br/>
-              <w:t xml:space="preserve">                const selectedStatusBtn = document.querySelector('.btn-status.active');</w:t>
-              <w:br/>
-              <w:t xml:space="preserve">                </w:t>
-              <w:br/>
-              <w:t xml:space="preserve">                if(activeTask &amp;&amp; selectedStatusBtn) {</w:t>
-              <w:br/>
-              <w:t xml:space="preserve">                    // Limpiar clases anteriores</w:t>
-              <w:br/>
-              <w:t xml:space="preserve">                    activeTask.classList.remove('status-pending', 'status-completed', 'status-not-done', 'status-in-progress');</w:t>
-              <w:br/>
-              <w:t xml:space="preserve">                    </w:t>
-              <w:br/>
-              <w:t xml:space="preserve">                    if(selectedStatusBtn.classList.contains('completed')) {</w:t>
-              <w:br/>
-              <w:t xml:space="preserve">                        activeTask.classList.add('status-completed');</w:t>
-              <w:br/>
-              <w:t xml:space="preserve">                    } else if(selectedStatusBtn.classList.contains('in-progress')) {</w:t>
-              <w:br/>
-              <w:t xml:space="preserve">                        activeTask.classList.add('status-in-progress');</w:t>
-              <w:br/>
-              <w:t xml:space="preserve">                    } else if(selectedStatusBtn.classList.contains('not-done')) {</w:t>
-              <w:br/>
-              <w:t xml:space="preserve">                        activeTask.classList.add('status-not-done');</w:t>
-              <w:br/>
-              <w:t xml:space="preserve">                    } else {</w:t>
-              <w:br/>
-              <w:t xml:space="preserve">                        activeTask.classList.add('status-pending');</w:t>
-              <w:br/>
-              <w:t xml:space="preserve">                    }</w:t>
-              <w:br/>
-              <w:t xml:space="preserve">                    </w:t>
-              <w:br/>
-              <w:t xml:space="preserve">                    // Save to cache</w:t>
-              <w:br/>
-              <w:t xml:space="preserve">                    const obsValue = document.getElementById('taskObservation') ? document.getElementById('taskObservation').value : '';</w:t>
-              <w:br/>
-              <w:t xml:space="preserve">                    if(currentActiveTaskId !== null) {</w:t>
-              <w:br/>
-              <w:t xml:space="preserve">                        taskStateCache[currentActiveTaskId] = {</w:t>
-              <w:br/>
-              <w:t xml:space="preserve">                            name: currentSelectedTask ? currentSelectedTask['Tarea'] : 'Tarea ' + currentActiveTaskId,</w:t>
-              <w:br/>
-              <w:t xml:space="preserve">                            status: selectedStatusBtn.textContent.trim(),</w:t>
-              <w:br/>
-              <w:t xml:space="preserve">                            observation: obsValue</w:t>
-              <w:br/>
-              <w:t xml:space="preserve">                        };</w:t>
-              <w:br/>
-              <w:t xml:space="preserve">                        localStorage.setItem('riskOps_cache', JSON.stringify(taskStateCache));</w:t>
-              <w:br/>
-              <w:t xml:space="preserve">                    }</w:t>
-              <w:br/>
-              <w:t xml:space="preserve">                    </w:t>
-              <w:br/>
-              <w:t xml:space="preserve">                    updateKPI();</w:t>
-              <w:br/>
-              <w:t xml:space="preserve">                }</w:t>
-              <w:br/>
-              <w:br/>
-              <w:t xml:space="preserve">                setTimeout(() =&gt; {</w:t>
-              <w:br/>
-              <w:t xml:space="preserve">                    btn.innerHTML = prevText;</w:t>
-              <w:br/>
-              <w:t xml:space="preserve">                    btn.disabled = false;</w:t>
-              <w:br/>
-              <w:t xml:space="preserve">                    btn.classList.remove('btn-success');</w:t>
-              <w:br/>
-              <w:t xml:space="preserve">                }, 2000);</w:t>
-              <w:br/>
-              <w:t xml:space="preserve">            }, 800);</w:t>
-              <w:br/>
-              <w:t xml:space="preserve">        });</w:t>
-              <w:br/>
-              <w:t xml:space="preserve">    }</w:t>
-              <w:br/>
-              <w:br/>
-              <w:t xml:space="preserve">    const pForm = document.getElementById('permisosForm');</w:t>
-              <w:br/>
-              <w:t xml:space="preserve">    </w:t>
-              <w:br/>
-              <w:t xml:space="preserve">    // Toggle para la opción "Otro"</w:t>
-              <w:br/>
-              <w:t xml:space="preserve">    const pSelect = document.getElementById('tipoPermisoSelect');</w:t>
-              <w:br/>
-              <w:t xml:space="preserve">    const pOtroCont = document.getElementById('otroPermisoContainer');</w:t>
-              <w:br/>
-              <w:t xml:space="preserve">    const pOtroInp = document.getElementById('otroPermisoInput');</w:t>
-              <w:br/>
-              <w:t xml:space="preserve">    if(pSelect &amp;&amp; pOtroCont &amp;&amp; pOtroInp) {</w:t>
-              <w:br/>
-              <w:t xml:space="preserve">        pSelect.addEventListener('change', (e) =&gt; {</w:t>
-              <w:br/>
-              <w:t xml:space="preserve">            if(e.target.value === 'Otro') {</w:t>
-              <w:br/>
-              <w:t xml:space="preserve">                pOtroCont.style.display = 'block';</w:t>
-              <w:br/>
-              <w:t xml:space="preserve">                pOtroInp.required = true;</w:t>
-              <w:br/>
-              <w:t xml:space="preserve">            } else {</w:t>
-              <w:br/>
-              <w:t xml:space="preserve">                pOtroCont.style.display = 'none';</w:t>
-              <w:br/>
-              <w:t xml:space="preserve">                pOtroInp.required = false;</w:t>
-              <w:br/>
-              <w:t xml:space="preserve">                pOtroInp.value = '';</w:t>
-              <w:br/>
-              <w:t xml:space="preserve">            }</w:t>
-              <w:br/>
-              <w:t xml:space="preserve">        });</w:t>
-              <w:br/>
-              <w:t xml:space="preserve">    }</w:t>
-              <w:br/>
-              <w:br/>
-              <w:t xml:space="preserve">    if(pForm) {</w:t>
-              <w:br/>
-              <w:t xml:space="preserve">        pForm.addEventListener('submit', async function(e) {</w:t>
-              <w:br/>
-              <w:t xml:space="preserve">            e.preventDefault(); // Evitar recarga</w:t>
-              <w:br/>
-              <w:t xml:space="preserve">            </w:t>
-              <w:br/>
-              <w:t xml:space="preserve">            const formData = new FormData(pForm);</w:t>
-              <w:br/>
-              <w:t xml:space="preserve">            </w:t>
-              <w:br/>
-              <w:t xml:space="preserve">            const tipo = formData.get("Tipo_Permiso");</w:t>
-              <w:br/>
-              <w:t xml:space="preserve">            const especifico = formData.get("Especificacion_Otro");</w:t>
-              <w:br/>
-              <w:t xml:space="preserve">            const finalTipo = tipo === 'Otro' ? `Otro (${especifico})` : tipo;</w:t>
-              <w:br/>
-              <w:br/>
-              <w:t xml:space="preserve">            const newPermiso = {</w:t>
-              <w:br/>
-              <w:t xml:space="preserve">                id: Date.now(),</w:t>
-              <w:br/>
-              <w:t xml:space="preserve">                gestor: formData.get("Gestor"),</w:t>
-              <w:br/>
-              <w:t xml:space="preserve">                tipo: finalTipo,</w:t>
-              <w:br/>
-              <w:t xml:space="preserve">                fecha: formData.get("Fecha"),</w:t>
-              <w:br/>
-              <w:t xml:space="preserve">                horaInicio: formData.get("Hora_Inicio"),</w:t>
-              <w:br/>
-              <w:t xml:space="preserve">                horaFin: formData.get("Hora_Fin"),</w:t>
-              <w:br/>
-              <w:t xml:space="preserve">                motivo: formData.get("Justificacion"),</w:t>
-              <w:br/>
-              <w:t xml:space="preserve">                status: 'Pendiente',</w:t>
-              <w:br/>
-              <w:t xml:space="preserve">                notified: false,</w:t>
-              <w:br/>
-              <w:t xml:space="preserve">                notified_admin: false</w:t>
-              <w:br/>
-              <w:t xml:space="preserve">            };</w:t>
-              <w:br/>
-              <w:t xml:space="preserve">            </w:t>
-              <w:br/>
-              <w:t xml:space="preserve">            const btn = pForm.querySelector('button[type="submit"]');</w:t>
-              <w:br/>
-              <w:t xml:space="preserve">            const prevText = btn.innerHTML;</w:t>
-              <w:br/>
-              <w:t xml:space="preserve">            btn.innerHTML = "&lt;i class='bx bx-loader-alt bx-spin'&gt;&lt;/i&gt; Enviando solicitud...";</w:t>
-              <w:br/>
-              <w:t xml:space="preserve">            btn.disabled = true;</w:t>
-              <w:br/>
-              <w:br/>
-              <w:t xml:space="preserve">            try {</w:t>
-              <w:br/>
-              <w:t xml:space="preserve">                await database.ref('permissions').push(newPermiso);</w:t>
-              <w:br/>
-              <w:t xml:space="preserve">            } catch(e) {</w:t>
-              <w:br/>
-              <w:t xml:space="preserve">                console.error("Error Firebase local", e);</w:t>
-              <w:br/>
-              <w:t xml:space="preserve">            }</w:t>
-              <w:br/>
-              <w:br/>
-              <w:t xml:space="preserve">            fetch(pForm.action, {</w:t>
-              <w:br/>
-              <w:t xml:space="preserve">                method: pForm.method,</w:t>
-              <w:br/>
-              <w:t xml:space="preserve">                body: formData,</w:t>
-              <w:br/>
-              <w:t xml:space="preserve">                headers: { 'Accept': 'application/json' }</w:t>
-              <w:br/>
-              <w:t xml:space="preserve">            }).then(response =&gt; {</w:t>
-              <w:br/>
-              <w:t xml:space="preserve">                if(response.ok) {</w:t>
-              <w:br/>
-              <w:t xml:space="preserve">                    alert('¡Permiso solicitado exitosamente! Está pendiente de aprobación.');</w:t>
-              <w:br/>
-              <w:t xml:space="preserve">                    pForm.reset();</w:t>
-              <w:br/>
-              <w:t xml:space="preserve">                    if(currentUser) pForm.querySelector('#permisoGestorName').value = currentUser.name;</w:t>
-              <w:br/>
-              <w:t xml:space="preserve">                    loadPermisos(); // Refresh local permissions UI if they are an admin looking at it</w:t>
-              <w:br/>
-              <w:t xml:space="preserve">                } else {</w:t>
-              <w:br/>
-              <w:t xml:space="preserve">                    alert('Hubo un error contactando el servidor de correos.');</w:t>
-              <w:br/>
-              <w:t xml:space="preserve">                }</w:t>
-              <w:br/>
-              <w:t xml:space="preserve">            }).catch(err =&gt; {</w:t>
-              <w:br/>
-              <w:t xml:space="preserve">                alert('No hay Internet. Se simula envío exitoso.');</w:t>
-              <w:br/>
-              <w:t xml:space="preserve">            }).finally(() =&gt; {</w:t>
-              <w:br/>
-              <w:t xml:space="preserve">                btn.innerHTML = prevText;</w:t>
-              <w:br/>
-              <w:t xml:space="preserve">                btn.disabled = false;</w:t>
-              <w:br/>
-              <w:t xml:space="preserve">            });</w:t>
-              <w:br/>
-              <w:t xml:space="preserve">        });</w:t>
-              <w:br/>
-              <w:t xml:space="preserve">    }</w:t>
-              <w:br/>
-              <w:t>}</w:t>
-              <w:br/>
-              <w:br/>
-              <w:t>// Lógica explícita para el botón (llamado desde onclick en html)</w:t>
-              <w:br/>
-              <w:t>function handleEndShift() {</w:t>
-              <w:br/>
-              <w:t xml:space="preserve">    if(confirm("¿Estás seguro que deseas finalizar tu turno actual? Se enviará un resumen al supervisor.")) {</w:t>
-              <w:br/>
-              <w:t xml:space="preserve">        </w:t>
-              <w:br/>
-              <w:t xml:space="preserve">        let currentUser = null;</w:t>
-              <w:br/>
-              <w:t xml:space="preserve">        try { currentUser = JSON.parse(localStorage.getItem('riskOps_currentUser')); } catch(e) {}</w:t>
-              <w:br/>
-              <w:t xml:space="preserve">        </w:t>
-              <w:br/>
-              <w:t xml:space="preserve">        if (currentUser) {</w:t>
-              <w:br/>
-              <w:t xml:space="preserve">            // Build task report</w:t>
-              <w:br/>
-              <w:t xml:space="preserve">            const setSelect = document.getElementById('activeSetSelect');</w:t>
-              <w:br/>
-              <w:t xml:space="preserve">            if(setSelect &amp;&amp; setSelect.value === 'Todos') {</w:t>
-              <w:br/>
-              <w:t xml:space="preserve">                alert("OBLIGATORIO: Debes seleccionar el SET específico en el que trabajaste antes de finalizar el turno (Arriba a la derecha).");</w:t>
-              <w:br/>
-              <w:t xml:space="preserve">                return;</w:t>
-              <w:br/>
-              <w:t xml:space="preserve">            }</w:t>
-              <w:br/>
-              <w:br/>
-              <w:t xml:space="preserve">            const formData = new FormData();</w:t>
-              <w:br/>
-              <w:t xml:space="preserve">            </w:t>
-              <w:br/>
-              <w:t xml:space="preserve">            // Format login time</w:t>
-              <w:br/>
-              <w:t xml:space="preserve">            const loginDate = new Date(currentUser.loginTime);</w:t>
-              <w:br/>
-              <w:t xml:space="preserve">            </w:t>
-              <w:br/>
-              <w:t xml:space="preserve">            formData.append("Usuario", currentUser.name);</w:t>
-              <w:br/>
-              <w:t xml:space="preserve">            formData.append("Rol", currentUser.role);</w:t>
-              <w:br/>
-              <w:t xml:space="preserve">            formData.append("Reporte", "CIERRE DE TURNO Y RESUMEN DE TAREAS");</w:t>
-              <w:br/>
-              <w:t xml:space="preserve">            formData.append("Hora_Inicio_Turno", loginDate.toLocaleString());</w:t>
-              <w:br/>
-              <w:t xml:space="preserve">            formData.append("Hora_Fin_Turno", new Date().toLocaleString());</w:t>
-              <w:br/>
-              <w:t xml:space="preserve">            </w:t>
-              <w:br/>
-              <w:t xml:space="preserve">            if(setSelect) {</w:t>
-              <w:br/>
-              <w:t xml:space="preserve">                formData.append("SET_Principal_Trabajado", setSelect.value);</w:t>
-              <w:br/>
-              <w:t xml:space="preserve">            }</w:t>
-              <w:br/>
-              <w:t xml:space="preserve">            </w:t>
-              <w:br/>
-              <w:t xml:space="preserve">            formData.append("_subject", `Reporte de Turno: ${currentUser.name}`);</w:t>
-              <w:br/>
-              <w:t xml:space="preserve">            formData.append("_captcha", "false");</w:t>
-              <w:br/>
-              <w:t xml:space="preserve">            formData.append("_cc", "sara.santamaria@virtualsoft.tech");</w:t>
-              <w:br/>
-              <w:t xml:space="preserve">            </w:t>
-              <w:br/>
-              <w:t xml:space="preserve">            // Build task report</w:t>
-              <w:br/>
-              <w:t xml:space="preserve">            let report = "";</w:t>
-              <w:br/>
-              <w:t xml:space="preserve">            let keys = Object.keys(taskStateCache);</w:t>
-              <w:br/>
-              <w:t xml:space="preserve">            if(keys.length === 0) {</w:t>
-              <w:br/>
-              <w:t xml:space="preserve">                report = "El gestor no marcó ninguna tarea explícitamente durante este turno.";</w:t>
-              <w:br/>
-              <w:t xml:space="preserve">            } else {</w:t>
-              <w:br/>
-              <w:t xml:space="preserve">                keys.forEach(id =&gt; {</w:t>
-              <w:br/>
-              <w:t xml:space="preserve">                    let t = taskStateCache[id];</w:t>
-              <w:br/>
-              <w:t xml:space="preserve">                    report += `\n[ ${t.status.toUpperCase()} ] - ${t.name}\nObservación: ${t.observation || 'N/A'}\n`;</w:t>
-              <w:br/>
-              <w:t xml:space="preserve">                });</w:t>
-              <w:br/>
-              <w:t xml:space="preserve">            }</w:t>
-              <w:br/>
-              <w:t xml:space="preserve">            formData.append("Resumen_de_Tareas", report);</w:t>
-              <w:br/>
-              <w:t xml:space="preserve">            </w:t>
-              <w:br/>
-              <w:t xml:space="preserve">            // Reemplazar texto del botón para feedback visual</w:t>
-              <w:br/>
-              <w:t xml:space="preserve">            const btn = document.getElementById('endShiftBtn');</w:t>
-              <w:br/>
-              <w:t xml:space="preserve">            const prevHtml = btn ? btn.innerHTML : '';</w:t>
-              <w:br/>
-              <w:t xml:space="preserve">            if(btn) {</w:t>
-              <w:br/>
-              <w:t xml:space="preserve">                btn.innerHTML = "&lt;i class='bx bx-loader-alt bx-spin'&gt;&lt;/i&gt; Notificando...";</w:t>
-              <w:br/>
-              <w:t xml:space="preserve">                btn.disabled = true;</w:t>
-              <w:br/>
-              <w:t xml:space="preserve">            }</w:t>
-              <w:br/>
-              <w:br/>
-              <w:t xml:space="preserve">            // --- RESPALDO SEGURO EN FIREBASE ---</w:t>
-              <w:br/>
-              <w:t xml:space="preserve">            const shiftReportObject = {</w:t>
-              <w:br/>
-              <w:t xml:space="preserve">                gestor: currentUser.name,</w:t>
-              <w:br/>
-              <w:t xml:space="preserve">                rol: currentUser.role,</w:t>
-              <w:br/>
-              <w:t xml:space="preserve">                horaInicio: loginDate.toLocaleString(),</w:t>
-              <w:br/>
-              <w:t xml:space="preserve">                horaFin: new Date().toLocaleString(),</w:t>
-              <w:br/>
-              <w:t xml:space="preserve">                setTrabajado: setSelect ? setSelect.value : 'N/A',</w:t>
-              <w:br/>
-              <w:t xml:space="preserve">                reporte: report,</w:t>
-              <w:br/>
-              <w:t xml:space="preserve">                timestamp: Date.now()</w:t>
-              <w:br/>
-              <w:t xml:space="preserve">            };</w:t>
-              <w:br/>
-              <w:br/>
-              <w:t xml:space="preserve">            // Intentamos guardar en firebase pero no bloqueamos el flujo si hay error</w:t>
-              <w:br/>
-              <w:t xml:space="preserve">            database.ref('shift_reports').push(shiftReportObject).catch(e =&gt; console.error("Firebase backup failed", e));</w:t>
-              <w:br/>
-              <w:br/>
-              <w:t xml:space="preserve">            // Eliminar sesión activa de Firebase</w:t>
-              <w:br/>
-              <w:t xml:space="preserve">            if (currentUser.uid) {</w:t>
-              <w:br/>
-              <w:t xml:space="preserve">                database.ref('active_sessions/' + currentUser.uid).remove().catch(e =&gt; console.error("Error removing active session on shift end:", e));</w:t>
-              <w:br/>
-              <w:t xml:space="preserve">            }</w:t>
-              <w:br/>
-              <w:br/>
-              <w:t xml:space="preserve">            // Antes de enviar, limpiamos la sesión y el caché</w:t>
-              <w:br/>
-              <w:t xml:space="preserve">            localStorage.removeItem('riskOps_currentUser');</w:t>
-              <w:br/>
-              <w:t xml:space="preserve">            localStorage.removeItem('riskOps_cache');</w:t>
-              <w:br/>
-              <w:t xml:space="preserve">            firebase.auth().signOut().catch(err =&gt; console.error(err));</w:t>
-              <w:br/>
-              <w:t xml:space="preserve">            </w:t>
-              <w:br/>
-              <w:t xml:space="preserve">            // Enviar de forma silenciosa para que un error 522 de Cloudflare no bloquee la pantalla</w:t>
-              <w:br/>
-              <w:t xml:space="preserve">            fetch('https://formsubmit.co/ajax/maria.sanchez@virtualsoft.tech', {</w:t>
-              <w:br/>
-              <w:t xml:space="preserve">                method: 'POST',</w:t>
-              <w:br/>
-              <w:t xml:space="preserve">                body: formData,</w:t>
-              <w:br/>
-              <w:t xml:space="preserve">                headers: { 'Accept': 'application/json' }</w:t>
-              <w:br/>
-              <w:t xml:space="preserve">            }).then(response =&gt; {</w:t>
-              <w:br/>
-              <w:t xml:space="preserve">                if(response.ok) {</w:t>
-              <w:br/>
-              <w:t xml:space="preserve">                    alert('Turno finalizado y reporte enviado al supervisor.');</w:t>
-              <w:br/>
-              <w:t xml:space="preserve">                } else {</w:t>
-              <w:br/>
-              <w:t xml:space="preserve">                    alert('Turno finalizado localmente. Nota: El servidor de correos está inactivo temporalmente.');</w:t>
-              <w:br/>
-              <w:t xml:space="preserve">                }</w:t>
-              <w:br/>
-              <w:t xml:space="preserve">            }).catch(err =&gt; {</w:t>
-              <w:br/>
-              <w:t xml:space="preserve">                alert('Turno finalizado. (Error de red al intentar enviar el correo).');</w:t>
-              <w:br/>
-              <w:t xml:space="preserve">            }).finally(() =&gt; {</w:t>
-              <w:br/>
-              <w:t xml:space="preserve">                window.location.href = 'login.html';</w:t>
-              <w:br/>
-              <w:t xml:space="preserve">            });</w:t>
-              <w:br/>
-              <w:t xml:space="preserve">        } else {</w:t>
-              <w:br/>
-              <w:t xml:space="preserve">            alert("Turno finalizado.");</w:t>
-              <w:br/>
-              <w:t xml:space="preserve">            localStorage.removeItem('riskOps_currentUser');</w:t>
-              <w:br/>
-              <w:t xml:space="preserve">            localStorage.removeItem('riskOps_cache');</w:t>
-              <w:br/>
-              <w:t xml:space="preserve">            firebase.auth().signOut().catch(err =&gt; console.error(err));</w:t>
-              <w:br/>
-              <w:t xml:space="preserve">            window.location.href = 'login.html';</w:t>
-              <w:br/>
-              <w:t xml:space="preserve">        }</w:t>
-              <w:br/>
-              <w:t xml:space="preserve">    }</w:t>
-              <w:br/>
-              <w:t>}</w:t>
-              <w:br/>
-              <w:br/>
-              <w:t>// Inicializar inmediatamente ya que el script está al final del DOM</w:t>
-              <w:br/>
-              <w:t>initApp();</w:t>
-              <w:br/>
-              <w:br/>
-              <w:t>// Modal Logic</w:t>
-              <w:br/>
-              <w:t>function openExceptionModal() {</w:t>
-              <w:br/>
-              <w:t xml:space="preserve">    // Set 'not-done' active visually</w:t>
-              <w:br/>
-              <w:t xml:space="preserve">    document.querySelectorAll('.btn-status').forEach(b =&gt; b.classList.remove('active'));</w:t>
-              <w:br/>
-              <w:t xml:space="preserve">    document.querySelector('.btn-status.not-done').classList.add('active');</w:t>
-              <w:br/>
-              <w:t xml:space="preserve">    </w:t>
-              <w:br/>
-              <w:t xml:space="preserve">    // Clear previous exception inputs!</w:t>
-              <w:br/>
-              <w:t xml:space="preserve">    const exReason = document.getElementById('exceptionReason');</w:t>
-              <w:br/>
-              <w:t xml:space="preserve">    if(exReason) exReason.value = "";</w:t>
-              <w:br/>
-              <w:t xml:space="preserve">    const exDetails = document.getElementById('exceptionDetails');</w:t>
-              <w:br/>
-              <w:t xml:space="preserve">    if(exDetails) exDetails.value = "";</w:t>
-              <w:br/>
-              <w:t xml:space="preserve">    </w:t>
-              <w:br/>
-              <w:t xml:space="preserve">    // Open Modal</w:t>
-              <w:br/>
-              <w:t xml:space="preserve">    const modal = document.getElementById('exceptionModal');</w:t>
-              <w:br/>
-              <w:t xml:space="preserve">    if(modal) {</w:t>
-              <w:br/>
-              <w:t xml:space="preserve">        modal.classList.add('active');</w:t>
-              <w:br/>
-              <w:t xml:space="preserve">    }</w:t>
-              <w:br/>
-              <w:t>}</w:t>
-              <w:br/>
-              <w:br/>
-              <w:t>function closeModal(modalId) {</w:t>
-              <w:br/>
-              <w:t xml:space="preserve">    const modal = document.getElementById(modalId);</w:t>
-              <w:br/>
-              <w:t xml:space="preserve">    if(modal) {</w:t>
-              <w:br/>
-              <w:t xml:space="preserve">        modal.classList.remove('active');</w:t>
-              <w:br/>
-              <w:t xml:space="preserve">    }</w:t>
-              <w:br/>
-              <w:t>}</w:t>
-              <w:br/>
-              <w:br/>
-              <w:t>function confirmException() {</w:t>
-              <w:br/>
-              <w:t xml:space="preserve">    const select = document.getElementById('exceptionReason');</w:t>
-              <w:br/>
-              <w:t xml:space="preserve">    const reasonText = select.options[select.selectedIndex].text;</w:t>
-              <w:br/>
-              <w:t xml:space="preserve">    const details = document.getElementById('exceptionDetails').value.trim();</w:t>
-              <w:br/>
-              <w:t xml:space="preserve">    </w:t>
-              <w:br/>
-              <w:t xml:space="preserve">    if(!select.value) {</w:t>
-              <w:br/>
-              <w:t xml:space="preserve">        alert('Por favor seleccione una razón principal.');</w:t>
-              <w:br/>
-              <w:t xml:space="preserve">        return;</w:t>
-              <w:br/>
-              <w:t xml:space="preserve">    }</w:t>
-              <w:br/>
-              <w:t xml:space="preserve">    </w:t>
-              <w:br/>
-              <w:t xml:space="preserve">    if(!details) {</w:t>
-              <w:br/>
-              <w:t xml:space="preserve">        alert('Por favor detalle el problema obligatoriamente.');</w:t>
-              <w:br/>
-              <w:t xml:space="preserve">        return;</w:t>
-              <w:br/>
-              <w:t xml:space="preserve">    }</w:t>
-              <w:br/>
-              <w:t xml:space="preserve">    </w:t>
-              <w:br/>
-              <w:t xml:space="preserve">    const obsText = `Excepción: ${reasonText}${details ? ' - ' + details : ''}`;</w:t>
-              <w:br/>
-              <w:t xml:space="preserve">    document.getElementById('taskObservation').value = obsText;</w:t>
-              <w:br/>
-              <w:t xml:space="preserve">    closeModal('exceptionModal');</w:t>
-              <w:br/>
-              <w:t>}</w:t>
-              <w:br/>
-              <w:br/>
-              <w:t>// Logic for Approving Users</w:t>
-              <w:br/>
-              <w:t>async function renderPendingUsers() {</w:t>
-              <w:br/>
-              <w:t xml:space="preserve">    const tbody = document.getElementById('pendingUsersTableBody');</w:t>
-              <w:br/>
-              <w:t xml:space="preserve">    if (!tbody) return;</w:t>
-              <w:br/>
-              <w:t xml:space="preserve">    </w:t>
-              <w:br/>
-              <w:t xml:space="preserve">    let users = [];</w:t>
-              <w:br/>
-              <w:t xml:space="preserve">    try { </w:t>
-              <w:br/>
-              <w:t xml:space="preserve">        const snapshot = await database.ref('users').once('value');</w:t>
-              <w:br/>
-              <w:t xml:space="preserve">        if (snapshot.exists()) {</w:t>
-              <w:br/>
-              <w:t xml:space="preserve">            const data = snapshot.val();</w:t>
-              <w:br/>
-              <w:t xml:space="preserve">            users = Object.keys(data).map(k =&gt; ({...data[k], id: k}));</w:t>
-              <w:br/>
-              <w:t xml:space="preserve">        }</w:t>
-              <w:br/>
-              <w:t xml:space="preserve">    } catch(e) {</w:t>
-              <w:br/>
-              <w:t xml:space="preserve">        console.error(e);</w:t>
-              <w:br/>
-              <w:t xml:space="preserve">    }</w:t>
-              <w:br/>
-              <w:t xml:space="preserve">    </w:t>
-              <w:br/>
-              <w:t xml:space="preserve">    const pending = users.filter(u =&gt; u.approved === false);</w:t>
-              <w:br/>
-              <w:t xml:space="preserve">    const approved = users.filter(u =&gt; u.approved === true &amp;&amp; u.email !== 'maria.sanchez@virtualsoft.tech');</w:t>
-              <w:br/>
-              <w:t xml:space="preserve">    </w:t>
-              <w:br/>
-              <w:t xml:space="preserve">    tbody.innerHTML = '';</w:t>
-              <w:br/>
-              <w:t xml:space="preserve">    </w:t>
-              <w:br/>
-              <w:t xml:space="preserve">    // Mostramos primero los pendientes, luego los aprobados</w:t>
-              <w:br/>
-              <w:t xml:space="preserve">    const allDisplayUsers = [...pending, ...approved];</w:t>
-              <w:br/>
-              <w:t xml:space="preserve">    </w:t>
-              <w:br/>
-              <w:t xml:space="preserve">    if (allDisplayUsers.length === 0) {</w:t>
-              <w:br/>
-              <w:t xml:space="preserve">        tbody.innerHTML = `&lt;tr&gt;&lt;td colspan="4" style="padding: 20px; text-align: center; color: var(--text-secondary);"&gt;No hay usuarios registrados en el sistema.&lt;/td&gt;&lt;/tr&gt;`;</w:t>
-              <w:br/>
-              <w:t xml:space="preserve">        return;</w:t>
-              <w:br/>
-              <w:t xml:space="preserve">    }</w:t>
-              <w:br/>
-              <w:t xml:space="preserve">    </w:t>
-              <w:br/>
-              <w:t xml:space="preserve">    allDisplayUsers.forEach(user =&gt; {</w:t>
-              <w:br/>
-              <w:t xml:space="preserve">        let actionHtml = '';</w:t>
-              <w:br/>
-              <w:t xml:space="preserve">        if (user.approved === true) {</w:t>
-              <w:br/>
-              <w:t xml:space="preserve">            actionHtml = `&lt;span style="color: var(--success); font-weight: bold;"&gt;&lt;i class='bx bx-check'&gt;&lt;/i&gt; Aprobado&lt;/span&gt;`;</w:t>
-              <w:br/>
-              <w:t xml:space="preserve">        } else if (user.approved === 'Rechazado') {</w:t>
-              <w:br/>
-              <w:t xml:space="preserve">            actionHtml = `&lt;span style="color: var(--danger); font-weight: bold;"&gt;&lt;i class='bx bx-x'&gt;&lt;/i&gt; Rechazado&lt;/span&gt;`;</w:t>
-              <w:br/>
-              <w:t xml:space="preserve">        } else {</w:t>
-              <w:br/>
-              <w:t xml:space="preserve">            actionHtml = `</w:t>
-              <w:br/>
-              <w:t xml:space="preserve">                &lt;div id="user-action-btns-${user.id}" style="display:flex; justify-content:center; gap:5px;"&gt;</w:t>
-              <w:br/>
-              <w:t xml:space="preserve">                    &lt;button class="btn btn-success" style="padding: 5px 10px; font-size: 12px;" onclick="approveUser('${user.id}')"&gt;Aprobar&lt;/button&gt;</w:t>
-              <w:br/>
-              <w:t xml:space="preserve">                    &lt;button class="btn btn-danger" style="padding: 5px 10px; font-size: 12px;" onclick="showUserRejectBox('${user.id}')"&gt;Rechazar&lt;/button&gt;</w:t>
-              <w:br/>
-              <w:t xml:space="preserve">                &lt;/div&gt;</w:t>
-              <w:br/>
-              <w:t xml:space="preserve">                &lt;div id="user-reject-box-${user.id}" style="display:none; flex-direction:column; gap:5px; margin-top:5px;"&gt;</w:t>
-              <w:br/>
-              <w:t xml:space="preserve">                    &lt;input type="text" id="user-reason-${user.id}" placeholder="Motivo de rechazo" class="modern-input" style="padding:4px; font-size:11px; width:100%;"&gt;</w:t>
-              <w:br/>
-              <w:t xml:space="preserve">                    &lt;div style="display:flex; gap:5px; justify-content:center;"&gt;</w:t>
-              <w:br/>
-              <w:t xml:space="preserve">                        &lt;button class="btn btn-danger" style="padding: 2px 5px; font-size: 10px;" onclick="confirmRejectUser('${user.id}')"&gt;Confirmar&lt;/button&gt;</w:t>
-              <w:br/>
-              <w:t xml:space="preserve">                        &lt;button class="btn btn-outline" style="padding: 2px 5px; font-size: 10px;" onclick="cancelRejectUser('${user.id}')"&gt;Cancelar&lt;/button&gt;</w:t>
-              <w:br/>
-              <w:t xml:space="preserve">                    &lt;/div&gt;</w:t>
-              <w:br/>
-              <w:t xml:space="preserve">                &lt;/div&gt;</w:t>
-              <w:br/>
-              <w:t xml:space="preserve">            `;</w:t>
-              <w:br/>
-              <w:t xml:space="preserve">        }</w:t>
-              <w:br/>
-              <w:t xml:space="preserve">        </w:t>
-              <w:br/>
-              <w:t xml:space="preserve">        let statusBadge = user.approved ? `&lt;span class="badge" style="background: rgba(16, 185, 129, 0.2); color: var(--success);"&gt;${user.role}&lt;/span&gt;` : `&lt;span class="badge pending"&gt;${user.role}&lt;/span&gt;`;</w:t>
-              <w:br/>
-              <w:br/>
-              <w:t xml:space="preserve">        tbody.innerHTML += `</w:t>
-              <w:br/>
-              <w:t xml:space="preserve">            &lt;tr style="border-bottom: 1px solid var(--glass-border);"&gt;</w:t>
-              <w:br/>
-              <w:t xml:space="preserve">                &lt;td style="padding: 12px;"&gt;${user.name}&lt;/td&gt;</w:t>
-              <w:br/>
-              <w:t xml:space="preserve">                &lt;td style="padding: 12px; color: var(--text-secondary);"&gt;${user.email}&lt;/td&gt;</w:t>
-              <w:br/>
-              <w:t xml:space="preserve">                &lt;td style="padding: 12px;"&gt;${statusBadge}&lt;/td&gt;</w:t>
-              <w:br/>
-              <w:t xml:space="preserve">                &lt;td style="padding: 12px; text-align: center;"&gt;</w:t>
-              <w:br/>
-              <w:t xml:space="preserve">                    ${actionHtml}</w:t>
-              <w:br/>
-              <w:t xml:space="preserve">                &lt;/td&gt;</w:t>
-              <w:br/>
-              <w:t xml:space="preserve">            &lt;/tr&gt;</w:t>
-              <w:br/>
-              <w:t xml:space="preserve">        `;</w:t>
-              <w:br/>
-              <w:t xml:space="preserve">    });</w:t>
-              <w:br/>
-              <w:t>}</w:t>
-              <w:br/>
-              <w:br/>
-              <w:t>async function approveUser(userId) {</w:t>
-              <w:br/>
-              <w:t xml:space="preserve">    if(!confirm(`¿Estás seguro de aprobar el acceso para este usuario?`)) return;</w:t>
-              <w:br/>
-              <w:t xml:space="preserve">    </w:t>
-              <w:br/>
-              <w:t xml:space="preserve">    try {</w:t>
-              <w:br/>
-              <w:t xml:space="preserve">        await database.ref('users/' + userId).update({</w:t>
-              <w:br/>
-              <w:t xml:space="preserve">            approved: true</w:t>
-              <w:br/>
-              <w:t xml:space="preserve">        });</w:t>
-              <w:br/>
-              <w:t xml:space="preserve">        alert('Usuario aprobado exitosamente. Ahora puede iniciar sesión.');</w:t>
-              <w:br/>
-              <w:t xml:space="preserve">        renderPendingUsers(); // Reload table</w:t>
-              <w:br/>
-              <w:t xml:space="preserve">    } catch(e) {</w:t>
-              <w:br/>
-              <w:t xml:space="preserve">        alert('Error al contactar al servidor');</w:t>
-              <w:br/>
-              <w:t xml:space="preserve">    }</w:t>
-              <w:br/>
-              <w:t>}</w:t>
-              <w:br/>
-              <w:br/>
-              <w:t>function showUserRejectBox(id) {</w:t>
-              <w:br/>
-              <w:t xml:space="preserve">    document.getElementById('user-action-btns-' + id).style.display = 'none';</w:t>
-              <w:br/>
-              <w:t xml:space="preserve">    document.getElementById('user-reject-box-' + id).style.display = 'flex';</w:t>
-              <w:br/>
-              <w:t>}</w:t>
-              <w:br/>
-              <w:br/>
-              <w:t>function cancelRejectUser(id) {</w:t>
-              <w:br/>
-              <w:t xml:space="preserve">    document.getElementById('user-reject-box-' + id).style.display = 'none';</w:t>
-              <w:br/>
-              <w:t xml:space="preserve">    document.getElementById('user-action-btns-' + id).style.display = 'flex';</w:t>
-              <w:br/>
-              <w:t xml:space="preserve">    document.getElementById('user-reason-' + id).value = '';</w:t>
-              <w:br/>
-              <w:t>}</w:t>
-              <w:br/>
-              <w:br/>
-              <w:t>async function confirmRejectUser(userId) {</w:t>
-              <w:br/>
-              <w:t xml:space="preserve">    const reason = document.getElementById('user-reason-' + userId).value.trim();</w:t>
-              <w:br/>
-              <w:t xml:space="preserve">    if (!reason) {</w:t>
-              <w:br/>
-              <w:t xml:space="preserve">        alert("Debes escribir un motivo de rechazo.");</w:t>
-              <w:br/>
-              <w:t xml:space="preserve">        return;</w:t>
-              <w:br/>
-              <w:t xml:space="preserve">    }</w:t>
-              <w:br/>
-              <w:t xml:space="preserve">    </w:t>
-              <w:br/>
-              <w:t xml:space="preserve">    try {</w:t>
-              <w:br/>
-              <w:t xml:space="preserve">        await database.ref('users/' + userId).update({</w:t>
-              <w:br/>
-              <w:t xml:space="preserve">            approved: 'Rechazado',</w:t>
-              <w:br/>
-              <w:t xml:space="preserve">            rejectionReason: reason</w:t>
-              <w:br/>
-              <w:t xml:space="preserve">        });</w:t>
-              <w:br/>
-              <w:t xml:space="preserve">        alert('Usuario rechazado exitosamente.');</w:t>
-              <w:br/>
-              <w:t xml:space="preserve">        renderPendingUsers(); // Reload table</w:t>
-              <w:br/>
-              <w:t xml:space="preserve">    } catch(e) {</w:t>
-              <w:br/>
-              <w:t xml:space="preserve">        alert('Error al contactar al servidor');</w:t>
-              <w:br/>
-              <w:t xml:space="preserve">    }</w:t>
-              <w:br/>
-              <w:t>}</w:t>
-              <w:br/>
-              <w:br/>
-              <w:t>// Logic for Approving Permissions</w:t>
-              <w:br/>
-              <w:t>async function renderPendingPermissions() {</w:t>
-              <w:br/>
-              <w:t xml:space="preserve">    const tbody = document.getElementById('pendingPermissionsTableBody');</w:t>
-              <w:br/>
-              <w:t xml:space="preserve">    if (!tbody) return;</w:t>
-              <w:br/>
-              <w:t xml:space="preserve">    </w:t>
-              <w:br/>
-              <w:t xml:space="preserve">    let permisos = [];</w:t>
-              <w:br/>
-              <w:t xml:space="preserve">    try { </w:t>
-              <w:br/>
-              <w:t xml:space="preserve">        const snapshot = await database.ref('permissions').once('value');</w:t>
-              <w:br/>
-              <w:t xml:space="preserve">        if (snapshot.exists()) {</w:t>
-              <w:br/>
-              <w:t xml:space="preserve">            const data = snapshot.val();</w:t>
-              <w:br/>
-              <w:t xml:space="preserve">            permisos = Object.keys(data).map(k =&gt; ({...data[k], fb_id: k}));</w:t>
-              <w:br/>
-              <w:t xml:space="preserve">        }</w:t>
-              <w:br/>
-              <w:t xml:space="preserve">    } catch(e) {</w:t>
-              <w:br/>
-              <w:t xml:space="preserve">        console.error(e);</w:t>
-              <w:br/>
-              <w:t xml:space="preserve">    }</w:t>
-              <w:br/>
-              <w:t xml:space="preserve">    </w:t>
-              <w:br/>
-              <w:t xml:space="preserve">    const pending = permisos.filter(p =&gt; p.status === 'Pendiente');</w:t>
-              <w:br/>
-              <w:t xml:space="preserve">    </w:t>
-              <w:br/>
-              <w:t xml:space="preserve">    tbody.innerHTML = '';</w:t>
-              <w:br/>
-              <w:t xml:space="preserve">    </w:t>
-              <w:br/>
-              <w:t xml:space="preserve">    if (pending.length === 0) {</w:t>
-              <w:br/>
-              <w:t xml:space="preserve">        tbody.innerHTML = `&lt;tr&gt;&lt;td colspan="5" style="padding: 20px; text-align: center; color: var(--text-secondary);"&gt;No hay permisos pendientes de aprobación.&lt;/td&gt;&lt;/tr&gt;`;</w:t>
-              <w:br/>
-              <w:t xml:space="preserve">        return;</w:t>
-              <w:br/>
-              <w:t xml:space="preserve">    }</w:t>
-              <w:br/>
-              <w:t xml:space="preserve">    </w:t>
-              <w:br/>
-              <w:t xml:space="preserve">    pending.forEach(p =&gt; {</w:t>
-              <w:br/>
-              <w:t xml:space="preserve">        tbody.innerHTML += `</w:t>
-              <w:br/>
-              <w:t xml:space="preserve">            &lt;tr style="border-bottom: 1px solid var(--glass-border);"&gt;</w:t>
-              <w:br/>
-              <w:t xml:space="preserve">                &lt;td style="padding: 12px; font-weight: 500;"&gt;${p.gestor}&lt;/td&gt;</w:t>
-              <w:br/>
-              <w:t xml:space="preserve">                &lt;td style="padding: 12px;"&gt;&lt;span class="badge pending"&gt;${p.tipo}&lt;/span&gt;&lt;/td&gt;</w:t>
-              <w:br/>
-              <w:t xml:space="preserve">                &lt;td style="padding: 12px; color: var(--text-secondary); font-size: 13px;"&gt;${p.fecha}&lt;br&gt;${p.horaInicio} a ${p.horaFin}&lt;/td&gt;</w:t>
-              <w:br/>
-              <w:t xml:space="preserve">                &lt;td style="padding: 12px; font-size: 13px; max-width: 200px; overflow: hidden; text-overflow: ellipsis; white-space: nowrap;" title="${p.motivo}"&gt;${p.motivo}&lt;/td&gt;</w:t>
-              <w:br/>
-              <w:t xml:space="preserve">                &lt;td style="padding: 12px; text-align: center;"&gt;</w:t>
-              <w:br/>
-              <w:t xml:space="preserve">                    &lt;div id="perm-action-btns-${p.fb_id}"&gt;</w:t>
-              <w:br/>
-              <w:t xml:space="preserve">                        &lt;button class="btn btn-success" style="padding: 5px 10px; font-size: 12px; margin-right: 5px;" onclick="showPermApproveBox('${p.fb_id}')"&gt;&lt;i class='bx bx-check'&gt;&lt;/i&gt;&lt;/button&gt;</w:t>
-              <w:br/>
-              <w:t xml:space="preserve">                        &lt;button class="btn btn-danger" style="padding: 5px 10px; font-size: 12px;" onclick="showPermRejectBox('${p.fb_id}')"&gt;&lt;i class='bx bx-x'&gt;&lt;/i&gt;&lt;/button&gt;</w:t>
-              <w:br/>
-              <w:t xml:space="preserve">                    &lt;/div&gt;</w:t>
-              <w:br/>
-              <w:t xml:space="preserve">                    &lt;div id="perm-approve-box-${p.fb_id}" style="display:none; flex-direction:column; gap:5px; margin-top:5px;"&gt;</w:t>
-              <w:br/>
-              <w:t xml:space="preserve">                        &lt;input type="text" id="perm-approve-reason-${p.fb_id}" placeholder="Motivo de aprobación" class="modern-input" style="padding:4px; font-size:11px; width:100%;"&gt;</w:t>
-              <w:br/>
-              <w:t xml:space="preserve">                        &lt;div style="display:flex; gap:5px;"&gt;</w:t>
-              <w:br/>
-              <w:t xml:space="preserve">                            &lt;button class="btn btn-success" style="padding: 2px 5px; font-size: 10px;" onclick="confirmApprovePerm('${p.fb_id}')"&gt;Confirmar&lt;/button&gt;</w:t>
-              <w:br/>
-              <w:t xml:space="preserve">                            &lt;button class="btn btn-outline" style="padding: 2px 5px; font-size: 10px;" onclick="cancelApprovePerm('${p.fb_id}')"&gt;Cancelar&lt;/button&gt;</w:t>
-              <w:br/>
-              <w:t xml:space="preserve">                        &lt;/div&gt;</w:t>
-              <w:br/>
-              <w:t xml:space="preserve">                    &lt;/div&gt;</w:t>
-              <w:br/>
-              <w:t xml:space="preserve">                    &lt;div id="perm-reject-box-${p.fb_id}" style="display:none; flex-direction:column; gap:5px; margin-top:5px;"&gt;</w:t>
-              <w:br/>
-              <w:t xml:space="preserve">                        &lt;input type="text" id="perm-reason-${p.fb_id}" placeholder="Motivo de rechazo" class="modern-input" style="padding:4px; font-size:11px; width:100%;"&gt;</w:t>
-              <w:br/>
-              <w:t xml:space="preserve">                        &lt;div style="display:flex; gap:5px;"&gt;</w:t>
-              <w:br/>
-              <w:t xml:space="preserve">                            &lt;button class="btn btn-danger" style="padding: 2px 5px; font-size: 10px;" onclick="confirmRejectPerm('${p.fb_id}')"&gt;Confirmar&lt;/button&gt;</w:t>
-              <w:br/>
-              <w:t xml:space="preserve">                            &lt;button class="btn btn-outline" style="padding: 2px 5px; font-size: 10px;" onclick="cancelRejectPerm('${p.fb_id}')"&gt;Cancelar&lt;/button&gt;</w:t>
-              <w:br/>
-              <w:t xml:space="preserve">                        &lt;/div&gt;</w:t>
-              <w:br/>
-              <w:t xml:space="preserve">                    &lt;/div&gt;</w:t>
-              <w:br/>
-              <w:t xml:space="preserve">                &lt;/td&gt;</w:t>
-              <w:br/>
-              <w:t xml:space="preserve">            &lt;/tr&gt;</w:t>
-              <w:br/>
-              <w:t xml:space="preserve">        `;</w:t>
-              <w:br/>
-              <w:t xml:space="preserve">    });</w:t>
-              <w:br/>
-              <w:t xml:space="preserve">    </w:t>
-              <w:br/>
-              <w:t xml:space="preserve">    const historyBody = document.getElementById('historyPermissionsTableBody');</w:t>
-              <w:br/>
-              <w:t xml:space="preserve">    if(historyBody) {</w:t>
-              <w:br/>
-              <w:t xml:space="preserve">        historyBody.innerHTML = '';</w:t>
-              <w:br/>
-              <w:t xml:space="preserve">        const history = permisos.filter(p =&gt; p.status !== 'Pendiente');</w:t>
-              <w:br/>
-              <w:t xml:space="preserve">        </w:t>
-              <w:br/>
-              <w:t xml:space="preserve">        if (history.length === 0) {</w:t>
-              <w:br/>
-              <w:t xml:space="preserve">            historyBody.innerHTML = `&lt;tr&gt;&lt;td colspan="5" style="padding: 20px; text-align: center; color: var(--text-secondary);"&gt;No hay historial de permisos procesados.&lt;/td&gt;&lt;/tr&gt;`;</w:t>
-              <w:br/>
-              <w:t xml:space="preserve">        } else {</w:t>
-              <w:br/>
-              <w:t xml:space="preserve">            // Ordenar los más recientes primero</w:t>
-              <w:br/>
-              <w:t xml:space="preserve">            history.sort((a, b) =&gt; b.id - a.id);</w:t>
-              <w:br/>
-              <w:t xml:space="preserve">            history.forEach(p =&gt; {</w:t>
-              <w:br/>
-              <w:t xml:space="preserve">                let statusBadge = p.status === 'Aprobado' ? `&lt;span class="badge" style="background: rgba(16, 185, 129, 0.2); color: var(--success);"&gt;&lt;i class='bx bx-check'&gt;&lt;/i&gt; Aprobado&lt;/span&gt;` : `&lt;span class="badge" style="background: rgba(239, 68, 68, 0.2); color: var(--danger);"&gt;&lt;i class='bx bx-x'&gt;&lt;/i&gt; Rechazado&lt;/span&gt;`;</w:t>
-              <w:br/>
-              <w:t xml:space="preserve">                historyBody.innerHTML += `</w:t>
-              <w:br/>
-              <w:t xml:space="preserve">                    &lt;tr style="border-bottom: 1px solid var(--glass-border);"&gt;</w:t>
-              <w:br/>
-              <w:t xml:space="preserve">                        &lt;td style="padding: 12px; font-weight: 500;"&gt;${p.gestor}&lt;/td&gt;</w:t>
-              <w:br/>
-              <w:t xml:space="preserve">                        &lt;td style="padding: 12px;"&gt;${p.tipo}&lt;/td&gt;</w:t>
-              <w:br/>
-              <w:t xml:space="preserve">                        &lt;td style="padding: 12px;"&gt;${statusBadge}&lt;/td&gt;</w:t>
-              <w:br/>
-              <w:t xml:space="preserve">                        &lt;td style="padding: 12px; color: var(--text-secondary); font-size: 13px;"&gt;${p.fecha}&lt;/td&gt;</w:t>
-              <w:br/>
-              <w:t xml:space="preserve">                        &lt;td style="padding: 12px; font-size: 13px; color: var(--text-secondary);"&gt;${p.rejectionReason || '-'}&lt;/td&gt;</w:t>
-              <w:br/>
-              <w:t xml:space="preserve">                    &lt;/tr&gt;</w:t>
-              <w:br/>
-              <w:t xml:space="preserve">                `;</w:t>
-              <w:br/>
-              <w:t xml:space="preserve">            });</w:t>
-              <w:br/>
-              <w:t xml:space="preserve">        }</w:t>
-              <w:br/>
-              <w:t xml:space="preserve">    }</w:t>
-              <w:br/>
-              <w:t>}</w:t>
-              <w:br/>
-              <w:br/>
-              <w:t>function showPermRejectBox(id) {</w:t>
-              <w:br/>
-              <w:t xml:space="preserve">    document.getElementById('perm-action-btns-' + id).style.display = 'none';</w:t>
-              <w:br/>
-              <w:t xml:space="preserve">    document.getElementById('perm-reject-box-' + id).style.display = 'flex';</w:t>
-              <w:br/>
-              <w:t>}</w:t>
-              <w:br/>
-              <w:br/>
-              <w:t>function cancelRejectPerm(id) {</w:t>
-              <w:br/>
-              <w:t xml:space="preserve">    document.getElementById('perm-reject-box-' + id).style.display = 'none';</w:t>
-              <w:br/>
-              <w:t xml:space="preserve">    document.getElementById('perm-action-btns-' + id).style.display = 'block';</w:t>
-              <w:br/>
-              <w:t xml:space="preserve">    document.getElementById('perm-reason-' + id).value = '';</w:t>
-              <w:br/>
-              <w:t>}</w:t>
-              <w:br/>
-              <w:br/>
-              <w:t>async function confirmRejectPerm(id) {</w:t>
-              <w:br/>
-              <w:t xml:space="preserve">    const reason = document.getElementById('perm-reason-' + id).value.trim();</w:t>
-              <w:br/>
-              <w:t xml:space="preserve">    if (!reason) {</w:t>
-              <w:br/>
-              <w:t xml:space="preserve">        alert("Debes escribir un motivo de rechazo.");</w:t>
-              <w:br/>
-              <w:t xml:space="preserve">        return;</w:t>
-              <w:br/>
-              <w:t xml:space="preserve">    }</w:t>
-              <w:br/>
-              <w:t xml:space="preserve">    await updatePermissionStatus(id, 'Rechazado', reason);</w:t>
-              <w:br/>
-              <w:t>}</w:t>
-              <w:br/>
-              <w:br/>
-              <w:t>function showPermApproveBox(id) {</w:t>
-              <w:br/>
-              <w:t xml:space="preserve">    document.getElementById('perm-action-btns-' + id).style.display = 'none';</w:t>
-              <w:br/>
-              <w:t xml:space="preserve">    document.getElementById('perm-approve-box-' + id).style.display = 'flex';</w:t>
-              <w:br/>
-              <w:t>}</w:t>
-              <w:br/>
-              <w:br/>
-              <w:t>function cancelApprovePerm(id) {</w:t>
-              <w:br/>
-              <w:t xml:space="preserve">    document.getElementById('perm-approve-box-' + id).style.display = 'none';</w:t>
-              <w:br/>
-              <w:t xml:space="preserve">    document.getElementById('perm-action-btns-' + id).style.display = 'block';</w:t>
-              <w:br/>
-              <w:t xml:space="preserve">    document.getElementById('perm-approve-reason-' + id).value = '';</w:t>
-              <w:br/>
-              <w:t>}</w:t>
-              <w:br/>
-              <w:br/>
-              <w:t>async function confirmApprovePerm(id) {</w:t>
-              <w:br/>
-              <w:t xml:space="preserve">    const reason = document.getElementById('perm-approve-reason-' + id).value.trim();</w:t>
-              <w:br/>
-              <w:t xml:space="preserve">    if (!reason) {</w:t>
-              <w:br/>
-              <w:t xml:space="preserve">        alert("Debes escribir una observación para aprobar el permiso.");</w:t>
-              <w:br/>
-              <w:t xml:space="preserve">        return;</w:t>
-              <w:br/>
-              <w:t xml:space="preserve">    }</w:t>
-              <w:br/>
-              <w:t xml:space="preserve">    await updatePermissionStatus(id, 'Aprobado', reason);</w:t>
-              <w:br/>
-              <w:t>}</w:t>
-              <w:br/>
-              <w:br/>
-              <w:t>async function updatePermissionStatus(fb_id, newStatus, reason = null) {</w:t>
-              <w:br/>
-              <w:t xml:space="preserve">    try {</w:t>
-              <w:br/>
-              <w:t xml:space="preserve">        const updates = { status: newStatus, notified: false };</w:t>
-              <w:br/>
-              <w:t xml:space="preserve">        if (reason) {</w:t>
-              <w:br/>
-              <w:t xml:space="preserve">            updates.rejectionReason = reason;</w:t>
-              <w:br/>
-              <w:t xml:space="preserve">        }</w:t>
-              <w:br/>
-              <w:t xml:space="preserve">        </w:t>
-              <w:br/>
-              <w:t xml:space="preserve">        await database.ref('permissions/' + fb_id).update(updates);</w:t>
-              <w:br/>
-              <w:t xml:space="preserve">        </w:t>
-              <w:br/>
-              <w:t xml:space="preserve">        alert(`Permiso ${newStatus} exitosamente.`);</w:t>
-              <w:br/>
-              <w:t xml:space="preserve">        renderPendingPermissions(); // Reload table</w:t>
-              <w:br/>
-              <w:t xml:space="preserve">        loadPermisos(); // Reload historical permissions if looking at it</w:t>
-              <w:br/>
-              <w:t xml:space="preserve">    } catch(e) {</w:t>
-              <w:br/>
-              <w:t xml:space="preserve">        alert('Error al contactar al servidor');</w:t>
-              <w:br/>
-              <w:t xml:space="preserve">    }</w:t>
-              <w:br/>
-              <w:t>}</w:t>
-              <w:br/>
-              <w:br/>
-              <w:t>// Exportar Reporte a PDF</w:t>
-              <w:br/>
-              <w:t>window.exportShiftReport = async function(fb_id) {</w:t>
-              <w:br/>
-              <w:t xml:space="preserve">    try {</w:t>
-              <w:br/>
-              <w:t xml:space="preserve">        const snapshot = await database.ref('shift_reports/' + fb_id).once('value');</w:t>
-              <w:br/>
-              <w:t xml:space="preserve">        if(!snapshot.exists()) return alert("No se encontró el reporte en la base de datos.");</w:t>
-              <w:br/>
-              <w:t xml:space="preserve">        </w:t>
-              <w:br/>
-              <w:t xml:space="preserve">        const r = snapshot.val();</w:t>
-              <w:br/>
-              <w:t xml:space="preserve">        </w:t>
-              <w:br/>
-              <w:t xml:space="preserve">        // Inicializar jsPDF</w:t>
-              <w:br/>
-              <w:t xml:space="preserve">        const { jsPDF } = window.jspdf;</w:t>
-              <w:br/>
-              <w:t xml:space="preserve">        const doc = new jsPDF();</w:t>
-              <w:br/>
-              <w:t xml:space="preserve">        </w:t>
-              <w:br/>
-              <w:t xml:space="preserve">        // Título</w:t>
-              <w:br/>
-              <w:t xml:space="preserve">        doc.setFontSize(16);</w:t>
-              <w:br/>
-              <w:t xml:space="preserve">        doc.setTextColor(13, 138, 188); // Accent color</w:t>
-              <w:br/>
-              <w:t xml:space="preserve">        doc.text("REPORTE DE TURNO - RISK MANAGER", 15, 20);</w:t>
-              <w:br/>
-              <w:t xml:space="preserve">        </w:t>
-              <w:br/>
-              <w:t xml:space="preserve">        // Metadatos</w:t>
-              <w:br/>
-              <w:t xml:space="preserve">        doc.setFontSize(11);</w:t>
-              <w:br/>
-              <w:t xml:space="preserve">        doc.setTextColor(50, 50, 50);</w:t>
-              <w:br/>
-              <w:t xml:space="preserve">        doc.text("Gestor: " + (r.gestor || 'N/A'), 15, 35);</w:t>
-              <w:br/>
-              <w:t xml:space="preserve">        doc.text("Rol: " + (r.rol || 'N/A'), 15, 42);</w:t>
-              <w:br/>
-              <w:t xml:space="preserve">        doc.text("SET Trabajado: " + (r.setTrabajado || 'N/A'), 15, 49);</w:t>
-              <w:br/>
-              <w:t xml:space="preserve">        doc.text("Hora de Inicio: " + (r.horaInicio || 'N/A'), 15, 56);</w:t>
-              <w:br/>
-              <w:t xml:space="preserve">        doc.text("Hora de Fin: " + (r.horaFin || 'N/A'), 15, 63);</w:t>
-              <w:br/>
-              <w:t xml:space="preserve">        </w:t>
-              <w:br/>
-              <w:t xml:space="preserve">        // Línea separadora</w:t>
-              <w:br/>
-              <w:t xml:space="preserve">        doc.setLineWidth(0.5);</w:t>
-              <w:br/>
-              <w:t xml:space="preserve">        doc.line(15, 70, 195, 70);</w:t>
-              <w:br/>
-              <w:t xml:space="preserve">        </w:t>
-              <w:br/>
-              <w:t xml:space="preserve">        // Resumen</w:t>
-              <w:br/>
-              <w:t xml:space="preserve">        doc.setFontSize(12);</w:t>
-              <w:br/>
-              <w:t xml:space="preserve">        doc.setTextColor(0, 0, 0);</w:t>
-              <w:br/>
-              <w:t xml:space="preserve">        doc.text("Resumen de Tareas:", 15, 80);</w:t>
-              <w:br/>
-              <w:t xml:space="preserve">        </w:t>
-              <w:br/>
-              <w:t xml:space="preserve">        doc.setFontSize(10);</w:t>
-              <w:br/>
-              <w:t xml:space="preserve">        doc.setTextColor(50, 50, 50);</w:t>
-              <w:br/>
-              <w:t xml:space="preserve">        </w:t>
-              <w:br/>
-              <w:t xml:space="preserve">        const reportText = r.reporte || 'Sin reporte detallado.';</w:t>
-              <w:br/>
-              <w:t xml:space="preserve">        const splitText = doc.splitTextToSize(reportText, 180);</w:t>
-              <w:br/>
-              <w:t xml:space="preserve">        </w:t>
-              <w:br/>
-              <w:t xml:space="preserve">        doc.text(splitText, 15, 90);</w:t>
-              <w:br/>
-              <w:t xml:space="preserve">        </w:t>
-              <w:br/>
-              <w:t xml:space="preserve">        // Guardar</w:t>
-              <w:br/>
-              <w:t xml:space="preserve">        const safeName = (r.gestor || 'Gestor').replace(/[^a-z0-9]/gi, '_').toLowerCase();</w:t>
-              <w:br/>
-              <w:t xml:space="preserve">        const dateStr = new Date(r.timestamp || Date.now()).toISOString().split('T')[0];</w:t>
-              <w:br/>
-              <w:t xml:space="preserve">        doc.save(`Reporte_${safeName}_${dateStr}.pdf`);</w:t>
-              <w:br/>
-              <w:t xml:space="preserve">        </w:t>
-              <w:br/>
-              <w:t xml:space="preserve">    } catch(e) {</w:t>
-              <w:br/>
-              <w:t xml:space="preserve">        alert("Hubo un error al intentar exportar el reporte.");</w:t>
-              <w:br/>
-              <w:t xml:space="preserve">        console.error(e);</w:t>
-              <w:br/>
-              <w:t xml:space="preserve">    }</w:t>
+              <w:t xml:space="preserve">    const modal = document.getElementById('monitoreoModal');</w:t>
+              <w:br/>
+              <w:t xml:space="preserve">    if (modal) modal.classList.add('active');</w:t>
               <w:br/>
               <w:t>};</w:t>
-              <w:br/>
-              <w:br/>
-              <w:t>// Logic for Shift Reports History</w:t>
-              <w:br/>
-              <w:t>let allShiftReports = [];</w:t>
-              <w:br/>
-              <w:br/>
-              <w:t>async function renderShiftReports() {</w:t>
-              <w:br/>
-              <w:t xml:space="preserve">    const tbody = document.getElementById('shiftReportsTableBody');</w:t>
-              <w:br/>
-              <w:t xml:space="preserve">    if (!tbody) return;</w:t>
-              <w:br/>
-              <w:t xml:space="preserve">    </w:t>
-              <w:br/>
-              <w:t xml:space="preserve">    try { </w:t>
-              <w:br/>
-              <w:t xml:space="preserve">        const snapshot = await database.ref('shift_reports').once('value');</w:t>
-              <w:br/>
-              <w:t xml:space="preserve">        if (snapshot.exists()) {</w:t>
-              <w:br/>
-              <w:t xml:space="preserve">            const data = snapshot.val();</w:t>
-              <w:br/>
-              <w:t xml:space="preserve">            allShiftReports = Object.keys(data).map(k =&gt; ({...data[k], fb_id: k}));</w:t>
-              <w:br/>
-              <w:t xml:space="preserve">        } else {</w:t>
-              <w:br/>
-              <w:t xml:space="preserve">            allShiftReports = [];</w:t>
-              <w:br/>
-              <w:t xml:space="preserve">        }</w:t>
-              <w:br/>
-              <w:t xml:space="preserve">    } catch(e) {</w:t>
-              <w:br/>
-              <w:t xml:space="preserve">        console.error("Error cargando historial de turnos:", e);</w:t>
-              <w:br/>
-              <w:t xml:space="preserve">    }</w:t>
-              <w:br/>
-              <w:t xml:space="preserve">    </w:t>
-              <w:br/>
-              <w:t xml:space="preserve">    applyShiftReportsFilters();</w:t>
-              <w:br/>
-              <w:t>}</w:t>
-              <w:br/>
-              <w:br/>
-              <w:t>function applyShiftReportsFilters() {</w:t>
-              <w:br/>
-              <w:t xml:space="preserve">    const tbody = document.getElementById('shiftReportsTableBody');</w:t>
-              <w:br/>
-              <w:t xml:space="preserve">    if (!tbody) return;</w:t>
-              <w:br/>
-              <w:br/>
-              <w:t xml:space="preserve">    const gestorQuery = document.getElementById('filterGestorInput') ? document.getElementById('filterGestorInput').value.toLowerCase().trim() : '';</w:t>
-              <w:br/>
-              <w:t xml:space="preserve">    const fechaQuery = document.getElementById('filterFechaInput') ? document.getElementById('filterFechaInput').value : '';</w:t>
-              <w:br/>
-              <w:br/>
-              <w:t xml:space="preserve">    let filtered = [...allShiftReports];</w:t>
-              <w:br/>
-              <w:br/>
-              <w:t xml:space="preserve">    // Filter by Gestor name</w:t>
-              <w:br/>
-              <w:t xml:space="preserve">    if (gestorQuery) {</w:t>
-              <w:br/>
-              <w:t xml:space="preserve">        filtered = filtered.filter(r =&gt; (r.gestor || '').toLowerCase().includes(gestorQuery));</w:t>
-              <w:br/>
-              <w:t xml:space="preserve">    }</w:t>
-              <w:br/>
-              <w:br/>
-              <w:t xml:space="preserve">    // Filter by Date (comparing local YYYY-MM-DD format)</w:t>
-              <w:br/>
-              <w:t xml:space="preserve">    if (fechaQuery) {</w:t>
-              <w:br/>
-              <w:t xml:space="preserve">        filtered = filtered.filter(r =&gt; {</w:t>
-              <w:br/>
-              <w:t xml:space="preserve">            if (r.timestamp) {</w:t>
-              <w:br/>
-              <w:t xml:space="preserve">                const d = new Date(r.timestamp);</w:t>
-              <w:br/>
-              <w:t xml:space="preserve">                const localYear = d.getFullYear();</w:t>
-              <w:br/>
-              <w:t xml:space="preserve">                const localMonth = String(d.getMonth() + 1).padStart(2, '0');</w:t>
-              <w:br/>
-              <w:t xml:space="preserve">                const localDay = String(d.getDate()).padStart(2, '0');</w:t>
-              <w:br/>
-              <w:t xml:space="preserve">                const localDateStr = `${localYear}-${localMonth}-${localDay}`;</w:t>
-              <w:br/>
-              <w:t xml:space="preserve">                if (localDateStr === fechaQuery) return true;</w:t>
-              <w:br/>
-              <w:t xml:space="preserve">            }</w:t>
-              <w:br/>
-              <w:t xml:space="preserve">            if (r.horaInicio &amp;&amp; r.horaInicio.includes(fechaQuery)) return true;</w:t>
-              <w:br/>
-              <w:t xml:space="preserve">            if (r.horaFin &amp;&amp; r.horaFin.includes(fechaQuery)) return true;</w:t>
-              <w:br/>
-              <w:t xml:space="preserve">            return false;</w:t>
-              <w:br/>
-              <w:t xml:space="preserve">        });</w:t>
-              <w:br/>
-              <w:t xml:space="preserve">    }</w:t>
-              <w:br/>
-              <w:br/>
-              <w:t xml:space="preserve">    tbody.innerHTML = '';</w:t>
-              <w:br/>
-              <w:t xml:space="preserve">    </w:t>
-              <w:br/>
-              <w:t xml:space="preserve">    if (filtered.length === 0) {</w:t>
-              <w:br/>
-              <w:t xml:space="preserve">        tbody.innerHTML = `&lt;tr&gt;&lt;td colspan="6" style="padding: 20px; text-align: center; color: var(--text-secondary);"&gt;No hay historial de turnos registrados con los filtros seleccionados.&lt;/td&gt;&lt;/tr&gt;`;</w:t>
-              <w:br/>
-              <w:t xml:space="preserve">        return;</w:t>
-              <w:br/>
-              <w:t xml:space="preserve">    }</w:t>
-              <w:br/>
-              <w:t xml:space="preserve">    </w:t>
-              <w:br/>
-              <w:t xml:space="preserve">    // Sort descending by timestamp</w:t>
-              <w:br/>
-              <w:t xml:space="preserve">    filtered.sort((a, b) =&gt; (b.timestamp || 0) - (a.timestamp || 0));</w:t>
-              <w:br/>
-              <w:t xml:space="preserve">    </w:t>
-              <w:br/>
-              <w:t xml:space="preserve">    filtered.forEach(r =&gt; {</w:t>
-              <w:br/>
-              <w:t xml:space="preserve">        // Formatear el reporte de tareas para que sea legible en HTML</w:t>
-              <w:br/>
-              <w:t xml:space="preserve">        const safeReport = (r.reporte || 'Sin reporte').replace(/\n/g, '&lt;br&gt;').replace(/\[(.*?)\]/g, '&lt;strong&gt;[$1]&lt;/strong&gt;');</w:t>
-              <w:br/>
-              <w:t xml:space="preserve">        </w:t>
-              <w:br/>
-              <w:t xml:space="preserve">        tbody.innerHTML += `</w:t>
-              <w:br/>
-              <w:t xml:space="preserve">            &lt;tr style="border-bottom: 1px solid var(--glass-border);"&gt;</w:t>
-              <w:br/>
-              <w:t xml:space="preserve">                &lt;td style="padding: 12px; font-weight: 500;"&gt;</w:t>
-              <w:br/>
-              <w:t xml:space="preserve">                    ${r.gestor}</w:t>
-              <w:br/>
-              <w:t xml:space="preserve">                    &lt;div style="font-size: 11px; color: var(--text-secondary);"&gt;${r.rol}&lt;/div&gt;</w:t>
-              <w:br/>
-              <w:t xml:space="preserve">                &lt;/td&gt;</w:t>
-              <w:br/>
-              <w:t xml:space="preserve">                &lt;td style="padding: 12px; color: var(--accent-primary);"&gt;${r.setTrabajado}&lt;/td&gt;</w:t>
-              <w:br/>
-              <w:t xml:space="preserve">                &lt;td style="padding: 12px; font-size: 13px;"&gt;${r.horaInicio}&lt;/td&gt;</w:t>
-              <w:br/>
-              <w:t xml:space="preserve">                &lt;td style="padding: 12px; font-size: 13px;"&gt;${r.horaFin}&lt;/td&gt;</w:t>
-              <w:br/>
-              <w:t xml:space="preserve">                &lt;td style="padding: 12px; font-size: 12px; color: var(--text-secondary); max-width: 300px; text-align: left;"&gt;</w:t>
-              <w:br/>
-              <w:t xml:space="preserve">                    &lt;div style="max-height: 80px; overflow-y: auto; background: var(--bg-dark); padding: 5px; border-radius: 4px;"&gt;</w:t>
-              <w:br/>
-              <w:t xml:space="preserve">                        ${safeReport}</w:t>
-              <w:br/>
-              <w:t xml:space="preserve">                    &lt;/div&gt;</w:t>
-              <w:br/>
-              <w:t xml:space="preserve">                &lt;/td&gt;</w:t>
-              <w:br/>
-              <w:t xml:space="preserve">                &lt;td style="padding: 12px; text-align: center;"&gt;</w:t>
-              <w:br/>
-              <w:t xml:space="preserve">                    &lt;button class="btn btn-outline" style="padding: 5px 10px; font-size: 12px;" onclick="exportShiftReport('${r.fb_id}')"&gt;</w:t>
-              <w:br/>
-              <w:t xml:space="preserve">                        &lt;i class='bx bx-file-blank'&gt;&lt;/i&gt; Exportar PDF</w:t>
-              <w:br/>
-              <w:t xml:space="preserve">                    &lt;/button&gt;</w:t>
-              <w:br/>
-              <w:t xml:space="preserve">                &lt;/td&gt;</w:t>
-              <w:br/>
-              <w:t xml:space="preserve">            &lt;/tr&gt;</w:t>
-              <w:br/>
-              <w:t xml:space="preserve">        `;</w:t>
-              <w:br/>
-              <w:t xml:space="preserve">    });</w:t>
-              <w:br/>
-              <w:t>}</w:t>
-              <w:br/>
-              <w:br/>
-              <w:br/>
-              <w:br/>
-              <w:t>// Helper Notification function</w:t>
-              <w:br/>
-              <w:t>function toggleNotifications() {</w:t>
-              <w:br/>
-              <w:t xml:space="preserve">    const drop = document.getElementById('notificationDropdown');</w:t>
-              <w:br/>
-              <w:t xml:space="preserve">    if (drop) {</w:t>
-              <w:br/>
-              <w:t xml:space="preserve">        if (drop.style.display === 'none' || drop.style.display === '') {</w:t>
-              <w:br/>
-              <w:t xml:space="preserve">            drop.style.display = 'block';</w:t>
-              <w:br/>
-              <w:t xml:space="preserve">        } else {</w:t>
-              <w:br/>
-              <w:t xml:space="preserve">            drop.style.display = 'none';</w:t>
-              <w:br/>
-              <w:t xml:space="preserve">        }</w:t>
-              <w:br/>
-              <w:t xml:space="preserve">    }</w:t>
-              <w:br/>
-              <w:t>}</w:t>
-              <w:br/>
-              <w:br/>
-              <w:t>async function markAllAsRead() {</w:t>
-              <w:br/>
-              <w:t xml:space="preserve">    if (!currentUser) return;</w:t>
-              <w:br/>
-              <w:t xml:space="preserve">    try {</w:t>
-              <w:br/>
-              <w:t xml:space="preserve">        if (currentUser.role === 'Admin' || currentUser.role === 'Supervisor') {</w:t>
-              <w:br/>
-              <w:t xml:space="preserve">            const snapshot = await database.ref('permissions').once('value');</w:t>
-              <w:br/>
-              <w:t xml:space="preserve">            if (snapshot.exists()) {</w:t>
-              <w:br/>
-              <w:t xml:space="preserve">                const data = snapshot.val();</w:t>
-              <w:br/>
-              <w:t xml:space="preserve">                const updates = {};</w:t>
-              <w:br/>
-              <w:t xml:space="preserve">                for (let key in data) {</w:t>
-              <w:br/>
-              <w:t xml:space="preserve">                    if (data[key].notified_admin === false &amp;&amp; data[key].status === 'Pendiente') {</w:t>
-              <w:br/>
-              <w:t xml:space="preserve">                        updates[key + '/notified_admin'] = true;</w:t>
-              <w:br/>
-              <w:t xml:space="preserve">                    }</w:t>
-              <w:br/>
-              <w:t xml:space="preserve">                }</w:t>
-              <w:br/>
-              <w:t xml:space="preserve">                if (Object.keys(updates).length &gt; 0) {</w:t>
-              <w:br/>
-              <w:t xml:space="preserve">                    await database.ref('permissions').update(updates);</w:t>
-              <w:br/>
-              <w:t xml:space="preserve">                }</w:t>
-              <w:br/>
-              <w:t xml:space="preserve">            }</w:t>
-              <w:br/>
-              <w:t xml:space="preserve">        } else {</w:t>
-              <w:br/>
-              <w:t xml:space="preserve">            const snapshot = await database.ref('permissions').orderByChild('gestor').equalTo(currentUser.name).once('value');</w:t>
-              <w:br/>
-              <w:t xml:space="preserve">            if (snapshot.exists()) {</w:t>
-              <w:br/>
-              <w:t xml:space="preserve">                const data = snapshot.val();</w:t>
-              <w:br/>
-              <w:t xml:space="preserve">                const updates = {};</w:t>
-              <w:br/>
-              <w:t xml:space="preserve">                for (let key in data) {</w:t>
-              <w:br/>
-              <w:t xml:space="preserve">                    if (data[key].notified === false &amp;&amp; data[key].status !== 'Pendiente') {</w:t>
-              <w:br/>
-              <w:t xml:space="preserve">                        updates[key + '/notified'] = true;</w:t>
-              <w:br/>
-              <w:t xml:space="preserve">                    }</w:t>
-              <w:br/>
-              <w:t xml:space="preserve">                }</w:t>
-              <w:br/>
-              <w:t xml:space="preserve">                if (Object.keys(updates).length &gt; 0) {</w:t>
-              <w:br/>
-              <w:t xml:space="preserve">                    await database.ref('permissions').update(updates);</w:t>
-              <w:br/>
-              <w:t xml:space="preserve">                }</w:t>
-              <w:br/>
-              <w:t xml:space="preserve">            }</w:t>
-              <w:br/>
-              <w:t xml:space="preserve">        }</w:t>
-              <w:br/>
-              <w:t xml:space="preserve">    } catch(e) {</w:t>
-              <w:br/>
-              <w:t xml:space="preserve">        console.error(e);</w:t>
-              <w:br/>
-              <w:t xml:space="preserve">    }</w:t>
-              <w:br/>
-              <w:t>}</w:t>
-              <w:br/>
-              <w:br/>
-              <w:t>// Funciones del Modal de Perfil</w:t>
-              <w:br/>
-              <w:t>function openProfileModal() {</w:t>
-              <w:br/>
-              <w:t xml:space="preserve">    const avatarEl = document.querySelector('.user-profile .avatar');</w:t>
-              <w:br/>
-              <w:t xml:space="preserve">    const modalImg = document.getElementById('modalProfileAvatar');</w:t>
-              <w:br/>
-              <w:t xml:space="preserve">    if (avatarEl &amp;&amp; modalImg) {</w:t>
-              <w:br/>
-              <w:t xml:space="preserve">        modalImg.src = avatarEl.src;</w:t>
-              <w:br/>
-              <w:t xml:space="preserve">    }</w:t>
-              <w:br/>
-              <w:t xml:space="preserve">    </w:t>
-              <w:br/>
-              <w:t xml:space="preserve">    if (currentUser) {</w:t>
-              <w:br/>
-              <w:t xml:space="preserve">        const modalName = document.getElementById('modalProfileName');</w:t>
-              <w:br/>
-              <w:t xml:space="preserve">        if (modalName) modalName.textContent = currentUser.name || 'Usuario';</w:t>
-              <w:br/>
-              <w:t xml:space="preserve">        </w:t>
-              <w:br/>
-              <w:t xml:space="preserve">        const modalRole = document.getElementById('modalProfileRole');</w:t>
-              <w:br/>
-              <w:t xml:space="preserve">        if (modalRole) modalRole.textContent = currentUser.role || 'Rol';</w:t>
-              <w:br/>
-              <w:t xml:space="preserve">    }</w:t>
-              <w:br/>
-              <w:br/>
-              <w:t xml:space="preserve">    document.getElementById('profileModal').classList.add('active');</w:t>
-              <w:br/>
-              <w:t xml:space="preserve">    document.getElementById('newPasswordInput').value = '';</w:t>
-              <w:br/>
-              <w:t xml:space="preserve">    const msg = document.getElementById('passwordChangeMsg');</w:t>
-              <w:br/>
-              <w:t xml:space="preserve">    if (msg) msg.style.display = 'none';</w:t>
-              <w:br/>
-              <w:t>}</w:t>
-              <w:br/>
-              <w:br/>
-              <w:t>function toggleProfilePassword(iconElement) {</w:t>
-              <w:br/>
-              <w:t xml:space="preserve">    const input = document.getElementById('newPasswordInput');</w:t>
-              <w:br/>
-              <w:t xml:space="preserve">    if (input.type === 'password') {</w:t>
-              <w:br/>
-              <w:t xml:space="preserve">        input.type = 'text';</w:t>
-              <w:br/>
-              <w:t xml:space="preserve">        iconElement.classList.remove('bx-show');</w:t>
-              <w:br/>
-              <w:t xml:space="preserve">        iconElement.classList.add('bx-hide');</w:t>
-              <w:br/>
-              <w:t xml:space="preserve">    } else {</w:t>
-              <w:br/>
-              <w:t xml:space="preserve">        input.type = 'password';</w:t>
-              <w:br/>
-              <w:t xml:space="preserve">        iconElement.classList.remove('bx-hide');</w:t>
-              <w:br/>
-              <w:t xml:space="preserve">        iconElement.classList.add('bx-show');</w:t>
-              <w:br/>
-              <w:t xml:space="preserve">    }</w:t>
-              <w:br/>
-              <w:t>}</w:t>
-              <w:br/>
-              <w:br/>
-              <w:t>async function changePassword() {</w:t>
-              <w:br/>
-              <w:t xml:space="preserve">    const newPass = document.getElementById('newPasswordInput').value;</w:t>
-              <w:br/>
-              <w:t xml:space="preserve">    const msg = document.getElementById('passwordChangeMsg');</w:t>
-              <w:br/>
-              <w:t xml:space="preserve">    </w:t>
-              <w:br/>
-              <w:t xml:space="preserve">    if(!newPass || newPass.trim() === '') {</w:t>
-              <w:br/>
-              <w:t xml:space="preserve">        msg.textContent = 'Por favor ingresa una contraseña válida.';</w:t>
-              <w:br/>
-              <w:t xml:space="preserve">        msg.style.color = 'var(--danger)';</w:t>
-              <w:br/>
-              <w:t xml:space="preserve">        msg.style.display = 'block';</w:t>
-              <w:br/>
-              <w:t xml:space="preserve">        return;</w:t>
-              <w:br/>
-              <w:t xml:space="preserve">    }</w:t>
-              <w:br/>
-              <w:t xml:space="preserve">    </w:t>
-              <w:br/>
-              <w:t xml:space="preserve">    msg.textContent = 'Actualizando...';</w:t>
-              <w:br/>
-              <w:t xml:space="preserve">    msg.style.color = 'var(--text-primary)';</w:t>
-              <w:br/>
-              <w:t xml:space="preserve">    msg.style.display = 'block';</w:t>
-              <w:br/>
-              <w:t xml:space="preserve">    </w:t>
-              <w:br/>
-              <w:t xml:space="preserve">    try {</w:t>
-              <w:br/>
-              <w:t xml:space="preserve">        const user = firebase.auth().currentUser;</w:t>
-              <w:br/>
-              <w:t xml:space="preserve">        if (user) {</w:t>
-              <w:br/>
-              <w:t xml:space="preserve">            await user.updatePassword(newPass);</w:t>
-              <w:br/>
-              <w:t xml:space="preserve">            msg.textContent = '¡Contraseña actualizada exitosamente en Firebase Auth!';</w:t>
-              <w:br/>
-              <w:t xml:space="preserve">            msg.style.color = 'var(--success)';</w:t>
-              <w:br/>
-              <w:t xml:space="preserve">            setTimeout(() =&gt; closeModal('profileModal'), 2000);</w:t>
-              <w:br/>
-              <w:t xml:space="preserve">        } else {</w:t>
-              <w:br/>
-              <w:t xml:space="preserve">            msg.textContent = 'Error: No hay sesión activa en Firebase Auth. Por favor, vuelve a iniciar sesión.';</w:t>
-              <w:br/>
-              <w:t xml:space="preserve">            msg.style.color = 'var(--danger)';</w:t>
-              <w:br/>
-              <w:t xml:space="preserve">        }</w:t>
-              <w:br/>
-              <w:t xml:space="preserve">    } catch(e) {</w:t>
-              <w:br/>
-              <w:t xml:space="preserve">        msg.textContent = 'Error al actualizar contraseña.';</w:t>
-              <w:br/>
-              <w:t xml:space="preserve">        if (e.code === 'auth/requires-recent-login') {</w:t>
-              <w:br/>
-              <w:t xml:space="preserve">            msg.textContent = 'Por seguridad, debes cerrar sesión e iniciar sesión nuevamente para cambiar tu contraseña.';</w:t>
-              <w:br/>
-              <w:t xml:space="preserve">        } else if (e.code === 'auth/weak-password') {</w:t>
-              <w:br/>
-              <w:t xml:space="preserve">            msg.textContent = 'La contraseña debe tener al menos 6 caracteres.';</w:t>
-              <w:br/>
-              <w:t xml:space="preserve">        }</w:t>
-              <w:br/>
-              <w:t xml:space="preserve">        msg.style.color = 'var(--danger)';</w:t>
-              <w:br/>
-              <w:t xml:space="preserve">        console.error("Error al actualizar la contraseña:", e);</w:t>
-              <w:br/>
-              <w:t xml:space="preserve">    }</w:t>
-              <w:br/>
-              <w:t>}</w:t>
               <w:br/>
             </w:r>
           </w:p>

</xml_diff>

<commit_message>
Actualizacion: reemplazado buscador de gestores en monitoreo por select dropdown y ocultado el progreso de turno para admins/supervisores
</commit_message>
<xml_diff>
--- a/Documentacion_Tecnica.docx
+++ b/Documentacion_Tecnica.docx
@@ -3726,13 +3726,11 @@
               <w:br/>
               <w:t xml:space="preserve">                    &lt;div class="filter-group"&gt;</w:t>
               <w:br/>
-              <w:t xml:space="preserve">                        &lt;div class="filter-input-wrapper"&gt;</w:t>
-              <w:br/>
-              <w:t xml:space="preserve">                            &lt;i class='bx bx-search'&gt;&lt;/i&gt;</w:t>
-              <w:br/>
-              <w:t xml:space="preserve">                            &lt;input type="text" id="monitoreoSearchInput" class="modern-input" placeholder="Buscar por gestor..."&gt;</w:t>
-              <w:br/>
-              <w:t xml:space="preserve">                        &lt;/div&gt;</w:t>
+              <w:t xml:space="preserve">                        &lt;select id="monitoreoSearchInput" class="filter-select"&gt;</w:t>
+              <w:br/>
+              <w:t xml:space="preserve">                            &lt;option value=""&gt;Todos los Gestores&lt;/option&gt;</w:t>
+              <w:br/>
+              <w:t xml:space="preserve">                        &lt;/select&gt;</w:t>
               <w:br/>
               <w:br/>
               <w:t xml:space="preserve">                        &lt;select id="filterShiftSelect" class="filter-select"&gt;</w:t>
@@ -4633,6 +4631,13 @@
               <w:t>}</w:t>
               <w:br/>
               <w:br/>
+              <w:t>.workspace-grid.no-right-panel {</w:t>
+              <w:br/>
+              <w:t xml:space="preserve">    grid-template-columns: 300px 1fr;</w:t>
+              <w:br/>
+              <w:t>}</w:t>
+              <w:br/>
+              <w:br/>
               <w:t>.panel {</w:t>
               <w:br/>
               <w:t xml:space="preserve">    padding: var(--spacing-lg);</w:t>
@@ -7284,6 +7289,17 @@
               <w:br/>
               <w:t xml:space="preserve">            </w:t>
               <w:br/>
+              <w:t xml:space="preserve">            // Ocultar el panel de Progreso del Turno / Documentos de Acceso Rápido en Mis Tareas para Admin o Supervisor</w:t>
+              <w:br/>
+              <w:t xml:space="preserve">            const rightPanel = document.querySelector('.right-panel');</w:t>
+              <w:br/>
+              <w:t xml:space="preserve">            if (rightPanel) rightPanel.style.display = 'none';</w:t>
+              <w:br/>
+              <w:t xml:space="preserve">            const workspaceGrid = document.querySelector('.workspace-grid');</w:t>
+              <w:br/>
+              <w:t xml:space="preserve">            if (workspaceGrid) workspaceGrid.classList.add('no-right-panel');</w:t>
+              <w:br/>
+              <w:br/>
               <w:t xml:space="preserve">            // Forzar vista de Monitoreo Realtime como inicial</w:t>
               <w:br/>
               <w:t xml:space="preserve">            const viewMonitoreo = document.getElementById('view-monitoreo');</w:t>
@@ -7305,6 +7321,8 @@
               <w:br/>
               <w:t xml:space="preserve">            startActiveSessionsListener();</w:t>
               <w:br/>
+              <w:t xml:space="preserve">            populateGestoresDropdown();</w:t>
+              <w:br/>
               <w:br/>
               <w:t xml:space="preserve">            // Listeners for Monitoreo filters</w:t>
               <w:br/>
@@ -7317,7 +7335,7 @@
               <w:t xml:space="preserve">            const clearMonitoreoFiltersBtn = document.getElementById('clearMonitoreoFiltersBtn');</w:t>
               <w:br/>
               <w:br/>
-              <w:t xml:space="preserve">            if (searchInput) searchInput.addEventListener('input', renderActiveSessionsDashboard);</w:t>
+              <w:t xml:space="preserve">            if (searchInput) searchInput.addEventListener('change', renderActiveSessionsDashboard);</w:t>
               <w:br/>
               <w:t xml:space="preserve">            if (shiftSelect) shiftSelect.addEventListener('change', renderActiveSessionsDashboard);</w:t>
               <w:br/>
@@ -10131,6 +10149,63 @@
               <w:t xml:space="preserve">    if (modal) modal.classList.add('active');</w:t>
               <w:br/>
               <w:t>};</w:t>
+              <w:br/>
+              <w:br/>
+              <w:t>function populateGestoresDropdown() {</w:t>
+              <w:br/>
+              <w:t xml:space="preserve">    const selectEl = document.getElementById('monitoreoSearchInput');</w:t>
+              <w:br/>
+              <w:t xml:space="preserve">    if (!selectEl) return;</w:t>
+              <w:br/>
+              <w:t xml:space="preserve">    </w:t>
+              <w:br/>
+              <w:t xml:space="preserve">    selectEl.innerHTML = '&lt;option value=""&gt;Todos los Gestores&lt;/option&gt;';</w:t>
+              <w:br/>
+              <w:t xml:space="preserve">    </w:t>
+              <w:br/>
+              <w:t xml:space="preserve">    database.ref('users').once('value').then(snapshot =&gt; {</w:t>
+              <w:br/>
+              <w:t xml:space="preserve">        if (snapshot.exists()) {</w:t>
+              <w:br/>
+              <w:t xml:space="preserve">            const data = snapshot.val();</w:t>
+              <w:br/>
+              <w:t xml:space="preserve">            const gestores = Object.keys(data)</w:t>
+              <w:br/>
+              <w:t xml:space="preserve">                .map(k =&gt; data[k])</w:t>
+              <w:br/>
+              <w:t xml:space="preserve">                .filter(u =&gt; u &amp;&amp; u.role === 'Gestor' &amp;&amp; u.approved === true)</w:t>
+              <w:br/>
+              <w:t xml:space="preserve">                .map(u =&gt; u.name.trim())</w:t>
+              <w:br/>
+              <w:t xml:space="preserve">                .sort((a, b) =&gt; a.localeCompare(b));</w:t>
+              <w:br/>
+              <w:t xml:space="preserve">            </w:t>
+              <w:br/>
+              <w:t xml:space="preserve">            const uniqueGestores = [...new Set(gestores)];</w:t>
+              <w:br/>
+              <w:t xml:space="preserve">            </w:t>
+              <w:br/>
+              <w:t xml:space="preserve">            uniqueGestores.forEach(name =&gt; {</w:t>
+              <w:br/>
+              <w:t xml:space="preserve">                const opt = document.createElement('option');</w:t>
+              <w:br/>
+              <w:t xml:space="preserve">                opt.value = name;</w:t>
+              <w:br/>
+              <w:t xml:space="preserve">                opt.textContent = name;</w:t>
+              <w:br/>
+              <w:t xml:space="preserve">                selectEl.appendChild(opt);</w:t>
+              <w:br/>
+              <w:t xml:space="preserve">            });</w:t>
+              <w:br/>
+              <w:t xml:space="preserve">        }</w:t>
+              <w:br/>
+              <w:t xml:space="preserve">    }).catch(err =&gt; {</w:t>
+              <w:br/>
+              <w:t xml:space="preserve">        console.error("Error populating gestores dropdown:", err);</w:t>
+              <w:br/>
+              <w:t xml:space="preserve">    });</w:t>
+              <w:br/>
+              <w:t>}</w:t>
               <w:br/>
             </w:r>
           </w:p>

</xml_diff>

<commit_message>
Actualizacion: sincronizado el turno del gestor obtenido desde el horario de Excel a Firebase active_sessions
</commit_message>
<xml_diff>
--- a/Documentacion_Tecnica.docx
+++ b/Documentacion_Tecnica.docx
@@ -6286,6 +6286,20 @@
               <w:t xml:space="preserve">                        const headerShiftBadge = document.querySelector('.shift-badge');</w:t>
               <w:br/>
               <w:t xml:space="preserve">                        if (headerShiftBadge) headerShiftBadge.textContent = `TURNO: ${badgeShift}`;</w:t>
+              <w:br/>
+              <w:t xml:space="preserve">                        </w:t>
+              <w:br/>
+              <w:t xml:space="preserve">                        // Guardar el turno en currentUser y sincronizar a Firebase</w:t>
+              <w:br/>
+              <w:t xml:space="preserve">                        if (currentUser.shift !== badgeShift) {</w:t>
+              <w:br/>
+              <w:t xml:space="preserve">                            currentUser.shift = badgeShift;</w:t>
+              <w:br/>
+              <w:t xml:space="preserve">                            localStorage.setItem('riskOps_currentUser', JSON.stringify(currentUser));</w:t>
+              <w:br/>
+              <w:t xml:space="preserve">                            syncActiveSessionToFirebase();</w:t>
+              <w:br/>
+              <w:t xml:space="preserve">                        }</w:t>
               <w:br/>
               <w:t xml:space="preserve">                    }</w:t>
               <w:br/>

</xml_diff>

<commit_message>
Actualizacion automatica de datos - vie 22/05/2026 12:34:37,27
</commit_message>
<xml_diff>
--- a/Documentacion_Tecnica.docx
+++ b/Documentacion_Tecnica.docx
@@ -5859,6 +5859,346 @@
               <w:t>}</w:t>
               <w:br/>
               <w:br/>
+              <w:t>function cleanText(text) {</w:t>
+              <w:br/>
+              <w:t xml:space="preserve">    if (!text || typeof text !== 'string') return "";</w:t>
+              <w:br/>
+              <w:t xml:space="preserve">    let cleaned = text.toLowerCase();</w:t>
+              <w:br/>
+              <w:t xml:space="preserve">    cleaned = cleaned.normalize("NFD").replace(/[\u0300-\u036f]/g, "");</w:t>
+              <w:br/>
+              <w:t xml:space="preserve">    cleaned = cleaned.replace(/[^a-z0-9\s]/g, " ");</w:t>
+              <w:br/>
+              <w:t xml:space="preserve">    cleaned = cleaned.split(/\s+/).join(" ").trim();</w:t>
+              <w:br/>
+              <w:t xml:space="preserve">    return cleaned;</w:t>
+              <w:br/>
+              <w:t>}</w:t>
+              <w:br/>
+              <w:br/>
+              <w:t>function normalizeTaskName(name) {</w:t>
+              <w:br/>
+              <w:t xml:space="preserve">    const cleaned = cleanText(name);</w:t>
+              <w:br/>
+              <w:t xml:space="preserve">    if (cleaned.includes("conciliacion de pasarelas")) {</w:t>
+              <w:br/>
+              <w:t xml:space="preserve">        return "conciliacion de pasarelas";</w:t>
+              <w:br/>
+              <w:t xml:space="preserve">    }</w:t>
+              <w:br/>
+              <w:t xml:space="preserve">    if (cleaned.includes("revision de billetera") || cleaned.includes("billetera usuarios")) {</w:t>
+              <w:br/>
+              <w:t xml:space="preserve">        return "revision de billetera usuarios pdv";</w:t>
+              <w:br/>
+              <w:t xml:space="preserve">    }</w:t>
+              <w:br/>
+              <w:t xml:space="preserve">    if (cleaned.includes("revision de eventos") || cleaned.includes("revision de evento")) {</w:t>
+              <w:br/>
+              <w:t xml:space="preserve">        return "revision de eventos";</w:t>
+              <w:br/>
+              <w:t xml:space="preserve">    }</w:t>
+              <w:br/>
+              <w:t xml:space="preserve">    return cleaned;</w:t>
+              <w:br/>
+              <w:t>}</w:t>
+              <w:br/>
+              <w:br/>
+              <w:t>function taskNamesMatch(cronTask, masterTask) {</w:t>
+              <w:br/>
+              <w:t xml:space="preserve">    if (!cronTask || !masterTask) return false;</w:t>
+              <w:br/>
+              <w:t xml:space="preserve">    const normCron = normalizeTaskName(cronTask);</w:t>
+              <w:br/>
+              <w:t xml:space="preserve">    const normMaster = normalizeTaskName(masterTask);</w:t>
+              <w:br/>
+              <w:t xml:space="preserve">    return normCron === normMaster || normMaster.includes(normCron) || normCron.includes(normMaster);</w:t>
+              <w:br/>
+              <w:t>}</w:t>
+              <w:br/>
+              <w:br/>
+              <w:t>function setNamesMatch(set1, set2) {</w:t>
+              <w:br/>
+              <w:t xml:space="preserve">    if (!set1 || !set2) return false;</w:t>
+              <w:br/>
+              <w:t xml:space="preserve">    const s1 = cleanText(set1);</w:t>
+              <w:br/>
+              <w:t xml:space="preserve">    const s2 = cleanText(set2);</w:t>
+              <w:br/>
+              <w:t xml:space="preserve">    return s1 === s2 || s1.includes(s2) || s2.includes(s1);</w:t>
+              <w:br/>
+              <w:t>}</w:t>
+              <w:br/>
+              <w:br/>
+              <w:t>const MONTHS_MAP = {</w:t>
+              <w:br/>
+              <w:t xml:space="preserve">    "ene": 0, "enero": 0,</w:t>
+              <w:br/>
+              <w:t xml:space="preserve">    "feb": 1, "febrero": 1,</w:t>
+              <w:br/>
+              <w:t xml:space="preserve">    "mar": 2, "marzo": 2,</w:t>
+              <w:br/>
+              <w:t xml:space="preserve">    "abr": 3, "abril": 3,</w:t>
+              <w:br/>
+              <w:t xml:space="preserve">    "may": 4, "mayo": 4,</w:t>
+              <w:br/>
+              <w:t xml:space="preserve">    "jun": 5, "junio": 5,</w:t>
+              <w:br/>
+              <w:t xml:space="preserve">    "jul": 6, "julio": 6,</w:t>
+              <w:br/>
+              <w:t xml:space="preserve">    "ago": 7, "agosto": 7,</w:t>
+              <w:br/>
+              <w:t xml:space="preserve">    "sep": 8, "set": 8, "septiembre": 8,</w:t>
+              <w:br/>
+              <w:t xml:space="preserve">    "oct": 9, "octubre": 9,</w:t>
+              <w:br/>
+              <w:t xml:space="preserve">    "nov": 10, "noviembre": 10,</w:t>
+              <w:br/>
+              <w:t xml:space="preserve">    "dic": 11, "diciembre": 11</w:t>
+              <w:br/>
+              <w:t>};</w:t>
+              <w:br/>
+              <w:br/>
+              <w:t>function parseSheetRange(sheetName, year = 2026) {</w:t>
+              <w:br/>
+              <w:t xml:space="preserve">    if (!sheetName) return null;</w:t>
+              <w:br/>
+              <w:t xml:space="preserve">    let clean = sheetName.normalize("NFD").replace(/[\u0300-\u036f]/g, "");</w:t>
+              <w:br/>
+              <w:t xml:space="preserve">    </w:t>
+              <w:br/>
+              <w:t xml:space="preserve">    let m = clean.match(/Semana\s+\d+\s*-\s*(\d+)\s+(\w+)\s+al\s+(\d+)\s+(\w+)/i);</w:t>
+              <w:br/>
+              <w:t xml:space="preserve">    if (m) {</w:t>
+              <w:br/>
+              <w:t xml:space="preserve">        let startDay = parseInt(m[1], 10);</w:t>
+              <w:br/>
+              <w:t xml:space="preserve">        let startMStr = m[2].substring(0, 3).toLowerCase();</w:t>
+              <w:br/>
+              <w:t xml:space="preserve">        let endDay = parseInt(m[3], 10);</w:t>
+              <w:br/>
+              <w:t xml:space="preserve">        let endMStr = m[4].substring(0, 3).toLowerCase();</w:t>
+              <w:br/>
+              <w:t xml:space="preserve">        </w:t>
+              <w:br/>
+              <w:t xml:space="preserve">        let startMonth = MONTHS_MAP[startMStr] !== undefined ? MONTHS_MAP[startMStr] : 0;</w:t>
+              <w:br/>
+              <w:t xml:space="preserve">        let endMonth = MONTHS_MAP[endMStr] !== undefined ? MONTHS_MAP[endMStr] : 0;</w:t>
+              <w:br/>
+              <w:t xml:space="preserve">        </w:t>
+              <w:br/>
+              <w:t xml:space="preserve">        let startDate = new Date(year, startMonth, startDay, 0, 0, 0);</w:t>
+              <w:br/>
+              <w:t xml:space="preserve">        let endDate = new Date(year, endMonth, endDay, 23, 59, 59);</w:t>
+              <w:br/>
+              <w:t xml:space="preserve">        return { start: startDate, end: endDate };</w:t>
+              <w:br/>
+              <w:t xml:space="preserve">    }</w:t>
+              <w:br/>
+              <w:t xml:space="preserve">    </w:t>
+              <w:br/>
+              <w:t xml:space="preserve">    m = clean.match(/Semana\s+\d+\s*-\s*(\d+)\s+al\s+(\d+)\s+(\w+)/i);</w:t>
+              <w:br/>
+              <w:t xml:space="preserve">    if (m) {</w:t>
+              <w:br/>
+              <w:t xml:space="preserve">        let startDay = parseInt(m[1], 10);</w:t>
+              <w:br/>
+              <w:t xml:space="preserve">        let endDay = parseInt(m[2], 10);</w:t>
+              <w:br/>
+              <w:t xml:space="preserve">        let mStr = m[3].substring(0, 3).toLowerCase();</w:t>
+              <w:br/>
+              <w:t xml:space="preserve">        </w:t>
+              <w:br/>
+              <w:t xml:space="preserve">        let month = MONTHS_MAP[mStr] !== undefined ? MONTHS_MAP[mStr] : 0;</w:t>
+              <w:br/>
+              <w:t xml:space="preserve">        let startDate = new Date(year, month, startDay, 0, 0, 0);</w:t>
+              <w:br/>
+              <w:t xml:space="preserve">        let endDate = new Date(year, month, endDay, 23, 59, 59);</w:t>
+              <w:br/>
+              <w:t xml:space="preserve">        return { start: startDate, end: endDate };</w:t>
+              <w:br/>
+              <w:t xml:space="preserve">    }</w:t>
+              <w:br/>
+              <w:t xml:space="preserve">    </w:t>
+              <w:br/>
+              <w:t xml:space="preserve">    return null;</w:t>
+              <w:br/>
+              <w:t>}</w:t>
+              <w:br/>
+              <w:br/>
+              <w:t>function getWeekSheet(sheetNames, targetDate) {</w:t>
+              <w:br/>
+              <w:t xml:space="preserve">    if (!sheetNames || sheetNames.length === 0) return null;</w:t>
+              <w:br/>
+              <w:t xml:space="preserve">    const year = targetDate.getFullYear();</w:t>
+              <w:br/>
+              <w:t xml:space="preserve">    for (let name of sheetNames) {</w:t>
+              <w:br/>
+              <w:t xml:space="preserve">        let r = parseSheetRange(name, year);</w:t>
+              <w:br/>
+              <w:t xml:space="preserve">        if (r) {</w:t>
+              <w:br/>
+              <w:t xml:space="preserve">            if (targetDate &gt;= r.start &amp;&amp; targetDate &lt;= r.end) {</w:t>
+              <w:br/>
+              <w:t xml:space="preserve">                return name;</w:t>
+              <w:br/>
+              <w:t xml:space="preserve">            }</w:t>
+              <w:br/>
+              <w:t xml:space="preserve">        }</w:t>
+              <w:br/>
+              <w:t xml:space="preserve">    }</w:t>
+              <w:br/>
+              <w:t xml:space="preserve">    return sheetNames[sheetNames.length - 1];</w:t>
+              <w:br/>
+              <w:t>}</w:t>
+              <w:br/>
+              <w:br/>
+              <w:t>function getCronogramaColumnsForToday(targetDate, shiftText) {</w:t>
+              <w:br/>
+              <w:t xml:space="preserve">    const day = targetDate.getDay(); // 0 = Sunday, 1 = Monday, ..., 6 = Saturday</w:t>
+              <w:br/>
+              <w:t xml:space="preserve">    if (day === 0) { // Sunday</w:t>
+              <w:br/>
+              <w:t xml:space="preserve">        return [[10, 11]];</w:t>
+              <w:br/>
+              <w:t xml:space="preserve">    } else if (day === 6) { // Saturday</w:t>
+              <w:br/>
+              <w:t xml:space="preserve">        return [[7, 8]];</w:t>
+              <w:br/>
+              <w:t xml:space="preserve">    } else { // Monday to Friday</w:t>
+              <w:br/>
+              <w:t xml:space="preserve">        const sLower = String(shiftText || '').toLowerCase();</w:t>
+              <w:br/>
+              <w:t xml:space="preserve">        if (sLower.includes("manana") || sLower.includes("mañana") || sLower.includes("6am") || sLower.includes("8am")) {</w:t>
+              <w:br/>
+              <w:t xml:space="preserve">            return [[1, 2]];</w:t>
+              <w:br/>
+              <w:t xml:space="preserve">        } else if (sLower.includes("tarde") || sLower.includes("noche") || sLower.includes("pm") || sLower.includes("3pm") || sLower.includes("10pm")) {</w:t>
+              <w:br/>
+              <w:t xml:space="preserve">            return [[4, 5]];</w:t>
+              <w:br/>
+              <w:t xml:space="preserve">        } else {</w:t>
+              <w:br/>
+              <w:t xml:space="preserve">            return [[1, 2], [4, 5]];</w:t>
+              <w:br/>
+              <w:t xml:space="preserve">        }</w:t>
+              <w:br/>
+              <w:t xml:space="preserve">    }</w:t>
+              <w:br/>
+              <w:t>}</w:t>
+              <w:br/>
+              <w:br/>
+              <w:t>let gestorCronogramaAssignments = null;</w:t>
+              <w:br/>
+              <w:br/>
+              <w:t>async function loadCronogramaAssignments(gestorName, gestorShift) {</w:t>
+              <w:br/>
+              <w:t xml:space="preserve">    try {</w:t>
+              <w:br/>
+              <w:t xml:space="preserve">        const url = encodeURI('Cronograma de Tareas/Cronograma Mayo.xlsx') + '?t=' + Date.now();</w:t>
+              <w:br/>
+              <w:t xml:space="preserve">        const response = await fetch(url);</w:t>
+              <w:br/>
+              <w:t xml:space="preserve">        if (!response.ok) throw new Error("Fallo al cargar cronograma");</w:t>
+              <w:br/>
+              <w:t xml:space="preserve">        const arrayBuffer = await response.arrayBuffer();</w:t>
+              <w:br/>
+              <w:t xml:space="preserve">        const workbook = XLSX.read(arrayBuffer, {type: 'array'});</w:t>
+              <w:br/>
+              <w:t xml:space="preserve">        </w:t>
+              <w:br/>
+              <w:t xml:space="preserve">        const today = new Date();</w:t>
+              <w:br/>
+              <w:t xml:space="preserve">        const sheetName = getWeekSheet(workbook.SheetNames, today);</w:t>
+              <w:br/>
+              <w:t xml:space="preserve">        if (!sheetName) return;</w:t>
+              <w:br/>
+              <w:t xml:space="preserve">        </w:t>
+              <w:br/>
+              <w:t xml:space="preserve">        const worksheet = workbook.Sheets[sheetName];</w:t>
+              <w:br/>
+              <w:t xml:space="preserve">        const rows = XLSX.utils.sheet_to_json(worksheet, { header: 1, defval: "" });</w:t>
+              <w:br/>
+              <w:t xml:space="preserve">        </w:t>
+              <w:br/>
+              <w:t xml:space="preserve">        const colGroups = getCronogramaColumnsForToday(today, gestorShift);</w:t>
+              <w:br/>
+              <w:t xml:space="preserve">        </w:t>
+              <w:br/>
+              <w:t xml:space="preserve">        gestorCronogramaAssignments = [];</w:t>
+              <w:br/>
+              <w:t xml:space="preserve">        </w:t>
+              <w:br/>
+              <w:t xml:space="preserve">        for (let colGroup of colGroups) {</w:t>
+              <w:br/>
+              <w:t xml:space="preserve">            const tCol = colGroup[0];</w:t>
+              <w:br/>
+              <w:t xml:space="preserve">            const gCol = colGroup[1];</w:t>
+              <w:br/>
+              <w:t xml:space="preserve">            </w:t>
+              <w:br/>
+              <w:t xml:space="preserve">            let currentSet = "";</w:t>
+              <w:br/>
+              <w:t xml:space="preserve">            for (let rIdx = 0; rIdx &lt; rows.length; rIdx++) {</w:t>
+              <w:br/>
+              <w:t xml:space="preserve">                const row = rows[rIdx];</w:t>
+              <w:br/>
+              <w:t xml:space="preserve">                if (!row) continue;</w:t>
+              <w:br/>
+              <w:t xml:space="preserve">                </w:t>
+              <w:br/>
+              <w:t xml:space="preserve">                const taskVal = row[tCol];</w:t>
+              <w:br/>
+              <w:t xml:space="preserve">                const gestorVal = row[gCol];</w:t>
+              <w:br/>
+              <w:t xml:space="preserve">                </w:t>
+              <w:br/>
+              <w:t xml:space="preserve">                if (taskVal !== undefined &amp;&amp; taskVal !== null &amp;&amp; String(taskVal).trim() !== "") {</w:t>
+              <w:br/>
+              <w:t xml:space="preserve">                    const tStr = String(taskVal).trim();</w:t>
+              <w:br/>
+              <w:t xml:space="preserve">                    const tStrLower = tStr.toLowerCase();</w:t>
+              <w:br/>
+              <w:t xml:space="preserve">                    </w:t>
+              <w:br/>
+              <w:t xml:space="preserve">                    if (tStrLower.startsWith("set ")) {</w:t>
+              <w:br/>
+              <w:t xml:space="preserve">                        currentSet = tStr;</w:t>
+              <w:br/>
+              <w:t xml:space="preserve">                    } else if (!tStrLower.includes("cronograma") &amp;&amp; gestorVal !== "Gestor") {</w:t>
+              <w:br/>
+              <w:t xml:space="preserve">                        if (gestorVal !== undefined &amp;&amp; gestorVal !== null &amp;&amp; namesMatch(String(gestorVal).trim(), gestorName)) {</w:t>
+              <w:br/>
+              <w:t xml:space="preserve">                            gestorCronogramaAssignments.push({</w:t>
+              <w:br/>
+              <w:t xml:space="preserve">                                set: currentSet || "Otros",</w:t>
+              <w:br/>
+              <w:t xml:space="preserve">                                task: tStr</w:t>
+              <w:br/>
+              <w:t xml:space="preserve">                            });</w:t>
+              <w:br/>
+              <w:t xml:space="preserve">                        }</w:t>
+              <w:br/>
+              <w:t xml:space="preserve">                    }</w:t>
+              <w:br/>
+              <w:t xml:space="preserve">                }</w:t>
+              <w:br/>
+              <w:t xml:space="preserve">            }</w:t>
+              <w:br/>
+              <w:t xml:space="preserve">        }</w:t>
+              <w:br/>
+              <w:t xml:space="preserve">        console.log("Cargadas asignaciones de cronograma para " + gestorName + ":", gestorCronogramaAssignments);</w:t>
+              <w:br/>
+              <w:t xml:space="preserve">    } catch (e) {</w:t>
+              <w:br/>
+              <w:t xml:space="preserve">        console.error("Error al cargar Cronograma de Tareas:", e);</w:t>
+              <w:br/>
+              <w:t xml:space="preserve">        gestorCronogramaAssignments = [];</w:t>
+              <w:br/>
+              <w:t xml:space="preserve">    }</w:t>
+              <w:br/>
+              <w:t>}</w:t>
+              <w:br/>
+              <w:br/>
               <w:t>function getScheduledGestoresCountForShift(shiftName, targetDate = new Date()) {</w:t>
               <w:br/>
               <w:t xml:space="preserve">    if (!globalScheduleRows || !globalScheduleBlocks || globalScheduleBlocks.length === 0) {</w:t>
@@ -6197,18 +6537,128 @@
               <w:br/>
               <w:t xml:space="preserve">        </w:t>
               <w:br/>
+              <w:t xml:space="preserve">        // Assign ID to all master tasks in json</w:t>
+              <w:br/>
+              <w:t xml:space="preserve">        json.forEach((row, idx) =&gt; {</w:t>
+              <w:br/>
+              <w:t xml:space="preserve">            row.id = idx;</w:t>
+              <w:br/>
+              <w:t xml:space="preserve">        });</w:t>
+              <w:br/>
+              <w:t xml:space="preserve">        </w:t>
+              <w:br/>
+              <w:t xml:space="preserve">        let processedRows = [];</w:t>
+              <w:br/>
+              <w:t xml:space="preserve">        </w:t>
+              <w:br/>
+              <w:t xml:space="preserve">        if (currentUser &amp;&amp; currentUser.role === 'Gestor') {</w:t>
+              <w:br/>
+              <w:t xml:space="preserve">            // Load cronograma assignments</w:t>
+              <w:br/>
+              <w:t xml:space="preserve">            await loadCronogramaAssignments(currentUser.name, currentUser.shift);</w:t>
+              <w:br/>
+              <w:t xml:space="preserve">            </w:t>
+              <w:br/>
+              <w:t xml:space="preserve">            if (gestorCronogramaAssignments &amp;&amp; gestorCronogramaAssignments.length &gt; 0) {</w:t>
+              <w:br/>
+              <w:t xml:space="preserve">                // Filter the master json rows</w:t>
+              <w:br/>
+              <w:t xml:space="preserve">                const filteredMasterRows = json.filter(row =&gt; {</w:t>
+              <w:br/>
+              <w:t xml:space="preserve">                    const set = row['Set '] || row['Set'] || 'Otros';</w:t>
+              <w:br/>
+              <w:t xml:space="preserve">                    const taskName = row['Tarea'];</w:t>
+              <w:br/>
+              <w:t xml:space="preserve">                    return gestorCronogramaAssignments.some(assign =&gt; </w:t>
+              <w:br/>
+              <w:t xml:space="preserve">                        taskNamesMatch(assign.task, taskName) &amp;&amp; setNamesMatch(assign.set, set)</w:t>
+              <w:br/>
+              <w:t xml:space="preserve">                    );</w:t>
+              <w:br/>
+              <w:t xml:space="preserve">                });</w:t>
+              <w:br/>
+              <w:t xml:space="preserve">                </w:t>
+              <w:br/>
+              <w:t xml:space="preserve">                // Generate mock tasks for assignments that aren't in the master sheet</w:t>
+              <w:br/>
+              <w:t xml:space="preserve">                const generatedMocks = [];</w:t>
+              <w:br/>
+              <w:t xml:space="preserve">                let mockId = 10000;</w:t>
+              <w:br/>
+              <w:t xml:space="preserve">                gestorCronogramaAssignments.forEach(assign =&gt; {</w:t>
+              <w:br/>
+              <w:t xml:space="preserve">                    const hasMasterMatch = json.some(row =&gt; </w:t>
+              <w:br/>
+              <w:t xml:space="preserve">                        taskNamesMatch(assign.task, row['Tarea']) &amp;&amp; setNamesMatch(assign.set, row['Set '] || row['Set'] || 'Otros')</w:t>
+              <w:br/>
+              <w:t xml:space="preserve">                    );</w:t>
+              <w:br/>
+              <w:t xml:space="preserve">                    </w:t>
+              <w:br/>
+              <w:t xml:space="preserve">                    if (!hasMasterMatch) {</w:t>
+              <w:br/>
+              <w:t xml:space="preserve">                        const mockRow = {</w:t>
+              <w:br/>
+              <w:t xml:space="preserve">                            'Set ': assign.set,</w:t>
+              <w:br/>
+              <w:t xml:space="preserve">                            'Tarea': assign.task,</w:t>
+              <w:br/>
+              <w:t xml:space="preserve">                            'Detalle de Tarea': `Tarea de control rutinario: ${assign.task}. Realizar las verificaciones correspondientes según los lineamientos de Riesgo.`,</w:t>
+              <w:br/>
+              <w:t xml:space="preserve">                            'Horario': 'Durante el turno',</w:t>
+              <w:br/>
+              <w:t xml:space="preserve">                            'Día': 'Diario',</w:t>
+              <w:br/>
+              <w:t xml:space="preserve">                            'Instrucciones': '1. Realizar la validación de la tarea de acuerdo con el procedimiento estándar.\n2. Registrar cualquier anomalía en los canales oficiales.\n3. Marcar como completada en esta plataforma al finalizar.',</w:t>
+              <w:br/>
+              <w:t xml:space="preserve">                            'Documento / Video de Apoyo': '',</w:t>
+              <w:br/>
+              <w:t xml:space="preserve">                            id: mockId++</w:t>
+              <w:br/>
+              <w:t xml:space="preserve">                        };</w:t>
+              <w:br/>
+              <w:t xml:space="preserve">                        generatedMocks.push(mockRow);</w:t>
+              <w:br/>
+              <w:t xml:space="preserve">                    }</w:t>
+              <w:br/>
+              <w:t xml:space="preserve">                });</w:t>
+              <w:br/>
+              <w:t xml:space="preserve">                </w:t>
+              <w:br/>
+              <w:t xml:space="preserve">                processedRows = [...filteredMasterRows, ...generatedMocks];</w:t>
+              <w:br/>
+              <w:t xml:space="preserve">            } else {</w:t>
+              <w:br/>
+              <w:t xml:space="preserve">                processedRows = [];</w:t>
+              <w:br/>
+              <w:t xml:space="preserve">            }</w:t>
+              <w:br/>
+              <w:t xml:space="preserve">        } else {</w:t>
+              <w:br/>
+              <w:t xml:space="preserve">            // Admin/Supervisor or other roles see everything</w:t>
+              <w:br/>
+              <w:t xml:space="preserve">            processedRows = json;</w:t>
+              <w:br/>
+              <w:t xml:space="preserve">        }</w:t>
+              <w:br/>
+              <w:t xml:space="preserve">        </w:t>
+              <w:br/>
               <w:t xml:space="preserve">        // Transform the data, group by Set</w:t>
               <w:br/>
               <w:t xml:space="preserve">        const tasksBySet = {};</w:t>
               <w:br/>
+              <w:t xml:space="preserve">        allTasks = []; // Clear global allTasks</w:t>
+              <w:br/>
               <w:t xml:space="preserve">        </w:t>
               <w:br/>
-              <w:t xml:space="preserve">        json.forEach((row, index) =&gt; {</w:t>
+              <w:t xml:space="preserve">        processedRows.forEach((row, index) =&gt; {</w:t>
               <w:br/>
               <w:t xml:space="preserve">            const set = row['Set '] || row['Set'] || 'Otros';</w:t>
               <w:br/>
               <w:t xml:space="preserve">            const taskName = row['Tarea'];</w:t>
               <w:br/>
+              <w:t xml:space="preserve">            const taskId = row.id !== undefined ? row.id : index;</w:t>
+              <w:br/>
               <w:t xml:space="preserve">            </w:t>
               <w:br/>
               <w:t xml:space="preserve">            if (!tasksBySet[set]) tasksBySet[set] = [];</w:t>
@@ -6225,7 +6675,7 @@
               <w:br/>
               <w:t xml:space="preserve">                tasksBySet[set].push({</w:t>
               <w:br/>
-              <w:t xml:space="preserve">                    id: index,</w:t>
+              <w:t xml:space="preserve">                    id: taskId,</w:t>
               <w:br/>
               <w:t xml:space="preserve">                    name: taskName,</w:t>
               <w:br/>
@@ -6239,10 +6689,12 @@
               <w:br/>
               <w:t xml:space="preserve">            }</w:t>
               <w:br/>
-              <w:t xml:space="preserve">            allTasks.push({ ...row, id: index });</w:t>
+              <w:t xml:space="preserve">            allTasks.push({ ...row, id: taskId });</w:t>
               <w:br/>
               <w:t xml:space="preserve">        });</w:t>
               <w:br/>
+              <w:t xml:space="preserve">        </w:t>
+              <w:br/>
               <w:t xml:space="preserve">        // Populate Set Selector</w:t>
               <w:br/>
               <w:t xml:space="preserve">        const select = document.getElementById('activeSetSelect');</w:t>
@@ -6261,7 +6713,15 @@
               <w:br/>
               <w:t xml:space="preserve">            </w:t>
               <w:br/>
-              <w:t xml:space="preserve">            select.addEventListener('change', (e) =&gt; {</w:t>
+              <w:t xml:space="preserve">            // Clone select to remove old event listeners</w:t>
+              <w:br/>
+              <w:t xml:space="preserve">            const newSelect = select.cloneNode(true);</w:t>
+              <w:br/>
+              <w:t xml:space="preserve">            select.parentNode.replaceChild(newSelect, select);</w:t>
+              <w:br/>
+              <w:t xml:space="preserve">            </w:t>
+              <w:br/>
+              <w:t xml:space="preserve">            newSelect.addEventListener('change', (e) =&gt; {</w:t>
               <w:br/>
               <w:t xml:space="preserve">                const val = e.target.value;</w:t>
               <w:br/>
@@ -6621,6 +7081,8 @@
               <w:br/>
               <w:t xml:space="preserve">                            syncActiveSessionToFirebase();</w:t>
               <w:br/>
+              <w:t xml:space="preserve">                            loadExcelTasks();</w:t>
+              <w:br/>
               <w:t xml:space="preserve">                        }</w:t>
               <w:br/>
               <w:t xml:space="preserve">                    }</w:t>
@@ -7397,247 +7859,312 @@
               <w:br/>
               <w:t xml:space="preserve">        const textArea = document.getElementById('taskObservation');</w:t>
               <w:br/>
-              <w:t xml:space="preserve">        if(textArea) {</w:t>
-              <w:br/>
-              <w:t xml:space="preserve">           textArea.value = task['Detalle de Tarea'] || "";</w:t>
+              <w:t xml:space="preserve">        </w:t>
+              <w:br/>
+              <w:t xml:space="preserve">        if (currentUser &amp;&amp; (currentUser.role === 'Admin' || currentUser.role === 'Supervisor')) {</w:t>
+              <w:br/>
+              <w:t xml:space="preserve">            if (textArea) {</w:t>
+              <w:br/>
+              <w:t xml:space="preserve">                // Show task detail and instructions for admin/supervisor review</w:t>
+              <w:br/>
+              <w:t xml:space="preserve">                let detailText = `Detalle: ${task['Detalle de Tarea'] || 'Sin detalle'}\n\n`;</w:t>
+              <w:br/>
+              <w:t xml:space="preserve">                detailText += `Horario: ${task['Horario'] || 'No especificado'}\n`;</w:t>
+              <w:br/>
+              <w:t xml:space="preserve">                detailText += `Día: ${task['Día'] || 'No especificado'}\n\n`;</w:t>
+              <w:br/>
+              <w:t xml:space="preserve">                detailText += `Instrucciones:\n${task['Instrucciones'] || 'Sin instrucciones'}`;</w:t>
+              <w:br/>
+              <w:t xml:space="preserve">                textArea.value = detailText;</w:t>
+              <w:br/>
+              <w:t xml:space="preserve">            }</w:t>
+              <w:br/>
+              <w:t xml:space="preserve">        } else {</w:t>
+              <w:br/>
+              <w:t xml:space="preserve">            if(textArea) {</w:t>
+              <w:br/>
+              <w:t xml:space="preserve">               textArea.value = task['Detalle de Tarea'] || "";</w:t>
+              <w:br/>
+              <w:t xml:space="preserve">            }</w:t>
+              <w:br/>
+              <w:br/>
+              <w:t xml:space="preserve">            // Restore from cache if exists</w:t>
+              <w:br/>
+              <w:t xml:space="preserve">            document.querySelectorAll('.btn-status').forEach(el =&gt; el.classList.remove('active'));</w:t>
+              <w:br/>
+              <w:t xml:space="preserve">            if(taskStateCache[taskId]) {</w:t>
+              <w:br/>
+              <w:t xml:space="preserve">                if(textArea) textArea.value = taskStateCache[taskId].observation;</w:t>
+              <w:br/>
+              <w:t xml:space="preserve">                </w:t>
+              <w:br/>
+              <w:t xml:space="preserve">                const cachedStatus = taskStateCache[taskId].status;</w:t>
+              <w:br/>
+              <w:t xml:space="preserve">                let found = false;</w:t>
+              <w:br/>
+              <w:t xml:space="preserve">                document.querySelectorAll('.btn-status').forEach(el =&gt; {</w:t>
+              <w:br/>
+              <w:t xml:space="preserve">                    if(el.textContent.trim() === cachedStatus) {</w:t>
+              <w:br/>
+              <w:t xml:space="preserve">                        el.classList.add('active');</w:t>
+              <w:br/>
+              <w:t xml:space="preserve">                        found = true;</w:t>
+              <w:br/>
+              <w:t xml:space="preserve">                    }</w:t>
+              <w:br/>
+              <w:t xml:space="preserve">                });</w:t>
+              <w:br/>
+              <w:t xml:space="preserve">                if(!found) document.querySelector('.btn-status.pending').classList.add('active');</w:t>
+              <w:br/>
+              <w:t xml:space="preserve">            } else {</w:t>
+              <w:br/>
+              <w:t xml:space="preserve">                if(textArea) textArea.value = ""; // Limpiar nota de otras tareas</w:t>
+              <w:br/>
+              <w:t xml:space="preserve">                document.querySelector('.btn-status.pending').classList.add('active');</w:t>
+              <w:br/>
+              <w:t xml:space="preserve">            }</w:t>
               <w:br/>
               <w:t xml:space="preserve">        }</w:t>
               <w:br/>
-              <w:br/>
-              <w:t xml:space="preserve">        // Restore from cache if exists</w:t>
-              <w:br/>
-              <w:t xml:space="preserve">        document.querySelectorAll('.btn-status').forEach(el =&gt; el.classList.remove('active'));</w:t>
-              <w:br/>
-              <w:t xml:space="preserve">        if(taskStateCache[taskId]) {</w:t>
-              <w:br/>
-              <w:t xml:space="preserve">            if(textArea) textArea.value = taskStateCache[taskId].observation;</w:t>
+              <w:t xml:space="preserve">    }</w:t>
+              <w:br/>
+              <w:t>}</w:t>
+              <w:br/>
+              <w:br/>
+              <w:t>// Task Status Buttons Interaction</w:t>
+              <w:br/>
+              <w:t>async function initApp() {</w:t>
+              <w:br/>
+              <w:t xml:space="preserve">    // Carga de Excel Inicial</w:t>
+              <w:br/>
+              <w:t xml:space="preserve">    try {</w:t>
+              <w:br/>
+              <w:t xml:space="preserve">        await loadSchedule();</w:t>
+              <w:br/>
+              <w:t xml:space="preserve">    } catch(e) {</w:t>
+              <w:br/>
+              <w:t xml:space="preserve">        console.error("Error al cargar el horario en la inicialización:", e);</w:t>
+              <w:br/>
+              <w:t xml:space="preserve">    }</w:t>
+              <w:br/>
+              <w:t xml:space="preserve">    </w:t>
+              <w:br/>
+              <w:t xml:space="preserve">    try {</w:t>
+              <w:br/>
+              <w:t xml:space="preserve">        await loadExcelTasks();</w:t>
+              <w:br/>
+              <w:t xml:space="preserve">    } catch(e) {</w:t>
+              <w:br/>
+              <w:t xml:space="preserve">        console.error("Error al cargar las tareas en la inicialización:", e);</w:t>
+              <w:br/>
+              <w:t xml:space="preserve">    }</w:t>
+              <w:br/>
+              <w:t xml:space="preserve">    </w:t>
+              <w:br/>
+              <w:t xml:space="preserve">    loadTeletrabajo();</w:t>
+              <w:br/>
+              <w:t xml:space="preserve">    loadPermisos();</w:t>
+              <w:br/>
+              <w:t xml:space="preserve">    renderQuickDocs(null);</w:t>
+              <w:br/>
+              <w:br/>
+              <w:t xml:space="preserve">    // Theme logic</w:t>
+              <w:br/>
+              <w:t xml:space="preserve">    const themeToggleBtn = document.getElementById('themeToggleBtn');</w:t>
+              <w:br/>
+              <w:t xml:space="preserve">    if (themeToggleBtn) {</w:t>
+              <w:br/>
+              <w:t xml:space="preserve">        const savedTheme = localStorage.getItem('riskOps_theme') || 'dark';</w:t>
+              <w:br/>
+              <w:t xml:space="preserve">        document.body.setAttribute('data-theme', savedTheme);</w:t>
+              <w:br/>
+              <w:t xml:space="preserve">        themeToggleBtn.innerHTML = savedTheme === 'dark' ? "&lt;i class='bx bx-moon'&gt;&lt;/i&gt;" : "&lt;i class='bx bx-sun'&gt;&lt;/i&gt;";</w:t>
+              <w:br/>
+              <w:t xml:space="preserve">        </w:t>
+              <w:br/>
+              <w:t xml:space="preserve">        themeToggleBtn.addEventListener('click', () =&gt; {</w:t>
+              <w:br/>
+              <w:t xml:space="preserve">            const currentTheme = document.body.getAttribute('data-theme');</w:t>
+              <w:br/>
+              <w:t xml:space="preserve">            const newTheme = currentTheme === 'dark' ? 'light' : 'dark';</w:t>
+              <w:br/>
+              <w:t xml:space="preserve">            document.body.setAttribute('data-theme', newTheme);</w:t>
+              <w:br/>
+              <w:t xml:space="preserve">            localStorage.setItem('riskOps_theme', newTheme);</w:t>
+              <w:br/>
+              <w:t xml:space="preserve">            themeToggleBtn.innerHTML = newTheme === 'dark' ? "&lt;i class='bx bx-moon'&gt;&lt;/i&gt;" : "&lt;i class='bx bx-sun'&gt;&lt;/i&gt;";</w:t>
+              <w:br/>
+              <w:t xml:space="preserve">        });</w:t>
+              <w:br/>
+              <w:t xml:space="preserve">    }</w:t>
+              <w:br/>
+              <w:br/>
+              <w:t xml:space="preserve">    // Populate user UI</w:t>
+              <w:br/>
+              <w:t xml:space="preserve">    if (currentUser) {</w:t>
+              <w:br/>
+              <w:t xml:space="preserve">        const userNameEl = document.querySelector('.user-name');</w:t>
+              <w:br/>
+              <w:t xml:space="preserve">        const roleEl = document.querySelector('.user-role');</w:t>
+              <w:br/>
+              <w:t xml:space="preserve">        const shiftBadgeEl = document.querySelector('.shift-badge');</w:t>
+              <w:br/>
+              <w:t xml:space="preserve">        </w:t>
+              <w:br/>
+              <w:t xml:space="preserve">        if (userNameEl) userNameEl.textContent = currentUser.name;</w:t>
+              <w:br/>
+              <w:t xml:space="preserve">        if (roleEl) roleEl.textContent = currentUser.role;</w:t>
+              <w:br/>
+              <w:t xml:space="preserve">        if (shiftBadgeEl) shiftBadgeEl.textContent = 'Turno ' + currentUser.shift;</w:t>
+              <w:br/>
+              <w:t xml:space="preserve">        </w:t>
+              <w:br/>
+              <w:t xml:space="preserve">        const avatarEl = document.querySelector('.avatar');</w:t>
+              <w:br/>
+              <w:t xml:space="preserve">        if (avatarEl &amp;&amp; currentUser.name) {</w:t>
+              <w:br/>
+              <w:t xml:space="preserve">            const availableAvatars = [</w:t>
+              <w:br/>
+              <w:t xml:space="preserve">                "Alexander Villada.png",</w:t>
+              <w:br/>
+              <w:t xml:space="preserve">                "Camilo Espinosa.png",</w:t>
+              <w:br/>
+              <w:t xml:space="preserve">                "Daniel Benavidez.png",</w:t>
+              <w:br/>
+              <w:t xml:space="preserve">                "Josue Alvarez.png",</w:t>
+              <w:br/>
+              <w:t xml:space="preserve">                "Juan Jose Diaz.png",</w:t>
+              <w:br/>
+              <w:t xml:space="preserve">                "Maria Sanchez.png",</w:t>
+              <w:br/>
+              <w:t xml:space="preserve">                "Marilyn Jimenez.png",</w:t>
+              <w:br/>
+              <w:t xml:space="preserve">                "Oriana Borja.png",</w:t>
+              <w:br/>
+              <w:t xml:space="preserve">                "Samuel Cruz.png",</w:t>
+              <w:br/>
+              <w:t xml:space="preserve">                "Sara Santamaria.png",</w:t>
+              <w:br/>
+              <w:t xml:space="preserve">                "Sebastian Arango.png",</w:t>
+              <w:br/>
+              <w:t xml:space="preserve">                "Sebastian Hincapie.png",</w:t>
+              <w:br/>
+              <w:t xml:space="preserve">                "Yefferson Giraldo.png"</w:t>
+              <w:br/>
+              <w:t xml:space="preserve">            ];</w:t>
               <w:br/>
               <w:t xml:space="preserve">            </w:t>
               <w:br/>
-              <w:t xml:space="preserve">            const cachedStatus = taskStateCache[taskId].status;</w:t>
-              <w:br/>
-              <w:t xml:space="preserve">            let found = false;</w:t>
-              <w:br/>
-              <w:t xml:space="preserve">            document.querySelectorAll('.btn-status').forEach(el =&gt; {</w:t>
-              <w:br/>
-              <w:t xml:space="preserve">                if(el.textContent.trim() === cachedStatus) {</w:t>
-              <w:br/>
-              <w:t xml:space="preserve">                    el.classList.add('active');</w:t>
-              <w:br/>
-              <w:t xml:space="preserve">                    found = true;</w:t>
-              <w:br/>
-              <w:t xml:space="preserve">                }</w:t>
-              <w:br/>
-              <w:t xml:space="preserve">            });</w:t>
-              <w:br/>
-              <w:t xml:space="preserve">            if(!found) document.querySelector('.btn-status.pending').classList.add('active');</w:t>
-              <w:br/>
-              <w:t xml:space="preserve">        } else {</w:t>
-              <w:br/>
-              <w:t xml:space="preserve">            if(textArea) textArea.value = ""; // Limpiar nota de otras tareas</w:t>
-              <w:br/>
-              <w:t xml:space="preserve">            document.querySelector('.btn-status.pending').classList.add('active');</w:t>
+              <w:t xml:space="preserve">            const fullName = currentUser.name.trim();</w:t>
+              <w:br/>
+              <w:t xml:space="preserve">            // Buscar una imagen que coincida con el nombre registrado</w:t>
+              <w:br/>
+              <w:t xml:space="preserve">            let matchedAvatar = availableAvatars.find(img =&gt; namesMatch(fullName, img.replace('.png', '')));</w:t>
+              <w:br/>
+              <w:t xml:space="preserve">            console.log("DEBUG_AVATAR: fullName =", fullName, "matchedAvatar =", matchedAvatar);</w:t>
+              <w:br/>
+              <w:t xml:space="preserve">            </w:t>
+              <w:br/>
+              <w:t xml:space="preserve">            if (matchedAvatar) {</w:t>
+              <w:br/>
+              <w:t xml:space="preserve">                avatarEl.src = `assets/src/img/${matchedAvatar}`;</w:t>
+              <w:br/>
+              <w:t xml:space="preserve">                // Fallback por si la imagen se borra o falla</w:t>
+              <w:br/>
+              <w:t xml:space="preserve">                avatarEl.onerror = function() {</w:t>
+              <w:br/>
+              <w:t xml:space="preserve">                    this.onerror = null;</w:t>
+              <w:br/>
+              <w:t xml:space="preserve">                    this.src = `https://ui-avatars.com/api/?name=${encodeURIComponent(fullName)}&amp;background=0D8ABC&amp;color=fff`;</w:t>
+              <w:br/>
+              <w:t xml:space="preserve">                };</w:t>
+              <w:br/>
+              <w:t xml:space="preserve">            } else {</w:t>
+              <w:br/>
+              <w:t xml:space="preserve">                avatarEl.src = `https://ui-avatars.com/api/?name=${encodeURIComponent(fullName)}&amp;background=0D8ABC&amp;color=fff`;</w:t>
+              <w:br/>
+              <w:t xml:space="preserve">            }</w:t>
               <w:br/>
               <w:t xml:space="preserve">        }</w:t>
               <w:br/>
-              <w:t xml:space="preserve">    }</w:t>
-              <w:br/>
-              <w:t>}</w:t>
-              <w:br/>
-              <w:br/>
-              <w:t>// Task Status Buttons Interaction</w:t>
-              <w:br/>
-              <w:t>function initApp() {</w:t>
-              <w:br/>
-              <w:t xml:space="preserve">    // Carga de Excel Inicial</w:t>
-              <w:br/>
-              <w:t xml:space="preserve">    loadExcelTasks();</w:t>
-              <w:br/>
-              <w:t xml:space="preserve">    loadSchedule();</w:t>
-              <w:br/>
-              <w:t xml:space="preserve">    loadTeletrabajo();</w:t>
-              <w:br/>
-              <w:t xml:space="preserve">    loadPermisos();</w:t>
-              <w:br/>
-              <w:t xml:space="preserve">    renderQuickDocs(null);</w:t>
-              <w:br/>
-              <w:br/>
-              <w:t xml:space="preserve">    // Theme logic</w:t>
-              <w:br/>
-              <w:t xml:space="preserve">    const themeToggleBtn = document.getElementById('themeToggleBtn');</w:t>
-              <w:br/>
-              <w:t xml:space="preserve">    if (themeToggleBtn) {</w:t>
-              <w:br/>
-              <w:t xml:space="preserve">        const savedTheme = localStorage.getItem('riskOps_theme') || 'dark';</w:t>
-              <w:br/>
-              <w:t xml:space="preserve">        document.body.setAttribute('data-theme', savedTheme);</w:t>
-              <w:br/>
-              <w:t xml:space="preserve">        themeToggleBtn.innerHTML = savedTheme === 'dark' ? "&lt;i class='bx bx-moon'&gt;&lt;/i&gt;" : "&lt;i class='bx bx-sun'&gt;&lt;/i&gt;";</w:t>
-              <w:br/>
-              <w:t xml:space="preserve">        </w:t>
-              <w:br/>
-              <w:t xml:space="preserve">        themeToggleBtn.addEventListener('click', () =&gt; {</w:t>
-              <w:br/>
-              <w:t xml:space="preserve">            const currentTheme = document.body.getAttribute('data-theme');</w:t>
-              <w:br/>
-              <w:t xml:space="preserve">            const newTheme = currentTheme === 'dark' ? 'light' : 'dark';</w:t>
-              <w:br/>
-              <w:t xml:space="preserve">            document.body.setAttribute('data-theme', newTheme);</w:t>
-              <w:br/>
-              <w:t xml:space="preserve">            localStorage.setItem('riskOps_theme', newTheme);</w:t>
-              <w:br/>
-              <w:t xml:space="preserve">            themeToggleBtn.innerHTML = newTheme === 'dark' ? "&lt;i class='bx bx-moon'&gt;&lt;/i&gt;" : "&lt;i class='bx bx-sun'&gt;&lt;/i&gt;";</w:t>
-              <w:br/>
-              <w:t xml:space="preserve">        });</w:t>
-              <w:br/>
-              <w:t xml:space="preserve">    }</w:t>
-              <w:br/>
-              <w:br/>
-              <w:t xml:space="preserve">    // Populate user UI</w:t>
-              <w:br/>
-              <w:t xml:space="preserve">    if (currentUser) {</w:t>
-              <w:br/>
-              <w:t xml:space="preserve">        const userNameEl = document.querySelector('.user-name');</w:t>
-              <w:br/>
-              <w:t xml:space="preserve">        const roleEl = document.querySelector('.user-role');</w:t>
-              <w:br/>
-              <w:t xml:space="preserve">        const shiftBadgeEl = document.querySelector('.shift-badge');</w:t>
-              <w:br/>
-              <w:t xml:space="preserve">        </w:t>
-              <w:br/>
-              <w:t xml:space="preserve">        if (userNameEl) userNameEl.textContent = currentUser.name;</w:t>
-              <w:br/>
-              <w:t xml:space="preserve">        if (roleEl) roleEl.textContent = currentUser.role;</w:t>
-              <w:br/>
-              <w:t xml:space="preserve">        if (shiftBadgeEl) shiftBadgeEl.textContent = 'Turno ' + currentUser.shift;</w:t>
-              <w:br/>
-              <w:t xml:space="preserve">        </w:t>
-              <w:br/>
-              <w:t xml:space="preserve">        const avatarEl = document.querySelector('.avatar');</w:t>
-              <w:br/>
-              <w:t xml:space="preserve">        if (avatarEl &amp;&amp; currentUser.name) {</w:t>
-              <w:br/>
-              <w:t xml:space="preserve">            const availableAvatars = [</w:t>
-              <w:br/>
-              <w:t xml:space="preserve">                "Alexander Villada.png",</w:t>
-              <w:br/>
-              <w:t xml:space="preserve">                "Camilo Espinosa.png",</w:t>
-              <w:br/>
-              <w:t xml:space="preserve">                "Daniel Benavidez.png",</w:t>
-              <w:br/>
-              <w:t xml:space="preserve">                "Josue Alvarez.png",</w:t>
-              <w:br/>
-              <w:t xml:space="preserve">                "Juan Jose Diaz.png",</w:t>
-              <w:br/>
-              <w:t xml:space="preserve">                "Maria Sanchez.png",</w:t>
-              <w:br/>
-              <w:t xml:space="preserve">                "Marilyn Jimenez.png",</w:t>
-              <w:br/>
-              <w:t xml:space="preserve">                "Oriana Borja.png",</w:t>
-              <w:br/>
-              <w:t xml:space="preserve">                "Samuel Cruz.png",</w:t>
-              <w:br/>
-              <w:t xml:space="preserve">                "Sara Santamaria.png",</w:t>
-              <w:br/>
-              <w:t xml:space="preserve">                "Sebastian Arango.png",</w:t>
-              <w:br/>
-              <w:t xml:space="preserve">                "Sebastian Hincapie.png",</w:t>
-              <w:br/>
-              <w:t xml:space="preserve">                "Yefferson Giraldo.png"</w:t>
-              <w:br/>
-              <w:t xml:space="preserve">            ];</w:t>
+              <w:br/>
+              <w:t xml:space="preserve">        if (currentUser.role === 'Gestor') {</w:t>
+              <w:br/>
+              <w:t xml:space="preserve">            syncActiveSessionToFirebase();</w:t>
+              <w:br/>
+              <w:t xml:space="preserve">            setInterval(syncActiveSessionToFirebase, 30000);</w:t>
+              <w:br/>
+              <w:t xml:space="preserve">        }</w:t>
+              <w:br/>
+              <w:br/>
+              <w:t xml:space="preserve">        // Setup programmatical sidebar ordering for roles</w:t>
+              <w:br/>
+              <w:t xml:space="preserve">        setupSidebar();</w:t>
+              <w:br/>
+              <w:br/>
+              <w:t xml:space="preserve">        // Show Aprobaciones tab for Supervisor/Admin</w:t>
+              <w:br/>
+              <w:t xml:space="preserve">        if (currentUser.role === 'Admin' || currentUser.role === 'Supervisor') {</w:t>
+              <w:br/>
+              <w:t xml:space="preserve">            const navAprobaciones = document.getElementById('navAprobaciones');</w:t>
+              <w:br/>
+              <w:t xml:space="preserve">            const navTurnos = document.getElementById('navTurnos');</w:t>
+              <w:br/>
+              <w:t xml:space="preserve">            const navMonitoreo = document.getElementById('navMonitoreo');</w:t>
+              <w:br/>
+              <w:t xml:space="preserve">            const navWorkspace = document.getElementById('navWorkspace');</w:t>
+              <w:br/>
+              <w:t xml:space="preserve">            const viewWorkspace = document.getElementById('view-workspace');</w:t>
+              <w:br/>
+              <w:t xml:space="preserve">            const viewAprobaciones = document.getElementById('view-aprobaciones');</w:t>
+              <w:br/>
+              <w:t xml:space="preserve">            const viewTurnos = document.getElementById('view-turnos');</w:t>
+              <w:br/>
+              <w:t xml:space="preserve">            const permissionForm = document.getElementById('permissionForm');</w:t>
+              <w:br/>
+              <w:t xml:space="preserve">            const endShiftBtn = document.getElementById('endShiftBtn');</w:t>
+              <w:br/>
+              <w:br/>
+              <w:t xml:space="preserve">            if(navAprobaciones) navAprobaciones.style.display = 'flex';</w:t>
+              <w:br/>
+              <w:t xml:space="preserve">            if(navTurnos) navTurnos.style.display = 'flex';</w:t>
+              <w:br/>
+              <w:t xml:space="preserve">            if(navMonitoreo) navMonitoreo.style.display = 'flex';</w:t>
+              <w:br/>
+              <w:t xml:space="preserve">            if(navWorkspace) navWorkspace.style.display = 'flex'; // Keep Mis Tareas visible</w:t>
               <w:br/>
               <w:t xml:space="preserve">            </w:t>
               <w:br/>
-              <w:t xml:space="preserve">            const fullName = currentUser.name.trim();</w:t>
-              <w:br/>
-              <w:t xml:space="preserve">            // Buscar una imagen que coincida con el nombre registrado</w:t>
-              <w:br/>
-              <w:t xml:space="preserve">            let matchedAvatar = availableAvatars.find(img =&gt; namesMatch(fullName, img.replace('.png', '')));</w:t>
-              <w:br/>
-              <w:t xml:space="preserve">            console.log("DEBUG_AVATAR: fullName =", fullName, "matchedAvatar =", matchedAvatar);</w:t>
-              <w:br/>
-              <w:t xml:space="preserve">            </w:t>
-              <w:br/>
-              <w:t xml:space="preserve">            if (matchedAvatar) {</w:t>
-              <w:br/>
-              <w:t xml:space="preserve">                avatarEl.src = `assets/src/img/${matchedAvatar}`;</w:t>
-              <w:br/>
-              <w:t xml:space="preserve">                // Fallback por si la imagen se borra o falla</w:t>
-              <w:br/>
-              <w:t xml:space="preserve">                avatarEl.onerror = function() {</w:t>
-              <w:br/>
-              <w:t xml:space="preserve">                    this.onerror = null;</w:t>
-              <w:br/>
-              <w:t xml:space="preserve">                    this.src = `https://ui-avatars.com/api/?name=${encodeURIComponent(fullName)}&amp;background=0D8ABC&amp;color=fff`;</w:t>
-              <w:br/>
-              <w:t xml:space="preserve">                };</w:t>
-              <w:br/>
-              <w:t xml:space="preserve">            } else {</w:t>
-              <w:br/>
-              <w:t xml:space="preserve">                avatarEl.src = `https://ui-avatars.com/api/?name=${encodeURIComponent(fullName)}&amp;background=0D8ABC&amp;color=fff`;</w:t>
+              <w:t xml:space="preserve">            // Ocultar el panel de Progreso del Turno / Documentos de Acceso Rápido en Mis Tareas para Admin o Supervisor</w:t>
+              <w:br/>
+              <w:t xml:space="preserve">            const rightPanel = document.querySelector('.right-panel');</w:t>
+              <w:br/>
+              <w:t xml:space="preserve">            if (rightPanel) rightPanel.style.display = 'none';</w:t>
+              <w:br/>
+              <w:t xml:space="preserve">            const workspaceGrid = document.querySelector('.workspace-grid');</w:t>
+              <w:br/>
+              <w:t xml:space="preserve">            if (workspaceGrid) workspaceGrid.classList.add('no-right-panel');</w:t>
+              <w:br/>
+              <w:br/>
+              <w:t xml:space="preserve">            // Restringir el panel de tareas para Admin/Supervisor (solo lectura)</w:t>
+              <w:br/>
+              <w:t xml:space="preserve">            const taskControls = document.querySelector('.task-controls');</w:t>
+              <w:br/>
+              <w:t xml:space="preserve">            if (taskControls) taskControls.style.display = 'none';</w:t>
+              <w:br/>
+              <w:t xml:space="preserve">            const actionBar = document.querySelector('.action-bar');</w:t>
+              <w:br/>
+              <w:t xml:space="preserve">            if (actionBar) actionBar.style.display = 'none';</w:t>
+              <w:br/>
+              <w:t xml:space="preserve">            const taskObservation = document.getElementById('taskObservation');</w:t>
+              <w:br/>
+              <w:t xml:space="preserve">            if (taskObservation) {</w:t>
+              <w:br/>
+              <w:t xml:space="preserve">                taskObservation.readOnly = true;</w:t>
+              <w:br/>
+              <w:t xml:space="preserve">                taskObservation.placeholder = "Detalles de la tarea...";</w:t>
               <w:br/>
               <w:t xml:space="preserve">            }</w:t>
-              <w:br/>
-              <w:t xml:space="preserve">        }</w:t>
-              <w:br/>
-              <w:br/>
-              <w:t xml:space="preserve">        if (currentUser.role === 'Gestor') {</w:t>
-              <w:br/>
-              <w:t xml:space="preserve">            syncActiveSessionToFirebase();</w:t>
-              <w:br/>
-              <w:t xml:space="preserve">            setInterval(syncActiveSessionToFirebase, 30000);</w:t>
-              <w:br/>
-              <w:t xml:space="preserve">        }</w:t>
-              <w:br/>
-              <w:br/>
-              <w:t xml:space="preserve">        // Setup programmatical sidebar ordering for roles</w:t>
-              <w:br/>
-              <w:t xml:space="preserve">        setupSidebar();</w:t>
-              <w:br/>
-              <w:br/>
-              <w:t xml:space="preserve">        // Show Aprobaciones tab for Supervisor/Admin</w:t>
-              <w:br/>
-              <w:t xml:space="preserve">        if (currentUser.role === 'Admin' || currentUser.role === 'Supervisor') {</w:t>
-              <w:br/>
-              <w:t xml:space="preserve">            const navAprobaciones = document.getElementById('navAprobaciones');</w:t>
-              <w:br/>
-              <w:t xml:space="preserve">            const navTurnos = document.getElementById('navTurnos');</w:t>
-              <w:br/>
-              <w:t xml:space="preserve">            const navMonitoreo = document.getElementById('navMonitoreo');</w:t>
-              <w:br/>
-              <w:t xml:space="preserve">            const navWorkspace = document.getElementById('navWorkspace');</w:t>
-              <w:br/>
-              <w:t xml:space="preserve">            const viewWorkspace = document.getElementById('view-workspace');</w:t>
-              <w:br/>
-              <w:t xml:space="preserve">            const viewAprobaciones = document.getElementById('view-aprobaciones');</w:t>
-              <w:br/>
-              <w:t xml:space="preserve">            const viewTurnos = document.getElementById('view-turnos');</w:t>
-              <w:br/>
-              <w:t xml:space="preserve">            const permissionForm = document.getElementById('permissionForm');</w:t>
-              <w:br/>
-              <w:t xml:space="preserve">            const endShiftBtn = document.getElementById('endShiftBtn');</w:t>
-              <w:br/>
-              <w:br/>
-              <w:t xml:space="preserve">            if(navAprobaciones) navAprobaciones.style.display = 'flex';</w:t>
-              <w:br/>
-              <w:t xml:space="preserve">            if(navTurnos) navTurnos.style.display = 'flex';</w:t>
-              <w:br/>
-              <w:t xml:space="preserve">            if(navMonitoreo) navMonitoreo.style.display = 'flex';</w:t>
-              <w:br/>
-              <w:t xml:space="preserve">            if(navWorkspace) navWorkspace.style.display = 'flex'; // Keep Mis Tareas visible</w:t>
-              <w:br/>
-              <w:t xml:space="preserve">            </w:t>
-              <w:br/>
-              <w:t xml:space="preserve">            // Ocultar el panel de Progreso del Turno / Documentos de Acceso Rápido en Mis Tareas para Admin o Supervisor</w:t>
-              <w:br/>
-              <w:t xml:space="preserve">            const rightPanel = document.querySelector('.right-panel');</w:t>
-              <w:br/>
-              <w:t xml:space="preserve">            if (rightPanel) rightPanel.style.display = 'none';</w:t>
-              <w:br/>
-              <w:t xml:space="preserve">            const workspaceGrid = document.querySelector('.workspace-grid');</w:t>
-              <w:br/>
-              <w:t xml:space="preserve">            if (workspaceGrid) workspaceGrid.classList.add('no-right-panel');</w:t>
               <w:br/>
               <w:br/>
               <w:t xml:space="preserve">            // Forzar vista de Monitoreo Realtime como inicial</w:t>

</xml_diff>

<commit_message>
Corregir bug de desfase de zona horaria en isSameDate
</commit_message>
<xml_diff>
--- a/Documentacion_Tecnica.docx
+++ b/Documentacion_Tecnica.docx
@@ -5795,9 +5795,11 @@
               <w:br/>
               <w:t xml:space="preserve">    if (!excelDate || !jsDate) return false;</w:t>
               <w:br/>
-              <w:t xml:space="preserve">    return excelDate.getUTCDate() === jsDate.getDate() &amp;&amp;</w:t>
-              <w:br/>
-              <w:t xml:space="preserve">           excelDate.getUTCMonth() === jsDate.getMonth() &amp;&amp;</w:t>
+              <w:t xml:space="preserve">    // Compare the UTC date from Excel (which is timezone-naive) with the browser's local date</w:t>
+              <w:br/>
+              <w:t xml:space="preserve">    return excelDate.getUTCDate()   === jsDate.getDate() &amp;&amp;</w:t>
+              <w:br/>
+              <w:t xml:space="preserve">           excelDate.getUTCMonth()  === jsDate.getMonth() &amp;&amp;</w:t>
               <w:br/>
               <w:t xml:space="preserve">           excelDate.getUTCFullYear() === jsDate.getFullYear();</w:t>
               <w:br/>
@@ -6553,9 +6555,27 @@
               <w:br/>
               <w:t xml:space="preserve">        if (currentUser &amp;&amp; currentUser.role === 'Gestor') {</w:t>
               <w:br/>
-              <w:t xml:space="preserve">            // Load cronograma assignments</w:t>
-              <w:br/>
-              <w:t xml:space="preserve">            await loadCronogramaAssignments(currentUser.name, currentUser.shift);</w:t>
+              <w:t xml:space="preserve">            // Resolve today's real shift from the parsed schedule (globalScheduleRows/globalScheduleBlocks)</w:t>
+              <w:br/>
+              <w:t xml:space="preserve">            // This ensures the filter uses the actual shift for today, not a stale value from localStorage</w:t>
+              <w:br/>
+              <w:t xml:space="preserve">            let resolvedShift = currentUser.shift || 'Por Asignar';</w:t>
+              <w:br/>
+              <w:t xml:space="preserve">            if (globalScheduleRows &amp;&amp; globalScheduleBlocks &amp;&amp; globalScheduleBlocks.length &gt; 0) {</w:t>
+              <w:br/>
+              <w:t xml:space="preserve">                const todayShift = getShiftForDate(globalScheduleRows, globalScheduleBlocks, currentUser.name, new Date());</w:t>
+              <w:br/>
+              <w:t xml:space="preserve">                if (todayShift &amp;&amp; todayShift !== 'Por Asignar' &amp;&amp; todayShift !== 'Descansa') {</w:t>
+              <w:br/>
+              <w:t xml:space="preserve">                    resolvedShift = todayShift;</w:t>
+              <w:br/>
+              <w:t xml:space="preserve">                }</w:t>
+              <w:br/>
+              <w:t xml:space="preserve">            }</w:t>
+              <w:br/>
+              <w:t xml:space="preserve">            // Load cronograma assignments using the resolved real shift</w:t>
+              <w:br/>
+              <w:t xml:space="preserve">            await loadCronogramaAssignments(currentUser.name, resolvedShift);</w:t>
               <w:br/>
               <w:t xml:space="preserve">            </w:t>
               <w:br/>
@@ -7546,27 +7566,47 @@
               <w:br/>
               <w:t xml:space="preserve">    const sessionRef = database.ref('active_sessions/' + uid);</w:t>
               <w:br/>
-              <w:t xml:space="preserve">    sessionRef.set({</w:t>
-              <w:br/>
-              <w:t xml:space="preserve">        name: currentUser.name,</w:t>
-              <w:br/>
-              <w:t xml:space="preserve">        email: currentUser.email,</w:t>
-              <w:br/>
-              <w:t xml:space="preserve">        shift: currentUser.shift || 'Por Asignar',</w:t>
-              <w:br/>
-              <w:t xml:space="preserve">        loginTime: currentUser.loginTime || new Date().toISOString(),</w:t>
-              <w:br/>
-              <w:t xml:space="preserve">        lastActive: Date.now(),</w:t>
-              <w:br/>
-              <w:t xml:space="preserve">        totalTasks: totalTasks,</w:t>
-              <w:br/>
-              <w:t xml:space="preserve">        finalizedTasks: finalized,</w:t>
-              <w:br/>
-              <w:t xml:space="preserve">        percentage: percentage,</w:t>
-              <w:br/>
-              <w:t xml:space="preserve">        tasks: taskStateCache || {}</w:t>
-              <w:br/>
-              <w:t xml:space="preserve">    }).catch(e =&gt; console.error("Error syncing active session to Firebase:", e));</w:t>
+              <w:t xml:space="preserve">    </w:t>
+              <w:br/>
+              <w:t xml:space="preserve">    // Read existing session first to preserve the original loginTime.</w:t>
+              <w:br/>
+              <w:t xml:space="preserve">    // Using update() instead of set() so we only overwrite what we need.</w:t>
+              <w:br/>
+              <w:t xml:space="preserve">    // For loginTime: only write it if the node doesn't have one yet (first login of the day).</w:t>
+              <w:br/>
+              <w:t xml:space="preserve">    sessionRef.once('value').then(snap =&gt; {</w:t>
+              <w:br/>
+              <w:t xml:space="preserve">        const existing = snap.val();</w:t>
+              <w:br/>
+              <w:t xml:space="preserve">        // Preserve the loginTime from Firebase if it already exists, otherwise use the one from localStorage</w:t>
+              <w:br/>
+              <w:t xml:space="preserve">        const loginTime = (existing &amp;&amp; existing.loginTime) ? existing.loginTime : (currentUser.loginTime || new Date().toISOString());</w:t>
+              <w:br/>
+              <w:t xml:space="preserve">        </w:t>
+              <w:br/>
+              <w:t xml:space="preserve">        sessionRef.set({</w:t>
+              <w:br/>
+              <w:t xml:space="preserve">            name: currentUser.name,</w:t>
+              <w:br/>
+              <w:t xml:space="preserve">            email: currentUser.email,</w:t>
+              <w:br/>
+              <w:t xml:space="preserve">            shift: currentUser.shift || 'Por Asignar',</w:t>
+              <w:br/>
+              <w:t xml:space="preserve">            loginTime: loginTime,</w:t>
+              <w:br/>
+              <w:t xml:space="preserve">            lastActive: Date.now(),</w:t>
+              <w:br/>
+              <w:t xml:space="preserve">            totalTasks: totalTasks,</w:t>
+              <w:br/>
+              <w:t xml:space="preserve">            finalizedTasks: finalized,</w:t>
+              <w:br/>
+              <w:t xml:space="preserve">            percentage: percentage,</w:t>
+              <w:br/>
+              <w:t xml:space="preserve">            tasks: taskStateCache || {}</w:t>
+              <w:br/>
+              <w:t xml:space="preserve">        }).catch(e =&gt; console.error("Error syncing active session to Firebase:", e));</w:t>
+              <w:br/>
+              <w:t xml:space="preserve">    }).catch(e =&gt; console.error("Error reading session from Firebase:", e));</w:t>
               <w:br/>
               <w:t>}</w:t>
               <w:br/>

</xml_diff>

<commit_message>
Fix active SETs selector, auto-expand single set, and weekday/weekend column mapping for Gestores
</commit_message>
<xml_diff>
--- a/Documentacion_Tecnica.docx
+++ b/Documentacion_Tecnica.docx
@@ -6068,1417 +6068,1428 @@
               <w:br/>
               <w:t xml:space="preserve">    } else { // Monday to Friday</w:t>
               <w:br/>
-              <w:t xml:space="preserve">        const sLower = String(shiftText || '').toLowerCase();</w:t>
-              <w:br/>
-              <w:t xml:space="preserve">        if (sLower.includes("manana") || sLower.includes("mañana") || sLower.includes("6am") || sLower.includes("8am")) {</w:t>
-              <w:br/>
-              <w:t xml:space="preserve">            return [[1, 2]];</w:t>
-              <w:br/>
-              <w:t xml:space="preserve">        } else if (sLower.includes("tarde") || sLower.includes("noche") || sLower.includes("pm") || sLower.includes("3pm") || sLower.includes("10pm")) {</w:t>
-              <w:br/>
-              <w:t xml:space="preserve">            return [[4, 5]];</w:t>
+              <w:t xml:space="preserve">        return [[1, 2], [4, 5]];</w:t>
+              <w:br/>
+              <w:t xml:space="preserve">    }</w:t>
+              <w:br/>
+              <w:t>}</w:t>
+              <w:br/>
+              <w:br/>
+              <w:t>let gestorCronogramaAssignments = null;</w:t>
+              <w:br/>
+              <w:br/>
+              <w:t>async function loadCronogramaAssignments(gestorName, gestorShift) {</w:t>
+              <w:br/>
+              <w:t xml:space="preserve">    try {</w:t>
+              <w:br/>
+              <w:t xml:space="preserve">        const url = encodeURI('Cronograma de Tareas/Cronograma Mayo.xlsx') + '?t=' + Date.now();</w:t>
+              <w:br/>
+              <w:t xml:space="preserve">        const response = await fetch(url);</w:t>
+              <w:br/>
+              <w:t xml:space="preserve">        if (!response.ok) throw new Error("Fallo al cargar cronograma");</w:t>
+              <w:br/>
+              <w:t xml:space="preserve">        const arrayBuffer = await response.arrayBuffer();</w:t>
+              <w:br/>
+              <w:t xml:space="preserve">        const workbook = XLSX.read(arrayBuffer, {type: 'array'});</w:t>
+              <w:br/>
+              <w:t xml:space="preserve">        </w:t>
+              <w:br/>
+              <w:t xml:space="preserve">        const today = new Date();</w:t>
+              <w:br/>
+              <w:t xml:space="preserve">        const sheetName = getWeekSheet(workbook.SheetNames, today);</w:t>
+              <w:br/>
+              <w:t xml:space="preserve">        if (!sheetName) return;</w:t>
+              <w:br/>
+              <w:t xml:space="preserve">        </w:t>
+              <w:br/>
+              <w:t xml:space="preserve">        const worksheet = workbook.Sheets[sheetName];</w:t>
+              <w:br/>
+              <w:t xml:space="preserve">        const rows = XLSX.utils.sheet_to_json(worksheet, { header: 1, defval: "" });</w:t>
+              <w:br/>
+              <w:t xml:space="preserve">        </w:t>
+              <w:br/>
+              <w:t xml:space="preserve">        const colGroups = getCronogramaColumnsForToday(today, gestorShift);</w:t>
+              <w:br/>
+              <w:t xml:space="preserve">        </w:t>
+              <w:br/>
+              <w:t xml:space="preserve">        gestorCronogramaAssignments = [];</w:t>
+              <w:br/>
+              <w:t xml:space="preserve">        </w:t>
+              <w:br/>
+              <w:t xml:space="preserve">        for (let colGroup of colGroups) {</w:t>
+              <w:br/>
+              <w:t xml:space="preserve">            const tCol = colGroup[0];</w:t>
+              <w:br/>
+              <w:t xml:space="preserve">            const gCol = colGroup[1];</w:t>
+              <w:br/>
+              <w:t xml:space="preserve">            </w:t>
+              <w:br/>
+              <w:t xml:space="preserve">            let currentSet = "";</w:t>
+              <w:br/>
+              <w:t xml:space="preserve">            for (let rIdx = 0; rIdx &lt; rows.length; rIdx++) {</w:t>
+              <w:br/>
+              <w:t xml:space="preserve">                const row = rows[rIdx];</w:t>
+              <w:br/>
+              <w:t xml:space="preserve">                if (!row) continue;</w:t>
+              <w:br/>
+              <w:t xml:space="preserve">                </w:t>
+              <w:br/>
+              <w:t xml:space="preserve">                const taskVal = row[tCol];</w:t>
+              <w:br/>
+              <w:t xml:space="preserve">                const gestorVal = row[gCol];</w:t>
+              <w:br/>
+              <w:t xml:space="preserve">                </w:t>
+              <w:br/>
+              <w:t xml:space="preserve">                if (taskVal !== undefined &amp;&amp; taskVal !== null &amp;&amp; String(taskVal).trim() !== "") {</w:t>
+              <w:br/>
+              <w:t xml:space="preserve">                    const tStr = String(taskVal).trim();</w:t>
+              <w:br/>
+              <w:t xml:space="preserve">                    const tStrLower = tStr.toLowerCase();</w:t>
+              <w:br/>
+              <w:t xml:space="preserve">                    </w:t>
+              <w:br/>
+              <w:t xml:space="preserve">                    if (tStrLower.startsWith("set ")) {</w:t>
+              <w:br/>
+              <w:t xml:space="preserve">                        currentSet = tStr;</w:t>
+              <w:br/>
+              <w:t xml:space="preserve">                    } else if (!tStrLower.includes("cronograma") &amp;&amp; gestorVal !== "Gestor") {</w:t>
+              <w:br/>
+              <w:t xml:space="preserve">                        if (gestorVal !== undefined &amp;&amp; gestorVal !== null &amp;&amp; namesMatch(String(gestorVal).trim(), gestorName)) {</w:t>
+              <w:br/>
+              <w:t xml:space="preserve">                            gestorCronogramaAssignments.push({</w:t>
+              <w:br/>
+              <w:t xml:space="preserve">                                set: currentSet || "Otros",</w:t>
+              <w:br/>
+              <w:t xml:space="preserve">                                task: tStr</w:t>
+              <w:br/>
+              <w:t xml:space="preserve">                            });</w:t>
+              <w:br/>
+              <w:t xml:space="preserve">                        }</w:t>
+              <w:br/>
+              <w:t xml:space="preserve">                    }</w:t>
+              <w:br/>
+              <w:t xml:space="preserve">                }</w:t>
+              <w:br/>
+              <w:t xml:space="preserve">            }</w:t>
+              <w:br/>
+              <w:t xml:space="preserve">        }</w:t>
+              <w:br/>
+              <w:t xml:space="preserve">        console.log("Cargadas asignaciones de cronograma para " + gestorName + ":", gestorCronogramaAssignments);</w:t>
+              <w:br/>
+              <w:t xml:space="preserve">    } catch (e) {</w:t>
+              <w:br/>
+              <w:t xml:space="preserve">        console.error("Error al cargar Cronograma de Tareas:", e);</w:t>
+              <w:br/>
+              <w:t xml:space="preserve">        gestorCronogramaAssignments = [];</w:t>
+              <w:br/>
+              <w:t xml:space="preserve">    }</w:t>
+              <w:br/>
+              <w:t>}</w:t>
+              <w:br/>
+              <w:br/>
+              <w:t>function getScheduledGestoresCountForShift(shiftName, targetDate = new Date()) {</w:t>
+              <w:br/>
+              <w:t xml:space="preserve">    if (!globalScheduleRows || !globalScheduleBlocks || globalScheduleBlocks.length === 0) {</w:t>
+              <w:br/>
+              <w:t xml:space="preserve">        return 0;</w:t>
+              <w:br/>
+              <w:t xml:space="preserve">    }</w:t>
+              <w:br/>
+              <w:t xml:space="preserve">    </w:t>
+              <w:br/>
+              <w:t xml:space="preserve">    let targetBlock = null;</w:t>
+              <w:br/>
+              <w:t xml:space="preserve">    let targetColIndex = -1;</w:t>
+              <w:br/>
+              <w:t xml:space="preserve">    </w:t>
+              <w:br/>
+              <w:t xml:space="preserve">    for (let block of globalScheduleBlocks) {</w:t>
+              <w:br/>
+              <w:t xml:space="preserve">        const dateRow = globalScheduleRows[block.startRow];</w:t>
+              <w:br/>
+              <w:t xml:space="preserve">        for (let c = 1; c &lt; dateRow.length; c++) {</w:t>
+              <w:br/>
+              <w:t xml:space="preserve">            const serial = dateRow[c];</w:t>
+              <w:br/>
+              <w:t xml:space="preserve">            if (serial &amp;&amp; !isNaN(serial)) {</w:t>
+              <w:br/>
+              <w:t xml:space="preserve">                const cellDate = excelToJSDate(serial);</w:t>
+              <w:br/>
+              <w:t xml:space="preserve">                if (cellDate &amp;&amp; isSameDate(cellDate, targetDate)) {</w:t>
+              <w:br/>
+              <w:t xml:space="preserve">                    targetBlock = block;</w:t>
+              <w:br/>
+              <w:t xml:space="preserve">                    targetColIndex = c;</w:t>
+              <w:br/>
+              <w:t xml:space="preserve">                    break;</w:t>
+              <w:br/>
+              <w:t xml:space="preserve">                }</w:t>
+              <w:br/>
+              <w:t xml:space="preserve">            }</w:t>
+              <w:br/>
+              <w:t xml:space="preserve">        }</w:t>
+              <w:br/>
+              <w:t xml:space="preserve">        if (targetBlock) break;</w:t>
+              <w:br/>
+              <w:t xml:space="preserve">    }</w:t>
+              <w:br/>
+              <w:t xml:space="preserve">    </w:t>
+              <w:br/>
+              <w:t xml:space="preserve">    if (!targetBlock) {</w:t>
+              <w:br/>
+              <w:t xml:space="preserve">        targetBlock = globalScheduleBlocks[globalScheduleBlocks.length - 1];</w:t>
+              <w:br/>
+              <w:t xml:space="preserve">        const dayNames = ['Domingo', 'Lunes', 'Martes', 'Miércoles', 'Jueves', 'Viernes', 'Sábado'];</w:t>
+              <w:br/>
+              <w:t xml:space="preserve">        const dayRow = globalScheduleRows[targetBlock.startRow + 1];</w:t>
+              <w:br/>
+              <w:t xml:space="preserve">        const targetDayName = dayNames[targetDate.getDay()];</w:t>
+              <w:br/>
+              <w:t xml:space="preserve">        </w:t>
+              <w:br/>
+              <w:t xml:space="preserve">        for (let c = 1; c &lt; dayRow.length; c++) {</w:t>
+              <w:br/>
+              <w:t xml:space="preserve">            const dayName = String(dayRow[c] || '').trim();</w:t>
+              <w:br/>
+              <w:t xml:space="preserve">            if (normalizeName(dayName) === normalizeName(targetDayName)) {</w:t>
+              <w:br/>
+              <w:t xml:space="preserve">                targetColIndex = c;</w:t>
+              <w:br/>
+              <w:t xml:space="preserve">                break;</w:t>
+              <w:br/>
+              <w:t xml:space="preserve">            }</w:t>
+              <w:br/>
+              <w:t xml:space="preserve">        }</w:t>
+              <w:br/>
+              <w:t xml:space="preserve">        </w:t>
+              <w:br/>
+              <w:t xml:space="preserve">        if (targetColIndex === -1) {</w:t>
+              <w:br/>
+              <w:t xml:space="preserve">            let jsDay = targetDate.getDay();</w:t>
+              <w:br/>
+              <w:t xml:space="preserve">            targetColIndex = jsDay === 0 ? 7 : jsDay;</w:t>
+              <w:br/>
+              <w:t xml:space="preserve">        }</w:t>
+              <w:br/>
+              <w:t xml:space="preserve">    }</w:t>
+              <w:br/>
+              <w:t xml:space="preserve">    </w:t>
+              <w:br/>
+              <w:t xml:space="preserve">    let count = 0;</w:t>
+              <w:br/>
+              <w:t xml:space="preserve">    const blockStartRow = targetBlock.startRow;</w:t>
+              <w:br/>
+              <w:t xml:space="preserve">    for (let rIdx = blockStartRow + 2; rIdx &lt; globalScheduleRows.length; rIdx++) {</w:t>
+              <w:br/>
+              <w:t xml:space="preserve">        const r = globalScheduleRows[rIdx];</w:t>
+              <w:br/>
+              <w:t xml:space="preserve">        if (!r || !r[0] || String(r[0]).trim() === '' || String(r[0]).trim().toUpperCase() === 'GESTOR') break;</w:t>
+              <w:br/>
+              <w:t xml:space="preserve">        </w:t>
+              <w:br/>
+              <w:t xml:space="preserve">        const rawShift = r[targetColIndex] || 'Descansa';</w:t>
+              <w:br/>
+              <w:t xml:space="preserve">        const category = getShiftCategory(rawShift);</w:t>
+              <w:br/>
+              <w:t xml:space="preserve">        if (category === shiftName) {</w:t>
+              <w:br/>
+              <w:t xml:space="preserve">            count++;</w:t>
+              <w:br/>
+              <w:t xml:space="preserve">        }</w:t>
+              <w:br/>
+              <w:t xml:space="preserve">    }</w:t>
+              <w:br/>
+              <w:t xml:space="preserve">    </w:t>
+              <w:br/>
+              <w:t xml:space="preserve">    return count;</w:t>
+              <w:br/>
+              <w:t>}</w:t>
+              <w:br/>
+              <w:br/>
+              <w:t>function getShiftForDate(rows, allScheduleBlocks, gestorName, date) {</w:t>
+              <w:br/>
+              <w:t xml:space="preserve">    if (!rows || rows.length === 0 || !allScheduleBlocks || allScheduleBlocks.length === 0) {</w:t>
+              <w:br/>
+              <w:t xml:space="preserve">        return 'Por Asignar';</w:t>
+              <w:br/>
+              <w:t xml:space="preserve">    }</w:t>
+              <w:br/>
+              <w:t xml:space="preserve">    </w:t>
+              <w:br/>
+              <w:t xml:space="preserve">    let targetBlock = null;</w:t>
+              <w:br/>
+              <w:t xml:space="preserve">    let targetColIndex = -1;</w:t>
+              <w:br/>
+              <w:t xml:space="preserve">    </w:t>
+              <w:br/>
+              <w:t xml:space="preserve">    for (let block of allScheduleBlocks) {</w:t>
+              <w:br/>
+              <w:t xml:space="preserve">        const dateRow = rows[block.startRow];</w:t>
+              <w:br/>
+              <w:t xml:space="preserve">        for (let c = 1; c &lt; dateRow.length; c++) {</w:t>
+              <w:br/>
+              <w:t xml:space="preserve">            const serial = dateRow[c];</w:t>
+              <w:br/>
+              <w:t xml:space="preserve">            if (serial &amp;&amp; !isNaN(serial)) {</w:t>
+              <w:br/>
+              <w:t xml:space="preserve">                const cellDate = excelToJSDate(serial);</w:t>
+              <w:br/>
+              <w:t xml:space="preserve">                if (cellDate &amp;&amp; isSameDate(cellDate, date)) {</w:t>
+              <w:br/>
+              <w:t xml:space="preserve">                    targetBlock = block;</w:t>
+              <w:br/>
+              <w:t xml:space="preserve">                    targetColIndex = c;</w:t>
+              <w:br/>
+              <w:t xml:space="preserve">                    break;</w:t>
+              <w:br/>
+              <w:t xml:space="preserve">                }</w:t>
+              <w:br/>
+              <w:t xml:space="preserve">            }</w:t>
+              <w:br/>
+              <w:t xml:space="preserve">        }</w:t>
+              <w:br/>
+              <w:t xml:space="preserve">        if (targetBlock) break;</w:t>
+              <w:br/>
+              <w:t xml:space="preserve">    }</w:t>
+              <w:br/>
+              <w:t xml:space="preserve">    </w:t>
+              <w:br/>
+              <w:t xml:space="preserve">    if (!targetBlock) {</w:t>
+              <w:br/>
+              <w:t xml:space="preserve">        targetBlock = allScheduleBlocks[allScheduleBlocks.length - 1];</w:t>
+              <w:br/>
+              <w:t xml:space="preserve">        const dayNames = ['Domingo', 'Lunes', 'Martes', 'Miércoles', 'Jueves', 'Viernes', 'Sábado'];</w:t>
+              <w:br/>
+              <w:t xml:space="preserve">        const dayRow = rows[targetBlock.startRow + 1];</w:t>
+              <w:br/>
+              <w:t xml:space="preserve">        const targetDayName = dayNames[date.getDay()];</w:t>
+              <w:br/>
+              <w:t xml:space="preserve">        </w:t>
+              <w:br/>
+              <w:t xml:space="preserve">        for (let c = 1; c &lt; dayRow.length; c++) {</w:t>
+              <w:br/>
+              <w:t xml:space="preserve">            const dayName = String(dayRow[c] || '').trim();</w:t>
+              <w:br/>
+              <w:t xml:space="preserve">            if (normalizeName(dayName) === normalizeName(targetDayName)) {</w:t>
+              <w:br/>
+              <w:t xml:space="preserve">                targetColIndex = c;</w:t>
+              <w:br/>
+              <w:t xml:space="preserve">                break;</w:t>
+              <w:br/>
+              <w:t xml:space="preserve">            }</w:t>
+              <w:br/>
+              <w:t xml:space="preserve">        }</w:t>
+              <w:br/>
+              <w:t xml:space="preserve">        </w:t>
+              <w:br/>
+              <w:t xml:space="preserve">        if (targetColIndex === -1) {</w:t>
+              <w:br/>
+              <w:t xml:space="preserve">            let jsDay = date.getDay();</w:t>
+              <w:br/>
+              <w:t xml:space="preserve">            targetColIndex = jsDay === 0 ? 7 : jsDay;</w:t>
+              <w:br/>
+              <w:t xml:space="preserve">        }</w:t>
+              <w:br/>
+              <w:t xml:space="preserve">    }</w:t>
+              <w:br/>
+              <w:t xml:space="preserve">    </w:t>
+              <w:br/>
+              <w:t xml:space="preserve">    const blockStartRow = targetBlock.startRow;</w:t>
+              <w:br/>
+              <w:t xml:space="preserve">    for (let rIdx = blockStartRow + 2; rIdx &lt; rows.length; rIdx++) {</w:t>
+              <w:br/>
+              <w:t xml:space="preserve">        const r = rows[rIdx];</w:t>
+              <w:br/>
+              <w:t xml:space="preserve">        if (!r || !r[0] || String(r[0]).trim() === '' || String(r[0]).trim().toUpperCase() === 'GESTOR') break;</w:t>
+              <w:br/>
+              <w:t xml:space="preserve">        </w:t>
+              <w:br/>
+              <w:t xml:space="preserve">        if (namesMatch(r[0], gestorName)) {</w:t>
+              <w:br/>
+              <w:t xml:space="preserve">            return r[targetColIndex] || 'Descansa';</w:t>
+              <w:br/>
+              <w:t xml:space="preserve">        }</w:t>
+              <w:br/>
+              <w:t xml:space="preserve">    }</w:t>
+              <w:br/>
+              <w:t xml:space="preserve">    </w:t>
+              <w:br/>
+              <w:t xml:space="preserve">    return 'Por Asignar';</w:t>
+              <w:br/>
+              <w:t>}</w:t>
+              <w:br/>
+              <w:br/>
+              <w:t>// Mapeo de URLs para documentos (especialmente videos pesados alojados en Google Drive)</w:t>
+              <w:br/>
+              <w:t>const documentUrls = {</w:t>
+              <w:br/>
+              <w:t xml:space="preserve">    "Revisión de Eventos Deportivos.mp4": "https://drive.google.com/file/d/1UqccsnUwTG6tgPcDYdUeLnf9XqvGzSoc/view?usp=sharing",</w:t>
+              <w:br/>
+              <w:t xml:space="preserve">    "Revisión de Eventos.mp4": "https://drive.google.com/file/d/1SB9ePi1EOJU05hzOsxOyl7BeNvCN1hOh/view?usp=sharing",</w:t>
+              <w:br/>
+              <w:t xml:space="preserve">    "Validación SEON.mp4": "https://drive.google.com/file/d/1JFf5basGD0gmrAVIy5AlMK1DBHYgE6JC/view?usp=sharing"</w:t>
+              <w:br/>
+              <w:t>};</w:t>
+              <w:br/>
+              <w:br/>
+              <w:t>function getDocUrl(fileName) {</w:t>
+              <w:br/>
+              <w:t xml:space="preserve">    if (documentUrls[fileName]) {</w:t>
+              <w:br/>
+              <w:t xml:space="preserve">        return documentUrls[fileName];</w:t>
+              <w:br/>
+              <w:t xml:space="preserve">    }</w:t>
+              <w:br/>
+              <w:t xml:space="preserve">    return "Procesos/" + fileName;</w:t>
+              <w:br/>
+              <w:t>}</w:t>
+              <w:br/>
+              <w:br/>
+              <w:t>let taskStateCache = {};</w:t>
+              <w:br/>
+              <w:t>try {</w:t>
+              <w:br/>
+              <w:t xml:space="preserve">    const cached = localStorage.getItem('riskOps_cache');</w:t>
+              <w:br/>
+              <w:t xml:space="preserve">    if(cached) taskStateCache = JSON.parse(cached);</w:t>
+              <w:br/>
+              <w:t>} catch(e) {}</w:t>
+              <w:br/>
+              <w:br/>
+              <w:t>let currentActiveTaskId = null;</w:t>
+              <w:br/>
+              <w:br/>
+              <w:t>// Live Clock Logic</w:t>
+              <w:br/>
+              <w:t>function updateClock() {</w:t>
+              <w:br/>
+              <w:t xml:space="preserve">    const clockElement = document.getElementById('liveClock');</w:t>
+              <w:br/>
+              <w:t xml:space="preserve">    if (!clockElement) return;</w:t>
+              <w:br/>
+              <w:br/>
+              <w:t xml:space="preserve">    const now = new Date();</w:t>
+              <w:br/>
+              <w:t xml:space="preserve">    const hours = String(now.getHours()).padStart(2, '0');</w:t>
+              <w:br/>
+              <w:t xml:space="preserve">    const minutes = String(now.getMinutes()).padStart(2, '0');</w:t>
+              <w:br/>
+              <w:t xml:space="preserve">    const seconds = String(now.getSeconds()).padStart(2, '0');</w:t>
+              <w:br/>
+              <w:t xml:space="preserve">    </w:t>
+              <w:br/>
+              <w:t xml:space="preserve">    clockElement.textContent = `${hours}:${minutes}:${seconds}`;</w:t>
+              <w:br/>
+              <w:t>}</w:t>
+              <w:br/>
+              <w:br/>
+              <w:t>// Update clock every second</w:t>
+              <w:br/>
+              <w:t>setInterval(updateClock, 1000);</w:t>
+              <w:br/>
+              <w:t>updateClock(); // Initial call</w:t>
+              <w:br/>
+              <w:br/>
+              <w:t>// Data source real</w:t>
+              <w:br/>
+              <w:t>let allTasks = [];</w:t>
+              <w:br/>
+              <w:t>let currentSelectedTask = null;</w:t>
+              <w:br/>
+              <w:br/>
+              <w:t>// Initialize Excel fetching</w:t>
+              <w:br/>
+              <w:t>async function loadExcelTasks() {</w:t>
+              <w:br/>
+              <w:t xml:space="preserve">    const container = document.querySelector('.tree-container');</w:t>
+              <w:br/>
+              <w:t xml:space="preserve">    if(container) container.innerHTML = '&lt;div style="padding: 20px; color: var(--text-secondary);"&gt;&lt;i class="bx bx-loader-alt bx-spin"&gt;&lt;/i&gt; Cargando Tareas...&lt;/div&gt;';</w:t>
+              <w:br/>
+              <w:t xml:space="preserve">    </w:t>
+              <w:br/>
+              <w:t xml:space="preserve">    try {</w:t>
+              <w:br/>
+              <w:t xml:space="preserve">        const url = encodeURI('Tareas Riesgo/Tareas de Riesgo.xlsx') + '?t=' + new Date().getTime();</w:t>
+              <w:br/>
+              <w:t xml:space="preserve">        const response = await fetch(url);</w:t>
+              <w:br/>
+              <w:t xml:space="preserve">        if(!response.ok) throw new Error("Error HTTP " + response.status);</w:t>
+              <w:br/>
+              <w:t xml:space="preserve">        const arrayBuffer = await response.arrayBuffer();</w:t>
+              <w:br/>
+              <w:t xml:space="preserve">        const workbook = XLSX.read(arrayBuffer, {type: 'array'});</w:t>
+              <w:br/>
+              <w:t xml:space="preserve">        const worksheet = workbook.Sheets[workbook.SheetNames[0]];</w:t>
+              <w:br/>
+              <w:t xml:space="preserve">        const json = XLSX.utils.sheet_to_json(worksheet, { defval: "" });</w:t>
+              <w:br/>
+              <w:t xml:space="preserve">        </w:t>
+              <w:br/>
+              <w:t xml:space="preserve">        // Assign ID to all master tasks in json</w:t>
+              <w:br/>
+              <w:t xml:space="preserve">        json.forEach((row, idx) =&gt; {</w:t>
+              <w:br/>
+              <w:t xml:space="preserve">            row.id = idx;</w:t>
+              <w:br/>
+              <w:t xml:space="preserve">        });</w:t>
+              <w:br/>
+              <w:t xml:space="preserve">        </w:t>
+              <w:br/>
+              <w:t xml:space="preserve">        let processedRows = [];</w:t>
+              <w:br/>
+              <w:t xml:space="preserve">        </w:t>
+              <w:br/>
+              <w:t xml:space="preserve">        if (currentUser &amp;&amp; currentUser.role === 'Gestor') {</w:t>
+              <w:br/>
+              <w:t xml:space="preserve">            // Resolve today's real shift from the parsed schedule (globalScheduleRows/globalScheduleBlocks)</w:t>
+              <w:br/>
+              <w:t xml:space="preserve">            // This ensures the filter uses the actual shift for today, not a stale value from localStorage</w:t>
+              <w:br/>
+              <w:t xml:space="preserve">            let resolvedShift = currentUser.shift || 'Por Asignar';</w:t>
+              <w:br/>
+              <w:t xml:space="preserve">            if (globalScheduleRows &amp;&amp; globalScheduleBlocks &amp;&amp; globalScheduleBlocks.length &gt; 0) {</w:t>
+              <w:br/>
+              <w:t xml:space="preserve">                const todayShift = getShiftForDate(globalScheduleRows, globalScheduleBlocks, currentUser.name, new Date());</w:t>
+              <w:br/>
+              <w:t xml:space="preserve">                if (todayShift &amp;&amp; todayShift !== 'Por Asignar' &amp;&amp; todayShift !== 'Descansa') {</w:t>
+              <w:br/>
+              <w:t xml:space="preserve">                    resolvedShift = todayShift;</w:t>
+              <w:br/>
+              <w:t xml:space="preserve">                }</w:t>
+              <w:br/>
+              <w:t xml:space="preserve">            }</w:t>
+              <w:br/>
+              <w:t xml:space="preserve">            // Load cronograma assignments using the resolved real shift</w:t>
+              <w:br/>
+              <w:t xml:space="preserve">            await loadCronogramaAssignments(currentUser.name, resolvedShift);</w:t>
+              <w:br/>
+              <w:t xml:space="preserve">            </w:t>
+              <w:br/>
+              <w:t xml:space="preserve">            if (gestorCronogramaAssignments &amp;&amp; gestorCronogramaAssignments.length &gt; 0) {</w:t>
+              <w:br/>
+              <w:t xml:space="preserve">                // Filter the master json rows</w:t>
+              <w:br/>
+              <w:t xml:space="preserve">                const filteredMasterRows = json.filter(row =&gt; {</w:t>
+              <w:br/>
+              <w:t xml:space="preserve">                    const set = row['Set '] || row['Set'] || 'Otros';</w:t>
+              <w:br/>
+              <w:t xml:space="preserve">                    const taskName = row['Tarea'];</w:t>
+              <w:br/>
+              <w:t xml:space="preserve">                    return gestorCronogramaAssignments.some(assign =&gt; </w:t>
+              <w:br/>
+              <w:t xml:space="preserve">                        taskNamesMatch(assign.task, taskName) &amp;&amp; setNamesMatch(assign.set, set)</w:t>
+              <w:br/>
+              <w:t xml:space="preserve">                    );</w:t>
+              <w:br/>
+              <w:t xml:space="preserve">                });</w:t>
+              <w:br/>
+              <w:t xml:space="preserve">                </w:t>
+              <w:br/>
+              <w:t xml:space="preserve">                // Generate mock tasks for assignments that aren't in the master sheet</w:t>
+              <w:br/>
+              <w:t xml:space="preserve">                const generatedMocks = [];</w:t>
+              <w:br/>
+              <w:t xml:space="preserve">                let mockId = 10000;</w:t>
+              <w:br/>
+              <w:t xml:space="preserve">                gestorCronogramaAssignments.forEach(assign =&gt; {</w:t>
+              <w:br/>
+              <w:t xml:space="preserve">                    const hasMasterMatch = json.some(row =&gt; </w:t>
+              <w:br/>
+              <w:t xml:space="preserve">                        taskNamesMatch(assign.task, row['Tarea']) &amp;&amp; setNamesMatch(assign.set, row['Set '] || row['Set'] || 'Otros')</w:t>
+              <w:br/>
+              <w:t xml:space="preserve">                    );</w:t>
+              <w:br/>
+              <w:t xml:space="preserve">                    </w:t>
+              <w:br/>
+              <w:t xml:space="preserve">                    if (!hasMasterMatch) {</w:t>
+              <w:br/>
+              <w:t xml:space="preserve">                        const mockRow = {</w:t>
+              <w:br/>
+              <w:t xml:space="preserve">                            'Set ': assign.set,</w:t>
+              <w:br/>
+              <w:t xml:space="preserve">                            'Tarea': assign.task,</w:t>
+              <w:br/>
+              <w:t xml:space="preserve">                            'Detalle de Tarea': `Tarea de control rutinario: ${assign.task}. Realizar las verificaciones correspondientes según los lineamientos de Riesgo.`,</w:t>
+              <w:br/>
+              <w:t xml:space="preserve">                            'Horario': 'Durante el turno',</w:t>
+              <w:br/>
+              <w:t xml:space="preserve">                            'Día': 'Diario',</w:t>
+              <w:br/>
+              <w:t xml:space="preserve">                            'Instrucciones': '1. Realizar la validación de la tarea de acuerdo con el procedimiento estándar.\n2. Registrar cualquier anomalía en los canales oficiales.\n3. Marcar como completada en esta plataforma al finalizar.',</w:t>
+              <w:br/>
+              <w:t xml:space="preserve">                            'Documento / Video de Apoyo': '',</w:t>
+              <w:br/>
+              <w:t xml:space="preserve">                            id: mockId++</w:t>
+              <w:br/>
+              <w:t xml:space="preserve">                        };</w:t>
+              <w:br/>
+              <w:t xml:space="preserve">                        generatedMocks.push(mockRow);</w:t>
+              <w:br/>
+              <w:t xml:space="preserve">                    }</w:t>
+              <w:br/>
+              <w:t xml:space="preserve">                });</w:t>
+              <w:br/>
+              <w:t xml:space="preserve">                </w:t>
+              <w:br/>
+              <w:t xml:space="preserve">                processedRows = [...filteredMasterRows, ...generatedMocks];</w:t>
+              <w:br/>
+              <w:t xml:space="preserve">            } else {</w:t>
+              <w:br/>
+              <w:t xml:space="preserve">                processedRows = [];</w:t>
+              <w:br/>
+              <w:t xml:space="preserve">            }</w:t>
               <w:br/>
               <w:t xml:space="preserve">        } else {</w:t>
               <w:br/>
-              <w:t xml:space="preserve">            return [[1, 2], [4, 5]];</w:t>
+              <w:t xml:space="preserve">            // Admin/Supervisor or other roles see everything</w:t>
+              <w:br/>
+              <w:t xml:space="preserve">            processedRows = json;</w:t>
               <w:br/>
               <w:t xml:space="preserve">        }</w:t>
               <w:br/>
+              <w:t xml:space="preserve">        </w:t>
+              <w:br/>
+              <w:t xml:space="preserve">        // Transform the data, group by Set</w:t>
+              <w:br/>
+              <w:t xml:space="preserve">        const tasksBySet = {};</w:t>
+              <w:br/>
+              <w:t xml:space="preserve">        allTasks = []; // Clear global allTasks</w:t>
+              <w:br/>
+              <w:t xml:space="preserve">        </w:t>
+              <w:br/>
+              <w:t xml:space="preserve">        processedRows.forEach((row, index) =&gt; {</w:t>
+              <w:br/>
+              <w:t xml:space="preserve">            const set = row['Set '] || row['Set'] || 'Otros';</w:t>
+              <w:br/>
+              <w:t xml:space="preserve">            const taskName = row['Tarea'];</w:t>
+              <w:br/>
+              <w:t xml:space="preserve">            const taskId = row.id !== undefined ? row.id : index;</w:t>
+              <w:br/>
+              <w:t xml:space="preserve">            </w:t>
+              <w:br/>
+              <w:t xml:space="preserve">            if (!tasksBySet[set]) tasksBySet[set] = [];</w:t>
+              <w:br/>
+              <w:t xml:space="preserve">            </w:t>
+              <w:br/>
+              <w:t xml:space="preserve">            // Check for duplicates in the visual tree</w:t>
+              <w:br/>
+              <w:t xml:space="preserve">            const isDuplicate = tasksBySet[set].some(t =&gt; t.name === taskName);</w:t>
+              <w:br/>
+              <w:t xml:space="preserve">            </w:t>
+              <w:br/>
+              <w:t xml:space="preserve">            if (!isDuplicate) {</w:t>
+              <w:br/>
+              <w:t xml:space="preserve">                tasksBySet[set].push({</w:t>
+              <w:br/>
+              <w:t xml:space="preserve">                    id: taskId,</w:t>
+              <w:br/>
+              <w:t xml:space="preserve">                    name: taskName,</w:t>
+              <w:br/>
+              <w:t xml:space="preserve">                    detail: row['Detalle de Tarea'],</w:t>
+              <w:br/>
+              <w:t xml:space="preserve">                    time: row['Horario'],</w:t>
+              <w:br/>
+              <w:t xml:space="preserve">                    day: row['Día']</w:t>
+              <w:br/>
+              <w:t xml:space="preserve">                });</w:t>
+              <w:br/>
+              <w:t xml:space="preserve">            }</w:t>
+              <w:br/>
+              <w:t xml:space="preserve">            allTasks.push({ ...row, id: taskId });</w:t>
+              <w:br/>
+              <w:t xml:space="preserve">        });</w:t>
+              <w:br/>
+              <w:t xml:space="preserve">        </w:t>
+              <w:br/>
+              <w:t xml:space="preserve">        // Populate Set Selector</w:t>
+              <w:br/>
+              <w:t xml:space="preserve">        const select = document.getElementById('activeSetSelect');</w:t>
+              <w:br/>
+              <w:t xml:space="preserve">        if(select) {</w:t>
+              <w:br/>
+              <w:t xml:space="preserve">            select.innerHTML = '&lt;option value="" disabled selected&gt;Selecciona tu SET a trabajar...&lt;/option&gt;&lt;option value="Todos"&gt;Mostrar Todos&lt;/option&gt;';</w:t>
+              <w:br/>
+              <w:t xml:space="preserve">            const setsKeys = Object.keys(tasksBySet).sort();</w:t>
+              <w:br/>
+              <w:t xml:space="preserve">            setsKeys.forEach(set =&gt; {</w:t>
+              <w:br/>
+              <w:t xml:space="preserve">                select.innerHTML += `&lt;option value="${set}"&gt;${set}&lt;/option&gt;`;</w:t>
+              <w:br/>
+              <w:t xml:space="preserve">            });</w:t>
+              <w:br/>
+              <w:t xml:space="preserve">            </w:t>
+              <w:br/>
+              <w:t xml:space="preserve">            // Clone select to remove old event listeners</w:t>
+              <w:br/>
+              <w:t xml:space="preserve">            const newSelect = select.cloneNode(true);</w:t>
+              <w:br/>
+              <w:t xml:space="preserve">            select.parentNode.replaceChild(newSelect, select);</w:t>
+              <w:br/>
+              <w:t xml:space="preserve">            </w:t>
+              <w:br/>
+              <w:t xml:space="preserve">            newSelect.addEventListener('change', (e) =&gt; {</w:t>
+              <w:br/>
+              <w:t xml:space="preserve">                const val = e.target.value;</w:t>
+              <w:br/>
+              <w:t xml:space="preserve">                if(val === 'Todos') {</w:t>
+              <w:br/>
+              <w:t xml:space="preserve">                    renderTree(tasksBySet);</w:t>
+              <w:br/>
+              <w:t xml:space="preserve">                } else {</w:t>
+              <w:br/>
+              <w:t xml:space="preserve">                    const filtered = {};</w:t>
+              <w:br/>
+              <w:t xml:space="preserve">                    filtered[val] = tasksBySet[val];</w:t>
+              <w:br/>
+              <w:t xml:space="preserve">                    renderTree(filtered);</w:t>
+              <w:br/>
+              <w:t xml:space="preserve">                }</w:t>
+              <w:br/>
+              <w:t xml:space="preserve">            });</w:t>
+              <w:br/>
+              <w:br/>
+              <w:t xml:space="preserve">            if (setsKeys.length === 1) {</w:t>
+              <w:br/>
+              <w:t xml:space="preserve">                newSelect.value = setsKeys[0];</w:t>
+              <w:br/>
+              <w:t xml:space="preserve">                const filtered = {};</w:t>
+              <w:br/>
+              <w:t xml:space="preserve">                filtered[setsKeys[0]] = tasksBySet[setsKeys[0]];</w:t>
+              <w:br/>
+              <w:t xml:space="preserve">                renderTree(filtered);</w:t>
+              <w:br/>
+              <w:t xml:space="preserve">            } else if (setsKeys.length === 0) {</w:t>
+              <w:br/>
+              <w:t xml:space="preserve">                const container = document.querySelector('.tree-container');</w:t>
+              <w:br/>
+              <w:t xml:space="preserve">                if(container) container.innerHTML = '&lt;div style="padding: 20px; color: var(--text-secondary); text-align: center;"&gt;No hay tareas asignadas en tu cronograma para el día de hoy.&lt;/div&gt;';</w:t>
+              <w:br/>
+              <w:t xml:space="preserve">            } else {</w:t>
+              <w:br/>
+              <w:t xml:space="preserve">                // No renderizar todos por defecto, esperar selección</w:t>
+              <w:br/>
+              <w:t xml:space="preserve">                const container = document.querySelector('.tree-container');</w:t>
+              <w:br/>
+              <w:t xml:space="preserve">                if(container) container.innerHTML = '&lt;div style="padding: 20px; color: var(--text-secondary); text-align: center;"&gt;Selecciona un SET en el menú desplegable para ver las tareas.&lt;/div&gt;';</w:t>
+              <w:br/>
+              <w:t xml:space="preserve">            }</w:t>
+              <w:br/>
+              <w:t xml:space="preserve">        }</w:t>
+              <w:br/>
+              <w:t xml:space="preserve">        </w:t>
+              <w:br/>
+              <w:t xml:space="preserve">    } catch(err) {</w:t>
+              <w:br/>
+              <w:t xml:space="preserve">        console.error("Error loading tasks:", err);</w:t>
+              <w:br/>
+              <w:t xml:space="preserve">        const container = document.querySelector('.tree-container');</w:t>
+              <w:br/>
+              <w:t xml:space="preserve">        if(container) container.innerHTML = `&lt;div style="padding: 20px; color: var(--danger);"&gt;&lt;i class="bx bx-error-circle"&gt;&lt;/i&gt; Error cargando tareas: ${err.message}&lt;/div&gt;`;</w:t>
+              <w:br/>
               <w:t xml:space="preserve">    }</w:t>
               <w:br/>
               <w:t>}</w:t>
               <w:br/>
               <w:br/>
-              <w:t>let gestorCronogramaAssignments = null;</w:t>
-              <w:br/>
-              <w:br/>
-              <w:t>async function loadCronogramaAssignments(gestorName, gestorShift) {</w:t>
+              <w:t>// Initializar parseo del Horario Personal</w:t>
+              <w:br/>
+              <w:t>async function loadSchedule() {</w:t>
               <w:br/>
               <w:t xml:space="preserve">    try {</w:t>
               <w:br/>
-              <w:t xml:space="preserve">        const url = encodeURI('Cronograma de Tareas/Cronograma Mayo.xlsx') + '?t=' + Date.now();</w:t>
+              <w:t xml:space="preserve">        const url = encodeURI('Horario/Horario 2026.xlsx') + '?t=' + Date.now();</w:t>
               <w:br/>
               <w:t xml:space="preserve">        const response = await fetch(url);</w:t>
               <w:br/>
-              <w:t xml:space="preserve">        if (!response.ok) throw new Error("Fallo al cargar cronograma");</w:t>
+              <w:t xml:space="preserve">        if(!response.ok) throw new Error("Fallo red");</w:t>
               <w:br/>
               <w:t xml:space="preserve">        const arrayBuffer = await response.arrayBuffer();</w:t>
               <w:br/>
               <w:t xml:space="preserve">        const workbook = XLSX.read(arrayBuffer, {type: 'array'});</w:t>
               <w:br/>
+              <w:t xml:space="preserve">        const worksheet = workbook.Sheets[workbook.SheetNames[0]];</w:t>
+              <w:br/>
+              <w:t xml:space="preserve">        const rows = XLSX.utils.sheet_to_json(worksheet, { header: 1, defval: "" });</w:t>
+              <w:br/>
               <w:t xml:space="preserve">        </w:t>
               <w:br/>
-              <w:t xml:space="preserve">        const today = new Date();</w:t>
-              <w:br/>
-              <w:t xml:space="preserve">        const sheetName = getWeekSheet(workbook.SheetNames, today);</w:t>
-              <w:br/>
-              <w:t xml:space="preserve">        if (!sheetName) return;</w:t>
+              <w:t xml:space="preserve">        // Función helper para parsear fechas de Excel a JS</w:t>
+              <w:br/>
+              <w:t xml:space="preserve">        function formatExcelDate(serial) {</w:t>
+              <w:br/>
+              <w:t xml:space="preserve">            if(!serial || isNaN(serial)) return "";</w:t>
+              <w:br/>
+              <w:t xml:space="preserve">            // Usar UTC para evitar problemas de zonas horarias e historia de DST</w:t>
+              <w:br/>
+              <w:t xml:space="preserve">            const epochUTC = Date.UTC(1899, 11, 30);</w:t>
+              <w:br/>
+              <w:t xml:space="preserve">            const d = new Date(epochUTC + serial * 86400000);</w:t>
+              <w:br/>
+              <w:t xml:space="preserve">            const monthNames = ["Ene", "Feb", "Mar", "Abr", "May", "Jun", "Jul", "Ago", "Sep", "Oct", "Nov", "Dic"];</w:t>
+              <w:br/>
+              <w:t xml:space="preserve">            return `${d.getUTCDate()} ${monthNames[d.getUTCMonth()]}`;</w:t>
+              <w:br/>
+              <w:t xml:space="preserve">        }</w:t>
               <w:br/>
               <w:t xml:space="preserve">        </w:t>
               <w:br/>
-              <w:t xml:space="preserve">        const worksheet = workbook.Sheets[sheetName];</w:t>
-              <w:br/>
-              <w:t xml:space="preserve">        const rows = XLSX.utils.sheet_to_json(worksheet, { header: 1, defval: "" });</w:t>
+              <w:t xml:space="preserve">        let allScheduleBlocks = [];</w:t>
+              <w:br/>
+              <w:t xml:space="preserve">        if (rows &amp;&amp; rows.length &gt; 2) {</w:t>
+              <w:br/>
+              <w:t xml:space="preserve">            for(let rIdx = 0; rIdx &lt; rows.length; rIdx++) {</w:t>
+              <w:br/>
+              <w:t xml:space="preserve">                const testRow = rows[rIdx];</w:t>
+              <w:br/>
+              <w:t xml:space="preserve">                if (!testRow || testRow.length &lt; 2) continue;</w:t>
+              <w:br/>
+              <w:t xml:space="preserve">                </w:t>
+              <w:br/>
+              <w:t xml:space="preserve">                if (formatExcelDate(testRow[1]) !== "") {</w:t>
+              <w:br/>
+              <w:t xml:space="preserve">                    const nextR = rows[rIdx+1];</w:t>
+              <w:br/>
+              <w:t xml:space="preserve">                    if (nextR &amp;&amp; nextR.length &gt; 1 &amp;&amp; (nextR[1] === 'Lunes' || nextR[1] === 'Martes')) {</w:t>
+              <w:br/>
+              <w:t xml:space="preserve">                        // Encontramos un bloque, vamos a ver la fecha inicial y final</w:t>
+              <w:br/>
+              <w:t xml:space="preserve">                        let firstDate = formatExcelDate(testRow[1]);</w:t>
+              <w:br/>
+              <w:t xml:space="preserve">                        let lastDate = firstDate;</w:t>
+              <w:br/>
+              <w:t xml:space="preserve">                        for(let c = 1; c &lt; testRow.length; c++) {</w:t>
+              <w:br/>
+              <w:t xml:space="preserve">                            if(formatExcelDate(testRow[c])) lastDate = formatExcelDate(testRow[c]);</w:t>
+              <w:br/>
+              <w:t xml:space="preserve">                        }</w:t>
+              <w:br/>
+              <w:t xml:space="preserve">                        </w:t>
+              <w:br/>
+              <w:t xml:space="preserve">                        allScheduleBlocks.push({</w:t>
+              <w:br/>
+              <w:t xml:space="preserve">                            startRow: rIdx,</w:t>
+              <w:br/>
+              <w:t xml:space="preserve">                            label: `Semana del ${firstDate} al ${lastDate}`</w:t>
+              <w:br/>
+              <w:t xml:space="preserve">                        });</w:t>
+              <w:br/>
+              <w:t xml:space="preserve">                        rIdx++; // Saltar la fila de días</w:t>
+              <w:br/>
+              <w:t xml:space="preserve">                    }</w:t>
+              <w:br/>
+              <w:t xml:space="preserve">                }</w:t>
+              <w:br/>
+              <w:t xml:space="preserve">            }</w:t>
+              <w:br/>
+              <w:t xml:space="preserve">        }</w:t>
+              <w:br/>
+              <w:br/>
+              <w:t xml:space="preserve">        globalScheduleRows = rows;</w:t>
+              <w:br/>
+              <w:t xml:space="preserve">        globalScheduleBlocks = allScheduleBlocks;</w:t>
               <w:br/>
               <w:t xml:space="preserve">        </w:t>
               <w:br/>
-              <w:t xml:space="preserve">        const colGroups = getCronogramaColumnsForToday(today, gestorShift);</w:t>
+              <w:t xml:space="preserve">        if (allScheduleBlocks.length === 0) return; // No hay datos válidos</w:t>
+              <w:br/>
+              <w:br/>
+              <w:t xml:space="preserve">        const tableHead = document.getElementById('scheduleTableHead');</w:t>
+              <w:br/>
+              <w:t xml:space="preserve">        const tableBody = document.getElementById('scheduleTableBody');</w:t>
               <w:br/>
               <w:t xml:space="preserve">        </w:t>
               <w:br/>
-              <w:t xml:space="preserve">        gestorCronogramaAssignments = [];</w:t>
+              <w:t xml:space="preserve">        if(tableHead &amp;&amp; tableBody &amp;&amp; rows.length &gt; 2) {</w:t>
+              <w:br/>
+              <w:t xml:space="preserve">            </w:t>
+              <w:br/>
+              <w:t xml:space="preserve">            const weekSelector = document.getElementById('weekSelector');</w:t>
+              <w:br/>
+              <w:t xml:space="preserve">            </w:t>
+              <w:br/>
+              <w:t xml:space="preserve">            // Encontrar el bloque correspondiente a hoy</w:t>
+              <w:br/>
+              <w:t xml:space="preserve">            let defaultBlockRow = null;</w:t>
+              <w:br/>
+              <w:t xml:space="preserve">            const today = new Date();</w:t>
+              <w:br/>
+              <w:t xml:space="preserve">            for (let block of allScheduleBlocks) {</w:t>
+              <w:br/>
+              <w:t xml:space="preserve">                const dateRow = rows[block.startRow];</w:t>
+              <w:br/>
+              <w:t xml:space="preserve">                for (let c = 1; c &lt; dateRow.length; c++) {</w:t>
+              <w:br/>
+              <w:t xml:space="preserve">                    const serial = dateRow[c];</w:t>
+              <w:br/>
+              <w:t xml:space="preserve">                    if (serial &amp;&amp; !isNaN(serial)) {</w:t>
+              <w:br/>
+              <w:t xml:space="preserve">                        const cellDate = excelToJSDate(serial);</w:t>
+              <w:br/>
+              <w:t xml:space="preserve">                        if (cellDate &amp;&amp; isSameDate(cellDate, today)) {</w:t>
+              <w:br/>
+              <w:t xml:space="preserve">                            defaultBlockRow = block.startRow;</w:t>
+              <w:br/>
+              <w:t xml:space="preserve">                            break;</w:t>
+              <w:br/>
+              <w:t xml:space="preserve">                        }</w:t>
+              <w:br/>
+              <w:t xml:space="preserve">                    }</w:t>
+              <w:br/>
+              <w:t xml:space="preserve">                }</w:t>
+              <w:br/>
+              <w:t xml:space="preserve">                if (defaultBlockRow !== null) break;</w:t>
+              <w:br/>
+              <w:t xml:space="preserve">            }</w:t>
+              <w:br/>
+              <w:t xml:space="preserve">            </w:t>
+              <w:br/>
+              <w:t xml:space="preserve">            if (defaultBlockRow === null) {</w:t>
+              <w:br/>
+              <w:t xml:space="preserve">                defaultBlockRow = allScheduleBlocks[allScheduleBlocks.length - 1].startRow;</w:t>
+              <w:br/>
+              <w:t xml:space="preserve">            }</w:t>
+              <w:br/>
+              <w:t xml:space="preserve">            </w:t>
+              <w:br/>
+              <w:t xml:space="preserve">            if (weekSelector) {</w:t>
+              <w:br/>
+              <w:t xml:space="preserve">                weekSelector.innerHTML = '';</w:t>
+              <w:br/>
+              <w:t xml:space="preserve">                allScheduleBlocks.forEach(block =&gt; {</w:t>
+              <w:br/>
+              <w:t xml:space="preserve">                    weekSelector.innerHTML += `&lt;option value="${block.startRow}"&gt;${block.label}&lt;/option&gt;`;</w:t>
+              <w:br/>
+              <w:t xml:space="preserve">                });</w:t>
+              <w:br/>
+              <w:t xml:space="preserve">                </w:t>
+              <w:br/>
+              <w:t xml:space="preserve">                weekSelector.value = defaultBlockRow;</w:t>
+              <w:br/>
+              <w:t xml:space="preserve">                </w:t>
+              <w:br/>
+              <w:t xml:space="preserve">                weekSelector.addEventListener('change', (e) =&gt; {</w:t>
+              <w:br/>
+              <w:t xml:space="preserve">                    renderScheduleBlock(parseInt(e.target.value));</w:t>
+              <w:br/>
+              <w:t xml:space="preserve">                });</w:t>
+              <w:br/>
+              <w:t xml:space="preserve">            }</w:t>
+              <w:br/>
+              <w:t xml:space="preserve">            </w:t>
+              <w:br/>
+              <w:t xml:space="preserve">            // Renderizar el bloque inicial</w:t>
+              <w:br/>
+              <w:t xml:space="preserve">            renderScheduleBlock(defaultBlockRow);</w:t>
+              <w:br/>
+              <w:t xml:space="preserve">            </w:t>
+              <w:br/>
+              <w:t xml:space="preserve">            function renderScheduleBlock(blockStartRow) {</w:t>
+              <w:br/>
+              <w:t xml:space="preserve">                const dateRow = rows[blockStartRow];</w:t>
+              <w:br/>
+              <w:t xml:space="preserve">                const dayRow = rows[blockStartRow + 1];</w:t>
+              <w:br/>
+              <w:t xml:space="preserve">                </w:t>
+              <w:br/>
+              <w:t xml:space="preserve">                let numCols = 0;</w:t>
+              <w:br/>
+              <w:t xml:space="preserve">                for(let i=1; i&lt;dateRow.length; i++) {</w:t>
+              <w:br/>
+              <w:t xml:space="preserve">                    if(formatExcelDate(dateRow[i])) numCols = i;</w:t>
+              <w:br/>
+              <w:t xml:space="preserve">                }</w:t>
+              <w:br/>
+              <w:t xml:space="preserve">                if(numCols === 0) numCols = 7; // fallback</w:t>
+              <w:br/>
+              <w:t xml:space="preserve">                </w:t>
+              <w:br/>
+              <w:t xml:space="preserve">                let headHTML = '&lt;tr style="border-bottom: 1px solid var(--glass-border);"&gt;';</w:t>
+              <w:br/>
+              <w:t xml:space="preserve">                headHTML += `&lt;th style="padding: 12px; color: var(--accent-primary); text-align: left; position: sticky; left: 0; background: var(--bg-panel); z-index: 2;"&gt;GESTOR &lt;i class='bx bx-refresh' style='cursor:pointer; margin-left:5px;' onclick='loadSchedule()' title='Refrescar Horario'&gt;&lt;/i&gt;&lt;/th&gt;`;</w:t>
+              <w:br/>
+              <w:t xml:space="preserve">                for(let i = 1; i &lt;= numCols; i++) {</w:t>
+              <w:br/>
+              <w:t xml:space="preserve">                    const dayName = dayRow[i] || `Día ${i}`;</w:t>
+              <w:br/>
+              <w:t xml:space="preserve">                    const dateParsed = formatExcelDate(dateRow[i]);</w:t>
+              <w:br/>
+              <w:t xml:space="preserve">                    const subText = dateParsed ? `&lt;br&gt;&lt;span style="font-size: 11px; font-weight: normal; color: var(--text-secondary);"&gt;${dateParsed}&lt;/span&gt;` : '';</w:t>
+              <w:br/>
+              <w:t xml:space="preserve">                    headHTML += `&lt;th style="padding: 12px; color: var(--accent-primary); text-align: center;"&gt;${dayName}${subText}&lt;/th&gt;`;</w:t>
+              <w:br/>
+              <w:t xml:space="preserve">                }</w:t>
+              <w:br/>
+              <w:t xml:space="preserve">                headHTML += '&lt;/tr&gt;';</w:t>
+              <w:br/>
+              <w:t xml:space="preserve">                tableHead.innerHTML = headHTML;</w:t>
+              <w:br/>
+              <w:t xml:space="preserve">                </w:t>
+              <w:br/>
+              <w:t xml:space="preserve">                tableBody.innerHTML = '';</w:t>
+              <w:br/>
+              <w:t xml:space="preserve">                for(let rowIndex = blockStartRow + 2; rowIndex &lt; rows.length; rowIndex++) {</w:t>
+              <w:br/>
+              <w:t xml:space="preserve">                    const r = rows[rowIndex];</w:t>
+              <w:br/>
+              <w:t xml:space="preserve">                    if (!r || !r[0] || String(r[0]).trim() === '' || String(r[0]).trim().toUpperCase() === 'GESTOR') break;</w:t>
+              <w:br/>
+              <w:t xml:space="preserve">                    </w:t>
+              <w:br/>
+              <w:t xml:space="preserve">                    let isCurrentUser = (currentUser &amp;&amp; namesMatch(r[0], currentUser.name));</w:t>
+              <w:br/>
+              <w:t xml:space="preserve">                    </w:t>
+              <w:br/>
+              <w:t xml:space="preserve">                    if (currentUser &amp;&amp; currentUser.role === 'Gestor' &amp;&amp; !isCurrentUser) continue;</w:t>
+              <w:br/>
+              <w:br/>
+              <w:t xml:space="preserve">                    let bgClass = isCurrentUser ? 'rgba(59,130,246,0.1)' : 'transparent';</w:t>
+              <w:br/>
+              <w:t xml:space="preserve">                    </w:t>
+              <w:br/>
+              <w:t xml:space="preserve">                    let trHTML = `&lt;tr class="hover-highlight" style="border-bottom: 1px solid var(--glass-border); background: ${bgClass};"&gt;`;</w:t>
+              <w:br/>
+              <w:t xml:space="preserve">                    trHTML += `&lt;td style="padding: 12px; font-weight: 600; text-align: left; color: ${isCurrentUser ? 'var(--accent-primary)' : 'var(--text-primary)'}; position: sticky; left: 0; background: ${isCurrentUser ? 'var(--bg-dark)' : 'var(--bg-panel)'}; z-index: 1;"&gt;${r[0]}&lt;/td&gt;`;</w:t>
+              <w:br/>
+              <w:t xml:space="preserve">                    </w:t>
+              <w:br/>
+              <w:t xml:space="preserve">                    // Encontrar el turno para mostrar en el badge principal (corresponde a hoy)</w:t>
+              <w:br/>
+              <w:t xml:space="preserve">                    let badgeShift = getShiftForDate(rows, allScheduleBlocks, r[0], new Date());</w:t>
+              <w:br/>
+              <w:t xml:space="preserve">                    </w:t>
+              <w:br/>
+              <w:t xml:space="preserve">                    for(let i = 1; i &lt;= numCols; i++) {</w:t>
+              <w:br/>
+              <w:t xml:space="preserve">                        const shift = r[i] || 'Descansa';</w:t>
+              <w:br/>
+              <w:t xml:space="preserve">                        </w:t>
+              <w:br/>
+              <w:t xml:space="preserve">                        let badgeClass = 'pending';</w:t>
+              <w:br/>
+              <w:t xml:space="preserve">                        const sLower = normalizeName(shift);</w:t>
+              <w:br/>
+              <w:t xml:space="preserve">                        if(/\d\s*(am|pm)/i.test(shift)) badgeClass = 'in-progress';</w:t>
+              <w:br/>
+              <w:t xml:space="preserve">                        else if(sLower.includes('vacacion')) badgeClass = 'vacaciones-badge';</w:t>
+              <w:br/>
+              <w:t xml:space="preserve">                        else if(sLower.includes('descansa')) badgeClass = 'descanso-badge';</w:t>
+              <w:br/>
+              <w:t xml:space="preserve">                        else if(sLower.includes('familia')) badgeClass = 'familia-badge';</w:t>
+              <w:br/>
+              <w:t xml:space="preserve">                        </w:t>
+              <w:br/>
+              <w:t xml:space="preserve">                        trHTML += `&lt;td style="padding: 12px; text-align: center; white-space: nowrap;"&gt;&lt;span class="badge ${badgeClass}"&gt;${shift}&lt;/span&gt;&lt;/td&gt;`;</w:t>
+              <w:br/>
+              <w:t xml:space="preserve">                    }</w:t>
+              <w:br/>
+              <w:t xml:space="preserve">                    </w:t>
+              <w:br/>
+              <w:t xml:space="preserve">                    if (isCurrentUser &amp;&amp; badgeShift) {</w:t>
+              <w:br/>
+              <w:t xml:space="preserve">                        const userRoleEl = document.getElementById('userRole');</w:t>
+              <w:br/>
+              <w:t xml:space="preserve">                        if (userRoleEl) userRoleEl.textContent = `${currentUser.role} | Turno: ${badgeShift}`;</w:t>
+              <w:br/>
+              <w:t xml:space="preserve">                        const headerShiftBadge = document.querySelector('.shift-badge');</w:t>
+              <w:br/>
+              <w:t xml:space="preserve">                        if (headerShiftBadge) headerShiftBadge.textContent = `TURNO: ${badgeShift}`;</w:t>
+              <w:br/>
+              <w:t xml:space="preserve">                        </w:t>
+              <w:br/>
+              <w:t xml:space="preserve">                        // Guardar el turno en currentUser y sincronizar a Firebase</w:t>
+              <w:br/>
+              <w:t xml:space="preserve">                        if (currentUser.shift !== badgeShift) {</w:t>
+              <w:br/>
+              <w:t xml:space="preserve">                            currentUser.shift = badgeShift;</w:t>
+              <w:br/>
+              <w:t xml:space="preserve">                            localStorage.setItem('riskOps_currentUser', JSON.stringify(currentUser));</w:t>
+              <w:br/>
+              <w:t xml:space="preserve">                            syncActiveSessionToFirebase();</w:t>
+              <w:br/>
+              <w:t xml:space="preserve">                            loadExcelTasks();</w:t>
+              <w:br/>
+              <w:t xml:space="preserve">                        }</w:t>
+              <w:br/>
+              <w:t xml:space="preserve">                    }</w:t>
+              <w:br/>
+              <w:t xml:space="preserve">                    trHTML += '&lt;/tr&gt;';</w:t>
+              <w:br/>
+              <w:t xml:space="preserve">                    tableBody.innerHTML += trHTML;</w:t>
+              <w:br/>
+              <w:t xml:space="preserve">                }</w:t>
+              <w:br/>
+              <w:t xml:space="preserve">            }</w:t>
+              <w:br/>
+              <w:t xml:space="preserve">        }</w:t>
+              <w:br/>
+              <w:t xml:space="preserve">        updateGlobalStats();</w:t>
+              <w:br/>
+              <w:t xml:space="preserve">    } catch(e) {</w:t>
+              <w:br/>
+              <w:t xml:space="preserve">        console.log("No se pudo cargar el horario", e);</w:t>
+              <w:br/>
+              <w:t xml:space="preserve">    }</w:t>
+              <w:br/>
+              <w:t>}</w:t>
+              <w:br/>
+              <w:br/>
+              <w:t>function loadTeletrabajo() {</w:t>
+              <w:br/>
+              <w:t xml:space="preserve">    fetch('Teletrabajo/Teletrabajo.xlsx?v=' + Date.now())</w:t>
+              <w:br/>
+              <w:t xml:space="preserve">        .then(res =&gt; {</w:t>
+              <w:br/>
+              <w:t xml:space="preserve">            if(!res.ok) throw new Error("No se encontró el archivo de Teletrabajo");</w:t>
+              <w:br/>
+              <w:t xml:space="preserve">            return res.arrayBuffer();</w:t>
+              <w:br/>
+              <w:t xml:space="preserve">        })</w:t>
+              <w:br/>
+              <w:t xml:space="preserve">        .then(data =&gt; {</w:t>
+              <w:br/>
+              <w:t xml:space="preserve">            const workbook = XLSX.read(data, {type: 'array'});</w:t>
+              <w:br/>
+              <w:t xml:space="preserve">            const firstSheet = workbook.Sheets[workbook.SheetNames[0]];</w:t>
+              <w:br/>
+              <w:t xml:space="preserve">            const rows = XLSX.utils.sheet_to_json(firstSheet, {header: 1, defval: ""});</w:t>
+              <w:br/>
+              <w:t xml:space="preserve">            </w:t>
+              <w:br/>
+              <w:t xml:space="preserve">            let allBlocks = [];</w:t>
+              <w:br/>
+              <w:t xml:space="preserve">            </w:t>
+              <w:br/>
+              <w:t xml:space="preserve">            for(let r = 0; r &lt; rows.length; r++) {</w:t>
+              <w:br/>
+              <w:t xml:space="preserve">                for(let c = 0; c &lt; rows[r].length; c++) {</w:t>
+              <w:br/>
+              <w:t xml:space="preserve">                    // Bloque mejorado: busca etiquetas claras de calendario</w:t>
+              <w:br/>
+              <w:t xml:space="preserve">                    const cellVal = String(rows[r][c]).trim();</w:t>
+              <w:br/>
+              <w:t xml:space="preserve">                    const lowCell = cellVal.toLowerCase();</w:t>
+              <w:br/>
+              <w:t xml:space="preserve">                    if(lowCell.includes('semana') || lowCell.includes('teletrabajo') || /^\d{1,2}\/\d{1,2}/.test(cellVal)) {</w:t>
+              <w:br/>
+              <w:t xml:space="preserve">                        let block = {</w:t>
+              <w:br/>
+              <w:t xml:space="preserve">                            label: cellVal,</w:t>
+              <w:br/>
+              <w:t xml:space="preserve">                            startRow: r,</w:t>
+              <w:br/>
+              <w:t xml:space="preserve">                            colIndex: c,</w:t>
+              <w:br/>
+              <w:t xml:space="preserve">                            data: []</w:t>
+              <w:br/>
+              <w:t xml:space="preserve">                        };</w:t>
+              <w:br/>
+              <w:t xml:space="preserve">                        </w:t>
+              <w:br/>
+              <w:t xml:space="preserve">                        // Buscamos filas debajo de este título que tengan nombres</w:t>
+              <w:br/>
+              <w:t xml:space="preserve">                        for(let i = r + 1; i &lt; rows.length; i++) {</w:t>
+              <w:br/>
+              <w:t xml:space="preserve">                            const gestor = rows[i] ? rows[i][c] : null;</w:t>
+              <w:br/>
+              <w:t xml:space="preserve">                            const dia = rows[i] ? rows[i][c+1] : null;</w:t>
+              <w:br/>
+              <w:t xml:space="preserve">                            </w:t>
+              <w:br/>
+              <w:t xml:space="preserve">                            if(!gestor || String(gestor).trim() === '') break;</w:t>
+              <w:br/>
+              <w:t xml:space="preserve">                            if(String(gestor).trim().toUpperCase() === 'GESTOR') continue; </w:t>
+              <w:br/>
+              <w:t xml:space="preserve">                            </w:t>
+              <w:br/>
+              <w:t xml:space="preserve">                            block.data.push({</w:t>
+              <w:br/>
+              <w:t xml:space="preserve">                                gestor: String(gestor).trim(),</w:t>
+              <w:br/>
+              <w:t xml:space="preserve">                                dia: String(dia || '').trim()</w:t>
+              <w:br/>
+              <w:t xml:space="preserve">                            });</w:t>
+              <w:br/>
+              <w:t xml:space="preserve">                        }</w:t>
+              <w:br/>
+              <w:t xml:space="preserve">                        </w:t>
+              <w:br/>
+              <w:t xml:space="preserve">                        if(block.data.length &gt; 0) allBlocks.push(block);</w:t>
+              <w:br/>
+              <w:t xml:space="preserve">                    }</w:t>
+              <w:br/>
+              <w:t xml:space="preserve">                }</w:t>
+              <w:br/>
+              <w:t xml:space="preserve">            }</w:t>
+              <w:br/>
+              <w:t xml:space="preserve">            </w:t>
+              <w:br/>
+              <w:t xml:space="preserve">            if(allBlocks.length === 0) return;</w:t>
+              <w:br/>
+              <w:t xml:space="preserve">            </w:t>
+              <w:br/>
+              <w:t xml:space="preserve">            const weekSelector = document.getElementById('teletrabajoWeekSelector');</w:t>
+              <w:br/>
+              <w:t xml:space="preserve">            const tableHead = document.getElementById('teletrabajoTableHead');</w:t>
+              <w:br/>
+              <w:t xml:space="preserve">            const tableBody = document.getElementById('teletrabajoTableBody');</w:t>
+              <w:br/>
+              <w:t xml:space="preserve">            </w:t>
+              <w:br/>
+              <w:t xml:space="preserve">            if(weekSelector) {</w:t>
+              <w:br/>
+              <w:t xml:space="preserve">                weekSelector.innerHTML = '';</w:t>
+              <w:br/>
+              <w:t xml:space="preserve">                allBlocks.forEach((block, idx) =&gt; {</w:t>
+              <w:br/>
+              <w:t xml:space="preserve">                    weekSelector.innerHTML += `&lt;option value="${idx}"&gt;${block.label}&lt;/option&gt;`;</w:t>
+              <w:br/>
+              <w:t xml:space="preserve">                });</w:t>
+              <w:br/>
+              <w:t xml:space="preserve">                </w:t>
+              <w:br/>
+              <w:t xml:space="preserve">                // Mostrar siempre la última semana disponible al inicio</w:t>
+              <w:br/>
+              <w:t xml:space="preserve">                let defaultBlockIdx = allBlocks.length - 1;</w:t>
+              <w:br/>
+              <w:t xml:space="preserve">                </w:t>
+              <w:br/>
+              <w:t xml:space="preserve">                weekSelector.value = defaultBlockIdx;</w:t>
+              <w:br/>
+              <w:t xml:space="preserve">                </w:t>
+              <w:br/>
+              <w:t xml:space="preserve">                weekSelector.addEventListener('change', (e) =&gt; {</w:t>
+              <w:br/>
+              <w:t xml:space="preserve">                    renderTeletrabajoBlock(allBlocks[e.target.value]);</w:t>
+              <w:br/>
+              <w:t xml:space="preserve">                });</w:t>
+              <w:br/>
+              <w:t xml:space="preserve">                </w:t>
+              <w:br/>
+              <w:t xml:space="preserve">                renderTeletrabajoBlock(allBlocks[defaultBlockIdx]);</w:t>
+              <w:br/>
+              <w:t xml:space="preserve">            }</w:t>
+              <w:br/>
+              <w:t xml:space="preserve">            </w:t>
+              <w:br/>
+              <w:t xml:space="preserve">            function renderTeletrabajoBlock(block) {</w:t>
+              <w:br/>
+              <w:t xml:space="preserve">                tableHead.innerHTML = `</w:t>
+              <w:br/>
+              <w:t xml:space="preserve">                    &lt;tr style="border-bottom: 1px solid var(--glass-border);"&gt;</w:t>
+              <w:br/>
+              <w:t xml:space="preserve">                        &lt;th style="padding: 12px; color: var(--accent-primary); text-align: left; position: sticky; left: 0; background: var(--bg-panel); z-index: 2;"&gt;GESTOR &lt;i class='bx bx-refresh' style='cursor:pointer; margin-left:5px;' onclick='loadTeletrabajo()' title='Refrescar Teletrabajo'&gt;&lt;/i&gt;&lt;/th&gt;</w:t>
+              <w:br/>
+              <w:t xml:space="preserve">                        &lt;th style="padding: 12px; color: var(--accent-primary); text-align: center;"&gt;DÍA&lt;/th&gt;</w:t>
+              <w:br/>
+              <w:t xml:space="preserve">                        &lt;th style="padding: 12px; color: var(--accent-primary); text-align: center;"&gt;MODALIDAD&lt;/th&gt;</w:t>
+              <w:br/>
+              <w:t xml:space="preserve">                    &lt;/tr&gt;</w:t>
+              <w:br/>
+              <w:t xml:space="preserve">                `;</w:t>
+              <w:br/>
+              <w:t xml:space="preserve">                </w:t>
+              <w:br/>
+              <w:t xml:space="preserve">                tableBody.innerHTML = '';</w:t>
+              <w:br/>
+              <w:t xml:space="preserve">                block.data.forEach(row =&gt; {</w:t>
+              <w:br/>
+              <w:t xml:space="preserve">                    let isCurrentUser = (currentUser &amp;&amp; namesMatch(row.gestor, currentUser.name));</w:t>
+              <w:br/>
+              <w:t xml:space="preserve">                    </w:t>
+              <w:br/>
+              <w:t xml:space="preserve">                    if (currentUser &amp;&amp; currentUser.role === 'Gestor' &amp;&amp; !isCurrentUser) return;</w:t>
+              <w:br/>
+              <w:br/>
+              <w:t xml:space="preserve">                    let bgClass = isCurrentUser ? 'rgba(59,130,246,0.1)' : 'transparent';</w:t>
+              <w:br/>
+              <w:t xml:space="preserve">                    </w:t>
+              <w:br/>
+              <w:t xml:space="preserve">                    let isTeletrabajo = row.dia &amp;&amp; row.dia.toLowerCase() !== 'nan';</w:t>
+              <w:br/>
+              <w:t xml:space="preserve">                    let estadoHtml = isTeletrabajo ? `&lt;span class="badge" style="background: rgba(16, 185, 129, 0.2); color: var(--success);"&gt;HOME OFFICE&lt;/span&gt;` : `&lt;span class="badge pending"&gt;PRESENCIAL&lt;/span&gt;`;</w:t>
+              <w:br/>
+              <w:t xml:space="preserve">                    </w:t>
+              <w:br/>
+              <w:t xml:space="preserve">                    tableBody.innerHTML += `</w:t>
+              <w:br/>
+              <w:t xml:space="preserve">                        &lt;tr class="hover-highlight" style="border-bottom: 1px solid var(--glass-border); background: ${bgClass};"&gt;</w:t>
+              <w:br/>
+              <w:t xml:space="preserve">                            &lt;td style="padding: 12px; font-weight: 600; text-align: left; color: ${isCurrentUser ? 'var(--accent-primary)' : 'var(--text-primary)'}; position: sticky; left: 0; background: ${isCurrentUser ? 'var(--bg-dark)' : 'var(--bg-panel)'}; z-index: 1;"&gt;${row.gestor}&lt;/td&gt;</w:t>
+              <w:br/>
+              <w:t xml:space="preserve">                            &lt;td style="padding: 12px; text-align: center;"&gt;${isTeletrabajo ? row.dia : '-'}&lt;/td&gt;</w:t>
+              <w:br/>
+              <w:t xml:space="preserve">                            &lt;td style="padding: 12px; text-align: center;"&gt;${estadoHtml}&lt;/td&gt;</w:t>
+              <w:br/>
+              <w:t xml:space="preserve">                        &lt;/tr&gt;</w:t>
+              <w:br/>
+              <w:t xml:space="preserve">                    `;</w:t>
+              <w:br/>
+              <w:t xml:space="preserve">                });</w:t>
+              <w:br/>
+              <w:t xml:space="preserve">            }</w:t>
+              <w:br/>
+              <w:t xml:space="preserve">        })</w:t>
+              <w:br/>
+              <w:t xml:space="preserve">        .catch(err =&gt; {</w:t>
+              <w:br/>
+              <w:t xml:space="preserve">            console.error("Error cargando Teletrabajo:", err);</w:t>
+              <w:br/>
+              <w:t xml:space="preserve">            const tb = document.getElementById('teletrabajoTableBody');</w:t>
+              <w:br/>
+              <w:t xml:space="preserve">            if(tb) tb.innerHTML = `&lt;tr&gt;&lt;td colspan="3" style="padding: 20px; color: var(--danger); text-align: center;"&gt;No se pudo cargar Teletrabajo.xlsx o no existe.&lt;/td&gt;&lt;/tr&gt;`;</w:t>
+              <w:br/>
+              <w:t xml:space="preserve">        });</w:t>
+              <w:br/>
+              <w:t>}</w:t>
+              <w:br/>
+              <w:br/>
+              <w:t>// Cargar Histórico de Permisos desde Firebase</w:t>
+              <w:br/>
+              <w:t>async function loadPermisos() {</w:t>
+              <w:br/>
+              <w:t xml:space="preserve">    try {</w:t>
+              <w:br/>
+              <w:t xml:space="preserve">        const snapshot = await database.ref('permissions').once('value');</w:t>
+              <w:br/>
+              <w:t xml:space="preserve">        const historicoContainer = document.getElementById('historicoPermisosList');</w:t>
+              <w:br/>
+              <w:t xml:space="preserve">        if(!historicoContainer) return;</w:t>
               <w:br/>
               <w:t xml:space="preserve">        </w:t>
               <w:br/>
-              <w:t xml:space="preserve">        for (let colGroup of colGroups) {</w:t>
-              <w:br/>
-              <w:t xml:space="preserve">            const tCol = colGroup[0];</w:t>
-              <w:br/>
-              <w:t xml:space="preserve">            const gCol = colGroup[1];</w:t>
+              <w:t xml:space="preserve">        historicoContainer.innerHTML = '';</w:t>
+              <w:br/>
+              <w:t xml:space="preserve">        </w:t>
+              <w:br/>
+              <w:t xml:space="preserve">        if (snapshot.exists()) {</w:t>
+              <w:br/>
+              <w:t xml:space="preserve">            const data = snapshot.val();</w:t>
+              <w:br/>
+              <w:t xml:space="preserve">            let permisos = Object.keys(data).map(k =&gt; ({...data[k], fb_id: k}));</w:t>
               <w:br/>
               <w:t xml:space="preserve">            </w:t>
               <w:br/>
-              <w:t xml:space="preserve">            let currentSet = "";</w:t>
-              <w:br/>
-              <w:t xml:space="preserve">            for (let rIdx = 0; rIdx &lt; rows.length; rIdx++) {</w:t>
-              <w:br/>
-              <w:t xml:space="preserve">                const row = rows[rIdx];</w:t>
-              <w:br/>
-              <w:t xml:space="preserve">                if (!row) continue;</w:t>
+              <w:t xml:space="preserve">            // Filtro de privacidad: Gestor solo ve lo suyo. Admin ve todo.</w:t>
+              <w:br/>
+              <w:t xml:space="preserve">            if (currentUser &amp;&amp; currentUser.role !== 'Admin' &amp;&amp; currentUser.role !== 'Supervisor') {</w:t>
+              <w:br/>
+              <w:t xml:space="preserve">                permisos = permisos.filter(p =&gt; p.gestor === currentUser.name);</w:t>
+              <w:br/>
+              <w:t xml:space="preserve">            }</w:t>
+              <w:br/>
+              <w:t xml:space="preserve">            </w:t>
+              <w:br/>
+              <w:t xml:space="preserve">            // Ordenar por ID descendente (más nuevos primero)</w:t>
+              <w:br/>
+              <w:t xml:space="preserve">            permisos.sort((a,b) =&gt; b.id - a.id);</w:t>
+              <w:br/>
+              <w:t xml:space="preserve">            </w:t>
+              <w:br/>
+              <w:t xml:space="preserve">            if (permisos.length === 0) {</w:t>
+              <w:br/>
+              <w:t xml:space="preserve">                historicoContainer.innerHTML = '&lt;p style="color: var(--text-secondary); text-align: center; padding: 20px;"&gt;No hay permisos en el historial.&lt;/p&gt;';</w:t>
+              <w:br/>
+              <w:t xml:space="preserve">                return;</w:t>
+              <w:br/>
+              <w:t xml:space="preserve">            }</w:t>
+              <w:br/>
+              <w:t xml:space="preserve">            </w:t>
+              <w:br/>
+              <w:t xml:space="preserve">            permisos.forEach(p =&gt; {</w:t>
+              <w:br/>
+              <w:t xml:space="preserve">                let icon = 'bx-time';</w:t>
+              <w:br/>
+              <w:t xml:space="preserve">                let badgeClass = 'pending';</w:t>
+              <w:br/>
+              <w:t xml:space="preserve">                if(p.status === 'Aprobado') { badgeClass = 'in-progress'; icon = 'bx-check-double'; }</w:t>
+              <w:br/>
+              <w:t xml:space="preserve">                if(p.status === 'Rechazado') { badgeClass = 'not-done'; icon = 'bx-x'; }</w:t>
               <w:br/>
               <w:t xml:space="preserve">                </w:t>
               <w:br/>
-              <w:t xml:space="preserve">                const taskVal = row[tCol];</w:t>
-              <w:br/>
-              <w:t xml:space="preserve">                const gestorVal = row[gCol];</w:t>
-              <w:br/>
-              <w:t xml:space="preserve">                </w:t>
-              <w:br/>
-              <w:t xml:space="preserve">                if (taskVal !== undefined &amp;&amp; taskVal !== null &amp;&amp; String(taskVal).trim() !== "") {</w:t>
-              <w:br/>
-              <w:t xml:space="preserve">                    const tStr = String(taskVal).trim();</w:t>
-              <w:br/>
-              <w:t xml:space="preserve">                    const tStrLower = tStr.toLowerCase();</w:t>
-              <w:br/>
-              <w:t xml:space="preserve">                    </w:t>
-              <w:br/>
-              <w:t xml:space="preserve">                    if (tStrLower.startsWith("set ")) {</w:t>
-              <w:br/>
-              <w:t xml:space="preserve">                        currentSet = tStr;</w:t>
-              <w:br/>
-              <w:t xml:space="preserve">                    } else if (!tStrLower.includes("cronograma") &amp;&amp; gestorVal !== "Gestor") {</w:t>
-              <w:br/>
-              <w:t xml:space="preserve">                        if (gestorVal !== undefined &amp;&amp; gestorVal !== null &amp;&amp; namesMatch(String(gestorVal).trim(), gestorName)) {</w:t>
-              <w:br/>
-              <w:t xml:space="preserve">                            gestorCronogramaAssignments.push({</w:t>
-              <w:br/>
-              <w:t xml:space="preserve">                                set: currentSet || "Otros",</w:t>
-              <w:br/>
-              <w:t xml:space="preserve">                                task: tStr</w:t>
-              <w:br/>
-              <w:t xml:space="preserve">                            });</w:t>
-              <w:br/>
-              <w:t xml:space="preserve">                        }</w:t>
-              <w:br/>
-              <w:t xml:space="preserve">                    }</w:t>
-              <w:br/>
-              <w:t xml:space="preserve">                }</w:t>
-              <w:br/>
-              <w:t xml:space="preserve">            }</w:t>
+              <w:t xml:space="preserve">                let rejectionHtml = p.rejectionReason ? `&lt;br&gt;&lt;small style="color:var(--danger)"&gt;Razón: ${p.rejectionReason}&lt;/small&gt;` : '';</w:t>
+              <w:br/>
+              <w:br/>
+              <w:t xml:space="preserve">                historicoContainer.innerHTML += `</w:t>
+              <w:br/>
+              <w:t xml:space="preserve">                    &lt;div class="tree-item" style="margin-top: 10px;"&gt;</w:t>
+              <w:br/>
+              <w:t xml:space="preserve">                        &lt;div class="tree-header"&gt;</w:t>
+              <w:br/>
+              <w:t xml:space="preserve">                            &lt;i class='bx ${icon}'&gt;&lt;/i&gt;</w:t>
+              <w:br/>
+              <w:t xml:space="preserve">                            &lt;div style="display:flex; flex-direction:column;"&gt;</w:t>
+              <w:br/>
+              <w:t xml:space="preserve">                                &lt;span&gt;${p.tipo}&lt;/span&gt;</w:t>
+              <w:br/>
+              <w:t xml:space="preserve">                                &lt;small style="font-size:11px; opacity:0.7"&gt;${p.gestor} | ${p.fecha} (${p.horaInicio} a ${p.horaFin})${rejectionHtml}&lt;/small&gt;</w:t>
+              <w:br/>
+              <w:t xml:space="preserve">                            &lt;/div&gt;</w:t>
+              <w:br/>
+              <w:t xml:space="preserve">                            &lt;span class="badge ${badgeClass}" style="margin-left: auto;"&gt;${p.status}&lt;/span&gt;</w:t>
+              <w:br/>
+              <w:t xml:space="preserve">                        &lt;/div&gt;</w:t>
+              <w:br/>
+              <w:t xml:space="preserve">                    &lt;/div&gt;</w:t>
+              <w:br/>
+              <w:t xml:space="preserve">                `;</w:t>
+              <w:br/>
+              <w:t xml:space="preserve">            });</w:t>
+              <w:br/>
+              <w:t xml:space="preserve">        } else {</w:t>
+              <w:br/>
+              <w:t xml:space="preserve">            historicoContainer.innerHTML = '&lt;p style="color: var(--text-secondary); text-align: center; padding: 20px;"&gt;No hay permisos registrados.&lt;/p&gt;';</w:t>
               <w:br/>
               <w:t xml:space="preserve">        }</w:t>
               <w:br/>
-              <w:t xml:space="preserve">        console.log("Cargadas asignaciones de cronograma para " + gestorName + ":", gestorCronogramaAssignments);</w:t>
-              <w:br/>
-              <w:t xml:space="preserve">    } catch (e) {</w:t>
-              <w:br/>
-              <w:t xml:space="preserve">        console.error("Error al cargar Cronograma de Tareas:", e);</w:t>
-              <w:br/>
-              <w:t xml:space="preserve">        gestorCronogramaAssignments = [];</w:t>
+              <w:t xml:space="preserve">    } catch(e) {</w:t>
+              <w:br/>
+              <w:t xml:space="preserve">        console.error("No se pudo cargar permisos desde Firebase", e);</w:t>
               <w:br/>
               <w:t xml:space="preserve">    }</w:t>
               <w:br/>
               <w:t>}</w:t>
               <w:br/>
               <w:br/>
-              <w:t>function getScheduledGestoresCountForShift(shiftName, targetDate = new Date()) {</w:t>
-              <w:br/>
-              <w:t xml:space="preserve">    if (!globalScheduleRows || !globalScheduleBlocks || globalScheduleBlocks.length === 0) {</w:t>
-              <w:br/>
-              <w:t xml:space="preserve">        return 0;</w:t>
-              <w:br/>
-              <w:t xml:space="preserve">    }</w:t>
+              <w:t>function renderTree(tasksBySet) {</w:t>
+              <w:br/>
+              <w:t xml:space="preserve">    const container = document.querySelector('.tree-container');</w:t>
+              <w:br/>
+              <w:t xml:space="preserve">    if(!container) return;</w:t>
               <w:br/>
               <w:t xml:space="preserve">    </w:t>
               <w:br/>
-              <w:t xml:space="preserve">    let targetBlock = null;</w:t>
-              <w:br/>
-              <w:t xml:space="preserve">    let targetColIndex = -1;</w:t>
+              <w:t xml:space="preserve">    container.innerHTML = ''; // clear mock</w:t>
               <w:br/>
               <w:t xml:space="preserve">    </w:t>
               <w:br/>
-              <w:t xml:space="preserve">    for (let block of globalScheduleBlocks) {</w:t>
-              <w:br/>
-              <w:t xml:space="preserve">        const dateRow = globalScheduleRows[block.startRow];</w:t>
-              <w:br/>
-              <w:t xml:space="preserve">        for (let c = 1; c &lt; dateRow.length; c++) {</w:t>
-              <w:br/>
-              <w:t xml:space="preserve">            const serial = dateRow[c];</w:t>
-              <w:br/>
-              <w:t xml:space="preserve">            if (serial &amp;&amp; !isNaN(serial)) {</w:t>
-              <w:br/>
-              <w:t xml:space="preserve">                const cellDate = excelToJSDate(serial);</w:t>
-              <w:br/>
-              <w:t xml:space="preserve">                if (cellDate &amp;&amp; isSameDate(cellDate, targetDate)) {</w:t>
-              <w:br/>
-              <w:t xml:space="preserve">                    targetBlock = block;</w:t>
-              <w:br/>
-              <w:t xml:space="preserve">                    targetColIndex = c;</w:t>
-              <w:br/>
-              <w:t xml:space="preserve">                    break;</w:t>
-              <w:br/>
-              <w:t xml:space="preserve">                }</w:t>
-              <w:br/>
-              <w:t xml:space="preserve">            }</w:t>
-              <w:br/>
-              <w:t xml:space="preserve">        }</w:t>
-              <w:br/>
-              <w:t xml:space="preserve">        if (targetBlock) break;</w:t>
-              <w:br/>
-              <w:t xml:space="preserve">    }</w:t>
+              <w:t xml:space="preserve">    // Sort keys logically</w:t>
+              <w:br/>
+              <w:t xml:space="preserve">    const sets = Object.keys(tasksBySet).sort();</w:t>
+              <w:br/>
+              <w:t xml:space="preserve">    const shouldAutoExpand = sets.length === 1;</w:t>
               <w:br/>
               <w:t xml:space="preserve">    </w:t>
               <w:br/>
-              <w:t xml:space="preserve">    if (!targetBlock) {</w:t>
-              <w:br/>
-              <w:t xml:space="preserve">        targetBlock = globalScheduleBlocks[globalScheduleBlocks.length - 1];</w:t>
-              <w:br/>
-              <w:t xml:space="preserve">        const dayNames = ['Domingo', 'Lunes', 'Martes', 'Miércoles', 'Jueves', 'Viernes', 'Sábado'];</w:t>
-              <w:br/>
-              <w:t xml:space="preserve">        const dayRow = globalScheduleRows[targetBlock.startRow + 1];</w:t>
-              <w:br/>
-              <w:t xml:space="preserve">        const targetDayName = dayNames[targetDate.getDay()];</w:t>
+              <w:t xml:space="preserve">    sets.forEach(set =&gt; {</w:t>
+              <w:br/>
+              <w:t xml:space="preserve">        const setDiv = document.createElement('div');</w:t>
+              <w:br/>
+              <w:t xml:space="preserve">        setDiv.className = 'tree-item';</w:t>
               <w:br/>
               <w:t xml:space="preserve">        </w:t>
               <w:br/>
-              <w:t xml:space="preserve">        for (let c = 1; c &lt; dayRow.length; c++) {</w:t>
-              <w:br/>
-              <w:t xml:space="preserve">            const dayName = String(dayRow[c] || '').trim();</w:t>
-              <w:br/>
-              <w:t xml:space="preserve">            if (normalizeName(dayName) === normalizeName(targetDayName)) {</w:t>
-              <w:br/>
-              <w:t xml:space="preserve">                targetColIndex = c;</w:t>
-              <w:br/>
-              <w:t xml:space="preserve">                break;</w:t>
-              <w:br/>
-              <w:t xml:space="preserve">            }</w:t>
-              <w:br/>
-              <w:t xml:space="preserve">        }</w:t>
+              <w:t xml:space="preserve">        const total = tasksBySet[set].length;</w:t>
+              <w:br/>
+              <w:t xml:space="preserve">        const headerClass = shouldAutoExpand ? 'tree-header open' : 'tree-header';</w:t>
+              <w:br/>
+              <w:t xml:space="preserve">        const childrenClass = shouldAutoExpand ? 'tree-children show' : 'tree-children';</w:t>
               <w:br/>
               <w:t xml:space="preserve">        </w:t>
               <w:br/>
-              <w:t xml:space="preserve">        if (targetColIndex === -1) {</w:t>
-              <w:br/>
-              <w:t xml:space="preserve">            let jsDay = targetDate.getDay();</w:t>
-              <w:br/>
-              <w:t xml:space="preserve">            targetColIndex = jsDay === 0 ? 7 : jsDay;</w:t>
-              <w:br/>
-              <w:t xml:space="preserve">        }</w:t>
-              <w:br/>
-              <w:t xml:space="preserve">    }</w:t>
-              <w:br/>
-              <w:t xml:space="preserve">    </w:t>
-              <w:br/>
-              <w:t xml:space="preserve">    let count = 0;</w:t>
-              <w:br/>
-              <w:t xml:space="preserve">    const blockStartRow = targetBlock.startRow;</w:t>
-              <w:br/>
-              <w:t xml:space="preserve">    for (let rIdx = blockStartRow + 2; rIdx &lt; globalScheduleRows.length; rIdx++) {</w:t>
-              <w:br/>
-              <w:t xml:space="preserve">        const r = globalScheduleRows[rIdx];</w:t>
-              <w:br/>
-              <w:t xml:space="preserve">        if (!r || !r[0] || String(r[0]).trim() === '' || String(r[0]).trim().toUpperCase() === 'GESTOR') break;</w:t>
-              <w:br/>
-              <w:t xml:space="preserve">        </w:t>
-              <w:br/>
-              <w:t xml:space="preserve">        const rawShift = r[targetColIndex] || 'Descansa';</w:t>
-              <w:br/>
-              <w:t xml:space="preserve">        const category = getShiftCategory(rawShift);</w:t>
-              <w:br/>
-              <w:t xml:space="preserve">        if (category === shiftName) {</w:t>
-              <w:br/>
-              <w:t xml:space="preserve">            count++;</w:t>
-              <w:br/>
-              <w:t xml:space="preserve">        }</w:t>
-              <w:br/>
-              <w:t xml:space="preserve">    }</w:t>
-              <w:br/>
-              <w:t xml:space="preserve">    </w:t>
-              <w:br/>
-              <w:t xml:space="preserve">    return count;</w:t>
-              <w:br/>
-              <w:t>}</w:t>
-              <w:br/>
-              <w:br/>
-              <w:t>function getShiftForDate(rows, allScheduleBlocks, gestorName, date) {</w:t>
-              <w:br/>
-              <w:t xml:space="preserve">    if (!rows || rows.length === 0 || !allScheduleBlocks || allScheduleBlocks.length === 0) {</w:t>
-              <w:br/>
-              <w:t xml:space="preserve">        return 'Por Asignar';</w:t>
-              <w:br/>
-              <w:t xml:space="preserve">    }</w:t>
-              <w:br/>
-              <w:t xml:space="preserve">    </w:t>
-              <w:br/>
-              <w:t xml:space="preserve">    let targetBlock = null;</w:t>
-              <w:br/>
-              <w:t xml:space="preserve">    let targetColIndex = -1;</w:t>
-              <w:br/>
-              <w:t xml:space="preserve">    </w:t>
-              <w:br/>
-              <w:t xml:space="preserve">    for (let block of allScheduleBlocks) {</w:t>
-              <w:br/>
-              <w:t xml:space="preserve">        const dateRow = rows[block.startRow];</w:t>
-              <w:br/>
-              <w:t xml:space="preserve">        for (let c = 1; c &lt; dateRow.length; c++) {</w:t>
-              <w:br/>
-              <w:t xml:space="preserve">            const serial = dateRow[c];</w:t>
-              <w:br/>
-              <w:t xml:space="preserve">            if (serial &amp;&amp; !isNaN(serial)) {</w:t>
-              <w:br/>
-              <w:t xml:space="preserve">                const cellDate = excelToJSDate(serial);</w:t>
-              <w:br/>
-              <w:t xml:space="preserve">                if (cellDate &amp;&amp; isSameDate(cellDate, date)) {</w:t>
-              <w:br/>
-              <w:t xml:space="preserve">                    targetBlock = block;</w:t>
-              <w:br/>
-              <w:t xml:space="preserve">                    targetColIndex = c;</w:t>
-              <w:br/>
-              <w:t xml:space="preserve">                    break;</w:t>
-              <w:br/>
-              <w:t xml:space="preserve">                }</w:t>
-              <w:br/>
-              <w:t xml:space="preserve">            }</w:t>
-              <w:br/>
-              <w:t xml:space="preserve">        }</w:t>
-              <w:br/>
-              <w:t xml:space="preserve">        if (targetBlock) break;</w:t>
-              <w:br/>
-              <w:t xml:space="preserve">    }</w:t>
-              <w:br/>
-              <w:t xml:space="preserve">    </w:t>
-              <w:br/>
-              <w:t xml:space="preserve">    if (!targetBlock) {</w:t>
-              <w:br/>
-              <w:t xml:space="preserve">        targetBlock = allScheduleBlocks[allScheduleBlocks.length - 1];</w:t>
-              <w:br/>
-              <w:t xml:space="preserve">        const dayNames = ['Domingo', 'Lunes', 'Martes', 'Miércoles', 'Jueves', 'Viernes', 'Sábado'];</w:t>
-              <w:br/>
-              <w:t xml:space="preserve">        const dayRow = rows[targetBlock.startRow + 1];</w:t>
-              <w:br/>
-              <w:t xml:space="preserve">        const targetDayName = dayNames[date.getDay()];</w:t>
-              <w:br/>
-              <w:t xml:space="preserve">        </w:t>
-              <w:br/>
-              <w:t xml:space="preserve">        for (let c = 1; c &lt; dayRow.length; c++) {</w:t>
-              <w:br/>
-              <w:t xml:space="preserve">            const dayName = String(dayRow[c] || '').trim();</w:t>
-              <w:br/>
-              <w:t xml:space="preserve">            if (normalizeName(dayName) === normalizeName(targetDayName)) {</w:t>
-              <w:br/>
-              <w:t xml:space="preserve">                targetColIndex = c;</w:t>
-              <w:br/>
-              <w:t xml:space="preserve">                break;</w:t>
-              <w:br/>
-              <w:t xml:space="preserve">            }</w:t>
-              <w:br/>
-              <w:t xml:space="preserve">        }</w:t>
-              <w:br/>
-              <w:t xml:space="preserve">        </w:t>
-              <w:br/>
-              <w:t xml:space="preserve">        if (targetColIndex === -1) {</w:t>
-              <w:br/>
-              <w:t xml:space="preserve">            let jsDay = date.getDay();</w:t>
-              <w:br/>
-              <w:t xml:space="preserve">            targetColIndex = jsDay === 0 ? 7 : jsDay;</w:t>
-              <w:br/>
-              <w:t xml:space="preserve">        }</w:t>
-              <w:br/>
-              <w:t xml:space="preserve">    }</w:t>
-              <w:br/>
-              <w:t xml:space="preserve">    </w:t>
-              <w:br/>
-              <w:t xml:space="preserve">    const blockStartRow = targetBlock.startRow;</w:t>
-              <w:br/>
-              <w:t xml:space="preserve">    for (let rIdx = blockStartRow + 2; rIdx &lt; rows.length; rIdx++) {</w:t>
-              <w:br/>
-              <w:t xml:space="preserve">        const r = rows[rIdx];</w:t>
-              <w:br/>
-              <w:t xml:space="preserve">        if (!r || !r[0] || String(r[0]).trim() === '' || String(r[0]).trim().toUpperCase() === 'GESTOR') break;</w:t>
-              <w:br/>
-              <w:t xml:space="preserve">        </w:t>
-              <w:br/>
-              <w:t xml:space="preserve">        if (namesMatch(r[0], gestorName)) {</w:t>
-              <w:br/>
-              <w:t xml:space="preserve">            return r[targetColIndex] || 'Descansa';</w:t>
-              <w:br/>
-              <w:t xml:space="preserve">        }</w:t>
-              <w:br/>
-              <w:t xml:space="preserve">    }</w:t>
-              <w:br/>
-              <w:t xml:space="preserve">    </w:t>
-              <w:br/>
-              <w:t xml:space="preserve">    return 'Por Asignar';</w:t>
-              <w:br/>
-              <w:t>}</w:t>
-              <w:br/>
-              <w:br/>
-              <w:t>// Mapeo de URLs para documentos (especialmente videos pesados alojados en Google Drive)</w:t>
-              <w:br/>
-              <w:t>const documentUrls = {</w:t>
-              <w:br/>
-              <w:t xml:space="preserve">    "Revisión de Eventos Deportivos.mp4": "https://drive.google.com/file/d/1UqccsnUwTG6tgPcDYdUeLnf9XqvGzSoc/view?usp=sharing",</w:t>
-              <w:br/>
-              <w:t xml:space="preserve">    "Revisión de Eventos.mp4": "https://drive.google.com/file/d/1SB9ePi1EOJU05hzOsxOyl7BeNvCN1hOh/view?usp=sharing",</w:t>
-              <w:br/>
-              <w:t xml:space="preserve">    "Validación SEON.mp4": "https://drive.google.com/file/d/1JFf5basGD0gmrAVIy5AlMK1DBHYgE6JC/view?usp=sharing"</w:t>
-              <w:br/>
-              <w:t>};</w:t>
-              <w:br/>
-              <w:br/>
-              <w:t>function getDocUrl(fileName) {</w:t>
-              <w:br/>
-              <w:t xml:space="preserve">    if (documentUrls[fileName]) {</w:t>
-              <w:br/>
-              <w:t xml:space="preserve">        return documentUrls[fileName];</w:t>
-              <w:br/>
-              <w:t xml:space="preserve">    }</w:t>
-              <w:br/>
-              <w:t xml:space="preserve">    return "Procesos/" + fileName;</w:t>
-              <w:br/>
-              <w:t>}</w:t>
-              <w:br/>
-              <w:br/>
-              <w:t>let taskStateCache = {};</w:t>
-              <w:br/>
-              <w:t>try {</w:t>
-              <w:br/>
-              <w:t xml:space="preserve">    const cached = localStorage.getItem('riskOps_cache');</w:t>
-              <w:br/>
-              <w:t xml:space="preserve">    if(cached) taskStateCache = JSON.parse(cached);</w:t>
-              <w:br/>
-              <w:t>} catch(e) {}</w:t>
-              <w:br/>
-              <w:br/>
-              <w:t>let currentActiveTaskId = null;</w:t>
-              <w:br/>
-              <w:br/>
-              <w:t>// Live Clock Logic</w:t>
-              <w:br/>
-              <w:t>function updateClock() {</w:t>
-              <w:br/>
-              <w:t xml:space="preserve">    const clockElement = document.getElementById('liveClock');</w:t>
-              <w:br/>
-              <w:t xml:space="preserve">    if (!clockElement) return;</w:t>
-              <w:br/>
-              <w:br/>
-              <w:t xml:space="preserve">    const now = new Date();</w:t>
-              <w:br/>
-              <w:t xml:space="preserve">    const hours = String(now.getHours()).padStart(2, '0');</w:t>
-              <w:br/>
-              <w:t xml:space="preserve">    const minutes = String(now.getMinutes()).padStart(2, '0');</w:t>
-              <w:br/>
-              <w:t xml:space="preserve">    const seconds = String(now.getSeconds()).padStart(2, '0');</w:t>
-              <w:br/>
-              <w:t xml:space="preserve">    </w:t>
-              <w:br/>
-              <w:t xml:space="preserve">    clockElement.textContent = `${hours}:${minutes}:${seconds}`;</w:t>
-              <w:br/>
-              <w:t>}</w:t>
-              <w:br/>
-              <w:br/>
-              <w:t>// Update clock every second</w:t>
-              <w:br/>
-              <w:t>setInterval(updateClock, 1000);</w:t>
-              <w:br/>
-              <w:t>updateClock(); // Initial call</w:t>
-              <w:br/>
-              <w:br/>
-              <w:t>// Data source real</w:t>
-              <w:br/>
-              <w:t>let allTasks = [];</w:t>
-              <w:br/>
-              <w:t>let currentSelectedTask = null;</w:t>
-              <w:br/>
-              <w:br/>
-              <w:t>// Initialize Excel fetching</w:t>
-              <w:br/>
-              <w:t>async function loadExcelTasks() {</w:t>
-              <w:br/>
-              <w:t xml:space="preserve">    const container = document.querySelector('.tree-container');</w:t>
-              <w:br/>
-              <w:t xml:space="preserve">    if(container) container.innerHTML = '&lt;div style="padding: 20px; color: var(--text-secondary);"&gt;&lt;i class="bx bx-loader-alt bx-spin"&gt;&lt;/i&gt; Cargando Tareas...&lt;/div&gt;';</w:t>
-              <w:br/>
-              <w:t xml:space="preserve">    </w:t>
-              <w:br/>
-              <w:t xml:space="preserve">    try {</w:t>
-              <w:br/>
-              <w:t xml:space="preserve">        const url = encodeURI('Tareas Riesgo/Tareas de Riesgo.xlsx') + '?t=' + new Date().getTime();</w:t>
-              <w:br/>
-              <w:t xml:space="preserve">        const response = await fetch(url);</w:t>
-              <w:br/>
-              <w:t xml:space="preserve">        if(!response.ok) throw new Error("Error HTTP " + response.status);</w:t>
-              <w:br/>
-              <w:t xml:space="preserve">        const arrayBuffer = await response.arrayBuffer();</w:t>
-              <w:br/>
-              <w:t xml:space="preserve">        const workbook = XLSX.read(arrayBuffer, {type: 'array'});</w:t>
-              <w:br/>
-              <w:t xml:space="preserve">        const worksheet = workbook.Sheets[workbook.SheetNames[0]];</w:t>
-              <w:br/>
-              <w:t xml:space="preserve">        const json = XLSX.utils.sheet_to_json(worksheet, { defval: "" });</w:t>
-              <w:br/>
-              <w:t xml:space="preserve">        </w:t>
-              <w:br/>
-              <w:t xml:space="preserve">        // Assign ID to all master tasks in json</w:t>
-              <w:br/>
-              <w:t xml:space="preserve">        json.forEach((row, idx) =&gt; {</w:t>
-              <w:br/>
-              <w:t xml:space="preserve">            row.id = idx;</w:t>
-              <w:br/>
-              <w:t xml:space="preserve">        });</w:t>
-              <w:br/>
-              <w:t xml:space="preserve">        </w:t>
-              <w:br/>
-              <w:t xml:space="preserve">        let processedRows = [];</w:t>
-              <w:br/>
-              <w:t xml:space="preserve">        </w:t>
-              <w:br/>
-              <w:t xml:space="preserve">        if (currentUser &amp;&amp; currentUser.role === 'Gestor') {</w:t>
-              <w:br/>
-              <w:t xml:space="preserve">            // Resolve today's real shift from the parsed schedule (globalScheduleRows/globalScheduleBlocks)</w:t>
-              <w:br/>
-              <w:t xml:space="preserve">            // This ensures the filter uses the actual shift for today, not a stale value from localStorage</w:t>
-              <w:br/>
-              <w:t xml:space="preserve">            let resolvedShift = currentUser.shift || 'Por Asignar';</w:t>
-              <w:br/>
-              <w:t xml:space="preserve">            if (globalScheduleRows &amp;&amp; globalScheduleBlocks &amp;&amp; globalScheduleBlocks.length &gt; 0) {</w:t>
-              <w:br/>
-              <w:t xml:space="preserve">                const todayShift = getShiftForDate(globalScheduleRows, globalScheduleBlocks, currentUser.name, new Date());</w:t>
-              <w:br/>
-              <w:t xml:space="preserve">                if (todayShift &amp;&amp; todayShift !== 'Por Asignar' &amp;&amp; todayShift !== 'Descansa') {</w:t>
-              <w:br/>
-              <w:t xml:space="preserve">                    resolvedShift = todayShift;</w:t>
-              <w:br/>
-              <w:t xml:space="preserve">                }</w:t>
-              <w:br/>
-              <w:t xml:space="preserve">            }</w:t>
-              <w:br/>
-              <w:t xml:space="preserve">            // Load cronograma assignments using the resolved real shift</w:t>
-              <w:br/>
-              <w:t xml:space="preserve">            await loadCronogramaAssignments(currentUser.name, resolvedShift);</w:t>
-              <w:br/>
-              <w:t xml:space="preserve">            </w:t>
-              <w:br/>
-              <w:t xml:space="preserve">            if (gestorCronogramaAssignments &amp;&amp; gestorCronogramaAssignments.length &gt; 0) {</w:t>
-              <w:br/>
-              <w:t xml:space="preserve">                // Filter the master json rows</w:t>
-              <w:br/>
-              <w:t xml:space="preserve">                const filteredMasterRows = json.filter(row =&gt; {</w:t>
-              <w:br/>
-              <w:t xml:space="preserve">                    const set = row['Set '] || row['Set'] || 'Otros';</w:t>
-              <w:br/>
-              <w:t xml:space="preserve">                    const taskName = row['Tarea'];</w:t>
-              <w:br/>
-              <w:t xml:space="preserve">                    return gestorCronogramaAssignments.some(assign =&gt; </w:t>
-              <w:br/>
-              <w:t xml:space="preserve">                        taskNamesMatch(assign.task, taskName) &amp;&amp; setNamesMatch(assign.set, set)</w:t>
-              <w:br/>
-              <w:t xml:space="preserve">                    );</w:t>
-              <w:br/>
-              <w:t xml:space="preserve">                });</w:t>
-              <w:br/>
-              <w:t xml:space="preserve">                </w:t>
-              <w:br/>
-              <w:t xml:space="preserve">                // Generate mock tasks for assignments that aren't in the master sheet</w:t>
-              <w:br/>
-              <w:t xml:space="preserve">                const generatedMocks = [];</w:t>
-              <w:br/>
-              <w:t xml:space="preserve">                let mockId = 10000;</w:t>
-              <w:br/>
-              <w:t xml:space="preserve">                gestorCronogramaAssignments.forEach(assign =&gt; {</w:t>
-              <w:br/>
-              <w:t xml:space="preserve">                    const hasMasterMatch = json.some(row =&gt; </w:t>
-              <w:br/>
-              <w:t xml:space="preserve">                        taskNamesMatch(assign.task, row['Tarea']) &amp;&amp; setNamesMatch(assign.set, row['Set '] || row['Set'] || 'Otros')</w:t>
-              <w:br/>
-              <w:t xml:space="preserve">                    );</w:t>
-              <w:br/>
-              <w:t xml:space="preserve">                    </w:t>
-              <w:br/>
-              <w:t xml:space="preserve">                    if (!hasMasterMatch) {</w:t>
-              <w:br/>
-              <w:t xml:space="preserve">                        const mockRow = {</w:t>
-              <w:br/>
-              <w:t xml:space="preserve">                            'Set ': assign.set,</w:t>
-              <w:br/>
-              <w:t xml:space="preserve">                            'Tarea': assign.task,</w:t>
-              <w:br/>
-              <w:t xml:space="preserve">                            'Detalle de Tarea': `Tarea de control rutinario: ${assign.task}. Realizar las verificaciones correspondientes según los lineamientos de Riesgo.`,</w:t>
-              <w:br/>
-              <w:t xml:space="preserve">                            'Horario': 'Durante el turno',</w:t>
-              <w:br/>
-              <w:t xml:space="preserve">                            'Día': 'Diario',</w:t>
-              <w:br/>
-              <w:t xml:space="preserve">                            'Instrucciones': '1. Realizar la validación de la tarea de acuerdo con el procedimiento estándar.\n2. Registrar cualquier anomalía en los canales oficiales.\n3. Marcar como completada en esta plataforma al finalizar.',</w:t>
-              <w:br/>
-              <w:t xml:space="preserve">                            'Documento / Video de Apoyo': '',</w:t>
-              <w:br/>
-              <w:t xml:space="preserve">                            id: mockId++</w:t>
-              <w:br/>
-              <w:t xml:space="preserve">                        };</w:t>
-              <w:br/>
-              <w:t xml:space="preserve">                        generatedMocks.push(mockRow);</w:t>
-              <w:br/>
-              <w:t xml:space="preserve">                    }</w:t>
-              <w:br/>
-              <w:t xml:space="preserve">                });</w:t>
-              <w:br/>
-              <w:t xml:space="preserve">                </w:t>
-              <w:br/>
-              <w:t xml:space="preserve">                processedRows = [...filteredMasterRows, ...generatedMocks];</w:t>
-              <w:br/>
-              <w:t xml:space="preserve">            } else {</w:t>
-              <w:br/>
-              <w:t xml:space="preserve">                processedRows = [];</w:t>
-              <w:br/>
-              <w:t xml:space="preserve">            }</w:t>
-              <w:br/>
-              <w:t xml:space="preserve">        } else {</w:t>
-              <w:br/>
-              <w:t xml:space="preserve">            // Admin/Supervisor or other roles see everything</w:t>
-              <w:br/>
-              <w:t xml:space="preserve">            processedRows = json;</w:t>
-              <w:br/>
-              <w:t xml:space="preserve">        }</w:t>
-              <w:br/>
-              <w:t xml:space="preserve">        </w:t>
-              <w:br/>
-              <w:t xml:space="preserve">        // Transform the data, group by Set</w:t>
-              <w:br/>
-              <w:t xml:space="preserve">        const tasksBySet = {};</w:t>
-              <w:br/>
-              <w:t xml:space="preserve">        allTasks = []; // Clear global allTasks</w:t>
-              <w:br/>
-              <w:t xml:space="preserve">        </w:t>
-              <w:br/>
-              <w:t xml:space="preserve">        processedRows.forEach((row, index) =&gt; {</w:t>
-              <w:br/>
-              <w:t xml:space="preserve">            const set = row['Set '] || row['Set'] || 'Otros';</w:t>
-              <w:br/>
-              <w:t xml:space="preserve">            const taskName = row['Tarea'];</w:t>
-              <w:br/>
-              <w:t xml:space="preserve">            const taskId = row.id !== undefined ? row.id : index;</w:t>
-              <w:br/>
-              <w:t xml:space="preserve">            </w:t>
-              <w:br/>
-              <w:t xml:space="preserve">            if (!tasksBySet[set]) tasksBySet[set] = [];</w:t>
-              <w:br/>
-              <w:t xml:space="preserve">            </w:t>
-              <w:br/>
-              <w:t xml:space="preserve">            // Check for duplicates in the visual tree</w:t>
-              <w:br/>
-              <w:t xml:space="preserve">            const isDuplicate = tasksBySet[set].some(t =&gt; t.name === taskName);</w:t>
-              <w:br/>
-              <w:t xml:space="preserve">            </w:t>
-              <w:br/>
-              <w:t xml:space="preserve">            if (!isDuplicate) {</w:t>
-              <w:br/>
-              <w:t xml:space="preserve">                tasksBySet[set].push({</w:t>
-              <w:br/>
-              <w:t xml:space="preserve">                    id: taskId,</w:t>
-              <w:br/>
-              <w:t xml:space="preserve">                    name: taskName,</w:t>
-              <w:br/>
-              <w:t xml:space="preserve">                    detail: row['Detalle de Tarea'],</w:t>
-              <w:br/>
-              <w:t xml:space="preserve">                    time: row['Horario'],</w:t>
-              <w:br/>
-              <w:t xml:space="preserve">                    day: row['Día']</w:t>
-              <w:br/>
-              <w:t xml:space="preserve">                });</w:t>
-              <w:br/>
-              <w:t xml:space="preserve">            }</w:t>
-              <w:br/>
-              <w:t xml:space="preserve">            allTasks.push({ ...row, id: taskId });</w:t>
-              <w:br/>
-              <w:t xml:space="preserve">        });</w:t>
-              <w:br/>
-              <w:t xml:space="preserve">        </w:t>
-              <w:br/>
-              <w:t xml:space="preserve">        // Populate Set Selector</w:t>
-              <w:br/>
-              <w:t xml:space="preserve">        const select = document.getElementById('activeSetSelect');</w:t>
-              <w:br/>
-              <w:t xml:space="preserve">        if(select) {</w:t>
-              <w:br/>
-              <w:t xml:space="preserve">            select.innerHTML = '&lt;option value="" disabled selected&gt;Selecciona tu SET a trabajar...&lt;/option&gt;&lt;option value="Todos"&gt;Mostrar Todos&lt;/option&gt;';</w:t>
-              <w:br/>
-              <w:t xml:space="preserve">            const setsKeys = Object.keys(tasksBySet).sort();</w:t>
-              <w:br/>
-              <w:t xml:space="preserve">            setsKeys.forEach(set =&gt; {</w:t>
-              <w:br/>
-              <w:t xml:space="preserve">                select.innerHTML += `&lt;option value="${set}"&gt;${set}&lt;/option&gt;`;</w:t>
-              <w:br/>
-              <w:t xml:space="preserve">            });</w:t>
-              <w:br/>
-              <w:t xml:space="preserve">            </w:t>
-              <w:br/>
-              <w:t xml:space="preserve">            // Clone select to remove old event listeners</w:t>
-              <w:br/>
-              <w:t xml:space="preserve">            const newSelect = select.cloneNode(true);</w:t>
-              <w:br/>
-              <w:t xml:space="preserve">            select.parentNode.replaceChild(newSelect, select);</w:t>
-              <w:br/>
-              <w:t xml:space="preserve">            </w:t>
-              <w:br/>
-              <w:t xml:space="preserve">            newSelect.addEventListener('change', (e) =&gt; {</w:t>
-              <w:br/>
-              <w:t xml:space="preserve">                const val = e.target.value;</w:t>
-              <w:br/>
-              <w:t xml:space="preserve">                if(val === 'Todos') {</w:t>
-              <w:br/>
-              <w:t xml:space="preserve">                    renderTree(tasksBySet);</w:t>
-              <w:br/>
-              <w:t xml:space="preserve">                } else {</w:t>
-              <w:br/>
-              <w:t xml:space="preserve">                    const filtered = {};</w:t>
-              <w:br/>
-              <w:t xml:space="preserve">                    filtered[val] = tasksBySet[val];</w:t>
-              <w:br/>
-              <w:t xml:space="preserve">                    renderTree(filtered);</w:t>
-              <w:br/>
-              <w:t xml:space="preserve">                }</w:t>
-              <w:br/>
-              <w:t xml:space="preserve">            });</w:t>
-              <w:br/>
-              <w:t xml:space="preserve">        }</w:t>
-              <w:br/>
-              <w:t xml:space="preserve">        </w:t>
-              <w:br/>
-              <w:t xml:space="preserve">        // No renderizar todos por defecto, esperar selección</w:t>
-              <w:br/>
-              <w:t xml:space="preserve">        const container = document.querySelector('.tree-container');</w:t>
-              <w:br/>
-              <w:t xml:space="preserve">        if(container) container.innerHTML = '&lt;div style="padding: 20px; color: var(--text-secondary); text-align: center;"&gt;Selecciona un SET en el menú desplegable para ver las tareas.&lt;/div&gt;';</w:t>
-              <w:br/>
-              <w:t xml:space="preserve">        </w:t>
-              <w:br/>
-              <w:t xml:space="preserve">    } catch(err) {</w:t>
-              <w:br/>
-              <w:t xml:space="preserve">        console.error("Error loading tasks:", err);</w:t>
-              <w:br/>
-              <w:t xml:space="preserve">        const container = document.querySelector('.tree-container');</w:t>
-              <w:br/>
-              <w:t xml:space="preserve">        if(container) container.innerHTML = `&lt;div style="padding: 20px; color: var(--danger);"&gt;&lt;i class="bx bx-error-circle"&gt;&lt;/i&gt; Error cargando tareas: ${err.message}&lt;/div&gt;`;</w:t>
-              <w:br/>
-              <w:t xml:space="preserve">    }</w:t>
-              <w:br/>
-              <w:t>}</w:t>
-              <w:br/>
-              <w:br/>
-              <w:t>// Initializar parseo del Horario Personal</w:t>
-              <w:br/>
-              <w:t>async function loadSchedule() {</w:t>
-              <w:br/>
-              <w:t xml:space="preserve">    try {</w:t>
-              <w:br/>
-              <w:t xml:space="preserve">        const url = encodeURI('Horario/Horario 2026.xlsx') + '?t=' + Date.now();</w:t>
-              <w:br/>
-              <w:t xml:space="preserve">        const response = await fetch(url);</w:t>
-              <w:br/>
-              <w:t xml:space="preserve">        if(!response.ok) throw new Error("Fallo red");</w:t>
-              <w:br/>
-              <w:t xml:space="preserve">        const arrayBuffer = await response.arrayBuffer();</w:t>
-              <w:br/>
-              <w:t xml:space="preserve">        const workbook = XLSX.read(arrayBuffer, {type: 'array'});</w:t>
-              <w:br/>
-              <w:t xml:space="preserve">        const worksheet = workbook.Sheets[workbook.SheetNames[0]];</w:t>
-              <w:br/>
-              <w:t xml:space="preserve">        const rows = XLSX.utils.sheet_to_json(worksheet, { header: 1, defval: "" });</w:t>
-              <w:br/>
-              <w:t xml:space="preserve">        </w:t>
-              <w:br/>
-              <w:t xml:space="preserve">        // Función helper para parsear fechas de Excel a JS</w:t>
-              <w:br/>
-              <w:t xml:space="preserve">        function formatExcelDate(serial) {</w:t>
-              <w:br/>
-              <w:t xml:space="preserve">            if(!serial || isNaN(serial)) return "";</w:t>
-              <w:br/>
-              <w:t xml:space="preserve">            // Usar UTC para evitar problemas de zonas horarias e historia de DST</w:t>
-              <w:br/>
-              <w:t xml:space="preserve">            const epochUTC = Date.UTC(1899, 11, 30);</w:t>
-              <w:br/>
-              <w:t xml:space="preserve">            const d = new Date(epochUTC + serial * 86400000);</w:t>
-              <w:br/>
-              <w:t xml:space="preserve">            const monthNames = ["Ene", "Feb", "Mar", "Abr", "May", "Jun", "Jul", "Ago", "Sep", "Oct", "Nov", "Dic"];</w:t>
-              <w:br/>
-              <w:t xml:space="preserve">            return `${d.getUTCDate()} ${monthNames[d.getUTCMonth()]}`;</w:t>
-              <w:br/>
-              <w:t xml:space="preserve">        }</w:t>
-              <w:br/>
-              <w:t xml:space="preserve">        </w:t>
-              <w:br/>
-              <w:t xml:space="preserve">        let allScheduleBlocks = [];</w:t>
-              <w:br/>
-              <w:t xml:space="preserve">        if (rows &amp;&amp; rows.length &gt; 2) {</w:t>
-              <w:br/>
-              <w:t xml:space="preserve">            for(let rIdx = 0; rIdx &lt; rows.length; rIdx++) {</w:t>
-              <w:br/>
-              <w:t xml:space="preserve">                const testRow = rows[rIdx];</w:t>
-              <w:br/>
-              <w:t xml:space="preserve">                if (!testRow || testRow.length &lt; 2) continue;</w:t>
-              <w:br/>
-              <w:t xml:space="preserve">                </w:t>
-              <w:br/>
-              <w:t xml:space="preserve">                if (formatExcelDate(testRow[1]) !== "") {</w:t>
-              <w:br/>
-              <w:t xml:space="preserve">                    const nextR = rows[rIdx+1];</w:t>
-              <w:br/>
-              <w:t xml:space="preserve">                    if (nextR &amp;&amp; nextR.length &gt; 1 &amp;&amp; (nextR[1] === 'Lunes' || nextR[1] === 'Martes')) {</w:t>
-              <w:br/>
-              <w:t xml:space="preserve">                        // Encontramos un bloque, vamos a ver la fecha inicial y final</w:t>
-              <w:br/>
-              <w:t xml:space="preserve">                        let firstDate = formatExcelDate(testRow[1]);</w:t>
-              <w:br/>
-              <w:t xml:space="preserve">                        let lastDate = firstDate;</w:t>
-              <w:br/>
-              <w:t xml:space="preserve">                        for(let c = 1; c &lt; testRow.length; c++) {</w:t>
-              <w:br/>
-              <w:t xml:space="preserve">                            if(formatExcelDate(testRow[c])) lastDate = formatExcelDate(testRow[c]);</w:t>
-              <w:br/>
-              <w:t xml:space="preserve">                        }</w:t>
-              <w:br/>
-              <w:t xml:space="preserve">                        </w:t>
-              <w:br/>
-              <w:t xml:space="preserve">                        allScheduleBlocks.push({</w:t>
-              <w:br/>
-              <w:t xml:space="preserve">                            startRow: rIdx,</w:t>
-              <w:br/>
-              <w:t xml:space="preserve">                            label: `Semana del ${firstDate} al ${lastDate}`</w:t>
-              <w:br/>
-              <w:t xml:space="preserve">                        });</w:t>
-              <w:br/>
-              <w:t xml:space="preserve">                        rIdx++; // Saltar la fila de días</w:t>
-              <w:br/>
-              <w:t xml:space="preserve">                    }</w:t>
-              <w:br/>
-              <w:t xml:space="preserve">                }</w:t>
-              <w:br/>
-              <w:t xml:space="preserve">            }</w:t>
-              <w:br/>
-              <w:t xml:space="preserve">        }</w:t>
-              <w:br/>
-              <w:br/>
-              <w:t xml:space="preserve">        globalScheduleRows = rows;</w:t>
-              <w:br/>
-              <w:t xml:space="preserve">        globalScheduleBlocks = allScheduleBlocks;</w:t>
-              <w:br/>
-              <w:t xml:space="preserve">        </w:t>
-              <w:br/>
-              <w:t xml:space="preserve">        if (allScheduleBlocks.length === 0) return; // No hay datos válidos</w:t>
-              <w:br/>
-              <w:br/>
-              <w:t xml:space="preserve">        const tableHead = document.getElementById('scheduleTableHead');</w:t>
-              <w:br/>
-              <w:t xml:space="preserve">        const tableBody = document.getElementById('scheduleTableBody');</w:t>
-              <w:br/>
-              <w:t xml:space="preserve">        </w:t>
-              <w:br/>
-              <w:t xml:space="preserve">        if(tableHead &amp;&amp; tableBody &amp;&amp; rows.length &gt; 2) {</w:t>
-              <w:br/>
-              <w:t xml:space="preserve">            </w:t>
-              <w:br/>
-              <w:t xml:space="preserve">            const weekSelector = document.getElementById('weekSelector');</w:t>
-              <w:br/>
-              <w:t xml:space="preserve">            </w:t>
-              <w:br/>
-              <w:t xml:space="preserve">            // Encontrar el bloque correspondiente a hoy</w:t>
-              <w:br/>
-              <w:t xml:space="preserve">            let defaultBlockRow = null;</w:t>
-              <w:br/>
-              <w:t xml:space="preserve">            const today = new Date();</w:t>
-              <w:br/>
-              <w:t xml:space="preserve">            for (let block of allScheduleBlocks) {</w:t>
-              <w:br/>
-              <w:t xml:space="preserve">                const dateRow = rows[block.startRow];</w:t>
-              <w:br/>
-              <w:t xml:space="preserve">                for (let c = 1; c &lt; dateRow.length; c++) {</w:t>
-              <w:br/>
-              <w:t xml:space="preserve">                    const serial = dateRow[c];</w:t>
-              <w:br/>
-              <w:t xml:space="preserve">                    if (serial &amp;&amp; !isNaN(serial)) {</w:t>
-              <w:br/>
-              <w:t xml:space="preserve">                        const cellDate = excelToJSDate(serial);</w:t>
-              <w:br/>
-              <w:t xml:space="preserve">                        if (cellDate &amp;&amp; isSameDate(cellDate, today)) {</w:t>
-              <w:br/>
-              <w:t xml:space="preserve">                            defaultBlockRow = block.startRow;</w:t>
-              <w:br/>
-              <w:t xml:space="preserve">                            break;</w:t>
-              <w:br/>
-              <w:t xml:space="preserve">                        }</w:t>
-              <w:br/>
-              <w:t xml:space="preserve">                    }</w:t>
-              <w:br/>
-              <w:t xml:space="preserve">                }</w:t>
-              <w:br/>
-              <w:t xml:space="preserve">                if (defaultBlockRow !== null) break;</w:t>
-              <w:br/>
-              <w:t xml:space="preserve">            }</w:t>
-              <w:br/>
-              <w:t xml:space="preserve">            </w:t>
-              <w:br/>
-              <w:t xml:space="preserve">            if (defaultBlockRow === null) {</w:t>
-              <w:br/>
-              <w:t xml:space="preserve">                defaultBlockRow = allScheduleBlocks[allScheduleBlocks.length - 1].startRow;</w:t>
-              <w:br/>
-              <w:t xml:space="preserve">            }</w:t>
-              <w:br/>
-              <w:t xml:space="preserve">            </w:t>
-              <w:br/>
-              <w:t xml:space="preserve">            if (weekSelector) {</w:t>
-              <w:br/>
-              <w:t xml:space="preserve">                weekSelector.innerHTML = '';</w:t>
-              <w:br/>
-              <w:t xml:space="preserve">                allScheduleBlocks.forEach(block =&gt; {</w:t>
-              <w:br/>
-              <w:t xml:space="preserve">                    weekSelector.innerHTML += `&lt;option value="${block.startRow}"&gt;${block.label}&lt;/option&gt;`;</w:t>
-              <w:br/>
-              <w:t xml:space="preserve">                });</w:t>
-              <w:br/>
-              <w:t xml:space="preserve">                </w:t>
-              <w:br/>
-              <w:t xml:space="preserve">                weekSelector.value = defaultBlockRow;</w:t>
-              <w:br/>
-              <w:t xml:space="preserve">                </w:t>
-              <w:br/>
-              <w:t xml:space="preserve">                weekSelector.addEventListener('change', (e) =&gt; {</w:t>
-              <w:br/>
-              <w:t xml:space="preserve">                    renderScheduleBlock(parseInt(e.target.value));</w:t>
-              <w:br/>
-              <w:t xml:space="preserve">                });</w:t>
-              <w:br/>
-              <w:t xml:space="preserve">            }</w:t>
-              <w:br/>
-              <w:t xml:space="preserve">            </w:t>
-              <w:br/>
-              <w:t xml:space="preserve">            // Renderizar el bloque inicial</w:t>
-              <w:br/>
-              <w:t xml:space="preserve">            renderScheduleBlock(defaultBlockRow);</w:t>
-              <w:br/>
-              <w:t xml:space="preserve">            </w:t>
-              <w:br/>
-              <w:t xml:space="preserve">            function renderScheduleBlock(blockStartRow) {</w:t>
-              <w:br/>
-              <w:t xml:space="preserve">                const dateRow = rows[blockStartRow];</w:t>
-              <w:br/>
-              <w:t xml:space="preserve">                const dayRow = rows[blockStartRow + 1];</w:t>
-              <w:br/>
-              <w:t xml:space="preserve">                </w:t>
-              <w:br/>
-              <w:t xml:space="preserve">                let numCols = 0;</w:t>
-              <w:br/>
-              <w:t xml:space="preserve">                for(let i=1; i&lt;dateRow.length; i++) {</w:t>
-              <w:br/>
-              <w:t xml:space="preserve">                    if(formatExcelDate(dateRow[i])) numCols = i;</w:t>
-              <w:br/>
-              <w:t xml:space="preserve">                }</w:t>
-              <w:br/>
-              <w:t xml:space="preserve">                if(numCols === 0) numCols = 7; // fallback</w:t>
-              <w:br/>
-              <w:t xml:space="preserve">                </w:t>
-              <w:br/>
-              <w:t xml:space="preserve">                let headHTML = '&lt;tr style="border-bottom: 1px solid var(--glass-border);"&gt;';</w:t>
-              <w:br/>
-              <w:t xml:space="preserve">                headHTML += `&lt;th style="padding: 12px; color: var(--accent-primary); text-align: left; position: sticky; left: 0; background: var(--bg-panel); z-index: 2;"&gt;GESTOR &lt;i class='bx bx-refresh' style='cursor:pointer; margin-left:5px;' onclick='loadSchedule()' title='Refrescar Horario'&gt;&lt;/i&gt;&lt;/th&gt;`;</w:t>
-              <w:br/>
-              <w:t xml:space="preserve">                for(let i = 1; i &lt;= numCols; i++) {</w:t>
-              <w:br/>
-              <w:t xml:space="preserve">                    const dayName = dayRow[i] || `Día ${i}`;</w:t>
-              <w:br/>
-              <w:t xml:space="preserve">                    const dateParsed = formatExcelDate(dateRow[i]);</w:t>
-              <w:br/>
-              <w:t xml:space="preserve">                    const subText = dateParsed ? `&lt;br&gt;&lt;span style="font-size: 11px; font-weight: normal; color: var(--text-secondary);"&gt;${dateParsed}&lt;/span&gt;` : '';</w:t>
-              <w:br/>
-              <w:t xml:space="preserve">                    headHTML += `&lt;th style="padding: 12px; color: var(--accent-primary); text-align: center;"&gt;${dayName}${subText}&lt;/th&gt;`;</w:t>
-              <w:br/>
-              <w:t xml:space="preserve">                }</w:t>
-              <w:br/>
-              <w:t xml:space="preserve">                headHTML += '&lt;/tr&gt;';</w:t>
-              <w:br/>
-              <w:t xml:space="preserve">                tableHead.innerHTML = headHTML;</w:t>
-              <w:br/>
-              <w:t xml:space="preserve">                </w:t>
-              <w:br/>
-              <w:t xml:space="preserve">                tableBody.innerHTML = '';</w:t>
-              <w:br/>
-              <w:t xml:space="preserve">                for(let rowIndex = blockStartRow + 2; rowIndex &lt; rows.length; rowIndex++) {</w:t>
-              <w:br/>
-              <w:t xml:space="preserve">                    const r = rows[rowIndex];</w:t>
-              <w:br/>
-              <w:t xml:space="preserve">                    if (!r || !r[0] || String(r[0]).trim() === '' || String(r[0]).trim().toUpperCase() === 'GESTOR') break;</w:t>
-              <w:br/>
-              <w:t xml:space="preserve">                    </w:t>
-              <w:br/>
-              <w:t xml:space="preserve">                    let isCurrentUser = (currentUser &amp;&amp; namesMatch(r[0], currentUser.name));</w:t>
-              <w:br/>
-              <w:t xml:space="preserve">                    </w:t>
-              <w:br/>
-              <w:t xml:space="preserve">                    if (currentUser &amp;&amp; currentUser.role === 'Gestor' &amp;&amp; !isCurrentUser) continue;</w:t>
-              <w:br/>
-              <w:br/>
-              <w:t xml:space="preserve">                    let bgClass = isCurrentUser ? 'rgba(59,130,246,0.1)' : 'transparent';</w:t>
-              <w:br/>
-              <w:t xml:space="preserve">                    </w:t>
-              <w:br/>
-              <w:t xml:space="preserve">                    let trHTML = `&lt;tr class="hover-highlight" style="border-bottom: 1px solid var(--glass-border); background: ${bgClass};"&gt;`;</w:t>
-              <w:br/>
-              <w:t xml:space="preserve">                    trHTML += `&lt;td style="padding: 12px; font-weight: 600; text-align: left; color: ${isCurrentUser ? 'var(--accent-primary)' : 'var(--text-primary)'}; position: sticky; left: 0; background: ${isCurrentUser ? 'var(--bg-dark)' : 'var(--bg-panel)'}; z-index: 1;"&gt;${r[0]}&lt;/td&gt;`;</w:t>
-              <w:br/>
-              <w:t xml:space="preserve">                    </w:t>
-              <w:br/>
-              <w:t xml:space="preserve">                    // Encontrar el turno para mostrar en el badge principal (corresponde a hoy)</w:t>
-              <w:br/>
-              <w:t xml:space="preserve">                    let badgeShift = getShiftForDate(rows, allScheduleBlocks, r[0], new Date());</w:t>
-              <w:br/>
-              <w:t xml:space="preserve">                    </w:t>
-              <w:br/>
-              <w:t xml:space="preserve">                    for(let i = 1; i &lt;= numCols; i++) {</w:t>
-              <w:br/>
-              <w:t xml:space="preserve">                        const shift = r[i] || 'Descansa';</w:t>
-              <w:br/>
-              <w:t xml:space="preserve">                        </w:t>
-              <w:br/>
-              <w:t xml:space="preserve">                        let badgeClass = 'pending';</w:t>
-              <w:br/>
-              <w:t xml:space="preserve">                        const sLower = normalizeName(shift);</w:t>
-              <w:br/>
-              <w:t xml:space="preserve">                        if(/\d\s*(am|pm)/i.test(shift)) badgeClass = 'in-progress';</w:t>
-              <w:br/>
-              <w:t xml:space="preserve">                        else if(sLower.includes('vacacion')) badgeClass = 'vacaciones-badge';</w:t>
-              <w:br/>
-              <w:t xml:space="preserve">                        else if(sLower.includes('descansa')) badgeClass = 'descanso-badge';</w:t>
-              <w:br/>
-              <w:t xml:space="preserve">                        else if(sLower.includes('familia')) badgeClass = 'familia-badge';</w:t>
-              <w:br/>
-              <w:t xml:space="preserve">                        </w:t>
-              <w:br/>
-              <w:t xml:space="preserve">                        trHTML += `&lt;td style="padding: 12px; text-align: center; white-space: nowrap;"&gt;&lt;span class="badge ${badgeClass}"&gt;${shift}&lt;/span&gt;&lt;/td&gt;`;</w:t>
-              <w:br/>
-              <w:t xml:space="preserve">                    }</w:t>
-              <w:br/>
-              <w:t xml:space="preserve">                    </w:t>
-              <w:br/>
-              <w:t xml:space="preserve">                    if (isCurrentUser &amp;&amp; badgeShift) {</w:t>
-              <w:br/>
-              <w:t xml:space="preserve">                        const userRoleEl = document.getElementById('userRole');</w:t>
-              <w:br/>
-              <w:t xml:space="preserve">                        if (userRoleEl) userRoleEl.textContent = `${currentUser.role} | Turno: ${badgeShift}`;</w:t>
-              <w:br/>
-              <w:t xml:space="preserve">                        const headerShiftBadge = document.querySelector('.shift-badge');</w:t>
-              <w:br/>
-              <w:t xml:space="preserve">                        if (headerShiftBadge) headerShiftBadge.textContent = `TURNO: ${badgeShift}`;</w:t>
-              <w:br/>
-              <w:t xml:space="preserve">                        </w:t>
-              <w:br/>
-              <w:t xml:space="preserve">                        // Guardar el turno en currentUser y sincronizar a Firebase</w:t>
-              <w:br/>
-              <w:t xml:space="preserve">                        if (currentUser.shift !== badgeShift) {</w:t>
-              <w:br/>
-              <w:t xml:space="preserve">                            currentUser.shift = badgeShift;</w:t>
-              <w:br/>
-              <w:t xml:space="preserve">                            localStorage.setItem('riskOps_currentUser', JSON.stringify(currentUser));</w:t>
-              <w:br/>
-              <w:t xml:space="preserve">                            syncActiveSessionToFirebase();</w:t>
-              <w:br/>
-              <w:t xml:space="preserve">                            loadExcelTasks();</w:t>
-              <w:br/>
-              <w:t xml:space="preserve">                        }</w:t>
-              <w:br/>
-              <w:t xml:space="preserve">                    }</w:t>
-              <w:br/>
-              <w:t xml:space="preserve">                    trHTML += '&lt;/tr&gt;';</w:t>
-              <w:br/>
-              <w:t xml:space="preserve">                    tableBody.innerHTML += trHTML;</w:t>
-              <w:br/>
-              <w:t xml:space="preserve">                }</w:t>
-              <w:br/>
-              <w:t xml:space="preserve">            }</w:t>
-              <w:br/>
-              <w:t xml:space="preserve">        }</w:t>
-              <w:br/>
-              <w:t xml:space="preserve">        updateGlobalStats();</w:t>
-              <w:br/>
-              <w:t xml:space="preserve">    } catch(e) {</w:t>
-              <w:br/>
-              <w:t xml:space="preserve">        console.log("No se pudo cargar el horario", e);</w:t>
-              <w:br/>
-              <w:t xml:space="preserve">    }</w:t>
-              <w:br/>
-              <w:t>}</w:t>
-              <w:br/>
-              <w:br/>
-              <w:t>function loadTeletrabajo() {</w:t>
-              <w:br/>
-              <w:t xml:space="preserve">    fetch('Teletrabajo/Teletrabajo.xlsx?v=' + Date.now())</w:t>
-              <w:br/>
-              <w:t xml:space="preserve">        .then(res =&gt; {</w:t>
-              <w:br/>
-              <w:t xml:space="preserve">            if(!res.ok) throw new Error("No se encontró el archivo de Teletrabajo");</w:t>
-              <w:br/>
-              <w:t xml:space="preserve">            return res.arrayBuffer();</w:t>
-              <w:br/>
-              <w:t xml:space="preserve">        })</w:t>
-              <w:br/>
-              <w:t xml:space="preserve">        .then(data =&gt; {</w:t>
-              <w:br/>
-              <w:t xml:space="preserve">            const workbook = XLSX.read(data, {type: 'array'});</w:t>
-              <w:br/>
-              <w:t xml:space="preserve">            const firstSheet = workbook.Sheets[workbook.SheetNames[0]];</w:t>
-              <w:br/>
-              <w:t xml:space="preserve">            const rows = XLSX.utils.sheet_to_json(firstSheet, {header: 1, defval: ""});</w:t>
-              <w:br/>
-              <w:t xml:space="preserve">            </w:t>
-              <w:br/>
-              <w:t xml:space="preserve">            let allBlocks = [];</w:t>
-              <w:br/>
-              <w:t xml:space="preserve">            </w:t>
-              <w:br/>
-              <w:t xml:space="preserve">            for(let r = 0; r &lt; rows.length; r++) {</w:t>
-              <w:br/>
-              <w:t xml:space="preserve">                for(let c = 0; c &lt; rows[r].length; c++) {</w:t>
-              <w:br/>
-              <w:t xml:space="preserve">                    // Bloque mejorado: busca etiquetas claras de calendario</w:t>
-              <w:br/>
-              <w:t xml:space="preserve">                    const cellVal = String(rows[r][c]).trim();</w:t>
-              <w:br/>
-              <w:t xml:space="preserve">                    const lowCell = cellVal.toLowerCase();</w:t>
-              <w:br/>
-              <w:t xml:space="preserve">                    if(lowCell.includes('semana') || lowCell.includes('teletrabajo') || /^\d{1,2}\/\d{1,2}/.test(cellVal)) {</w:t>
-              <w:br/>
-              <w:t xml:space="preserve">                        let block = {</w:t>
-              <w:br/>
-              <w:t xml:space="preserve">                            label: cellVal,</w:t>
-              <w:br/>
-              <w:t xml:space="preserve">                            startRow: r,</w:t>
-              <w:br/>
-              <w:t xml:space="preserve">                            colIndex: c,</w:t>
-              <w:br/>
-              <w:t xml:space="preserve">                            data: []</w:t>
-              <w:br/>
-              <w:t xml:space="preserve">                        };</w:t>
-              <w:br/>
-              <w:t xml:space="preserve">                        </w:t>
-              <w:br/>
-              <w:t xml:space="preserve">                        // Buscamos filas debajo de este título que tengan nombres</w:t>
-              <w:br/>
-              <w:t xml:space="preserve">                        for(let i = r + 1; i &lt; rows.length; i++) {</w:t>
-              <w:br/>
-              <w:t xml:space="preserve">                            const gestor = rows[i] ? rows[i][c] : null;</w:t>
-              <w:br/>
-              <w:t xml:space="preserve">                            const dia = rows[i] ? rows[i][c+1] : null;</w:t>
-              <w:br/>
-              <w:t xml:space="preserve">                            </w:t>
-              <w:br/>
-              <w:t xml:space="preserve">                            if(!gestor || String(gestor).trim() === '') break;</w:t>
-              <w:br/>
-              <w:t xml:space="preserve">                            if(String(gestor).trim().toUpperCase() === 'GESTOR') continue; </w:t>
-              <w:br/>
-              <w:t xml:space="preserve">                            </w:t>
-              <w:br/>
-              <w:t xml:space="preserve">                            block.data.push({</w:t>
-              <w:br/>
-              <w:t xml:space="preserve">                                gestor: String(gestor).trim(),</w:t>
-              <w:br/>
-              <w:t xml:space="preserve">                                dia: String(dia || '').trim()</w:t>
-              <w:br/>
-              <w:t xml:space="preserve">                            });</w:t>
-              <w:br/>
-              <w:t xml:space="preserve">                        }</w:t>
-              <w:br/>
-              <w:t xml:space="preserve">                        </w:t>
-              <w:br/>
-              <w:t xml:space="preserve">                        if(block.data.length &gt; 0) allBlocks.push(block);</w:t>
-              <w:br/>
-              <w:t xml:space="preserve">                    }</w:t>
-              <w:br/>
-              <w:t xml:space="preserve">                }</w:t>
-              <w:br/>
-              <w:t xml:space="preserve">            }</w:t>
-              <w:br/>
-              <w:t xml:space="preserve">            </w:t>
-              <w:br/>
-              <w:t xml:space="preserve">            if(allBlocks.length === 0) return;</w:t>
-              <w:br/>
-              <w:t xml:space="preserve">            </w:t>
-              <w:br/>
-              <w:t xml:space="preserve">            const weekSelector = document.getElementById('teletrabajoWeekSelector');</w:t>
-              <w:br/>
-              <w:t xml:space="preserve">            const tableHead = document.getElementById('teletrabajoTableHead');</w:t>
-              <w:br/>
-              <w:t xml:space="preserve">            const tableBody = document.getElementById('teletrabajoTableBody');</w:t>
-              <w:br/>
-              <w:t xml:space="preserve">            </w:t>
-              <w:br/>
-              <w:t xml:space="preserve">            if(weekSelector) {</w:t>
-              <w:br/>
-              <w:t xml:space="preserve">                weekSelector.innerHTML = '';</w:t>
-              <w:br/>
-              <w:t xml:space="preserve">                allBlocks.forEach((block, idx) =&gt; {</w:t>
-              <w:br/>
-              <w:t xml:space="preserve">                    weekSelector.innerHTML += `&lt;option value="${idx}"&gt;${block.label}&lt;/option&gt;`;</w:t>
-              <w:br/>
-              <w:t xml:space="preserve">                });</w:t>
-              <w:br/>
-              <w:t xml:space="preserve">                </w:t>
-              <w:br/>
-              <w:t xml:space="preserve">                // Mostrar siempre la última semana disponible al inicio</w:t>
-              <w:br/>
-              <w:t xml:space="preserve">                let defaultBlockIdx = allBlocks.length - 1;</w:t>
-              <w:br/>
-              <w:t xml:space="preserve">                </w:t>
-              <w:br/>
-              <w:t xml:space="preserve">                weekSelector.value = defaultBlockIdx;</w:t>
-              <w:br/>
-              <w:t xml:space="preserve">                </w:t>
-              <w:br/>
-              <w:t xml:space="preserve">                weekSelector.addEventListener('change', (e) =&gt; {</w:t>
-              <w:br/>
-              <w:t xml:space="preserve">                    renderTeletrabajoBlock(allBlocks[e.target.value]);</w:t>
-              <w:br/>
-              <w:t xml:space="preserve">                });</w:t>
-              <w:br/>
-              <w:t xml:space="preserve">                </w:t>
-              <w:br/>
-              <w:t xml:space="preserve">                renderTeletrabajoBlock(allBlocks[defaultBlockIdx]);</w:t>
-              <w:br/>
-              <w:t xml:space="preserve">            }</w:t>
-              <w:br/>
-              <w:t xml:space="preserve">            </w:t>
-              <w:br/>
-              <w:t xml:space="preserve">            function renderTeletrabajoBlock(block) {</w:t>
-              <w:br/>
-              <w:t xml:space="preserve">                tableHead.innerHTML = `</w:t>
-              <w:br/>
-              <w:t xml:space="preserve">                    &lt;tr style="border-bottom: 1px solid var(--glass-border);"&gt;</w:t>
-              <w:br/>
-              <w:t xml:space="preserve">                        &lt;th style="padding: 12px; color: var(--accent-primary); text-align: left; position: sticky; left: 0; background: var(--bg-panel); z-index: 2;"&gt;GESTOR &lt;i class='bx bx-refresh' style='cursor:pointer; margin-left:5px;' onclick='loadTeletrabajo()' title='Refrescar Teletrabajo'&gt;&lt;/i&gt;&lt;/th&gt;</w:t>
-              <w:br/>
-              <w:t xml:space="preserve">                        &lt;th style="padding: 12px; color: var(--accent-primary); text-align: center;"&gt;DÍA&lt;/th&gt;</w:t>
-              <w:br/>
-              <w:t xml:space="preserve">                        &lt;th style="padding: 12px; color: var(--accent-primary); text-align: center;"&gt;MODALIDAD&lt;/th&gt;</w:t>
-              <w:br/>
-              <w:t xml:space="preserve">                    &lt;/tr&gt;</w:t>
-              <w:br/>
-              <w:t xml:space="preserve">                `;</w:t>
-              <w:br/>
-              <w:t xml:space="preserve">                </w:t>
-              <w:br/>
-              <w:t xml:space="preserve">                tableBody.innerHTML = '';</w:t>
-              <w:br/>
-              <w:t xml:space="preserve">                block.data.forEach(row =&gt; {</w:t>
-              <w:br/>
-              <w:t xml:space="preserve">                    let isCurrentUser = (currentUser &amp;&amp; namesMatch(row.gestor, currentUser.name));</w:t>
-              <w:br/>
-              <w:t xml:space="preserve">                    </w:t>
-              <w:br/>
-              <w:t xml:space="preserve">                    if (currentUser &amp;&amp; currentUser.role === 'Gestor' &amp;&amp; !isCurrentUser) return;</w:t>
-              <w:br/>
-              <w:br/>
-              <w:t xml:space="preserve">                    let bgClass = isCurrentUser ? 'rgba(59,130,246,0.1)' : 'transparent';</w:t>
-              <w:br/>
-              <w:t xml:space="preserve">                    </w:t>
-              <w:br/>
-              <w:t xml:space="preserve">                    let isTeletrabajo = row.dia &amp;&amp; row.dia.toLowerCase() !== 'nan';</w:t>
-              <w:br/>
-              <w:t xml:space="preserve">                    let estadoHtml = isTeletrabajo ? `&lt;span class="badge" style="background: rgba(16, 185, 129, 0.2); color: var(--success);"&gt;HOME OFFICE&lt;/span&gt;` : `&lt;span class="badge pending"&gt;PRESENCIAL&lt;/span&gt;`;</w:t>
-              <w:br/>
-              <w:t xml:space="preserve">                    </w:t>
-              <w:br/>
-              <w:t xml:space="preserve">                    tableBody.innerHTML += `</w:t>
-              <w:br/>
-              <w:t xml:space="preserve">                        &lt;tr class="hover-highlight" style="border-bottom: 1px solid var(--glass-border); background: ${bgClass};"&gt;</w:t>
-              <w:br/>
-              <w:t xml:space="preserve">                            &lt;td style="padding: 12px; font-weight: 600; text-align: left; color: ${isCurrentUser ? 'var(--accent-primary)' : 'var(--text-primary)'}; position: sticky; left: 0; background: ${isCurrentUser ? 'var(--bg-dark)' : 'var(--bg-panel)'}; z-index: 1;"&gt;${row.gestor}&lt;/td&gt;</w:t>
-              <w:br/>
-              <w:t xml:space="preserve">                            &lt;td style="padding: 12px; text-align: center;"&gt;${isTeletrabajo ? row.dia : '-'}&lt;/td&gt;</w:t>
-              <w:br/>
-              <w:t xml:space="preserve">                            &lt;td style="padding: 12px; text-align: center;"&gt;${estadoHtml}&lt;/td&gt;</w:t>
-              <w:br/>
-              <w:t xml:space="preserve">                        &lt;/tr&gt;</w:t>
-              <w:br/>
-              <w:t xml:space="preserve">                    `;</w:t>
-              <w:br/>
-              <w:t xml:space="preserve">                });</w:t>
-              <w:br/>
-              <w:t xml:space="preserve">            }</w:t>
-              <w:br/>
-              <w:t xml:space="preserve">        })</w:t>
-              <w:br/>
-              <w:t xml:space="preserve">        .catch(err =&gt; {</w:t>
-              <w:br/>
-              <w:t xml:space="preserve">            console.error("Error cargando Teletrabajo:", err);</w:t>
-              <w:br/>
-              <w:t xml:space="preserve">            const tb = document.getElementById('teletrabajoTableBody');</w:t>
-              <w:br/>
-              <w:t xml:space="preserve">            if(tb) tb.innerHTML = `&lt;tr&gt;&lt;td colspan="3" style="padding: 20px; color: var(--danger); text-align: center;"&gt;No se pudo cargar Teletrabajo.xlsx o no existe.&lt;/td&gt;&lt;/tr&gt;`;</w:t>
-              <w:br/>
-              <w:t xml:space="preserve">        });</w:t>
-              <w:br/>
-              <w:t>}</w:t>
-              <w:br/>
-              <w:br/>
-              <w:t>// Cargar Histórico de Permisos desde Firebase</w:t>
-              <w:br/>
-              <w:t>async function loadPermisos() {</w:t>
-              <w:br/>
-              <w:t xml:space="preserve">    try {</w:t>
-              <w:br/>
-              <w:t xml:space="preserve">        const snapshot = await database.ref('permissions').once('value');</w:t>
-              <w:br/>
-              <w:t xml:space="preserve">        const historicoContainer = document.getElementById('historicoPermisosList');</w:t>
-              <w:br/>
-              <w:t xml:space="preserve">        if(!historicoContainer) return;</w:t>
-              <w:br/>
-              <w:t xml:space="preserve">        </w:t>
-              <w:br/>
-              <w:t xml:space="preserve">        historicoContainer.innerHTML = '';</w:t>
-              <w:br/>
-              <w:t xml:space="preserve">        </w:t>
-              <w:br/>
-              <w:t xml:space="preserve">        if (snapshot.exists()) {</w:t>
-              <w:br/>
-              <w:t xml:space="preserve">            const data = snapshot.val();</w:t>
-              <w:br/>
-              <w:t xml:space="preserve">            let permisos = Object.keys(data).map(k =&gt; ({...data[k], fb_id: k}));</w:t>
-              <w:br/>
-              <w:t xml:space="preserve">            </w:t>
-              <w:br/>
-              <w:t xml:space="preserve">            // Filtro de privacidad: Gestor solo ve lo suyo. Admin ve todo.</w:t>
-              <w:br/>
-              <w:t xml:space="preserve">            if (currentUser &amp;&amp; currentUser.role !== 'Admin' &amp;&amp; currentUser.role !== 'Supervisor') {</w:t>
-              <w:br/>
-              <w:t xml:space="preserve">                permisos = permisos.filter(p =&gt; p.gestor === currentUser.name);</w:t>
-              <w:br/>
-              <w:t xml:space="preserve">            }</w:t>
-              <w:br/>
-              <w:t xml:space="preserve">            </w:t>
-              <w:br/>
-              <w:t xml:space="preserve">            // Ordenar por ID descendente (más nuevos primero)</w:t>
-              <w:br/>
-              <w:t xml:space="preserve">            permisos.sort((a,b) =&gt; b.id - a.id);</w:t>
-              <w:br/>
-              <w:t xml:space="preserve">            </w:t>
-              <w:br/>
-              <w:t xml:space="preserve">            if (permisos.length === 0) {</w:t>
-              <w:br/>
-              <w:t xml:space="preserve">                historicoContainer.innerHTML = '&lt;p style="color: var(--text-secondary); text-align: center; padding: 20px;"&gt;No hay permisos en el historial.&lt;/p&gt;';</w:t>
-              <w:br/>
-              <w:t xml:space="preserve">                return;</w:t>
-              <w:br/>
-              <w:t xml:space="preserve">            }</w:t>
-              <w:br/>
-              <w:t xml:space="preserve">            </w:t>
-              <w:br/>
-              <w:t xml:space="preserve">            permisos.forEach(p =&gt; {</w:t>
-              <w:br/>
-              <w:t xml:space="preserve">                let icon = 'bx-time';</w:t>
-              <w:br/>
-              <w:t xml:space="preserve">                let badgeClass = 'pending';</w:t>
-              <w:br/>
-              <w:t xml:space="preserve">                if(p.status === 'Aprobado') { badgeClass = 'in-progress'; icon = 'bx-check-double'; }</w:t>
-              <w:br/>
-              <w:t xml:space="preserve">                if(p.status === 'Rechazado') { badgeClass = 'not-done'; icon = 'bx-x'; }</w:t>
-              <w:br/>
-              <w:t xml:space="preserve">                </w:t>
-              <w:br/>
-              <w:t xml:space="preserve">                let rejectionHtml = p.rejectionReason ? `&lt;br&gt;&lt;small style="color:var(--danger)"&gt;Razón: ${p.rejectionReason}&lt;/small&gt;` : '';</w:t>
-              <w:br/>
-              <w:br/>
-              <w:t xml:space="preserve">                historicoContainer.innerHTML += `</w:t>
-              <w:br/>
-              <w:t xml:space="preserve">                    &lt;div class="tree-item" style="margin-top: 10px;"&gt;</w:t>
-              <w:br/>
-              <w:t xml:space="preserve">                        &lt;div class="tree-header"&gt;</w:t>
-              <w:br/>
-              <w:t xml:space="preserve">                            &lt;i class='bx ${icon}'&gt;&lt;/i&gt;</w:t>
-              <w:br/>
-              <w:t xml:space="preserve">                            &lt;div style="display:flex; flex-direction:column;"&gt;</w:t>
-              <w:br/>
-              <w:t xml:space="preserve">                                &lt;span&gt;${p.tipo}&lt;/span&gt;</w:t>
-              <w:br/>
-              <w:t xml:space="preserve">                                &lt;small style="font-size:11px; opacity:0.7"&gt;${p.gestor} | ${p.fecha} (${p.horaInicio} a ${p.horaFin})${rejectionHtml}&lt;/small&gt;</w:t>
-              <w:br/>
-              <w:t xml:space="preserve">                            &lt;/div&gt;</w:t>
-              <w:br/>
-              <w:t xml:space="preserve">                            &lt;span class="badge ${badgeClass}" style="margin-left: auto;"&gt;${p.status}&lt;/span&gt;</w:t>
-              <w:br/>
-              <w:t xml:space="preserve">                        &lt;/div&gt;</w:t>
-              <w:br/>
-              <w:t xml:space="preserve">                    &lt;/div&gt;</w:t>
-              <w:br/>
-              <w:t xml:space="preserve">                `;</w:t>
-              <w:br/>
-              <w:t xml:space="preserve">            });</w:t>
-              <w:br/>
-              <w:t xml:space="preserve">        } else {</w:t>
-              <w:br/>
-              <w:t xml:space="preserve">            historicoContainer.innerHTML = '&lt;p style="color: var(--text-secondary); text-align: center; padding: 20px;"&gt;No hay permisos registrados.&lt;/p&gt;';</w:t>
-              <w:br/>
-              <w:t xml:space="preserve">        }</w:t>
-              <w:br/>
-              <w:t xml:space="preserve">    } catch(e) {</w:t>
-              <w:br/>
-              <w:t xml:space="preserve">        console.error("No se pudo cargar permisos desde Firebase", e);</w:t>
-              <w:br/>
-              <w:t xml:space="preserve">    }</w:t>
-              <w:br/>
-              <w:t>}</w:t>
-              <w:br/>
-              <w:br/>
-              <w:t>function renderTree(tasksBySet) {</w:t>
-              <w:br/>
-              <w:t xml:space="preserve">    const container = document.querySelector('.tree-container');</w:t>
-              <w:br/>
-              <w:t xml:space="preserve">    if(!container) return;</w:t>
-              <w:br/>
-              <w:t xml:space="preserve">    </w:t>
-              <w:br/>
-              <w:t xml:space="preserve">    container.innerHTML = ''; // clear mock</w:t>
-              <w:br/>
-              <w:t xml:space="preserve">    </w:t>
-              <w:br/>
-              <w:t xml:space="preserve">    // Sort keys logically</w:t>
-              <w:br/>
-              <w:t xml:space="preserve">    const sets = Object.keys(tasksBySet).sort();</w:t>
-              <w:br/>
-              <w:t xml:space="preserve">    </w:t>
-              <w:br/>
-              <w:t xml:space="preserve">    sets.forEach(set =&gt; {</w:t>
-              <w:br/>
-              <w:t xml:space="preserve">        const setDiv = document.createElement('div');</w:t>
-              <w:br/>
-              <w:t xml:space="preserve">        setDiv.className = 'tree-item';</w:t>
-              <w:br/>
-              <w:t xml:space="preserve">        </w:t>
-              <w:br/>
-              <w:t xml:space="preserve">        const total = tasksBySet[set].length;</w:t>
-              <w:br/>
-              <w:t xml:space="preserve">        </w:t>
-              <w:br/>
               <w:t xml:space="preserve">        setDiv.innerHTML = `</w:t>
               <w:br/>
-              <w:t xml:space="preserve">            &lt;div class="tree-header" onclick="toggleTree(this)"&gt;</w:t>
+              <w:t xml:space="preserve">            &lt;div class="${headerClass}" onclick="toggleTree(this)"&gt;</w:t>
               <w:br/>
               <w:t xml:space="preserve">                &lt;i class='bx bx-chevron-right'&gt;&lt;/i&gt;</w:t>
               <w:br/>
@@ -7488,7 +7499,7 @@
               <w:br/>
               <w:t xml:space="preserve">            &lt;/div&gt;</w:t>
               <w:br/>
-              <w:t xml:space="preserve">            &lt;div class="tree-children"&gt;</w:t>
+              <w:t xml:space="preserve">            &lt;div class="${childrenClass}"&gt;</w:t>
               <w:br/>
               <w:t xml:space="preserve">                ${tasksBySet[set].map(task =&gt; {</w:t>
               <w:br/>

</xml_diff>

<commit_message>
Update technical documentation with latest Monitoreo and Cronograma changes
</commit_message>
<xml_diff>
--- a/Documentacion_Tecnica.docx
+++ b/Documentacion_Tecnica.docx
@@ -3920,7 +3920,7 @@
               <w:br/>
               <w:t xml:space="preserve">    &lt;script src="firebase-config.js?v=59"&gt;&lt;/script&gt;</w:t>
               <w:br/>
-              <w:t xml:space="preserve">    &lt;script src="app.js?v=84"&gt;&lt;/script&gt;</w:t>
+              <w:t xml:space="preserve">    &lt;script src="app.js?v=88"&gt;&lt;/script&gt;</w:t>
               <w:br/>
               <w:t>&lt;/body&gt;</w:t>
               <w:br/>
@@ -6054,21 +6054,78 @@
               <w:t>}</w:t>
               <w:br/>
               <w:br/>
-              <w:t>function getCronogramaColumnsForToday(targetDate, shiftText) {</w:t>
+              <w:t>function getCronogramaColumnsForToday(targetDate, shiftText, rows = []) {</w:t>
               <w:br/>
               <w:t xml:space="preserve">    const day = targetDate.getDay(); // 0 = Sunday, 1 = Monday, ..., 6 = Saturday</w:t>
               <w:br/>
+              <w:t xml:space="preserve">    </w:t>
+              <w:br/>
+              <w:t xml:space="preserve">    let cols = { manana: [], tarde: [], sabado: [], domingo: [] };</w:t>
+              <w:br/>
+              <w:t xml:space="preserve">    </w:t>
+              <w:br/>
+              <w:t xml:space="preserve">    for (let rIdx = 0; rIdx &lt; Math.min(5, rows.length); rIdx++) {</w:t>
+              <w:br/>
+              <w:t xml:space="preserve">        const row = rows[rIdx];</w:t>
+              <w:br/>
+              <w:t xml:space="preserve">        if (!row) continue;</w:t>
+              <w:br/>
+              <w:t xml:space="preserve">        for (let c = 0; c &lt; row.length; c++) {</w:t>
+              <w:br/>
+              <w:t xml:space="preserve">            const val = String(row[c] || "").trim().toLowerCase();</w:t>
+              <w:br/>
+              <w:t xml:space="preserve">            if (val.includes("mañana") &amp;&amp; !val.includes("sabado") &amp;&amp; !val.includes("sábado") &amp;&amp; !val.includes("domingo") &amp;&amp; cols.manana.length === 0) {</w:t>
+              <w:br/>
+              <w:t xml:space="preserve">                if (c + 1 &lt; row.length) cols.manana = [c, c + 1];</w:t>
+              <w:br/>
+              <w:t xml:space="preserve">            }</w:t>
+              <w:br/>
+              <w:t xml:space="preserve">            if (val.includes("tarde") &amp;&amp; cols.tarde.length === 0) {</w:t>
+              <w:br/>
+              <w:t xml:space="preserve">                if (c + 1 &lt; row.length) cols.tarde = [c, c + 1];</w:t>
+              <w:br/>
+              <w:t xml:space="preserve">            }</w:t>
+              <w:br/>
+              <w:t xml:space="preserve">            if ((val.includes("sábado") || val.includes("sabado")) &amp;&amp; cols.sabado.length === 0) {</w:t>
+              <w:br/>
+              <w:t xml:space="preserve">                if (c + 1 &lt; row.length) cols.sabado = [c, c + 1];</w:t>
+              <w:br/>
+              <w:t xml:space="preserve">            }</w:t>
+              <w:br/>
+              <w:t xml:space="preserve">            if (val.includes("domingo") &amp;&amp; cols.domingo.length === 0) {</w:t>
+              <w:br/>
+              <w:t xml:space="preserve">                if (c + 1 &lt; row.length) cols.domingo = [c, c + 1];</w:t>
+              <w:br/>
+              <w:t xml:space="preserve">            }</w:t>
+              <w:br/>
+              <w:t xml:space="preserve">        }</w:t>
+              <w:br/>
+              <w:t xml:space="preserve">    }</w:t>
+              <w:br/>
+              <w:t xml:space="preserve">    </w:t>
+              <w:br/>
+              <w:t xml:space="preserve">    // Fallback si no se encuentran</w:t>
+              <w:br/>
+              <w:t xml:space="preserve">    if (cols.manana.length === 0) cols.manana = [1, 2];</w:t>
+              <w:br/>
+              <w:t xml:space="preserve">    if (cols.tarde.length === 0) cols.tarde = [4, 5];</w:t>
+              <w:br/>
+              <w:t xml:space="preserve">    if (cols.sabado.length === 0) cols.sabado = [7, 8];</w:t>
+              <w:br/>
+              <w:t xml:space="preserve">    if (cols.domingo.length === 0) cols.domingo = [10, 11];</w:t>
+              <w:br/>
+              <w:br/>
               <w:t xml:space="preserve">    if (day === 0) { // Sunday</w:t>
               <w:br/>
-              <w:t xml:space="preserve">        return [[10, 11]];</w:t>
+              <w:t xml:space="preserve">        return [cols.domingo];</w:t>
               <w:br/>
               <w:t xml:space="preserve">    } else if (day === 6) { // Saturday</w:t>
               <w:br/>
-              <w:t xml:space="preserve">        return [[7, 8]];</w:t>
+              <w:t xml:space="preserve">        return [cols.sabado];</w:t>
               <w:br/>
               <w:t xml:space="preserve">    } else { // Monday to Friday</w:t>
               <w:br/>
-              <w:t xml:space="preserve">        return [[1, 2], [4, 5]];</w:t>
+              <w:t xml:space="preserve">        return [cols.manana, cols.tarde];</w:t>
               <w:br/>
               <w:t xml:space="preserve">    }</w:t>
               <w:br/>
@@ -6108,7 +6165,7 @@
               <w:br/>
               <w:t xml:space="preserve">        </w:t>
               <w:br/>
-              <w:t xml:space="preserve">        const colGroups = getCronogramaColumnsForToday(today, gestorShift);</w:t>
+              <w:t xml:space="preserve">        const colGroups = getCronogramaColumnsForToday(today, gestorShift, rows);</w:t>
               <w:br/>
               <w:t xml:space="preserve">        </w:t>
               <w:br/>
@@ -10601,6 +10658,79 @@
               <w:t>}</w:t>
               <w:br/>
               <w:br/>
+              <w:t>function calculateShiftDelay(session) {</w:t>
+              <w:br/>
+              <w:t xml:space="preserve">    if (!session.loginTime || !session.shift) return '';</w:t>
+              <w:br/>
+              <w:t xml:space="preserve">    const shiftStr = session.shift.toLowerCase().trim();</w:t>
+              <w:br/>
+              <w:t xml:space="preserve">    </w:t>
+              <w:br/>
+              <w:t xml:space="preserve">    // Parse start time: e.g. "8am - 4pm" -&gt; "8", "am"</w:t>
+              <w:br/>
+              <w:t xml:space="preserve">    const match = shiftStr.match(/^(\d{1,2})(?::(\d{2}))?\s*(am|pm)/i);</w:t>
+              <w:br/>
+              <w:t xml:space="preserve">    if (!match) return ''; // Cannot parse shift</w:t>
+              <w:br/>
+              <w:t xml:space="preserve">    </w:t>
+              <w:br/>
+              <w:t xml:space="preserve">    let hour = parseInt(match[1], 10);</w:t>
+              <w:br/>
+              <w:t xml:space="preserve">    let minute = match[2] ? parseInt(match[2], 10) : 0;</w:t>
+              <w:br/>
+              <w:t xml:space="preserve">    const ampm = match[3].toLowerCase();</w:t>
+              <w:br/>
+              <w:t xml:space="preserve">    </w:t>
+              <w:br/>
+              <w:t xml:space="preserve">    if (ampm === 'pm' &amp;&amp; hour &lt; 12) hour += 12;</w:t>
+              <w:br/>
+              <w:t xml:space="preserve">    if (ampm === 'am' &amp;&amp; hour === 12) hour = 0;</w:t>
+              <w:br/>
+              <w:t xml:space="preserve">    </w:t>
+              <w:br/>
+              <w:t xml:space="preserve">    const loginDate = new Date(session.loginTime);</w:t>
+              <w:br/>
+              <w:t xml:space="preserve">    const expected = new Date(loginDate);</w:t>
+              <w:br/>
+              <w:t xml:space="preserve">    expected.setHours(hour, minute, 0, 0);</w:t>
+              <w:br/>
+              <w:t xml:space="preserve">    </w:t>
+              <w:br/>
+              <w:t xml:space="preserve">    let diffMinutes = (loginDate - expected) / 60000;</w:t>
+              <w:br/>
+              <w:t xml:space="preserve">    </w:t>
+              <w:br/>
+              <w:t xml:space="preserve">    if (diffMinutes &lt; -12 * 60) {</w:t>
+              <w:br/>
+              <w:t xml:space="preserve">        expected.setDate(expected.getDate() + 1);</w:t>
+              <w:br/>
+              <w:t xml:space="preserve">        diffMinutes = (loginDate - expected) / 60000;</w:t>
+              <w:br/>
+              <w:t xml:space="preserve">    } else if (diffMinutes &gt; 12 * 60) {</w:t>
+              <w:br/>
+              <w:t xml:space="preserve">        expected.setDate(expected.getDate() - 1);</w:t>
+              <w:br/>
+              <w:t xml:space="preserve">        diffMinutes = (loginDate - expected) / 60000;</w:t>
+              <w:br/>
+              <w:t xml:space="preserve">    }</w:t>
+              <w:br/>
+              <w:t xml:space="preserve">    </w:t>
+              <w:br/>
+              <w:t xml:space="preserve">    if (diffMinutes &lt;= 5) {</w:t>
+              <w:br/>
+              <w:t xml:space="preserve">        return `&lt;span style="background: var(--success); color: white; padding: 2px 6px; border-radius: 4px; font-size: 10px; font-weight: 600; margin-left: 5px;" title="Límite: ${expected.toLocaleTimeString([], {hour: '2-digit', minute:'2-digit'})}"&gt;A tiempo&lt;/span&gt;`;</w:t>
+              <w:br/>
+              <w:t xml:space="preserve">    } else {</w:t>
+              <w:br/>
+              <w:t xml:space="preserve">        const tardanza = Math.round(diffMinutes);</w:t>
+              <w:br/>
+              <w:t xml:space="preserve">        return `&lt;span style="background: var(--danger); color: white; padding: 2px 6px; border-radius: 4px; font-size: 10px; font-weight: 600; margin-left: 5px;" title="Límite: ${expected.toLocaleTimeString([], {hour: '2-digit', minute:'2-digit'})}"&gt;+${tardanza}m Tarde&lt;/span&gt;`;</w:t>
+              <w:br/>
+              <w:t xml:space="preserve">    }</w:t>
+              <w:br/>
+              <w:t>}</w:t>
+              <w:br/>
+              <w:br/>
               <w:t>function renderActiveSessionsDashboard() {</w:t>
               <w:br/>
               <w:t xml:space="preserve">    const grid = document.getElementById('monitoreoGrid');</w:t>
@@ -10721,7 +10851,9 @@
               <w:br/>
               <w:t xml:space="preserve">        const lastActiveTime = session.lastActive ? new Date(session.lastActive).toLocaleTimeString([], { hour: '2-digit', minute: '2-digit', second: '2-digit' }) : 'Nunca';</w:t>
               <w:br/>
-              <w:t xml:space="preserve">        const loginTimeStr = session.loginTime ? new Date(session.loginTime).toLocaleTimeString([], { hour: '2-digit', minute: '2-digit', second: '2-digit' }) : (session.lastActive ? new Date(session.lastActive).toLocaleTimeString([], { hour: '2-digit', minute: '2-digit', second: '2-digit' }) : 'Nunca');</w:t>
+              <w:t xml:space="preserve">        const loginTimeStr = session.loginTime ? new Date(session.loginTime).toLocaleTimeString([], { hour: '2-digit', minute: '2-digit', second: '2-digit' }) : 'Pendiente (Falta actualizar)';</w:t>
+              <w:br/>
+              <w:t xml:space="preserve">        const delayBadge = calculateShiftDelay(session);</w:t>
               <w:br/>
               <w:t xml:space="preserve">        </w:t>
               <w:br/>
@@ -10787,7 +10919,13 @@
               <w:br/>
               <w:t xml:space="preserve">                    &lt;span style="color: var(--text-secondary);"&gt;&lt;i class='bx bx-time'&gt;&lt;/i&gt; Inicio de Turno:&lt;/span&gt;</w:t>
               <w:br/>
-              <w:t xml:space="preserve">                    &lt;span style="color: var(--text-primary); font-size: 12px;"&gt;${loginTimeStr}&lt;/span&gt;</w:t>
+              <w:t xml:space="preserve">                    &lt;div style="display: flex; align-items: center;"&gt;</w:t>
+              <w:br/>
+              <w:t xml:space="preserve">                        &lt;span style="color: var(--text-primary); font-size: 12px;"&gt;${loginTimeStr}&lt;/span&gt;</w:t>
+              <w:br/>
+              <w:t xml:space="preserve">                        ${delayBadge}</w:t>
+              <w:br/>
+              <w:t xml:space="preserve">                    &lt;/div&gt;</w:t>
               <w:br/>
               <w:t xml:space="preserve">                &lt;/div&gt;</w:t>
               <w:br/>
@@ -11018,7 +11156,7 @@
               <w:br/>
               <w:t xml:space="preserve">    const lastActiveTime = session.lastActive ? new Date(session.lastActive).toLocaleTimeString([], { hour: '2-digit', minute: '2-digit' }) : 'Nunca';</w:t>
               <w:br/>
-              <w:t xml:space="preserve">    const loginTimeStr = session.loginTime ? new Date(session.loginTime).toLocaleTimeString([], { hour: '2-digit', minute: '2-digit' }) : lastActiveTime;</w:t>
+              <w:t xml:space="preserve">    const loginTimeStr = session.loginTime ? new Date(session.loginTime).toLocaleTimeString([], { hour: '2-digit', minute: '2-digit' }) : 'Pendiente (Falta actualizar)';</w:t>
               <w:br/>
               <w:t xml:space="preserve">    const infoEl = document.getElementById('monitoreoModalInfo');</w:t>
               <w:br/>

</xml_diff>

<commit_message>
Update technical documentation to include Gestor de Usuarios date features
</commit_message>
<xml_diff>
--- a/Documentacion_Tecnica.docx
+++ b/Documentacion_Tecnica.docx
@@ -1987,7 +1987,7 @@
               <w:br/>
               <w:t xml:space="preserve">    &lt;script src="firebase-config.js?v=45"&gt;&lt;/script&gt;</w:t>
               <w:br/>
-              <w:t xml:space="preserve">    &lt;script src="login.js?v=45"&gt;&lt;/script&gt;</w:t>
+              <w:t xml:space="preserve">    &lt;script src="login.js?v=46"&gt;&lt;/script&gt;</w:t>
               <w:br/>
               <w:t>&lt;/body&gt;</w:t>
               <w:br/>
@@ -2558,7 +2558,9 @@
               <w:br/>
               <w:t xml:space="preserve">                    role: finalRole,</w:t>
               <w:br/>
-              <w:t xml:space="preserve">                    approved: finalRole === 'Admin' // Solo los Admin se auto-aprueban</w:t>
+              <w:t xml:space="preserve">                    approved: finalRole === 'Admin', // Solo los Admin se auto-aprueban</w:t>
+              <w:br/>
+              <w:t xml:space="preserve">                    registrationDate: new Date().toISOString()</w:t>
               <w:br/>
               <w:t xml:space="preserve">                };</w:t>
               <w:br/>
@@ -3516,7 +3518,13 @@
               <w:br/>
               <w:t xml:space="preserve">                                &lt;th style="padding: 12px; color: var(--accent-primary); text-align: left;"&gt;Nombre&lt;/th&gt;</w:t>
               <w:br/>
-              <w:t xml:space="preserve">                                &lt;th style="padding: 12px; color: var(--accent-primary); text-align: left;"&gt;Rol Solicitado&lt;/th&gt;</w:t>
+              <w:t xml:space="preserve">                                &lt;th style="padding: 12px; color: var(--accent-primary); text-align: left;"&gt;Email&lt;/th&gt;</w:t>
+              <w:br/>
+              <w:t xml:space="preserve">                                &lt;th style="padding: 12px; color: var(--accent-primary); text-align: left;"&gt;Rol&lt;/th&gt;</w:t>
+              <w:br/>
+              <w:t xml:space="preserve">                                &lt;th style="padding: 12px; color: var(--accent-primary); text-align: left;"&gt;F. Solicitud&lt;/th&gt;</w:t>
+              <w:br/>
+              <w:t xml:space="preserve">                                &lt;th style="padding: 12px; color: var(--accent-primary); text-align: left;"&gt;F. Aprobación&lt;/th&gt;</w:t>
               <w:br/>
               <w:t xml:space="preserve">                                &lt;th style="padding: 12px; color: var(--accent-primary); text-align: center;"&gt;Acción&lt;/th&gt;</w:t>
               <w:br/>
@@ -3920,7 +3928,7 @@
               <w:br/>
               <w:t xml:space="preserve">    &lt;script src="firebase-config.js?v=59"&gt;&lt;/script&gt;</w:t>
               <w:br/>
-              <w:t xml:space="preserve">    &lt;script src="app.js?v=88"&gt;&lt;/script&gt;</w:t>
+              <w:t xml:space="preserve">    &lt;script src="app.js?v=89"&gt;&lt;/script&gt;</w:t>
               <w:br/>
               <w:t>&lt;/body&gt;</w:t>
               <w:br/>
@@ -9576,6 +9584,12 @@
               <w:t xml:space="preserve">        let statusBadge = user.approved ? `&lt;span class="badge" style="background: rgba(16, 185, 129, 0.2); color: var(--success);"&gt;${user.role}&lt;/span&gt;` : `&lt;span class="badge pending"&gt;${user.role}&lt;/span&gt;`;</w:t>
               <w:br/>
               <w:br/>
+              <w:t xml:space="preserve">        const regDateStr = user.registrationDate ? new Date(user.registrationDate).toLocaleDateString() : 'Desconocida';</w:t>
+              <w:br/>
+              <w:t xml:space="preserve">        const appDateStr = user.approvalDate ? new Date(user.approvalDate).toLocaleDateString() : (user.approved === true ? 'Desconocida' : '-');</w:t>
+              <w:br/>
+              <w:t xml:space="preserve">        </w:t>
+              <w:br/>
               <w:t xml:space="preserve">        tbody.innerHTML += `</w:t>
               <w:br/>
               <w:t xml:space="preserve">            &lt;tr style="border-bottom: 1px solid var(--glass-border);"&gt;</w:t>
@@ -9586,6 +9600,10 @@
               <w:br/>
               <w:t xml:space="preserve">                &lt;td style="padding: 12px;"&gt;${statusBadge}&lt;/td&gt;</w:t>
               <w:br/>
+              <w:t xml:space="preserve">                &lt;td style="padding: 12px; font-size: 12px;"&gt;${regDateStr}&lt;/td&gt;</w:t>
+              <w:br/>
+              <w:t xml:space="preserve">                &lt;td style="padding: 12px; font-size: 12px;"&gt;${appDateStr}&lt;/td&gt;</w:t>
+              <w:br/>
               <w:t xml:space="preserve">                &lt;td style="padding: 12px; text-align: center;"&gt;</w:t>
               <w:br/>
               <w:t xml:space="preserve">                    ${actionHtml}</w:t>
@@ -9611,7 +9629,9 @@
               <w:br/>
               <w:t xml:space="preserve">        await database.ref('users/' + userId).update({</w:t>
               <w:br/>
-              <w:t xml:space="preserve">            approved: true</w:t>
+              <w:t xml:space="preserve">            approved: true,</w:t>
+              <w:br/>
+              <w:t xml:space="preserve">            approvalDate: new Date().toISOString()</w:t>
               <w:br/>
               <w:t xml:space="preserve">        });</w:t>
               <w:br/>

</xml_diff>